<commit_message>
Add exercise dividers, SuccessFactors note, workshop OneDrive folder; drop Nifty Fifty references
- Deck: a divider slide before each exercise (number, Fluent Emoji picture, time,
  8-step progress tracker) and one PowerPoint section per exercise (45 slides)
- Plugins spotlight: link to the Available plugins for Copilot Cowork page and a
  highlighted SAP SuccessFactors note (no catalog plugin yet; ESS agent or custom MCP plugin)
- Setup: create Documents/ai_hr_cowork_workshop in OneDrive for the sample files;
  all prompts updated to that path
- Remove references to the Nifty Fifty scenarios and template metadata
- Sample custom instructions for Customize instructions for Cowork

Co-authored-by: Copilot <223556219+Copilot@users.noreply.github.com>
</commit_message>
<xml_diff>
--- a/README.docx
+++ b/README.docx
@@ -10,7 +10,7 @@
           <w:sz w:val="21"/>
           <w:szCs w:val="24"/>
         </w:rPr>
-        <w:id w:val="-1890411560"/>
+        <w:id w:val="1706060412"/>
         <w:docPartObj>
           <w:docPartGallery w:val="Table of Contents"/>
           <w:docPartUnique/>
@@ -51,7 +51,7 @@
           <w:r>
             <w:fldChar w:fldCharType="separate"/>
           </w:r>
-          <w:hyperlink w:anchor="_Toc241747911" w:history="1">
+          <w:hyperlink w:anchor="_Toc241754207" w:history="1">
             <w:r>
               <w:rPr>
                 <w:rStyle w:val="Hyperlink"/>
@@ -78,7 +78,7 @@
                 <w:noProof/>
                 <w:webHidden/>
               </w:rPr>
-              <w:instrText xml:space="preserve"> PAGEREF _Toc241747911 \h </w:instrText>
+              <w:instrText xml:space="preserve"> PAGEREF _Toc241754207 \h </w:instrText>
             </w:r>
             <w:r>
               <w:rPr>
@@ -125,7 +125,7 @@
               <w14:ligatures w14:val="standardContextual"/>
             </w:rPr>
           </w:pPr>
-          <w:hyperlink w:anchor="_Toc241747912" w:history="1">
+          <w:hyperlink w:anchor="_Toc241754208" w:history="1">
             <w:r>
               <w:rPr>
                 <w:rStyle w:val="Hyperlink"/>
@@ -152,7 +152,7 @@
                 <w:noProof/>
                 <w:webHidden/>
               </w:rPr>
-              <w:instrText xml:space="preserve"> PAGEREF _Toc241747912 \h </w:instrText>
+              <w:instrText xml:space="preserve"> PAGEREF _Toc241754208 \h </w:instrText>
             </w:r>
             <w:r>
               <w:rPr>
@@ -199,7 +199,7 @@
               <w14:ligatures w14:val="standardContextual"/>
             </w:rPr>
           </w:pPr>
-          <w:hyperlink w:anchor="_Toc241747913" w:history="1">
+          <w:hyperlink w:anchor="_Toc241754209" w:history="1">
             <w:r>
               <w:rPr>
                 <w:rStyle w:val="Hyperlink"/>
@@ -226,7 +226,7 @@
                 <w:noProof/>
                 <w:webHidden/>
               </w:rPr>
-              <w:instrText xml:space="preserve"> PAGEREF _Toc241747913 \h </w:instrText>
+              <w:instrText xml:space="preserve"> PAGEREF _Toc241754209 \h </w:instrText>
             </w:r>
             <w:r>
               <w:rPr>
@@ -273,7 +273,7 @@
               <w14:ligatures w14:val="standardContextual"/>
             </w:rPr>
           </w:pPr>
-          <w:hyperlink w:anchor="_Toc241747914" w:history="1">
+          <w:hyperlink w:anchor="_Toc241754210" w:history="1">
             <w:r>
               <w:rPr>
                 <w:rStyle w:val="Hyperlink"/>
@@ -300,7 +300,7 @@
                 <w:noProof/>
                 <w:webHidden/>
               </w:rPr>
-              <w:instrText xml:space="preserve"> PAGEREF _Toc241747914 \h </w:instrText>
+              <w:instrText xml:space="preserve"> PAGEREF _Toc241754210 \h </w:instrText>
             </w:r>
             <w:r>
               <w:rPr>
@@ -347,7 +347,7 @@
               <w14:ligatures w14:val="standardContextual"/>
             </w:rPr>
           </w:pPr>
-          <w:hyperlink w:anchor="_Toc241747915" w:history="1">
+          <w:hyperlink w:anchor="_Toc241754211" w:history="1">
             <w:r>
               <w:rPr>
                 <w:rStyle w:val="Hyperlink"/>
@@ -374,7 +374,7 @@
                 <w:noProof/>
                 <w:webHidden/>
               </w:rPr>
-              <w:instrText xml:space="preserve"> PAGEREF _Toc241747915 \h </w:instrText>
+              <w:instrText xml:space="preserve"> PAGEREF _Toc241754211 \h </w:instrText>
             </w:r>
             <w:r>
               <w:rPr>
@@ -421,7 +421,7 @@
               <w14:ligatures w14:val="standardContextual"/>
             </w:rPr>
           </w:pPr>
-          <w:hyperlink w:anchor="_Toc241747916" w:history="1">
+          <w:hyperlink w:anchor="_Toc241754212" w:history="1">
             <w:r>
               <w:rPr>
                 <w:rStyle w:val="Hyperlink"/>
@@ -448,7 +448,7 @@
                 <w:noProof/>
                 <w:webHidden/>
               </w:rPr>
-              <w:instrText xml:space="preserve"> PAGEREF _Toc241747916 \h </w:instrText>
+              <w:instrText xml:space="preserve"> PAGEREF _Toc241754212 \h </w:instrText>
             </w:r>
             <w:r>
               <w:rPr>
@@ -495,7 +495,7 @@
               <w14:ligatures w14:val="standardContextual"/>
             </w:rPr>
           </w:pPr>
-          <w:hyperlink w:anchor="_Toc241747917" w:history="1">
+          <w:hyperlink w:anchor="_Toc241754213" w:history="1">
             <w:r>
               <w:rPr>
                 <w:rStyle w:val="Hyperlink"/>
@@ -522,7 +522,7 @@
                 <w:noProof/>
                 <w:webHidden/>
               </w:rPr>
-              <w:instrText xml:space="preserve"> PAGEREF _Toc241747917 \h </w:instrText>
+              <w:instrText xml:space="preserve"> PAGEREF _Toc241754213 \h </w:instrText>
             </w:r>
             <w:r>
               <w:rPr>
@@ -569,7 +569,7 @@
               <w14:ligatures w14:val="standardContextual"/>
             </w:rPr>
           </w:pPr>
-          <w:hyperlink w:anchor="_Toc241747918" w:history="1">
+          <w:hyperlink w:anchor="_Toc241754214" w:history="1">
             <w:r>
               <w:rPr>
                 <w:rStyle w:val="Hyperlink"/>
@@ -596,7 +596,7 @@
                 <w:noProof/>
                 <w:webHidden/>
               </w:rPr>
-              <w:instrText xml:space="preserve"> PAGEREF _Toc241747918 \h </w:instrText>
+              <w:instrText xml:space="preserve"> PAGEREF _Toc241754214 \h </w:instrText>
             </w:r>
             <w:r>
               <w:rPr>
@@ -639,7 +639,7 @@
         <w:pStyle w:val="Heading1"/>
       </w:pPr>
       <w:bookmarkStart w:id="0" w:name="Xa046f7e33c7391c4827688ee785cfee5a5aaa0a"/>
-      <w:bookmarkStart w:id="1" w:name="_Toc241747911"/>
+      <w:bookmarkStart w:id="1" w:name="_Toc241754207"/>
       <w:r>
         <w:t>Getting Things Done with Copilot Cowork for HR Tasks</w:t>
       </w:r>
@@ -767,17 +767,7 @@
         <w:t>scenario card</w:t>
       </w:r>
       <w:r>
-        <w:t xml:space="preserve"> (Function, Goal, Output, Why Cowork?, Prompt, Workflow, Data sources) in the style of Microsoft's </w:t>
-      </w:r>
-      <w:r>
-        <w:rPr>
-          <w:i/>
-          <w:iCs/>
-        </w:rPr>
-        <w:t>Copilot Cowork "Nifty Fifty" scenarios</w:t>
-      </w:r>
-      <w:r>
-        <w:t>.</w:t>
+        <w:t xml:space="preserve"> (Function, Goal, Output, Why Cowork?, Prompt, Workflow, Data sources).</w:t>
       </w:r>
     </w:p>
     <w:p>
@@ -785,7 +775,7 @@
         <w:pStyle w:val="Heading2"/>
       </w:pPr>
       <w:bookmarkStart w:id="3" w:name="learning-objectives"/>
-      <w:bookmarkStart w:id="4" w:name="_Toc241747912"/>
+      <w:bookmarkStart w:id="4" w:name="_Toc241754208"/>
       <w:bookmarkEnd w:id="2"/>
       <w:r>
         <w:t>Learning objectives</w:t>
@@ -816,7 +806,10 @@
         <w:t>Choose the right tool:</w:t>
       </w:r>
       <w:r>
-        <w:t xml:space="preserve"> Copilot Chat for quick answers, Cowork for multi-step work that ends in a deliverable, and Agent Builder for a reusable helper others can use.</w:t>
+        <w:t xml:space="preserve"> </w:t>
+      </w:r>
+      <w:r>
+        <w:t>Copilot Chat for quick answers, Cowork for multi-step work that ends in a deliverable, and Agent Builder for a reusable helper others can use.</w:t>
       </w:r>
     </w:p>
     <w:p>
@@ -873,7 +866,10 @@
         <w:t>Package repeatable work:</w:t>
       </w:r>
       <w:r>
-        <w:t xml:space="preserve"> build and evaluate a custom skill, then schedule recurring work with Automations.</w:t>
+        <w:t xml:space="preserve"> build and evaluate a custom skill, then schedule recurring work </w:t>
+      </w:r>
+      <w:r>
+        <w:t>with Automations.</w:t>
       </w:r>
     </w:p>
     <w:p>
@@ -920,7 +916,7 @@
         <w:pStyle w:val="Heading2"/>
       </w:pPr>
       <w:bookmarkStart w:id="5" w:name="who-its-for"/>
-      <w:bookmarkStart w:id="6" w:name="_Toc241747913"/>
+      <w:bookmarkStart w:id="6" w:name="_Toc241754209"/>
       <w:bookmarkEnd w:id="3"/>
       <w:r>
         <w:t>Who it's for</w:t>
@@ -1017,36 +1013,43 @@
           <w:b/>
           <w:bCs/>
         </w:rPr>
-        <w:t>their own user account</w:t>
-      </w:r>
-      <w:r>
-        <w:t xml:space="preserve"> — so each person has their own OneDrive, drafts, and skills, while org search/grounding is </w:t>
+        <w:t xml:space="preserve">their own </w:t>
       </w:r>
       <w:r>
         <w:rPr>
           <w:b/>
           <w:bCs/>
         </w:rPr>
-        <w:t>consistent across attendees</w:t>
-      </w:r>
-      <w:r>
-        <w:t xml:space="preserve">. The </w:t>
+        <w:t>user account</w:t>
+      </w:r>
+      <w:r>
+        <w:t xml:space="preserve"> — so each person has their own OneDrive, drafts, and skills, while org search/grounding is </w:t>
       </w:r>
       <w:r>
         <w:rPr>
           <w:b/>
           <w:bCs/>
         </w:rPr>
-        <w:t>facilitator demos from their own separate tenant</w:t>
-      </w:r>
-      <w:r>
-        <w:t xml:space="preserve">, so the instructor's screen may look a little different from the attendees'. Exercises run on </w:t>
+        <w:t>consistent across attendees</w:t>
+      </w:r>
+      <w:r>
+        <w:t xml:space="preserve">. The </w:t>
       </w:r>
       <w:r>
         <w:rPr>
           <w:b/>
           <w:bCs/>
         </w:rPr>
+        <w:t>facilitator demos from their own separate tenant</w:t>
+      </w:r>
+      <w:r>
+        <w:t xml:space="preserve">, so the instructor's screen may look a little different from the attendees'. Exercises run on </w:t>
+      </w:r>
+      <w:r>
+        <w:rPr>
+          <w:b/>
+          <w:bCs/>
+        </w:rPr>
         <w:t>shared sample files</w:t>
       </w:r>
       <w:r>
@@ -1058,7 +1061,7 @@
         <w:pStyle w:val="Heading2"/>
       </w:pPr>
       <w:bookmarkStart w:id="7" w:name="prerequisites"/>
-      <w:bookmarkStart w:id="8" w:name="_Toc241747914"/>
+      <w:bookmarkStart w:id="8" w:name="_Toc241754210"/>
       <w:bookmarkEnd w:id="5"/>
       <w:r>
         <w:t>Prerequisites</w:t>
@@ -1080,10 +1083,7 @@
         <w:t>~25 attendees share one common tenant</w:t>
       </w:r>
       <w:r>
-        <w:t xml:space="preserve"> </w:t>
-      </w:r>
-      <w:r>
-        <w:t xml:space="preserve">provisioned by the host, each with a </w:t>
+        <w:t xml:space="preserve"> provisioned by the host, each with a </w:t>
       </w:r>
       <w:r>
         <w:rPr>
@@ -1153,10 +1153,7 @@
         <w:t>Microsoft Edge</w:t>
       </w:r>
       <w:r>
-        <w:t xml:space="preserve"> (version 152 or </w:t>
-      </w:r>
-      <w:r>
-        <w:t xml:space="preserve">later) signed in with their workshop account (custom skills and browser tasks aren't supported on mobile). Full details and a host checklist: </w:t>
+        <w:t xml:space="preserve"> (version 152 or later) signed in with their workshop account (custom skills and browser tasks aren't supported on mobile). Full details and a host checklist: </w:t>
       </w:r>
       <w:hyperlink r:id="rId7">
         <w:r>
@@ -1175,7 +1172,7 @@
         <w:pStyle w:val="Heading2"/>
       </w:pPr>
       <w:bookmarkStart w:id="9" w:name="agenda-240-minutes"/>
-      <w:bookmarkStart w:id="10" w:name="_Toc241747915"/>
+      <w:bookmarkStart w:id="10" w:name="_Toc241754211"/>
       <w:bookmarkEnd w:id="7"/>
       <w:r>
         <w:t>Agenda (240 minutes)</w:t>
@@ -1413,7 +1410,7 @@
               <w:rPr>
                 <w:sz w:val="19"/>
               </w:rPr>
-              <w:t xml:space="preserve"> — Executive Command Center (Nifty Fifty "Exec 01" scenario; approvals one at a time)</w:t>
+              <w:t xml:space="preserve"> — Executive Command Center (interactive HTML dashboard; approvals one at a time)</w:t>
             </w:r>
           </w:p>
         </w:tc>
@@ -1457,7 +1454,13 @@
               <w:rPr>
                 <w:sz w:val="19"/>
               </w:rPr>
-              <w:t xml:space="preserve"> — Research the web with Deep Research (cited briefing + Word/Excel scorecard)</w:t>
+              <w:t xml:space="preserve"> </w:t>
+            </w:r>
+            <w:r>
+              <w:rPr>
+                <w:sz w:val="19"/>
+              </w:rPr>
+              <w:t>— Research the web with Deep Research (cited briefing + Word/Excel scorecard)</w:t>
             </w:r>
           </w:p>
         </w:tc>
@@ -1706,13 +1709,7 @@
               <w:rPr>
                 <w:sz w:val="19"/>
               </w:rPr>
-              <w:t xml:space="preserve"> </w:t>
-            </w:r>
-            <w:r>
-              <w:rPr>
-                <w:sz w:val="19"/>
-              </w:rPr>
-              <w:t>— Onboarding pack (PowerPoint + Scheduling + Communications)</w:t>
+              <w:t xml:space="preserve"> — Onboarding pack (PowerPoint + Scheduling + Communications)</w:t>
             </w:r>
           </w:p>
         </w:tc>
@@ -1756,7 +1753,13 @@
               <w:rPr>
                 <w:sz w:val="19"/>
               </w:rPr>
-              <w:t xml:space="preserve"> — Automate &amp; share (Automations, Daily Briefing, skill sharing)</w:t>
+              <w:t xml:space="preserve"> </w:t>
+            </w:r>
+            <w:r>
+              <w:rPr>
+                <w:sz w:val="19"/>
+              </w:rPr>
+              <w:t>— Automate &amp; share (Automations, Daily Briefing, skill sharing)</w:t>
             </w:r>
           </w:p>
         </w:tc>
@@ -1905,7 +1908,7 @@
         <w:pStyle w:val="Heading2"/>
       </w:pPr>
       <w:bookmarkStart w:id="11" w:name="whats-in-this-kit"/>
-      <w:bookmarkStart w:id="12" w:name="_Toc241747916"/>
+      <w:bookmarkStart w:id="12" w:name="_Toc241754212"/>
       <w:bookmarkEnd w:id="9"/>
       <w:r>
         <w:t>What's in this kit</w:t>
@@ -1958,7 +1961,10 @@
         <w:t>.docx</w:t>
       </w:r>
       <w:r>
-        <w:t>, for printing, sharing, and editing in Microsoft 365). The Word versions have the same content, with a table of contents on the longer guides, and link to each other. Each is listed below with both formats.</w:t>
+        <w:t xml:space="preserve">, for printing, sharing, and editing in Microsoft 365). The Word versions have </w:t>
+      </w:r>
+      <w:r>
+        <w:t>the same content, with a table of contents on the longer guides, and link to each other. Each is listed below with both formats.</w:t>
       </w:r>
     </w:p>
     <w:p>
@@ -2014,9 +2020,9 @@
         <w:tblLook w:val="0020" w:firstRow="1" w:lastRow="0" w:firstColumn="0" w:lastColumn="0" w:noHBand="0" w:noVBand="0"/>
       </w:tblPr>
       <w:tblGrid>
-        <w:gridCol w:w="1967"/>
-        <w:gridCol w:w="2076"/>
-        <w:gridCol w:w="5929"/>
+        <w:gridCol w:w="1868"/>
+        <w:gridCol w:w="1953"/>
+        <w:gridCol w:w="6151"/>
       </w:tblGrid>
       <w:tr>
         <w:trPr>
@@ -2200,7 +2206,7 @@
               <w:rPr>
                 <w:sz w:val="19"/>
               </w:rPr>
-              <w:t>Instructor deck (37 slides, speaker notes, alt text) built on the Copilot Cowork "Nifty Fifty" template — objectives, approvals, a scenario card + hands-on slide per exercise, an Output folder walkthrough, an HR plugins spotlight, and a knowledge check</w:t>
+              <w:t>Instructor deck (45 slides, speaker notes, alt text) — a divider slide with a picture and progress tracker before each exercise, one PowerPoint section per exercise for quick navigation, objectives, approvals, a scenario card + hands-on slide per exercise, an Output folder walkthrough, an HR plugins spotlight, and a knowledge check</w:t>
             </w:r>
           </w:p>
         </w:tc>
@@ -2757,14 +2763,8 @@
               <w:rPr>
                 <w:sz w:val="19"/>
               </w:rPr>
-              <w:t>reference/01-</w:t>
-            </w:r>
-            <w:r>
-              <w:rPr>
-                <w:sz w:val="19"/>
-              </w:rPr>
               <w:lastRenderedPageBreak/>
-              <w:t>cowork-overview</w:t>
+              <w:t>reference/01-cowork-overview</w:t>
             </w:r>
           </w:p>
         </w:tc>
@@ -3677,7 +3677,40 @@
         </w:r>
       </w:hyperlink>
       <w:r>
-        <w:t xml:space="preserve"> to get all six at once, then upload them to OneDrive.</w:t>
+        <w:t xml:space="preserve"> to get all six at once, then upload them to a folder named </w:t>
+      </w:r>
+      <w:r>
+        <w:rPr>
+          <w:rStyle w:val="VerbatimChar"/>
+          <w:b/>
+          <w:bCs/>
+        </w:rPr>
+        <w:t>ai_hr_cowork_workshop</w:t>
+      </w:r>
+      <w:r>
+        <w:t xml:space="preserve"> under </w:t>
+      </w:r>
+      <w:r>
+        <w:rPr>
+          <w:b/>
+          <w:bCs/>
+        </w:rPr>
+        <w:t>Documents</w:t>
+      </w:r>
+      <w:r>
+        <w:t xml:space="preserve"> </w:t>
+      </w:r>
+      <w:r>
+        <w:t>in your OneDrive (</w:t>
+      </w:r>
+      <w:r>
+        <w:rPr>
+          <w:rStyle w:val="VerbatimChar"/>
+        </w:rPr>
+        <w:t>Documents/ai_hr_cowork_workshop</w:t>
+      </w:r>
+      <w:r>
+        <w:t>); the prompts use that path.</w:t>
       </w:r>
     </w:p>
     <w:tbl>
@@ -4144,10 +4177,10 @@
         <w:t>sample-knowledge/</w:t>
       </w:r>
       <w:r>
-        <w:t xml:space="preserve"> are the editable sources the Word and Excel files are generated from. Attendees don't need them, and they aren't in </w:t>
-      </w:r>
-      <w:r>
-        <w:t>the zip. If you change one, regenerate its Word or Excel copy so the two stay in sync.</w:t>
+        <w:t xml:space="preserve"> are the editable </w:t>
+      </w:r>
+      <w:r>
+        <w:t>sources the Word and Excel files are generated from. Attendees don't need them, and they aren't in the zip. If you change one, regenerate its Word or Excel copy so the two stay in sync.</w:t>
       </w:r>
     </w:p>
     <w:p>
@@ -4155,7 +4188,7 @@
         <w:pStyle w:val="Heading2"/>
       </w:pPr>
       <w:bookmarkStart w:id="14" w:name="how-to-use-this-kit"/>
-      <w:bookmarkStart w:id="15" w:name="_Toc241747917"/>
+      <w:bookmarkStart w:id="15" w:name="_Toc241754213"/>
       <w:bookmarkEnd w:id="11"/>
       <w:bookmarkEnd w:id="13"/>
       <w:r>
@@ -4335,10 +4368,7 @@
         </w:r>
       </w:hyperlink>
       <w:r>
-        <w:t xml:space="preserve"> (knowledge check, survey, and </w:t>
-      </w:r>
-      <w:r>
-        <w:t>30-day plan) and pause the Exercise 1 and 7 schedules.</w:t>
+        <w:t xml:space="preserve"> (knowledge check, survey, and 30-day plan) and pause the Exercise 1 and 7 schedules.</w:t>
       </w:r>
     </w:p>
     <w:p>
@@ -4385,7 +4415,7 @@
         <w:pStyle w:val="Heading2"/>
       </w:pPr>
       <w:bookmarkStart w:id="16" w:name="requirement-coverage"/>
-      <w:bookmarkStart w:id="17" w:name="_Toc241747918"/>
+      <w:bookmarkStart w:id="17" w:name="_Toc241754214"/>
       <w:bookmarkEnd w:id="14"/>
       <w:r>
         <w:t>Requirement coverage</w:t>
@@ -4479,10 +4509,7 @@
         <w:t>predefined skills</w:t>
       </w:r>
       <w:r>
-        <w:t xml:space="preserve"> </w:t>
-      </w:r>
-      <w:r>
-        <w:t>— Deep Research, Word, Excel, PowerPoint, Scheduling, Calendar, Communications, Daily Briefing (Exercises 2, 5, 6 &amp; 7)</w:t>
+        <w:t xml:space="preserve"> — Deep Research, Word, Excel, PowerPoint, Scheduling, Calendar, Communications, Daily Briefing (Exercises 2, 5, 6 &amp; 7)</w:t>
       </w:r>
     </w:p>
     <w:p>
@@ -4497,17 +4524,17 @@
         <w:t>✅</w:t>
       </w:r>
       <w:r>
-        <w:t xml:space="preserve"> A </w:t>
+        <w:t xml:space="preserve"> An </w:t>
       </w:r>
       <w:r>
         <w:rPr>
           <w:b/>
           <w:bCs/>
         </w:rPr>
-        <w:t>Nifty Fifty</w:t>
-      </w:r>
-      <w:r>
-        <w:t xml:space="preserve"> scenario — the </w:t>
+        <w:t>executive scenario</w:t>
+      </w:r>
+      <w:r>
+        <w:t xml:space="preserve"> — the </w:t>
       </w:r>
       <w:r>
         <w:rPr>
@@ -4717,7 +4744,7 @@
         <w:t>scenario card</w:t>
       </w:r>
       <w:r>
-        <w:t xml:space="preserve"> (workbook + deck, on the Nifty Fifty template)</w:t>
+        <w:t xml:space="preserve"> (workbook + deck)</w:t>
       </w:r>
     </w:p>
     <w:p>
@@ -4819,7 +4846,7 @@
     </w:p>
     <w:p>
       <w:r>
-        <w:pict w14:anchorId="4C1056A0">
+        <w:pict w14:anchorId="7F4389D8">
           <v:rect id="_x0000_i1025" style="width:0;height:1.5pt" o:hralign="center" o:hrstd="t" o:hr="t"/>
         </w:pict>
       </w:r>
@@ -4833,13 +4860,31 @@
           <w:i/>
           <w:iCs/>
         </w:rPr>
-        <w:t>Sample content depicts the fictional company "Zava" and is for training purposes only. Product capabilities and available models may vary by tenant and over time; confirm current behavior in your environment.</w:t>
+        <w:lastRenderedPageBreak/>
+        <w:t xml:space="preserve">Sample content depicts the fictional company "Zava" and is for training purposes only. Divider illustrations: </w:t>
+      </w:r>
+      <w:hyperlink r:id="rId66">
+        <w:r>
+          <w:rPr>
+            <w:rStyle w:val="Hyperlink"/>
+            <w:i/>
+            <w:iCs/>
+          </w:rPr>
+          <w:t>Fluent Emoji</w:t>
+        </w:r>
+      </w:hyperlink>
+      <w:r>
+        <w:rPr>
+          <w:i/>
+          <w:iCs/>
+        </w:rPr>
+        <w:t xml:space="preserve"> by Microsoft (MIT License). Product capabilities and available models may vary by tenant and over time; confirm current behavior in your environment.</w:t>
       </w:r>
       <w:bookmarkEnd w:id="0"/>
       <w:bookmarkEnd w:id="16"/>
     </w:p>
     <w:sectPr>
-      <w:footerReference w:type="default" r:id="rId66"/>
+      <w:footerReference w:type="default" r:id="rId67"/>
       <w:footnotePr>
         <w:numRestart w:val="eachSect"/>
       </w:footnotePr>
@@ -4959,7 +5004,7 @@
   <w:abstractNum w:abstractNumId="0" w15:restartNumberingAfterBreak="0">
     <w:nsid w:val="0000A990"/>
     <w:multiLevelType w:val="multilevel"/>
-    <w:tmpl w:val="BFE8AA70"/>
+    <w:tmpl w:val="F8F695C2"/>
     <w:lvl w:ilvl="0">
       <w:numFmt w:val="bullet"/>
       <w:lvlText w:val=" "/>
@@ -5036,7 +5081,7 @@
   <w:abstractNum w:abstractNumId="1" w15:restartNumberingAfterBreak="0">
     <w:nsid w:val="0000A991"/>
     <w:multiLevelType w:val="multilevel"/>
-    <w:tmpl w:val="0AC8D6C0"/>
+    <w:tmpl w:val="CC5A544E"/>
     <w:lvl w:ilvl="0">
       <w:numFmt w:val="bullet"/>
       <w:lvlText w:val=""/>
@@ -5140,7 +5185,7 @@
   <w:abstractNum w:abstractNumId="2" w15:restartNumberingAfterBreak="0">
     <w:nsid w:val="00A99411"/>
     <w:multiLevelType w:val="multilevel"/>
-    <w:tmpl w:val="C4CEC86C"/>
+    <w:tmpl w:val="CCD6B1AE"/>
     <w:lvl w:ilvl="0">
       <w:start w:val="1"/>
       <w:numFmt w:val="decimal"/>
@@ -5223,10 +5268,10 @@
       </w:pPr>
     </w:lvl>
   </w:abstractNum>
-  <w:num w:numId="1" w16cid:durableId="256639626">
+  <w:num w:numId="1" w16cid:durableId="1091895460">
     <w:abstractNumId w:val="0"/>
   </w:num>
-  <w:num w:numId="2" w16cid:durableId="606546410">
+  <w:num w:numId="2" w16cid:durableId="1327366616">
     <w:abstractNumId w:val="2"/>
     <w:lvlOverride w:ilvl="0">
       <w:startOverride w:val="1"/>
@@ -5256,10 +5301,10 @@
       <w:startOverride w:val="1"/>
     </w:lvlOverride>
   </w:num>
-  <w:num w:numId="3" w16cid:durableId="222985105">
+  <w:num w:numId="3" w16cid:durableId="607584808">
     <w:abstractNumId w:val="1"/>
   </w:num>
-  <w:num w:numId="4" w16cid:durableId="787554703">
+  <w:num w:numId="4" w16cid:durableId="1758214768">
     <w:abstractNumId w:val="2"/>
     <w:lvlOverride w:ilvl="0">
       <w:startOverride w:val="1"/>
@@ -5289,7 +5334,7 @@
       <w:startOverride w:val="1"/>
     </w:lvlOverride>
   </w:num>
-  <w:num w:numId="5" w16cid:durableId="1921019696">
+  <w:num w:numId="5" w16cid:durableId="1012999254">
     <w:abstractNumId w:val="1"/>
   </w:num>
 </w:numbering>
@@ -6540,7 +6585,7 @@
     <w:next w:val="Normal"/>
     <w:autoRedefine/>
     <w:uiPriority w:val="39"/>
-    <w:rsid w:val="00D14C25"/>
+    <w:rsid w:val="00BA273A"/>
     <w:pPr>
       <w:spacing w:after="100"/>
     </w:pPr>
@@ -6551,7 +6596,7 @@
     <w:next w:val="Normal"/>
     <w:autoRedefine/>
     <w:uiPriority w:val="39"/>
-    <w:rsid w:val="00D14C25"/>
+    <w:rsid w:val="00BA273A"/>
     <w:pPr>
       <w:spacing w:after="100"/>
       <w:ind w:left="210"/>
@@ -6561,7 +6606,7 @@
     <w:name w:val="header"/>
     <w:basedOn w:val="Normal"/>
     <w:link w:val="HeaderChar"/>
-    <w:rsid w:val="00D14C25"/>
+    <w:rsid w:val="00BA273A"/>
     <w:pPr>
       <w:tabs>
         <w:tab w:val="center" w:pos="4513"/>
@@ -6574,7 +6619,7 @@
     <w:name w:val="Header Char"/>
     <w:basedOn w:val="DefaultParagraphFont"/>
     <w:link w:val="Header"/>
-    <w:rsid w:val="00D14C25"/>
+    <w:rsid w:val="00BA273A"/>
     <w:rPr>
       <w:rFonts w:ascii="Segoe UI" w:eastAsia="Segoe UI" w:hAnsi="Segoe UI" w:cs="Segoe UI"/>
       <w:color w:val="242424"/>
@@ -6585,7 +6630,7 @@
     <w:name w:val="footer"/>
     <w:basedOn w:val="Normal"/>
     <w:link w:val="FooterChar"/>
-    <w:rsid w:val="00D14C25"/>
+    <w:rsid w:val="00BA273A"/>
     <w:pPr>
       <w:tabs>
         <w:tab w:val="center" w:pos="4513"/>
@@ -6598,7 +6643,7 @@
     <w:name w:val="Footer Char"/>
     <w:basedOn w:val="DefaultParagraphFont"/>
     <w:link w:val="Footer"/>
-    <w:rsid w:val="00D14C25"/>
+    <w:rsid w:val="00BA273A"/>
     <w:rPr>
       <w:rFonts w:ascii="Segoe UI" w:eastAsia="Segoe UI" w:hAnsi="Segoe UI" w:cs="Segoe UI"/>
       <w:color w:val="242424"/>

</xml_diff>

<commit_message>
Keep only zava-sample-knowledge.zip; move sample sources into tools/ (#2)
Remove the duplicate sample-knowledge/ folder (its Word/Excel files were identical to the zip contents). Editable .md/.csv sources now live in tools/zava-sample-data/, and make_office_samples.py builds the Office files in .build before zipping. Update README, PROJECT-SUMMARY, readiness checklist, and their Word copies.

Co-authored-by: Christophe Ragage <ID+ragage@users.noreply.github.com>
Co-authored-by: Copilot <223556219+Copilot@users.noreply.github.com>
</commit_message>
<xml_diff>
--- a/README.docx
+++ b/README.docx
@@ -10,7 +10,7 @@
           <w:sz w:val="21"/>
           <w:szCs w:val="24"/>
         </w:rPr>
-        <w:id w:val="-1579201702"/>
+        <w:id w:val="-1039124292"/>
         <w:docPartObj>
           <w:docPartGallery w:val="Table of Contents"/>
           <w:docPartUnique/>
@@ -51,7 +51,7 @@
           <w:r>
             <w:fldChar w:fldCharType="separate"/>
           </w:r>
-          <w:hyperlink w:anchor="_Toc241771627" w:history="1">
+          <w:hyperlink w:anchor="_Toc241773775" w:history="1">
             <w:r>
               <w:rPr>
                 <w:rStyle w:val="Hyperlink"/>
@@ -78,7 +78,7 @@
                 <w:noProof/>
                 <w:webHidden/>
               </w:rPr>
-              <w:instrText xml:space="preserve"> PAGEREF _Toc241771627 \h </w:instrText>
+              <w:instrText xml:space="preserve"> PAGEREF _Toc241773775 \h </w:instrText>
             </w:r>
             <w:r>
               <w:rPr>
@@ -125,7 +125,7 @@
               <w14:ligatures w14:val="standardContextual"/>
             </w:rPr>
           </w:pPr>
-          <w:hyperlink w:anchor="_Toc241771628" w:history="1">
+          <w:hyperlink w:anchor="_Toc241773776" w:history="1">
             <w:r>
               <w:rPr>
                 <w:rStyle w:val="Hyperlink"/>
@@ -152,7 +152,7 @@
                 <w:noProof/>
                 <w:webHidden/>
               </w:rPr>
-              <w:instrText xml:space="preserve"> PAGEREF _Toc241771628 \h </w:instrText>
+              <w:instrText xml:space="preserve"> PAGEREF _Toc241773776 \h </w:instrText>
             </w:r>
             <w:r>
               <w:rPr>
@@ -199,7 +199,7 @@
               <w14:ligatures w14:val="standardContextual"/>
             </w:rPr>
           </w:pPr>
-          <w:hyperlink w:anchor="_Toc241771629" w:history="1">
+          <w:hyperlink w:anchor="_Toc241773777" w:history="1">
             <w:r>
               <w:rPr>
                 <w:rStyle w:val="Hyperlink"/>
@@ -226,7 +226,7 @@
                 <w:noProof/>
                 <w:webHidden/>
               </w:rPr>
-              <w:instrText xml:space="preserve"> PAGEREF _Toc241771629 \h </w:instrText>
+              <w:instrText xml:space="preserve"> PAGEREF _Toc241773777 \h </w:instrText>
             </w:r>
             <w:r>
               <w:rPr>
@@ -273,7 +273,7 @@
               <w14:ligatures w14:val="standardContextual"/>
             </w:rPr>
           </w:pPr>
-          <w:hyperlink w:anchor="_Toc241771630" w:history="1">
+          <w:hyperlink w:anchor="_Toc241773778" w:history="1">
             <w:r>
               <w:rPr>
                 <w:rStyle w:val="Hyperlink"/>
@@ -300,7 +300,7 @@
                 <w:noProof/>
                 <w:webHidden/>
               </w:rPr>
-              <w:instrText xml:space="preserve"> PAGEREF _Toc241771630 \h </w:instrText>
+              <w:instrText xml:space="preserve"> PAGEREF _Toc241773778 \h </w:instrText>
             </w:r>
             <w:r>
               <w:rPr>
@@ -347,7 +347,7 @@
               <w14:ligatures w14:val="standardContextual"/>
             </w:rPr>
           </w:pPr>
-          <w:hyperlink w:anchor="_Toc241771631" w:history="1">
+          <w:hyperlink w:anchor="_Toc241773779" w:history="1">
             <w:r>
               <w:rPr>
                 <w:rStyle w:val="Hyperlink"/>
@@ -374,7 +374,7 @@
                 <w:noProof/>
                 <w:webHidden/>
               </w:rPr>
-              <w:instrText xml:space="preserve"> PAGEREF _Toc241771631 \h </w:instrText>
+              <w:instrText xml:space="preserve"> PAGEREF _Toc241773779 \h </w:instrText>
             </w:r>
             <w:r>
               <w:rPr>
@@ -421,7 +421,7 @@
               <w14:ligatures w14:val="standardContextual"/>
             </w:rPr>
           </w:pPr>
-          <w:hyperlink w:anchor="_Toc241771632" w:history="1">
+          <w:hyperlink w:anchor="_Toc241773780" w:history="1">
             <w:r>
               <w:rPr>
                 <w:rStyle w:val="Hyperlink"/>
@@ -448,7 +448,7 @@
                 <w:noProof/>
                 <w:webHidden/>
               </w:rPr>
-              <w:instrText xml:space="preserve"> PAGEREF _Toc241771632 \h </w:instrText>
+              <w:instrText xml:space="preserve"> PAGEREF _Toc241773780 \h </w:instrText>
             </w:r>
             <w:r>
               <w:rPr>
@@ -495,7 +495,7 @@
               <w14:ligatures w14:val="standardContextual"/>
             </w:rPr>
           </w:pPr>
-          <w:hyperlink w:anchor="_Toc241771633" w:history="1">
+          <w:hyperlink w:anchor="_Toc241773781" w:history="1">
             <w:r>
               <w:rPr>
                 <w:rStyle w:val="Hyperlink"/>
@@ -522,7 +522,7 @@
                 <w:noProof/>
                 <w:webHidden/>
               </w:rPr>
-              <w:instrText xml:space="preserve"> PAGEREF _Toc241771633 \h </w:instrText>
+              <w:instrText xml:space="preserve"> PAGEREF _Toc241773781 \h </w:instrText>
             </w:r>
             <w:r>
               <w:rPr>
@@ -569,7 +569,7 @@
               <w14:ligatures w14:val="standardContextual"/>
             </w:rPr>
           </w:pPr>
-          <w:hyperlink w:anchor="_Toc241771634" w:history="1">
+          <w:hyperlink w:anchor="_Toc241773782" w:history="1">
             <w:r>
               <w:rPr>
                 <w:rStyle w:val="Hyperlink"/>
@@ -596,7 +596,7 @@
                 <w:noProof/>
                 <w:webHidden/>
               </w:rPr>
-              <w:instrText xml:space="preserve"> PAGEREF _Toc241771634 \h </w:instrText>
+              <w:instrText xml:space="preserve"> PAGEREF _Toc241773782 \h </w:instrText>
             </w:r>
             <w:r>
               <w:rPr>
@@ -643,7 +643,7 @@
               <w14:ligatures w14:val="standardContextual"/>
             </w:rPr>
           </w:pPr>
-          <w:hyperlink w:anchor="_Toc241771635" w:history="1">
+          <w:hyperlink w:anchor="_Toc241773783" w:history="1">
             <w:r>
               <w:rPr>
                 <w:rStyle w:val="Hyperlink"/>
@@ -670,7 +670,7 @@
                 <w:noProof/>
                 <w:webHidden/>
               </w:rPr>
-              <w:instrText xml:space="preserve"> PAGEREF _Toc241771635 \h </w:instrText>
+              <w:instrText xml:space="preserve"> PAGEREF _Toc241773783 \h </w:instrText>
             </w:r>
             <w:r>
               <w:rPr>
@@ -713,7 +713,7 @@
         <w:pStyle w:val="Heading1"/>
       </w:pPr>
       <w:bookmarkStart w:id="0" w:name="Xa046f7e33c7391c4827688ee785cfee5a5aaa0a"/>
-      <w:bookmarkStart w:id="1" w:name="_Toc241771627"/>
+      <w:bookmarkStart w:id="1" w:name="_Toc241773775"/>
       <w:r>
         <w:t>Getting Things Done with Copilot Cowork for HR Tasks</w:t>
       </w:r>
@@ -849,7 +849,7 @@
         <w:pStyle w:val="Heading2"/>
       </w:pPr>
       <w:bookmarkStart w:id="3" w:name="learning-objectives"/>
-      <w:bookmarkStart w:id="4" w:name="_Toc241771628"/>
+      <w:bookmarkStart w:id="4" w:name="_Toc241773776"/>
       <w:bookmarkEnd w:id="2"/>
       <w:r>
         <w:t>Learning objectives</w:t>
@@ -880,10 +880,7 @@
         <w:t>Choose the right tool:</w:t>
       </w:r>
       <w:r>
-        <w:t xml:space="preserve"> </w:t>
-      </w:r>
-      <w:r>
-        <w:t>Copilot Chat for quick answers, Cowork for multi-step work that ends in a deliverable, and Agent Builder for a reusable helper others can use.</w:t>
+        <w:t xml:space="preserve"> Copilot Chat for quick answers, Cowork for multi-step work that ends in a deliverable, and Agent Builder for a reusable helper others can use.</w:t>
       </w:r>
     </w:p>
     <w:p>
@@ -940,10 +937,7 @@
         <w:t>Package repeatable work:</w:t>
       </w:r>
       <w:r>
-        <w:t xml:space="preserve"> build and evaluate a custom skill, then schedule recurring work </w:t>
-      </w:r>
-      <w:r>
-        <w:t>with Automations.</w:t>
+        <w:t xml:space="preserve"> build and evaluate a custom skill, then schedule recurring work with Automations.</w:t>
       </w:r>
     </w:p>
     <w:p>
@@ -990,7 +984,7 @@
         <w:pStyle w:val="Heading2"/>
       </w:pPr>
       <w:bookmarkStart w:id="5" w:name="who-its-for"/>
-      <w:bookmarkStart w:id="6" w:name="_Toc241771629"/>
+      <w:bookmarkStart w:id="6" w:name="_Toc241773777"/>
       <w:bookmarkEnd w:id="3"/>
       <w:r>
         <w:t>Who it's for</w:t>
@@ -1087,43 +1081,36 @@
           <w:b/>
           <w:bCs/>
         </w:rPr>
-        <w:t xml:space="preserve">their own </w:t>
+        <w:t>their own user account</w:t>
+      </w:r>
+      <w:r>
+        <w:t xml:space="preserve"> — so each person has their own OneDrive, drafts, and skills, while org search/grounding is </w:t>
       </w:r>
       <w:r>
         <w:rPr>
           <w:b/>
           <w:bCs/>
         </w:rPr>
-        <w:t>user account</w:t>
-      </w:r>
-      <w:r>
-        <w:t xml:space="preserve"> — so each person has their own OneDrive, drafts, and skills, while org search/grounding is </w:t>
+        <w:t>consistent across attendees</w:t>
+      </w:r>
+      <w:r>
+        <w:t xml:space="preserve">. The </w:t>
       </w:r>
       <w:r>
         <w:rPr>
           <w:b/>
           <w:bCs/>
         </w:rPr>
-        <w:t>consistent across attendees</w:t>
-      </w:r>
-      <w:r>
-        <w:t xml:space="preserve">. The </w:t>
+        <w:t>facilitator demos from their own separate tenant</w:t>
+      </w:r>
+      <w:r>
+        <w:t xml:space="preserve">, so the instructor's screen may look a little different from the attendees'. Exercises run on </w:t>
       </w:r>
       <w:r>
         <w:rPr>
           <w:b/>
           <w:bCs/>
         </w:rPr>
-        <w:t>facilitator demos from their own separate tenant</w:t>
-      </w:r>
-      <w:r>
-        <w:t xml:space="preserve">, so the instructor's screen may look a little different from the attendees'. Exercises run on </w:t>
-      </w:r>
-      <w:r>
-        <w:rPr>
-          <w:b/>
-          <w:bCs/>
-        </w:rPr>
         <w:t>shared sample files</w:t>
       </w:r>
       <w:r>
@@ -1135,7 +1122,7 @@
         <w:pStyle w:val="Heading2"/>
       </w:pPr>
       <w:bookmarkStart w:id="7" w:name="prerequisites"/>
-      <w:bookmarkStart w:id="8" w:name="_Toc241771630"/>
+      <w:bookmarkStart w:id="8" w:name="_Toc241773778"/>
       <w:bookmarkEnd w:id="5"/>
       <w:r>
         <w:t>Prerequisites</w:t>
@@ -1246,7 +1233,7 @@
         <w:pStyle w:val="Heading2"/>
       </w:pPr>
       <w:bookmarkStart w:id="9" w:name="agenda-240-minutes"/>
-      <w:bookmarkStart w:id="10" w:name="_Toc241771631"/>
+      <w:bookmarkStart w:id="10" w:name="_Toc241773779"/>
       <w:bookmarkEnd w:id="7"/>
       <w:r>
         <w:t>Agenda (240 minutes)</w:t>
@@ -1528,13 +1515,7 @@
               <w:rPr>
                 <w:sz w:val="19"/>
               </w:rPr>
-              <w:t xml:space="preserve"> </w:t>
-            </w:r>
-            <w:r>
-              <w:rPr>
-                <w:sz w:val="19"/>
-              </w:rPr>
-              <w:t>— Research the web with Deep Research (cited briefing + Word/Excel scorecard)</w:t>
+              <w:t xml:space="preserve"> — Research the web with Deep Research (cited briefing + Word/Excel scorecard)</w:t>
             </w:r>
           </w:p>
         </w:tc>
@@ -1827,13 +1808,7 @@
               <w:rPr>
                 <w:sz w:val="19"/>
               </w:rPr>
-              <w:t xml:space="preserve"> </w:t>
-            </w:r>
-            <w:r>
-              <w:rPr>
-                <w:sz w:val="19"/>
-              </w:rPr>
-              <w:t>— Automate &amp; share (Automations, Daily Briefing, skill sharing)</w:t>
+              <w:t xml:space="preserve"> — Automate &amp; share (Automations, Daily Briefing, skill sharing)</w:t>
             </w:r>
           </w:p>
         </w:tc>
@@ -1982,7 +1957,7 @@
         <w:pStyle w:val="Heading2"/>
       </w:pPr>
       <w:bookmarkStart w:id="11" w:name="whats-in-this-kit"/>
-      <w:bookmarkStart w:id="12" w:name="_Toc241771632"/>
+      <w:bookmarkStart w:id="12" w:name="_Toc241773780"/>
       <w:bookmarkEnd w:id="9"/>
       <w:r>
         <w:t>What's in this kit</w:t>
@@ -2035,10 +2010,7 @@
         <w:t>.docx</w:t>
       </w:r>
       <w:r>
-        <w:t xml:space="preserve">, for printing, sharing, and editing in Microsoft 365). The Word versions have </w:t>
-      </w:r>
-      <w:r>
-        <w:t>the same content, with a table of contents on the longer guides, and link to each other. Each is listed below with both formats.</w:t>
+        <w:t>, for printing, sharing, and editing in Microsoft 365). The Word versions have the same content, with a table of contents on the longer guides, and link to each other. Each is listed below with both formats.</w:t>
       </w:r>
     </w:p>
     <w:p>
@@ -2385,13 +2357,7 @@
               <w:rPr>
                 <w:sz w:val="19"/>
               </w:rPr>
-              <w:t xml:space="preserve"> </w:t>
-            </w:r>
-            <w:r>
-              <w:rPr>
-                <w:sz w:val="19"/>
-              </w:rPr>
-              <w:t>step, an HR plugins spotlight, and a knowledge check</w:t>
+              <w:t xml:space="preserve"> step, an HR plugins spotlight, and a knowledge check</w:t>
             </w:r>
           </w:p>
         </w:tc>
@@ -3791,75 +3757,6 @@
                 <w:rPr>
                   <w:rStyle w:val="Hyperlink"/>
                 </w:rPr>
-                <w:t>sample-knowledge/</w:t>
-              </w:r>
-            </w:hyperlink>
-          </w:p>
-        </w:tc>
-        <w:tc>
-          <w:tcPr>
-            <w:tcW w:w="0" w:type="auto"/>
-          </w:tcPr>
-          <w:p>
-            <w:pPr>
-              <w:pStyle w:val="Compact"/>
-              <w:spacing w:before="20" w:after="20"/>
-            </w:pPr>
-            <w:r>
-              <w:rPr>
-                <w:sz w:val="19"/>
-              </w:rPr>
-              <w:t>folder</w:t>
-            </w:r>
-          </w:p>
-        </w:tc>
-        <w:tc>
-          <w:tcPr>
-            <w:tcW w:w="0" w:type="auto"/>
-          </w:tcPr>
-          <w:p>
-            <w:pPr>
-              <w:pStyle w:val="Compact"/>
-              <w:spacing w:before="20" w:after="20"/>
-            </w:pPr>
-            <w:r>
-              <w:rPr>
-                <w:sz w:val="19"/>
-              </w:rPr>
-              <w:t xml:space="preserve">Fictional </w:t>
-            </w:r>
-            <w:r>
-              <w:rPr>
-                <w:i/>
-                <w:iCs/>
-                <w:sz w:val="19"/>
-              </w:rPr>
-              <w:t>Zava</w:t>
-            </w:r>
-            <w:r>
-              <w:rPr>
-                <w:sz w:val="19"/>
-              </w:rPr>
-              <w:t xml:space="preserve"> HR data: the Word/Excel files used in the exercises, plus their editable .md/.csv sources</w:t>
-            </w:r>
-          </w:p>
-        </w:tc>
-      </w:tr>
-      <w:tr>
-        <w:tc>
-          <w:tcPr>
-            <w:tcW w:w="0" w:type="auto"/>
-          </w:tcPr>
-          <w:p>
-            <w:pPr>
-              <w:pStyle w:val="Compact"/>
-              <w:spacing w:before="20" w:after="20"/>
-            </w:pPr>
-            <w:hyperlink r:id="rId51">
-              <w:r>
-                <w:rPr>
-                  <w:rStyle w:val="Hyperlink"/>
-                </w:rPr>
                 <w:t>zava-sample-knowledge.zip</w:t>
               </w:r>
             </w:hyperlink>
@@ -3895,7 +3792,21 @@
               <w:rPr>
                 <w:sz w:val="19"/>
               </w:rPr>
-              <w:t>The six Word and Excel sample files, zipped for easy upload to OneDrive</w:t>
+              <w:t xml:space="preserve">Fictional </w:t>
+            </w:r>
+            <w:r>
+              <w:rPr>
+                <w:i/>
+                <w:iCs/>
+                <w:sz w:val="19"/>
+              </w:rPr>
+              <w:t>Zava</w:t>
+            </w:r>
+            <w:r>
+              <w:rPr>
+                <w:sz w:val="19"/>
+              </w:rPr>
+              <w:t xml:space="preserve"> HR data: the six Word and Excel files used in the exercises, zipped for easy upload to OneDrive</w:t>
             </w:r>
           </w:p>
         </w:tc>
@@ -3910,7 +3821,7 @@
               <w:pStyle w:val="Compact"/>
               <w:spacing w:before="20" w:after="20"/>
             </w:pPr>
-            <w:hyperlink r:id="rId52">
+            <w:hyperlink r:id="rId51">
               <w:r>
                 <w:rPr>
                   <w:rStyle w:val="Hyperlink"/>
@@ -3950,7 +3861,7 @@
               <w:rPr>
                 <w:sz w:val="19"/>
               </w:rPr>
-              <w:t xml:space="preserve">Scripts that build the deck, Word copies, quick-reference card, and sample files, plus the kit checks. See </w:t>
+              <w:t xml:space="preserve">Scripts that build the deck, Word copies, quick-reference card, and sample files, plus the kit checks and the sample data's editable sources. See </w:t>
             </w:r>
             <w:hyperlink w:anchor="how-to-build-maintainers">
               <w:r>
@@ -3970,7 +3881,6 @@
       </w:pPr>
       <w:bookmarkStart w:id="13" w:name="sample-data-all-fictional--no-real-pii"/>
       <w:r>
-        <w:lastRenderedPageBreak/>
         <w:t>Sample data (all fictional — no real PII)</w:t>
       </w:r>
     </w:p>
@@ -3989,12 +3899,9 @@
         <w:t>Word and Excel</w:t>
       </w:r>
       <w:r>
-        <w:t xml:space="preserve"> sample files. They work in both Cowork and Agent Builder</w:t>
-      </w:r>
-      <w:r>
-        <w:t xml:space="preserve"> (which doesn't accept .md or .csv). Download </w:t>
-      </w:r>
-      <w:hyperlink r:id="rId53">
+        <w:t xml:space="preserve"> sample files. They work in both Cowork and Agent Builder (which doesn't accept .md or .csv). Download </w:t>
+      </w:r>
+      <w:hyperlink r:id="rId52">
         <w:r>
           <w:rPr>
             <w:rStyle w:val="Hyperlink"/>
@@ -4005,7 +3912,11 @@
         </w:r>
       </w:hyperlink>
       <w:r>
-        <w:t xml:space="preserve"> to get all six at once, then upload them to a folder named </w:t>
+        <w:t xml:space="preserve"> to get all six at once, then upload </w:t>
+      </w:r>
+      <w:r>
+        <w:lastRenderedPageBreak/>
+        <w:t xml:space="preserve">them to a folder named </w:t>
       </w:r>
       <w:r>
         <w:rPr>
@@ -4059,7 +3970,7 @@
         <w:tblLook w:val="0020" w:firstRow="1" w:lastRow="0" w:firstColumn="0" w:lastColumn="0" w:noHBand="0" w:noVBand="0"/>
       </w:tblPr>
       <w:tblGrid>
-        <w:gridCol w:w="3366"/>
+        <w:gridCol w:w="3063"/>
         <w:gridCol w:w="4692"/>
         <w:gridCol w:w="1646"/>
       </w:tblGrid>
@@ -4083,7 +3994,7 @@
                 <w:b/>
                 <w:sz w:val="19"/>
               </w:rPr>
-              <w:t>File</w:t>
+              <w:t>File (in the zip)</w:t>
             </w:r>
           </w:p>
         </w:tc>
@@ -4136,14 +4047,12 @@
               <w:pStyle w:val="Compact"/>
               <w:spacing w:before="20" w:after="20"/>
             </w:pPr>
-            <w:hyperlink r:id="rId54">
-              <w:r>
-                <w:rPr>
-                  <w:rStyle w:val="Hyperlink"/>
-                </w:rPr>
-                <w:t>employee-handbook-excerpt.docx</w:t>
-              </w:r>
-            </w:hyperlink>
+            <w:r>
+              <w:rPr>
+                <w:sz w:val="19"/>
+              </w:rPr>
+              <w:t>employee-handbook-excerpt.docx</w:t>
+            </w:r>
           </w:p>
         </w:tc>
         <w:tc>
@@ -4191,14 +4100,12 @@
               <w:pStyle w:val="Compact"/>
               <w:spacing w:before="20" w:after="20"/>
             </w:pPr>
-            <w:hyperlink r:id="rId55">
-              <w:r>
-                <w:rPr>
-                  <w:rStyle w:val="Hyperlink"/>
-                </w:rPr>
-                <w:t>benefits-summary.docx</w:t>
-              </w:r>
-            </w:hyperlink>
+            <w:r>
+              <w:rPr>
+                <w:sz w:val="19"/>
+              </w:rPr>
+              <w:t>benefits-summary.docx</w:t>
+            </w:r>
           </w:p>
         </w:tc>
         <w:tc>
@@ -4246,14 +4153,12 @@
               <w:pStyle w:val="Compact"/>
               <w:spacing w:before="20" w:after="20"/>
             </w:pPr>
-            <w:hyperlink r:id="rId56">
-              <w:r>
-                <w:rPr>
-                  <w:rStyle w:val="Hyperlink"/>
-                </w:rPr>
-                <w:t>onboarding-checklist.docx</w:t>
-              </w:r>
-            </w:hyperlink>
+            <w:r>
+              <w:rPr>
+                <w:sz w:val="19"/>
+              </w:rPr>
+              <w:t>onboarding-checklist.docx</w:t>
+            </w:r>
           </w:p>
         </w:tc>
         <w:tc>
@@ -4301,14 +4206,12 @@
               <w:pStyle w:val="Compact"/>
               <w:spacing w:before="20" w:after="20"/>
             </w:pPr>
-            <w:hyperlink r:id="rId57">
-              <w:r>
-                <w:rPr>
-                  <w:rStyle w:val="Hyperlink"/>
-                </w:rPr>
-                <w:t>job-description-sample.docx</w:t>
-              </w:r>
-            </w:hyperlink>
+            <w:r>
+              <w:rPr>
+                <w:sz w:val="19"/>
+              </w:rPr>
+              <w:t>job-description-sample.docx</w:t>
+            </w:r>
           </w:p>
         </w:tc>
         <w:tc>
@@ -4356,14 +4259,12 @@
               <w:pStyle w:val="Compact"/>
               <w:spacing w:before="20" w:after="20"/>
             </w:pPr>
-            <w:hyperlink r:id="rId58">
-              <w:r>
-                <w:rPr>
-                  <w:rStyle w:val="Hyperlink"/>
-                </w:rPr>
-                <w:t>employee-roster-sample.xlsx</w:t>
-              </w:r>
-            </w:hyperlink>
+            <w:r>
+              <w:rPr>
+                <w:sz w:val="19"/>
+              </w:rPr>
+              <w:t>employee-roster-sample.xlsx</w:t>
+            </w:r>
           </w:p>
         </w:tc>
         <w:tc>
@@ -4411,14 +4312,12 @@
               <w:pStyle w:val="Compact"/>
               <w:spacing w:before="20" w:after="20"/>
             </w:pPr>
-            <w:hyperlink r:id="rId59">
-              <w:r>
-                <w:rPr>
-                  <w:rStyle w:val="Hyperlink"/>
-                </w:rPr>
-                <w:t>hr-tickets-sample.xlsx</w:t>
-              </w:r>
-            </w:hyperlink>
+            <w:r>
+              <w:rPr>
+                <w:sz w:val="19"/>
+              </w:rPr>
+              <w:t>hr-tickets-sample.xlsx</w:t>
+            </w:r>
           </w:p>
         </w:tc>
         <w:tc>
@@ -4495,23 +4394,25 @@
       <w:r>
         <w:t xml:space="preserve"> files in </w:t>
       </w:r>
+      <w:hyperlink r:id="rId53">
+        <w:r>
+          <w:rPr>
+            <w:rStyle w:val="Hyperlink"/>
+          </w:rPr>
+          <w:t>tools/zava-sample-data/</w:t>
+        </w:r>
+      </w:hyperlink>
+      <w:r>
+        <w:t xml:space="preserve"> are the editable sources the Word and Excel files are generated from. Attendees don't need them, and they aren't in the zip. If you change one, run </w:t>
+      </w:r>
       <w:r>
         <w:rPr>
           <w:rStyle w:val="VerbatimChar"/>
         </w:rPr>
-        <w:t>sample-knowledge/</w:t>
-      </w:r>
-      <w:r>
-        <w:t xml:space="preserve"> are the editable sources the Word and Excel files are generated from. Attendees don't need them, and they aren't in the zip. If you change one, run </w:t>
-      </w:r>
-      <w:r>
-        <w:rPr>
-          <w:rStyle w:val="VerbatimChar"/>
-        </w:rPr>
         <w:t>python tools\make_office_samples.py</w:t>
       </w:r>
       <w:r>
-        <w:t xml:space="preserve"> to regenerate the Word and Excel copies and the zip (see </w:t>
+        <w:t xml:space="preserve"> to regenerate the zip (see </w:t>
       </w:r>
       <w:hyperlink w:anchor="how-to-build-maintainers">
         <w:r>
@@ -4530,7 +4431,7 @@
         <w:pStyle w:val="Heading2"/>
       </w:pPr>
       <w:bookmarkStart w:id="14" w:name="how-to-use-this-kit"/>
-      <w:bookmarkStart w:id="15" w:name="_Toc241771633"/>
+      <w:bookmarkStart w:id="15" w:name="_Toc241773781"/>
       <w:bookmarkEnd w:id="11"/>
       <w:bookmarkEnd w:id="13"/>
       <w:r>
@@ -4556,7 +4457,7 @@
       <w:r>
         <w:t xml:space="preserve"> walk the customer through </w:t>
       </w:r>
-      <w:hyperlink r:id="rId60">
+      <w:hyperlink r:id="rId54">
         <w:r>
           <w:rPr>
             <w:rStyle w:val="Hyperlink"/>
@@ -4586,7 +4487,7 @@
       <w:r>
         <w:t xml:space="preserve"> follow the </w:t>
       </w:r>
-      <w:hyperlink r:id="rId61">
+      <w:hyperlink r:id="rId55">
         <w:r>
           <w:rPr>
             <w:rStyle w:val="Hyperlink"/>
@@ -4597,7 +4498,7 @@
       <w:r>
         <w:t xml:space="preserve">. Provision accounts, estimate cost, and load </w:t>
       </w:r>
-      <w:hyperlink r:id="rId62">
+      <w:hyperlink r:id="rId56">
         <w:r>
           <w:rPr>
             <w:rStyle w:val="Hyperlink"/>
@@ -4627,7 +4528,7 @@
       <w:r>
         <w:t xml:space="preserve"> read </w:t>
       </w:r>
-      <w:hyperlink r:id="rId63">
+      <w:hyperlink r:id="rId57">
         <w:r>
           <w:rPr>
             <w:rStyle w:val="Hyperlink"/>
@@ -4638,7 +4539,7 @@
       <w:r>
         <w:t xml:space="preserve">, do a full dry run against the </w:t>
       </w:r>
-      <w:hyperlink r:id="rId64">
+      <w:hyperlink r:id="rId58">
         <w:r>
           <w:rPr>
             <w:rStyle w:val="Hyperlink"/>
@@ -4649,7 +4550,7 @@
       <w:r>
         <w:t xml:space="preserve">, and present with </w:t>
       </w:r>
-      <w:hyperlink r:id="rId65">
+      <w:hyperlink r:id="rId59">
         <w:r>
           <w:rPr>
             <w:rStyle w:val="Hyperlink"/>
@@ -4679,7 +4580,7 @@
       <w:r>
         <w:t xml:space="preserve"> on the day, follow </w:t>
       </w:r>
-      <w:hyperlink r:id="rId66">
+      <w:hyperlink r:id="rId60">
         <w:r>
           <w:rPr>
             <w:rStyle w:val="Hyperlink"/>
@@ -4690,7 +4591,7 @@
       <w:r>
         <w:t xml:space="preserve"> start to finish, with the printed </w:t>
       </w:r>
-      <w:hyperlink r:id="rId67">
+      <w:hyperlink r:id="rId61">
         <w:r>
           <w:rPr>
             <w:rStyle w:val="Hyperlink"/>
@@ -4701,7 +4602,7 @@
       <w:r>
         <w:t xml:space="preserve"> and the </w:t>
       </w:r>
-      <w:hyperlink r:id="rId68">
+      <w:hyperlink r:id="rId62">
         <w:r>
           <w:rPr>
             <w:rStyle w:val="Hyperlink"/>
@@ -4731,7 +4632,7 @@
       <w:r>
         <w:t xml:space="preserve"> send </w:t>
       </w:r>
-      <w:hyperlink r:id="rId69">
+      <w:hyperlink r:id="rId63">
         <w:r>
           <w:rPr>
             <w:rStyle w:val="Hyperlink"/>
@@ -4787,7 +4688,7 @@
         <w:pStyle w:val="Heading2"/>
       </w:pPr>
       <w:bookmarkStart w:id="16" w:name="how-to-build-maintainers"/>
-      <w:bookmarkStart w:id="17" w:name="_Toc241771634"/>
+      <w:bookmarkStart w:id="17" w:name="_Toc241773782"/>
       <w:bookmarkEnd w:id="14"/>
       <w:r>
         <w:t>How to build (maintainers)</w:t>
@@ -4799,12 +4700,9 @@
         <w:pStyle w:val="FirstParagraph"/>
       </w:pPr>
       <w:r>
-        <w:t xml:space="preserve">The instructor deck, the customer preview deck, the Word copies of the guides, the quick-reference </w:t>
-      </w:r>
-      <w:r>
-        <w:t xml:space="preserve">card, and the sample Word/Excel files and zip are all generated by the scripts in </w:t>
-      </w:r>
-      <w:hyperlink r:id="rId70">
+        <w:t xml:space="preserve">The instructor deck, the customer preview deck, the Word copies of the guides, the quick-reference card, and the sample-data zip are all generated by the scripts in </w:t>
+      </w:r>
+      <w:hyperlink r:id="rId64">
         <w:r>
           <w:rPr>
             <w:rStyle w:val="Hyperlink"/>
@@ -4876,7 +4774,6 @@
           <w:b/>
           <w:bCs/>
         </w:rPr>
-        <w:lastRenderedPageBreak/>
         <w:t>Inputs and settings</w:t>
       </w:r>
       <w:r>
@@ -5008,24 +4905,39 @@
               <w:rPr>
                 <w:sz w:val="19"/>
               </w:rPr>
-              <w:t xml:space="preserve"> (git-ignored)</w:t>
-            </w:r>
-          </w:p>
-        </w:tc>
-        <w:tc>
-          <w:tcPr>
-            <w:tcW w:w="0" w:type="auto"/>
-          </w:tcPr>
-          <w:p>
-            <w:pPr>
-              <w:pStyle w:val="Compact"/>
-              <w:spacing w:before="20" w:after="20"/>
-            </w:pPr>
-            <w:r>
-              <w:rPr>
-                <w:sz w:val="19"/>
-              </w:rPr>
-              <w:t>The source PowerPoint template the deck is built from. It isn't in the repo; ask the kit maintainer for it.</w:t>
+              <w:t xml:space="preserve"> (git-</w:t>
+            </w:r>
+            <w:r>
+              <w:rPr>
+                <w:sz w:val="19"/>
+              </w:rPr>
+              <w:lastRenderedPageBreak/>
+              <w:t>ignored)</w:t>
+            </w:r>
+          </w:p>
+        </w:tc>
+        <w:tc>
+          <w:tcPr>
+            <w:tcW w:w="0" w:type="auto"/>
+          </w:tcPr>
+          <w:p>
+            <w:pPr>
+              <w:pStyle w:val="Compact"/>
+              <w:spacing w:before="20" w:after="20"/>
+            </w:pPr>
+            <w:r>
+              <w:rPr>
+                <w:sz w:val="19"/>
+              </w:rPr>
+              <w:lastRenderedPageBreak/>
+              <w:t xml:space="preserve">The source PowerPoint template the deck is built </w:t>
+            </w:r>
+            <w:r>
+              <w:rPr>
+                <w:sz w:val="19"/>
+              </w:rPr>
+              <w:lastRenderedPageBreak/>
+              <w:t>from. It isn't in the repo; ask the kit maintainer for it.</w:t>
             </w:r>
           </w:p>
         </w:tc>
@@ -5044,6 +4956,7 @@
               <w:rPr>
                 <w:rStyle w:val="VerbatimChar"/>
               </w:rPr>
+              <w:lastRenderedPageBreak/>
               <w:t>DECK_UI_SHOT</w:t>
             </w:r>
           </w:p>
@@ -5472,7 +5385,7 @@
         <w:rPr>
           <w:rStyle w:val="CommentTok"/>
         </w:rPr>
-        <w:t># sample .docx/.xlsx files and zava-sample-knowledge.zip</w:t>
+        <w:t># zava-sample-knowledge.zip (Word/Excel files built in .build)</w:t>
       </w:r>
       <w:r>
         <w:br/>
@@ -5792,7 +5705,7 @@
         <w:pStyle w:val="Heading2"/>
       </w:pPr>
       <w:bookmarkStart w:id="18" w:name="requirement-coverage"/>
-      <w:bookmarkStart w:id="19" w:name="_Toc241771635"/>
+      <w:bookmarkStart w:id="19" w:name="_Toc241773783"/>
       <w:bookmarkEnd w:id="16"/>
       <w:r>
         <w:t>Requirement coverage</w:t>
@@ -5808,10 +5721,7 @@
         </w:numPr>
       </w:pPr>
       <w:r>
-        <w:t>✅</w:t>
-      </w:r>
-      <w:r>
-        <w:t xml:space="preserve"> </w:t>
+        <w:t xml:space="preserve">✅ </w:t>
       </w:r>
       <w:r>
         <w:rPr>
@@ -5833,10 +5743,7 @@
         </w:numPr>
       </w:pPr>
       <w:r>
-        <w:t>✅</w:t>
-      </w:r>
-      <w:r>
-        <w:t xml:space="preserve"> </w:t>
+        <w:t xml:space="preserve">✅ </w:t>
       </w:r>
       <w:r>
         <w:rPr>
@@ -5858,10 +5765,7 @@
         </w:numPr>
       </w:pPr>
       <w:r>
-        <w:t>✅</w:t>
-      </w:r>
-      <w:r>
-        <w:t xml:space="preserve"> Sample knowledge, instructions, prompt library, settings &amp; models overview</w:t>
+        <w:t>✅ Sample knowledge, instructions, prompt library, settings &amp; models overview</w:t>
       </w:r>
     </w:p>
     <w:p>
@@ -5873,10 +5777,7 @@
         </w:numPr>
       </w:pPr>
       <w:r>
-        <w:t>✅</w:t>
-      </w:r>
-      <w:r>
-        <w:t xml:space="preserve"> Using </w:t>
+        <w:t xml:space="preserve">✅ Using </w:t>
       </w:r>
       <w:r>
         <w:rPr>
@@ -5898,10 +5799,7 @@
         </w:numPr>
       </w:pPr>
       <w:r>
-        <w:t>✅</w:t>
-      </w:r>
-      <w:r>
-        <w:t xml:space="preserve"> An </w:t>
+        <w:t xml:space="preserve">✅ An </w:t>
       </w:r>
       <w:r>
         <w:rPr>
@@ -5933,11 +5831,7 @@
         </w:numPr>
       </w:pPr>
       <w:r>
-        <w:lastRenderedPageBreak/>
-        <w:t>✅</w:t>
-      </w:r>
-      <w:r>
-        <w:t xml:space="preserve"> Creating at least one </w:t>
+        <w:t xml:space="preserve">✅ Creating at least one </w:t>
       </w:r>
       <w:r>
         <w:rPr>
@@ -5969,10 +5863,8 @@
         </w:numPr>
       </w:pPr>
       <w:r>
-        <w:t>✅</w:t>
-      </w:r>
-      <w:r>
-        <w:t xml:space="preserve"> Using the </w:t>
+        <w:lastRenderedPageBreak/>
+        <w:t xml:space="preserve">✅ Using the </w:t>
       </w:r>
       <w:r>
         <w:rPr>
@@ -6014,10 +5906,7 @@
         </w:numPr>
       </w:pPr>
       <w:r>
-        <w:t>✅</w:t>
-      </w:r>
-      <w:r>
-        <w:t xml:space="preserve"> Using </w:t>
+        <w:t xml:space="preserve">✅ Using </w:t>
       </w:r>
       <w:r>
         <w:rPr>
@@ -6039,10 +5928,7 @@
         </w:numPr>
       </w:pPr>
       <w:r>
-        <w:t>✅</w:t>
-      </w:r>
-      <w:r>
-        <w:t xml:space="preserve"> A </w:t>
+        <w:t xml:space="preserve">✅ A </w:t>
       </w:r>
       <w:r>
         <w:rPr>
@@ -6084,10 +5970,7 @@
         </w:numPr>
       </w:pPr>
       <w:r>
-        <w:t>✅</w:t>
-      </w:r>
-      <w:r>
-        <w:t xml:space="preserve"> Checking what a Cowork task </w:t>
+        <w:t xml:space="preserve">✅ Checking what a Cowork task </w:t>
       </w:r>
       <w:r>
         <w:rPr>
@@ -6120,10 +6003,7 @@
         </w:numPr>
       </w:pPr>
       <w:r>
-        <w:t>✅</w:t>
-      </w:r>
-      <w:r>
-        <w:t xml:space="preserve"> A </w:t>
+        <w:t xml:space="preserve">✅ A </w:t>
       </w:r>
       <w:r>
         <w:rPr>
@@ -6145,10 +6025,7 @@
         </w:numPr>
       </w:pPr>
       <w:r>
-        <w:t>✅</w:t>
-      </w:r>
-      <w:r>
-        <w:t xml:space="preserve"> A </w:t>
+        <w:t xml:space="preserve">✅ A </w:t>
       </w:r>
       <w:r>
         <w:rPr>
@@ -6158,10 +6035,7 @@
         <w:t>customer preview deck</w:t>
       </w:r>
       <w:r>
-        <w:t xml:space="preserve"> </w:t>
-      </w:r>
-      <w:r>
-        <w:t>to present the training to a prospective customer and gather feedback before delivery</w:t>
+        <w:t xml:space="preserve"> to present the training to a prospective customer and gather feedback before delivery</w:t>
       </w:r>
     </w:p>
     <w:p>
@@ -6173,10 +6047,7 @@
         </w:numPr>
       </w:pPr>
       <w:r>
-        <w:t>✅</w:t>
-      </w:r>
-      <w:r>
-        <w:t xml:space="preserve"> A talk-only </w:t>
+        <w:t xml:space="preserve">✅ A talk-only </w:t>
       </w:r>
       <w:r>
         <w:rPr>
@@ -6208,10 +6079,7 @@
         </w:numPr>
       </w:pPr>
       <w:r>
-        <w:t>✅</w:t>
-      </w:r>
-      <w:r>
-        <w:t xml:space="preserve"> Every exercise introduced with a </w:t>
+        <w:t xml:space="preserve">✅ Every exercise introduced with a </w:t>
       </w:r>
       <w:r>
         <w:rPr>
@@ -6233,10 +6101,7 @@
         </w:numPr>
       </w:pPr>
       <w:r>
-        <w:t>✅</w:t>
-      </w:r>
-      <w:r>
-        <w:t xml:space="preserve"> </w:t>
+        <w:t xml:space="preserve">✅ </w:t>
       </w:r>
       <w:r>
         <w:rPr>
@@ -6315,15 +6180,12 @@
         </w:numPr>
       </w:pPr>
       <w:r>
-        <w:t>✅</w:t>
-      </w:r>
-      <w:r>
-        <w:t xml:space="preserve"> Broad HR-lifecycle focus: onboarding, policy/benefits, recruiting, communications, reporting</w:t>
+        <w:t>✅ Broad HR-lifecycle focus: onboarding, policy/benefits, recruiting, communications, reporting</w:t>
       </w:r>
     </w:p>
     <w:p>
       <w:r>
-        <w:pict w14:anchorId="69DF091A">
+        <w:pict w14:anchorId="44306101">
           <v:rect id="_x0000_i1025" style="width:0;height:1.5pt" o:hralign="center" o:hrstd="t" o:hr="t"/>
         </w:pict>
       </w:r>
@@ -6339,7 +6201,7 @@
         </w:rPr>
         <w:t xml:space="preserve">Sample content depicts the fictional company "Zava" and is for training purposes only. Divider illustrations: </w:t>
       </w:r>
-      <w:hyperlink r:id="rId71">
+      <w:hyperlink r:id="rId65">
         <w:r>
           <w:rPr>
             <w:rStyle w:val="Hyperlink"/>
@@ -6360,7 +6222,7 @@
       <w:bookmarkEnd w:id="18"/>
     </w:p>
     <w:sectPr>
-      <w:footerReference w:type="default" r:id="rId72"/>
+      <w:footerReference w:type="default" r:id="rId66"/>
       <w:footnotePr>
         <w:numRestart w:val="eachSect"/>
       </w:footnotePr>
@@ -6480,7 +6342,7 @@
   <w:abstractNum w:abstractNumId="0" w15:restartNumberingAfterBreak="0">
     <w:nsid w:val="0000A990"/>
     <w:multiLevelType w:val="multilevel"/>
-    <w:tmpl w:val="C37C079E"/>
+    <w:tmpl w:val="68064BD6"/>
     <w:lvl w:ilvl="0">
       <w:numFmt w:val="bullet"/>
       <w:lvlText w:val=" "/>
@@ -6557,7 +6419,7 @@
   <w:abstractNum w:abstractNumId="1" w15:restartNumberingAfterBreak="0">
     <w:nsid w:val="0000A991"/>
     <w:multiLevelType w:val="multilevel"/>
-    <w:tmpl w:val="368014C8"/>
+    <w:tmpl w:val="42A88FAE"/>
     <w:lvl w:ilvl="0">
       <w:numFmt w:val="bullet"/>
       <w:lvlText w:val=""/>
@@ -6661,7 +6523,7 @@
   <w:abstractNum w:abstractNumId="2" w15:restartNumberingAfterBreak="0">
     <w:nsid w:val="00A99411"/>
     <w:multiLevelType w:val="multilevel"/>
-    <w:tmpl w:val="671AC344"/>
+    <w:tmpl w:val="5DF85E10"/>
     <w:lvl w:ilvl="0">
       <w:start w:val="1"/>
       <w:numFmt w:val="decimal"/>
@@ -6744,10 +6606,10 @@
       </w:pPr>
     </w:lvl>
   </w:abstractNum>
-  <w:num w:numId="1" w16cid:durableId="1017124772">
+  <w:num w:numId="1" w16cid:durableId="446393440">
     <w:abstractNumId w:val="0"/>
   </w:num>
-  <w:num w:numId="2" w16cid:durableId="1225337758">
+  <w:num w:numId="2" w16cid:durableId="665324680">
     <w:abstractNumId w:val="2"/>
     <w:lvlOverride w:ilvl="0">
       <w:startOverride w:val="1"/>
@@ -6777,10 +6639,10 @@
       <w:startOverride w:val="1"/>
     </w:lvlOverride>
   </w:num>
-  <w:num w:numId="3" w16cid:durableId="1195194277">
+  <w:num w:numId="3" w16cid:durableId="668219264">
     <w:abstractNumId w:val="1"/>
   </w:num>
-  <w:num w:numId="4" w16cid:durableId="890069596">
+  <w:num w:numId="4" w16cid:durableId="1055242">
     <w:abstractNumId w:val="2"/>
     <w:lvlOverride w:ilvl="0">
       <w:startOverride w:val="1"/>
@@ -6810,7 +6672,7 @@
       <w:startOverride w:val="1"/>
     </w:lvlOverride>
   </w:num>
-  <w:num w:numId="5" w16cid:durableId="1062867594">
+  <w:num w:numId="5" w16cid:durableId="524101539">
     <w:abstractNumId w:val="1"/>
   </w:num>
 </w:numbering>
@@ -8061,7 +7923,7 @@
     <w:next w:val="Normal"/>
     <w:autoRedefine/>
     <w:uiPriority w:val="39"/>
-    <w:rsid w:val="00162686"/>
+    <w:rsid w:val="005C1298"/>
     <w:pPr>
       <w:spacing w:after="100"/>
     </w:pPr>
@@ -8072,7 +7934,7 @@
     <w:next w:val="Normal"/>
     <w:autoRedefine/>
     <w:uiPriority w:val="39"/>
-    <w:rsid w:val="00162686"/>
+    <w:rsid w:val="005C1298"/>
     <w:pPr>
       <w:spacing w:after="100"/>
       <w:ind w:left="210"/>
@@ -8082,7 +7944,7 @@
     <w:name w:val="header"/>
     <w:basedOn w:val="Normal"/>
     <w:link w:val="HeaderChar"/>
-    <w:rsid w:val="00162686"/>
+    <w:rsid w:val="005C1298"/>
     <w:pPr>
       <w:tabs>
         <w:tab w:val="center" w:pos="4513"/>
@@ -8095,7 +7957,7 @@
     <w:name w:val="Header Char"/>
     <w:basedOn w:val="DefaultParagraphFont"/>
     <w:link w:val="Header"/>
-    <w:rsid w:val="00162686"/>
+    <w:rsid w:val="005C1298"/>
     <w:rPr>
       <w:rFonts w:ascii="Segoe UI" w:eastAsia="Segoe UI" w:hAnsi="Segoe UI" w:cs="Segoe UI"/>
       <w:color w:val="242424"/>
@@ -8106,7 +7968,7 @@
     <w:name w:val="footer"/>
     <w:basedOn w:val="Normal"/>
     <w:link w:val="FooterChar"/>
-    <w:rsid w:val="00162686"/>
+    <w:rsid w:val="005C1298"/>
     <w:pPr>
       <w:tabs>
         <w:tab w:val="center" w:pos="4513"/>
@@ -8119,7 +7981,7 @@
     <w:name w:val="Footer Char"/>
     <w:basedOn w:val="DefaultParagraphFont"/>
     <w:link w:val="Footer"/>
-    <w:rsid w:val="00162686"/>
+    <w:rsid w:val="005C1298"/>
     <w:rPr>
       <w:rFonts w:ascii="Segoe UI" w:eastAsia="Segoe UI" w:hAnsi="Segoe UI" w:cs="Segoe UI"/>
       <w:color w:val="242424"/>

</xml_diff>

<commit_message>
Agent Host changes for agents/add-folder-for-sample-data-zip
</commit_message>
<xml_diff>
--- a/README.docx
+++ b/README.docx
@@ -10,7 +10,7 @@
           <w:sz w:val="21"/>
           <w:szCs w:val="24"/>
         </w:rPr>
-        <w:id w:val="1706060412"/>
+        <w:id w:val="-1980302248"/>
         <w:docPartObj>
           <w:docPartGallery w:val="Table of Contents"/>
           <w:docPartUnique/>
@@ -51,7 +51,7 @@
           <w:r>
             <w:fldChar w:fldCharType="separate"/>
           </w:r>
-          <w:hyperlink w:anchor="_Toc241754207" w:history="1">
+          <w:hyperlink w:anchor="_Toc241858843" w:history="1">
             <w:r>
               <w:rPr>
                 <w:rStyle w:val="Hyperlink"/>
@@ -78,7 +78,7 @@
                 <w:noProof/>
                 <w:webHidden/>
               </w:rPr>
-              <w:instrText xml:space="preserve"> PAGEREF _Toc241754207 \h </w:instrText>
+              <w:instrText xml:space="preserve"> PAGEREF _Toc241858843 \h </w:instrText>
             </w:r>
             <w:r>
               <w:rPr>
@@ -125,7 +125,7 @@
               <w14:ligatures w14:val="standardContextual"/>
             </w:rPr>
           </w:pPr>
-          <w:hyperlink w:anchor="_Toc241754208" w:history="1">
+          <w:hyperlink w:anchor="_Toc241858844" w:history="1">
             <w:r>
               <w:rPr>
                 <w:rStyle w:val="Hyperlink"/>
@@ -152,7 +152,7 @@
                 <w:noProof/>
                 <w:webHidden/>
               </w:rPr>
-              <w:instrText xml:space="preserve"> PAGEREF _Toc241754208 \h </w:instrText>
+              <w:instrText xml:space="preserve"> PAGEREF _Toc241858844 \h </w:instrText>
             </w:r>
             <w:r>
               <w:rPr>
@@ -199,7 +199,7 @@
               <w14:ligatures w14:val="standardContextual"/>
             </w:rPr>
           </w:pPr>
-          <w:hyperlink w:anchor="_Toc241754209" w:history="1">
+          <w:hyperlink w:anchor="_Toc241858845" w:history="1">
             <w:r>
               <w:rPr>
                 <w:rStyle w:val="Hyperlink"/>
@@ -226,7 +226,7 @@
                 <w:noProof/>
                 <w:webHidden/>
               </w:rPr>
-              <w:instrText xml:space="preserve"> PAGEREF _Toc241754209 \h </w:instrText>
+              <w:instrText xml:space="preserve"> PAGEREF _Toc241858845 \h </w:instrText>
             </w:r>
             <w:r>
               <w:rPr>
@@ -273,7 +273,7 @@
               <w14:ligatures w14:val="standardContextual"/>
             </w:rPr>
           </w:pPr>
-          <w:hyperlink w:anchor="_Toc241754210" w:history="1">
+          <w:hyperlink w:anchor="_Toc241858846" w:history="1">
             <w:r>
               <w:rPr>
                 <w:rStyle w:val="Hyperlink"/>
@@ -300,7 +300,7 @@
                 <w:noProof/>
                 <w:webHidden/>
               </w:rPr>
-              <w:instrText xml:space="preserve"> PAGEREF _Toc241754210 \h </w:instrText>
+              <w:instrText xml:space="preserve"> PAGEREF _Toc241858846 \h </w:instrText>
             </w:r>
             <w:r>
               <w:rPr>
@@ -347,7 +347,7 @@
               <w14:ligatures w14:val="standardContextual"/>
             </w:rPr>
           </w:pPr>
-          <w:hyperlink w:anchor="_Toc241754211" w:history="1">
+          <w:hyperlink w:anchor="_Toc241858847" w:history="1">
             <w:r>
               <w:rPr>
                 <w:rStyle w:val="Hyperlink"/>
@@ -374,7 +374,7 @@
                 <w:noProof/>
                 <w:webHidden/>
               </w:rPr>
-              <w:instrText xml:space="preserve"> PAGEREF _Toc241754211 \h </w:instrText>
+              <w:instrText xml:space="preserve"> PAGEREF _Toc241858847 \h </w:instrText>
             </w:r>
             <w:r>
               <w:rPr>
@@ -421,7 +421,7 @@
               <w14:ligatures w14:val="standardContextual"/>
             </w:rPr>
           </w:pPr>
-          <w:hyperlink w:anchor="_Toc241754212" w:history="1">
+          <w:hyperlink w:anchor="_Toc241858848" w:history="1">
             <w:r>
               <w:rPr>
                 <w:rStyle w:val="Hyperlink"/>
@@ -448,7 +448,7 @@
                 <w:noProof/>
                 <w:webHidden/>
               </w:rPr>
-              <w:instrText xml:space="preserve"> PAGEREF _Toc241754212 \h </w:instrText>
+              <w:instrText xml:space="preserve"> PAGEREF _Toc241858848 \h </w:instrText>
             </w:r>
             <w:r>
               <w:rPr>
@@ -495,7 +495,7 @@
               <w14:ligatures w14:val="standardContextual"/>
             </w:rPr>
           </w:pPr>
-          <w:hyperlink w:anchor="_Toc241754213" w:history="1">
+          <w:hyperlink w:anchor="_Toc241858849" w:history="1">
             <w:r>
               <w:rPr>
                 <w:rStyle w:val="Hyperlink"/>
@@ -522,7 +522,7 @@
                 <w:noProof/>
                 <w:webHidden/>
               </w:rPr>
-              <w:instrText xml:space="preserve"> PAGEREF _Toc241754213 \h </w:instrText>
+              <w:instrText xml:space="preserve"> PAGEREF _Toc241858849 \h </w:instrText>
             </w:r>
             <w:r>
               <w:rPr>
@@ -569,7 +569,7 @@
               <w14:ligatures w14:val="standardContextual"/>
             </w:rPr>
           </w:pPr>
-          <w:hyperlink w:anchor="_Toc241754214" w:history="1">
+          <w:hyperlink w:anchor="_Toc241858850" w:history="1">
             <w:r>
               <w:rPr>
                 <w:rStyle w:val="Hyperlink"/>
@@ -596,7 +596,7 @@
                 <w:noProof/>
                 <w:webHidden/>
               </w:rPr>
-              <w:instrText xml:space="preserve"> PAGEREF _Toc241754214 \h </w:instrText>
+              <w:instrText xml:space="preserve"> PAGEREF _Toc241858850 \h </w:instrText>
             </w:r>
             <w:r>
               <w:rPr>
@@ -639,7 +639,7 @@
         <w:pStyle w:val="Heading1"/>
       </w:pPr>
       <w:bookmarkStart w:id="0" w:name="Xa046f7e33c7391c4827688ee785cfee5a5aaa0a"/>
-      <w:bookmarkStart w:id="1" w:name="_Toc241754207"/>
+      <w:bookmarkStart w:id="1" w:name="_Toc241858843"/>
       <w:r>
         <w:t>Getting Things Done with Copilot Cowork for HR Tasks</w:t>
       </w:r>
@@ -775,7 +775,7 @@
         <w:pStyle w:val="Heading2"/>
       </w:pPr>
       <w:bookmarkStart w:id="3" w:name="learning-objectives"/>
-      <w:bookmarkStart w:id="4" w:name="_Toc241754208"/>
+      <w:bookmarkStart w:id="4" w:name="_Toc241858844"/>
       <w:bookmarkEnd w:id="2"/>
       <w:r>
         <w:t>Learning objectives</w:t>
@@ -916,7 +916,7 @@
         <w:pStyle w:val="Heading2"/>
       </w:pPr>
       <w:bookmarkStart w:id="5" w:name="who-its-for"/>
-      <w:bookmarkStart w:id="6" w:name="_Toc241754209"/>
+      <w:bookmarkStart w:id="6" w:name="_Toc241858845"/>
       <w:bookmarkEnd w:id="3"/>
       <w:r>
         <w:t>Who it's for</w:t>
@@ -1061,7 +1061,7 @@
         <w:pStyle w:val="Heading2"/>
       </w:pPr>
       <w:bookmarkStart w:id="7" w:name="prerequisites"/>
-      <w:bookmarkStart w:id="8" w:name="_Toc241754210"/>
+      <w:bookmarkStart w:id="8" w:name="_Toc241858846"/>
       <w:bookmarkEnd w:id="5"/>
       <w:r>
         <w:t>Prerequisites</w:t>
@@ -1172,7 +1172,7 @@
         <w:pStyle w:val="Heading2"/>
       </w:pPr>
       <w:bookmarkStart w:id="9" w:name="agenda-240-minutes"/>
-      <w:bookmarkStart w:id="10" w:name="_Toc241754211"/>
+      <w:bookmarkStart w:id="10" w:name="_Toc241858847"/>
       <w:bookmarkEnd w:id="7"/>
       <w:r>
         <w:t>Agenda (240 minutes)</w:t>
@@ -1908,7 +1908,7 @@
         <w:pStyle w:val="Heading2"/>
       </w:pPr>
       <w:bookmarkStart w:id="11" w:name="whats-in-this-kit"/>
-      <w:bookmarkStart w:id="12" w:name="_Toc241754212"/>
+      <w:bookmarkStart w:id="12" w:name="_Toc241858848"/>
       <w:bookmarkEnd w:id="9"/>
       <w:r>
         <w:t>What's in this kit</w:t>
@@ -2020,9 +2020,9 @@
         <w:tblLook w:val="0020" w:firstRow="1" w:lastRow="0" w:firstColumn="0" w:lastColumn="0" w:noHBand="0" w:noVBand="0"/>
       </w:tblPr>
       <w:tblGrid>
-        <w:gridCol w:w="1868"/>
-        <w:gridCol w:w="1953"/>
-        <w:gridCol w:w="6151"/>
+        <w:gridCol w:w="1828"/>
+        <w:gridCol w:w="1904"/>
+        <w:gridCol w:w="6240"/>
       </w:tblGrid>
       <w:tr>
         <w:trPr>
@@ -2166,7 +2166,68 @@
               <w:pStyle w:val="Compact"/>
               <w:spacing w:before="20" w:after="20"/>
             </w:pPr>
+            <w:r>
+              <w:rPr>
+                <w:sz w:val="19"/>
+              </w:rPr>
+              <w:t>PROJECT-SUMMARY</w:t>
+            </w:r>
+          </w:p>
+        </w:tc>
+        <w:tc>
+          <w:tcPr>
+            <w:tcW w:w="0" w:type="auto"/>
+          </w:tcPr>
+          <w:p>
+            <w:pPr>
+              <w:pStyle w:val="Compact"/>
+              <w:spacing w:before="20" w:after="20"/>
+            </w:pPr>
             <w:hyperlink r:id="rId10">
+              <w:r>
+                <w:rPr>
+                  <w:rStyle w:val="Hyperlink"/>
+                </w:rPr>
+                <w:t>.md</w:t>
+              </w:r>
+            </w:hyperlink>
+            <w:r>
+              <w:rPr>
+                <w:sz w:val="19"/>
+              </w:rPr>
+              <w:t xml:space="preserve"> (maintainers only)</w:t>
+            </w:r>
+          </w:p>
+        </w:tc>
+        <w:tc>
+          <w:tcPr>
+            <w:tcW w:w="0" w:type="auto"/>
+          </w:tcPr>
+          <w:p>
+            <w:pPr>
+              <w:pStyle w:val="Compact"/>
+              <w:spacing w:before="20" w:after="20"/>
+            </w:pPr>
+            <w:r>
+              <w:rPr>
+                <w:sz w:val="19"/>
+              </w:rPr>
+              <w:t>Handoff notes: status, architecture, decisions, how to build and test, remaining work</w:t>
+            </w:r>
+          </w:p>
+        </w:tc>
+      </w:tr>
+      <w:tr>
+        <w:tc>
+          <w:tcPr>
+            <w:tcW w:w="0" w:type="auto"/>
+          </w:tcPr>
+          <w:p>
+            <w:pPr>
+              <w:pStyle w:val="Compact"/>
+              <w:spacing w:before="20" w:after="20"/>
+            </w:pPr>
+            <w:hyperlink r:id="rId11">
               <w:r>
                 <w:rPr>
                   <w:rStyle w:val="Hyperlink"/>
@@ -2238,7 +2299,7 @@
               <w:pStyle w:val="Compact"/>
               <w:spacing w:before="20" w:after="20"/>
             </w:pPr>
-            <w:hyperlink r:id="rId11">
+            <w:hyperlink r:id="rId12">
               <w:r>
                 <w:rPr>
                   <w:rStyle w:val="Hyperlink"/>
@@ -2252,7 +2313,7 @@
               </w:rPr>
               <w:t xml:space="preserve"> · </w:t>
             </w:r>
-            <w:hyperlink r:id="rId12">
+            <w:hyperlink r:id="rId13">
               <w:r>
                 <w:rPr>
                   <w:rStyle w:val="Hyperlink"/>
@@ -2307,7 +2368,7 @@
               <w:pStyle w:val="Compact"/>
               <w:spacing w:before="20" w:after="20"/>
             </w:pPr>
-            <w:hyperlink r:id="rId13">
+            <w:hyperlink r:id="rId14">
               <w:r>
                 <w:rPr>
                   <w:rStyle w:val="Hyperlink"/>
@@ -2321,7 +2382,7 @@
               </w:rPr>
               <w:t xml:space="preserve"> · </w:t>
             </w:r>
-            <w:hyperlink r:id="rId14">
+            <w:hyperlink r:id="rId15">
               <w:r>
                 <w:rPr>
                   <w:rStyle w:val="Hyperlink"/>
@@ -2376,7 +2437,7 @@
               <w:pStyle w:val="Compact"/>
               <w:spacing w:before="20" w:after="20"/>
             </w:pPr>
-            <w:hyperlink r:id="rId15">
+            <w:hyperlink r:id="rId16">
               <w:r>
                 <w:rPr>
                   <w:rStyle w:val="Hyperlink"/>
@@ -2390,7 +2451,7 @@
               </w:rPr>
               <w:t xml:space="preserve"> · </w:t>
             </w:r>
-            <w:hyperlink r:id="rId16">
+            <w:hyperlink r:id="rId17">
               <w:r>
                 <w:rPr>
                   <w:rStyle w:val="Hyperlink"/>
@@ -2445,7 +2506,7 @@
               <w:pStyle w:val="Compact"/>
               <w:spacing w:before="20" w:after="20"/>
             </w:pPr>
-            <w:hyperlink r:id="rId17">
+            <w:hyperlink r:id="rId18">
               <w:r>
                 <w:rPr>
                   <w:rStyle w:val="Hyperlink"/>
@@ -2459,7 +2520,7 @@
               </w:rPr>
               <w:t xml:space="preserve"> · </w:t>
             </w:r>
-            <w:hyperlink r:id="rId18">
+            <w:hyperlink r:id="rId19">
               <w:r>
                 <w:rPr>
                   <w:rStyle w:val="Hyperlink"/>
@@ -2514,7 +2575,7 @@
               <w:pStyle w:val="Compact"/>
               <w:spacing w:before="20" w:after="20"/>
             </w:pPr>
-            <w:hyperlink r:id="rId19">
+            <w:hyperlink r:id="rId20">
               <w:r>
                 <w:rPr>
                   <w:rStyle w:val="Hyperlink"/>
@@ -2528,7 +2589,7 @@
               </w:rPr>
               <w:t xml:space="preserve"> · </w:t>
             </w:r>
-            <w:hyperlink r:id="rId20">
+            <w:hyperlink r:id="rId21">
               <w:r>
                 <w:rPr>
                   <w:rStyle w:val="Hyperlink"/>
@@ -2566,7 +2627,7 @@
               <w:pStyle w:val="Compact"/>
               <w:spacing w:before="20" w:after="20"/>
             </w:pPr>
-            <w:hyperlink r:id="rId21">
+            <w:hyperlink r:id="rId22">
               <w:r>
                 <w:rPr>
                   <w:rStyle w:val="Hyperlink"/>
@@ -2638,7 +2699,7 @@
               <w:pStyle w:val="Compact"/>
               <w:spacing w:before="20" w:after="20"/>
             </w:pPr>
-            <w:hyperlink r:id="rId22">
+            <w:hyperlink r:id="rId23">
               <w:r>
                 <w:rPr>
                   <w:rStyle w:val="Hyperlink"/>
@@ -2652,7 +2713,7 @@
               </w:rPr>
               <w:t xml:space="preserve"> · </w:t>
             </w:r>
-            <w:hyperlink r:id="rId23">
+            <w:hyperlink r:id="rId24">
               <w:r>
                 <w:rPr>
                   <w:rStyle w:val="Hyperlink"/>
@@ -2694,6 +2755,7 @@
               <w:rPr>
                 <w:sz w:val="19"/>
               </w:rPr>
+              <w:lastRenderedPageBreak/>
               <w:t>reference/00-copilot-vs-cowork</w:t>
             </w:r>
           </w:p>
@@ -2707,7 +2769,7 @@
               <w:pStyle w:val="Compact"/>
               <w:spacing w:before="20" w:after="20"/>
             </w:pPr>
-            <w:hyperlink r:id="rId24">
+            <w:hyperlink r:id="rId25">
               <w:r>
                 <w:rPr>
                   <w:rStyle w:val="Hyperlink"/>
@@ -2721,7 +2783,7 @@
               </w:rPr>
               <w:t xml:space="preserve"> · </w:t>
             </w:r>
-            <w:hyperlink r:id="rId25">
+            <w:hyperlink r:id="rId26">
               <w:r>
                 <w:rPr>
                   <w:rStyle w:val="Hyperlink"/>
@@ -2763,7 +2825,6 @@
               <w:rPr>
                 <w:sz w:val="19"/>
               </w:rPr>
-              <w:lastRenderedPageBreak/>
               <w:t>reference/01-cowork-overview</w:t>
             </w:r>
           </w:p>
@@ -2777,7 +2838,7 @@
               <w:pStyle w:val="Compact"/>
               <w:spacing w:before="20" w:after="20"/>
             </w:pPr>
-            <w:hyperlink r:id="rId26">
+            <w:hyperlink r:id="rId27">
               <w:r>
                 <w:rPr>
                   <w:rStyle w:val="Hyperlink"/>
@@ -2791,7 +2852,7 @@
               </w:rPr>
               <w:t xml:space="preserve"> · </w:t>
             </w:r>
-            <w:hyperlink r:id="rId27">
+            <w:hyperlink r:id="rId28">
               <w:r>
                 <w:rPr>
                   <w:rStyle w:val="Hyperlink"/>
@@ -2846,7 +2907,7 @@
               <w:pStyle w:val="Compact"/>
               <w:spacing w:before="20" w:after="20"/>
             </w:pPr>
-            <w:hyperlink r:id="rId28">
+            <w:hyperlink r:id="rId29">
               <w:r>
                 <w:rPr>
                   <w:rStyle w:val="Hyperlink"/>
@@ -2860,7 +2921,7 @@
               </w:rPr>
               <w:t xml:space="preserve"> · </w:t>
             </w:r>
-            <w:hyperlink r:id="rId29">
+            <w:hyperlink r:id="rId30">
               <w:r>
                 <w:rPr>
                   <w:rStyle w:val="Hyperlink"/>
@@ -2915,7 +2976,7 @@
               <w:pStyle w:val="Compact"/>
               <w:spacing w:before="20" w:after="20"/>
             </w:pPr>
-            <w:hyperlink r:id="rId30">
+            <w:hyperlink r:id="rId31">
               <w:r>
                 <w:rPr>
                   <w:rStyle w:val="Hyperlink"/>
@@ -2929,7 +2990,7 @@
               </w:rPr>
               <w:t xml:space="preserve"> · </w:t>
             </w:r>
-            <w:hyperlink r:id="rId31">
+            <w:hyperlink r:id="rId32">
               <w:r>
                 <w:rPr>
                   <w:rStyle w:val="Hyperlink"/>
@@ -2984,7 +3045,7 @@
               <w:pStyle w:val="Compact"/>
               <w:spacing w:before="20" w:after="20"/>
             </w:pPr>
-            <w:hyperlink r:id="rId32">
+            <w:hyperlink r:id="rId33">
               <w:r>
                 <w:rPr>
                   <w:rStyle w:val="Hyperlink"/>
@@ -2998,7 +3059,7 @@
               </w:rPr>
               <w:t xml:space="preserve"> · </w:t>
             </w:r>
-            <w:hyperlink r:id="rId33">
+            <w:hyperlink r:id="rId34">
               <w:r>
                 <w:rPr>
                   <w:rStyle w:val="Hyperlink"/>
@@ -3053,7 +3114,7 @@
               <w:pStyle w:val="Compact"/>
               <w:spacing w:before="20" w:after="20"/>
             </w:pPr>
-            <w:hyperlink r:id="rId34">
+            <w:hyperlink r:id="rId35">
               <w:r>
                 <w:rPr>
                   <w:rStyle w:val="Hyperlink"/>
@@ -3067,7 +3128,7 @@
               </w:rPr>
               <w:t xml:space="preserve"> · </w:t>
             </w:r>
-            <w:hyperlink r:id="rId35">
+            <w:hyperlink r:id="rId36">
               <w:r>
                 <w:rPr>
                   <w:rStyle w:val="Hyperlink"/>
@@ -3122,7 +3183,7 @@
               <w:pStyle w:val="Compact"/>
               <w:spacing w:before="20" w:after="20"/>
             </w:pPr>
-            <w:hyperlink r:id="rId36">
+            <w:hyperlink r:id="rId37">
               <w:r>
                 <w:rPr>
                   <w:rStyle w:val="Hyperlink"/>
@@ -3136,7 +3197,7 @@
               </w:rPr>
               <w:t xml:space="preserve"> · </w:t>
             </w:r>
-            <w:hyperlink r:id="rId37">
+            <w:hyperlink r:id="rId38">
               <w:r>
                 <w:rPr>
                   <w:rStyle w:val="Hyperlink"/>
@@ -3191,7 +3252,7 @@
               <w:pStyle w:val="Compact"/>
               <w:spacing w:before="20" w:after="20"/>
             </w:pPr>
-            <w:hyperlink r:id="rId38">
+            <w:hyperlink r:id="rId39">
               <w:r>
                 <w:rPr>
                   <w:rStyle w:val="Hyperlink"/>
@@ -3205,7 +3266,7 @@
               </w:rPr>
               <w:t xml:space="preserve"> · </w:t>
             </w:r>
-            <w:hyperlink r:id="rId39">
+            <w:hyperlink r:id="rId40">
               <w:r>
                 <w:rPr>
                   <w:rStyle w:val="Hyperlink"/>
@@ -3260,7 +3321,7 @@
               <w:pStyle w:val="Compact"/>
               <w:spacing w:before="20" w:after="20"/>
             </w:pPr>
-            <w:hyperlink r:id="rId40">
+            <w:hyperlink r:id="rId41">
               <w:r>
                 <w:rPr>
                   <w:rStyle w:val="Hyperlink"/>
@@ -3274,7 +3335,7 @@
               </w:rPr>
               <w:t xml:space="preserve"> · </w:t>
             </w:r>
-            <w:hyperlink r:id="rId41">
+            <w:hyperlink r:id="rId42">
               <w:r>
                 <w:rPr>
                   <w:rStyle w:val="Hyperlink"/>
@@ -3329,7 +3390,7 @@
               <w:pStyle w:val="Compact"/>
               <w:spacing w:before="20" w:after="20"/>
             </w:pPr>
-            <w:hyperlink r:id="rId42">
+            <w:hyperlink r:id="rId43">
               <w:r>
                 <w:rPr>
                   <w:rStyle w:val="Hyperlink"/>
@@ -3343,7 +3404,7 @@
               </w:rPr>
               <w:t xml:space="preserve"> · </w:t>
             </w:r>
-            <w:hyperlink r:id="rId43">
+            <w:hyperlink r:id="rId44">
               <w:r>
                 <w:rPr>
                   <w:rStyle w:val="Hyperlink"/>
@@ -3398,7 +3459,7 @@
               <w:pStyle w:val="Compact"/>
               <w:spacing w:before="20" w:after="20"/>
             </w:pPr>
-            <w:hyperlink r:id="rId44">
+            <w:hyperlink r:id="rId45">
               <w:r>
                 <w:rPr>
                   <w:rStyle w:val="Hyperlink"/>
@@ -3412,7 +3473,7 @@
               </w:rPr>
               <w:t xml:space="preserve"> · </w:t>
             </w:r>
-            <w:hyperlink r:id="rId45">
+            <w:hyperlink r:id="rId46">
               <w:r>
                 <w:rPr>
                   <w:rStyle w:val="Hyperlink"/>
@@ -3467,7 +3528,7 @@
               <w:pStyle w:val="Compact"/>
               <w:spacing w:before="20" w:after="20"/>
             </w:pPr>
-            <w:hyperlink r:id="rId46">
+            <w:hyperlink r:id="rId47">
               <w:r>
                 <w:rPr>
                   <w:rStyle w:val="Hyperlink"/>
@@ -3481,7 +3542,7 @@
               </w:rPr>
               <w:t xml:space="preserve"> (used by Cowork) · </w:t>
             </w:r>
-            <w:hyperlink r:id="rId47">
+            <w:hyperlink r:id="rId48">
               <w:r>
                 <w:rPr>
                   <w:rStyle w:val="Hyperlink"/>
@@ -3525,7 +3586,7 @@
               <w:pStyle w:val="Compact"/>
               <w:spacing w:before="20" w:after="20"/>
             </w:pPr>
-            <w:hyperlink r:id="rId48">
+            <w:hyperlink r:id="rId49">
               <w:r>
                 <w:rPr>
                   <w:rStyle w:val="Hyperlink"/>
@@ -3594,7 +3655,7 @@
               <w:pStyle w:val="Compact"/>
               <w:spacing w:before="20" w:after="20"/>
             </w:pPr>
-            <w:hyperlink r:id="rId49">
+            <w:hyperlink r:id="rId50">
               <w:r>
                 <w:rPr>
                   <w:rStyle w:val="Hyperlink"/>
@@ -3634,7 +3695,19 @@
               <w:rPr>
                 <w:sz w:val="19"/>
               </w:rPr>
-              <w:t>The six Word and Excel sample files, zipped for easy upload to OneDrive</w:t>
+              <w:t xml:space="preserve">The six Word and Excel sample files in an </w:t>
+            </w:r>
+            <w:r>
+              <w:rPr>
+                <w:rStyle w:val="VerbatimChar"/>
+              </w:rPr>
+              <w:t>ai_hr_cowork_workshop</w:t>
+            </w:r>
+            <w:r>
+              <w:rPr>
+                <w:sz w:val="19"/>
+              </w:rPr>
+              <w:t xml:space="preserve"> folder, ready to upload to OneDrive</w:t>
             </w:r>
           </w:p>
         </w:tc>
@@ -3666,7 +3739,7 @@
       <w:r>
         <w:t xml:space="preserve"> sample files. They work in both Cowork and Agent Builder (which doesn't accept .md or .csv). Download </w:t>
       </w:r>
-      <w:hyperlink r:id="rId50">
+      <w:hyperlink r:id="rId51">
         <w:r>
           <w:rPr>
             <w:rStyle w:val="Hyperlink"/>
@@ -3677,7 +3750,7 @@
         </w:r>
       </w:hyperlink>
       <w:r>
-        <w:t xml:space="preserve"> to get all six at once, then upload them to a folder named </w:t>
+        <w:t xml:space="preserve"> to get all six at once. It extracts to a folder named </w:t>
       </w:r>
       <w:r>
         <w:rPr>
@@ -3688,7 +3761,7 @@
         <w:t>ai_hr_cowork_workshop</w:t>
       </w:r>
       <w:r>
-        <w:t xml:space="preserve"> under </w:t>
+        <w:t xml:space="preserve">; upload that folder to </w:t>
       </w:r>
       <w:r>
         <w:rPr>
@@ -3698,10 +3771,7 @@
         <w:t>Documents</w:t>
       </w:r>
       <w:r>
-        <w:t xml:space="preserve"> </w:t>
-      </w:r>
-      <w:r>
-        <w:t>in your OneDrive (</w:t>
+        <w:t xml:space="preserve"> in your OneDrive (</w:t>
       </w:r>
       <w:r>
         <w:rPr>
@@ -3710,7 +3780,7 @@
         <w:t>Documents/ai_hr_cowork_workshop</w:t>
       </w:r>
       <w:r>
-        <w:t>); the prompts use that path.</w:t>
+        <w:t>). The prompts use that path.</w:t>
       </w:r>
     </w:p>
     <w:tbl>
@@ -3811,7 +3881,7 @@
               <w:pStyle w:val="Compact"/>
               <w:spacing w:before="20" w:after="20"/>
             </w:pPr>
-            <w:hyperlink r:id="rId51">
+            <w:hyperlink r:id="rId52">
               <w:r>
                 <w:rPr>
                   <w:rStyle w:val="Hyperlink"/>
@@ -3866,7 +3936,7 @@
               <w:pStyle w:val="Compact"/>
               <w:spacing w:before="20" w:after="20"/>
             </w:pPr>
-            <w:hyperlink r:id="rId52">
+            <w:hyperlink r:id="rId53">
               <w:r>
                 <w:rPr>
                   <w:rStyle w:val="Hyperlink"/>
@@ -3921,7 +3991,7 @@
               <w:pStyle w:val="Compact"/>
               <w:spacing w:before="20" w:after="20"/>
             </w:pPr>
-            <w:hyperlink r:id="rId53">
+            <w:hyperlink r:id="rId54">
               <w:r>
                 <w:rPr>
                   <w:rStyle w:val="Hyperlink"/>
@@ -3976,7 +4046,7 @@
               <w:pStyle w:val="Compact"/>
               <w:spacing w:before="20" w:after="20"/>
             </w:pPr>
-            <w:hyperlink r:id="rId54">
+            <w:hyperlink r:id="rId55">
               <w:r>
                 <w:rPr>
                   <w:rStyle w:val="Hyperlink"/>
@@ -4031,7 +4101,7 @@
               <w:pStyle w:val="Compact"/>
               <w:spacing w:before="20" w:after="20"/>
             </w:pPr>
-            <w:hyperlink r:id="rId55">
+            <w:hyperlink r:id="rId56">
               <w:r>
                 <w:rPr>
                   <w:rStyle w:val="Hyperlink"/>
@@ -4086,7 +4156,7 @@
               <w:pStyle w:val="Compact"/>
               <w:spacing w:before="20" w:after="20"/>
             </w:pPr>
-            <w:hyperlink r:id="rId56">
+            <w:hyperlink r:id="rId57">
               <w:r>
                 <w:rPr>
                   <w:rStyle w:val="Hyperlink"/>
@@ -4177,10 +4247,7 @@
         <w:t>sample-knowledge/</w:t>
       </w:r>
       <w:r>
-        <w:t xml:space="preserve"> are the editable </w:t>
-      </w:r>
-      <w:r>
-        <w:t>sources the Word and Excel files are generated from. Attendees don't need them, and they aren't in the zip. If you change one, regenerate its Word or Excel copy so the two stay in sync.</w:t>
+        <w:t xml:space="preserve"> are the editable sources the Word and Excel files are generated from. Attendees don't need them, and they aren't in the zip. If you change one, regenerate its Word or Excel copy so the two stay in sync.</w:t>
       </w:r>
     </w:p>
     <w:p>
@@ -4188,7 +4255,7 @@
         <w:pStyle w:val="Heading2"/>
       </w:pPr>
       <w:bookmarkStart w:id="14" w:name="how-to-use-this-kit"/>
-      <w:bookmarkStart w:id="15" w:name="_Toc241754213"/>
+      <w:bookmarkStart w:id="15" w:name="_Toc241858849"/>
       <w:bookmarkEnd w:id="11"/>
       <w:bookmarkEnd w:id="13"/>
       <w:r>
@@ -4214,7 +4281,7 @@
       <w:r>
         <w:t xml:space="preserve"> follow the </w:t>
       </w:r>
-      <w:hyperlink r:id="rId57">
+      <w:hyperlink r:id="rId58">
         <w:r>
           <w:rPr>
             <w:rStyle w:val="Hyperlink"/>
@@ -4225,7 +4292,7 @@
       <w:r>
         <w:t xml:space="preserve">. Provision accounts, estimate cost, and load </w:t>
       </w:r>
-      <w:hyperlink r:id="rId58">
+      <w:hyperlink r:id="rId59">
         <w:r>
           <w:rPr>
             <w:rStyle w:val="Hyperlink"/>
@@ -4255,7 +4322,7 @@
       <w:r>
         <w:t xml:space="preserve"> read </w:t>
       </w:r>
-      <w:hyperlink r:id="rId59">
+      <w:hyperlink r:id="rId60">
         <w:r>
           <w:rPr>
             <w:rStyle w:val="Hyperlink"/>
@@ -4266,7 +4333,7 @@
       <w:r>
         <w:t xml:space="preserve">, do a full dry run against the </w:t>
       </w:r>
-      <w:hyperlink r:id="rId60">
+      <w:hyperlink r:id="rId61">
         <w:r>
           <w:rPr>
             <w:rStyle w:val="Hyperlink"/>
@@ -4277,7 +4344,7 @@
       <w:r>
         <w:t xml:space="preserve">, and present with </w:t>
       </w:r>
-      <w:hyperlink r:id="rId61">
+      <w:hyperlink r:id="rId62">
         <w:r>
           <w:rPr>
             <w:rStyle w:val="Hyperlink"/>
@@ -4307,7 +4374,7 @@
       <w:r>
         <w:t xml:space="preserve"> on the day, follow </w:t>
       </w:r>
-      <w:hyperlink r:id="rId62">
+      <w:hyperlink r:id="rId63">
         <w:r>
           <w:rPr>
             <w:rStyle w:val="Hyperlink"/>
@@ -4318,7 +4385,7 @@
       <w:r>
         <w:t xml:space="preserve"> start to finish, with the printed </w:t>
       </w:r>
-      <w:hyperlink r:id="rId63">
+      <w:hyperlink r:id="rId64">
         <w:r>
           <w:rPr>
             <w:rStyle w:val="Hyperlink"/>
@@ -4329,7 +4396,7 @@
       <w:r>
         <w:t xml:space="preserve"> and the </w:t>
       </w:r>
-      <w:hyperlink r:id="rId64">
+      <w:hyperlink r:id="rId65">
         <w:r>
           <w:rPr>
             <w:rStyle w:val="Hyperlink"/>
@@ -4359,7 +4426,7 @@
       <w:r>
         <w:t xml:space="preserve"> send </w:t>
       </w:r>
-      <w:hyperlink r:id="rId65">
+      <w:hyperlink r:id="rId66">
         <w:r>
           <w:rPr>
             <w:rStyle w:val="Hyperlink"/>
@@ -4415,7 +4482,7 @@
         <w:pStyle w:val="Heading2"/>
       </w:pPr>
       <w:bookmarkStart w:id="16" w:name="requirement-coverage"/>
-      <w:bookmarkStart w:id="17" w:name="_Toc241754214"/>
+      <w:bookmarkStart w:id="17" w:name="_Toc241858850"/>
       <w:bookmarkEnd w:id="14"/>
       <w:r>
         <w:t>Requirement coverage</w:t>
@@ -4846,7 +4913,8 @@
     </w:p>
     <w:p>
       <w:r>
-        <w:pict w14:anchorId="7F4389D8">
+        <w:lastRenderedPageBreak/>
+        <w:pict w14:anchorId="6F9EC6E8">
           <v:rect id="_x0000_i1025" style="width:0;height:1.5pt" o:hralign="center" o:hrstd="t" o:hr="t"/>
         </w:pict>
       </w:r>
@@ -4860,10 +4928,9 @@
           <w:i/>
           <w:iCs/>
         </w:rPr>
-        <w:lastRenderedPageBreak/>
         <w:t xml:space="preserve">Sample content depicts the fictional company "Zava" and is for training purposes only. Divider illustrations: </w:t>
       </w:r>
-      <w:hyperlink r:id="rId66">
+      <w:hyperlink r:id="rId67">
         <w:r>
           <w:rPr>
             <w:rStyle w:val="Hyperlink"/>
@@ -4884,7 +4951,7 @@
       <w:bookmarkEnd w:id="16"/>
     </w:p>
     <w:sectPr>
-      <w:footerReference w:type="default" r:id="rId67"/>
+      <w:footerReference w:type="default" r:id="rId68"/>
       <w:footnotePr>
         <w:numRestart w:val="eachSect"/>
       </w:footnotePr>
@@ -5004,7 +5071,7 @@
   <w:abstractNum w:abstractNumId="0" w15:restartNumberingAfterBreak="0">
     <w:nsid w:val="0000A990"/>
     <w:multiLevelType w:val="multilevel"/>
-    <w:tmpl w:val="F8F695C2"/>
+    <w:tmpl w:val="FA706520"/>
     <w:lvl w:ilvl="0">
       <w:numFmt w:val="bullet"/>
       <w:lvlText w:val=" "/>
@@ -5081,7 +5148,7 @@
   <w:abstractNum w:abstractNumId="1" w15:restartNumberingAfterBreak="0">
     <w:nsid w:val="0000A991"/>
     <w:multiLevelType w:val="multilevel"/>
-    <w:tmpl w:val="CC5A544E"/>
+    <w:tmpl w:val="80CA409E"/>
     <w:lvl w:ilvl="0">
       <w:numFmt w:val="bullet"/>
       <w:lvlText w:val=""/>
@@ -5185,7 +5252,7 @@
   <w:abstractNum w:abstractNumId="2" w15:restartNumberingAfterBreak="0">
     <w:nsid w:val="00A99411"/>
     <w:multiLevelType w:val="multilevel"/>
-    <w:tmpl w:val="CCD6B1AE"/>
+    <w:tmpl w:val="DDCC8216"/>
     <w:lvl w:ilvl="0">
       <w:start w:val="1"/>
       <w:numFmt w:val="decimal"/>
@@ -5268,10 +5335,10 @@
       </w:pPr>
     </w:lvl>
   </w:abstractNum>
-  <w:num w:numId="1" w16cid:durableId="1091895460">
+  <w:num w:numId="1" w16cid:durableId="1179004737">
     <w:abstractNumId w:val="0"/>
   </w:num>
-  <w:num w:numId="2" w16cid:durableId="1327366616">
+  <w:num w:numId="2" w16cid:durableId="452678937">
     <w:abstractNumId w:val="2"/>
     <w:lvlOverride w:ilvl="0">
       <w:startOverride w:val="1"/>
@@ -5301,10 +5368,10 @@
       <w:startOverride w:val="1"/>
     </w:lvlOverride>
   </w:num>
-  <w:num w:numId="3" w16cid:durableId="607584808">
+  <w:num w:numId="3" w16cid:durableId="1528058854">
     <w:abstractNumId w:val="1"/>
   </w:num>
-  <w:num w:numId="4" w16cid:durableId="1758214768">
+  <w:num w:numId="4" w16cid:durableId="119307553">
     <w:abstractNumId w:val="2"/>
     <w:lvlOverride w:ilvl="0">
       <w:startOverride w:val="1"/>
@@ -5334,7 +5401,7 @@
       <w:startOverride w:val="1"/>
     </w:lvlOverride>
   </w:num>
-  <w:num w:numId="5" w16cid:durableId="1012999254">
+  <w:num w:numId="5" w16cid:durableId="1134449184">
     <w:abstractNumId w:val="1"/>
   </w:num>
 </w:numbering>
@@ -6585,7 +6652,7 @@
     <w:next w:val="Normal"/>
     <w:autoRedefine/>
     <w:uiPriority w:val="39"/>
-    <w:rsid w:val="00BA273A"/>
+    <w:rsid w:val="00234C3D"/>
     <w:pPr>
       <w:spacing w:after="100"/>
     </w:pPr>
@@ -6596,7 +6663,7 @@
     <w:next w:val="Normal"/>
     <w:autoRedefine/>
     <w:uiPriority w:val="39"/>
-    <w:rsid w:val="00BA273A"/>
+    <w:rsid w:val="00234C3D"/>
     <w:pPr>
       <w:spacing w:after="100"/>
       <w:ind w:left="210"/>
@@ -6606,7 +6673,7 @@
     <w:name w:val="header"/>
     <w:basedOn w:val="Normal"/>
     <w:link w:val="HeaderChar"/>
-    <w:rsid w:val="00BA273A"/>
+    <w:rsid w:val="00234C3D"/>
     <w:pPr>
       <w:tabs>
         <w:tab w:val="center" w:pos="4513"/>
@@ -6619,7 +6686,7 @@
     <w:name w:val="Header Char"/>
     <w:basedOn w:val="DefaultParagraphFont"/>
     <w:link w:val="Header"/>
-    <w:rsid w:val="00BA273A"/>
+    <w:rsid w:val="00234C3D"/>
     <w:rPr>
       <w:rFonts w:ascii="Segoe UI" w:eastAsia="Segoe UI" w:hAnsi="Segoe UI" w:cs="Segoe UI"/>
       <w:color w:val="242424"/>
@@ -6630,7 +6697,7 @@
     <w:name w:val="footer"/>
     <w:basedOn w:val="Normal"/>
     <w:link w:val="FooterChar"/>
-    <w:rsid w:val="00BA273A"/>
+    <w:rsid w:val="00234C3D"/>
     <w:pPr>
       <w:tabs>
         <w:tab w:val="center" w:pos="4513"/>
@@ -6643,7 +6710,7 @@
     <w:name w:val="Footer Char"/>
     <w:basedOn w:val="DefaultParagraphFont"/>
     <w:link w:val="Footer"/>
-    <w:rsid w:val="00BA273A"/>
+    <w:rsid w:val="00234C3D"/>
     <w:rPr>
       <w:rFonts w:ascii="Segoe UI" w:eastAsia="Segoe UI" w:hAnsi="Segoe UI" w:cs="Segoe UI"/>
       <w:color w:val="242424"/>

</xml_diff>

<commit_message>
Organize kit by audience; add training overview deck, invitation emails, and download tips
Move guides into participant/, instructor/, and summary/ folders and update every relative link, Word copy, and deck link to match. Add communication/ with a training overview deck and paste-ready participant and instructor emails. Both decks get a workshop-kit slide with download links, and the guides, emails, and decks get a 'select the Download icon' tip with a new illustration.

Co-authored-by: Copilot <223556219+Copilot@users.noreply.github.com>
</commit_message>
<xml_diff>
--- a/README.docx
+++ b/README.docx
@@ -10,7 +10,7 @@
           <w:sz w:val="21"/>
           <w:szCs w:val="24"/>
         </w:rPr>
-        <w:id w:val="-1980302248"/>
+        <w:id w:val="1117726744"/>
         <w:docPartObj>
           <w:docPartGallery w:val="Table of Contents"/>
           <w:docPartUnique/>
@@ -51,7 +51,7 @@
           <w:r>
             <w:fldChar w:fldCharType="separate"/>
           </w:r>
-          <w:hyperlink w:anchor="_Toc241858843" w:history="1">
+          <w:hyperlink w:anchor="_Toc241869862" w:history="1">
             <w:r>
               <w:rPr>
                 <w:rStyle w:val="Hyperlink"/>
@@ -78,7 +78,7 @@
                 <w:noProof/>
                 <w:webHidden/>
               </w:rPr>
-              <w:instrText xml:space="preserve"> PAGEREF _Toc241858843 \h </w:instrText>
+              <w:instrText xml:space="preserve"> PAGEREF _Toc241869862 \h </w:instrText>
             </w:r>
             <w:r>
               <w:rPr>
@@ -125,7 +125,7 @@
               <w14:ligatures w14:val="standardContextual"/>
             </w:rPr>
           </w:pPr>
-          <w:hyperlink w:anchor="_Toc241858844" w:history="1">
+          <w:hyperlink w:anchor="_Toc241869863" w:history="1">
             <w:r>
               <w:rPr>
                 <w:rStyle w:val="Hyperlink"/>
@@ -152,7 +152,7 @@
                 <w:noProof/>
                 <w:webHidden/>
               </w:rPr>
-              <w:instrText xml:space="preserve"> PAGEREF _Toc241858844 \h </w:instrText>
+              <w:instrText xml:space="preserve"> PAGEREF _Toc241869863 \h </w:instrText>
             </w:r>
             <w:r>
               <w:rPr>
@@ -199,7 +199,7 @@
               <w14:ligatures w14:val="standardContextual"/>
             </w:rPr>
           </w:pPr>
-          <w:hyperlink w:anchor="_Toc241858845" w:history="1">
+          <w:hyperlink w:anchor="_Toc241869864" w:history="1">
             <w:r>
               <w:rPr>
                 <w:rStyle w:val="Hyperlink"/>
@@ -226,7 +226,7 @@
                 <w:noProof/>
                 <w:webHidden/>
               </w:rPr>
-              <w:instrText xml:space="preserve"> PAGEREF _Toc241858845 \h </w:instrText>
+              <w:instrText xml:space="preserve"> PAGEREF _Toc241869864 \h </w:instrText>
             </w:r>
             <w:r>
               <w:rPr>
@@ -273,7 +273,7 @@
               <w14:ligatures w14:val="standardContextual"/>
             </w:rPr>
           </w:pPr>
-          <w:hyperlink w:anchor="_Toc241858846" w:history="1">
+          <w:hyperlink w:anchor="_Toc241869865" w:history="1">
             <w:r>
               <w:rPr>
                 <w:rStyle w:val="Hyperlink"/>
@@ -300,7 +300,7 @@
                 <w:noProof/>
                 <w:webHidden/>
               </w:rPr>
-              <w:instrText xml:space="preserve"> PAGEREF _Toc241858846 \h </w:instrText>
+              <w:instrText xml:space="preserve"> PAGEREF _Toc241869865 \h </w:instrText>
             </w:r>
             <w:r>
               <w:rPr>
@@ -347,7 +347,7 @@
               <w14:ligatures w14:val="standardContextual"/>
             </w:rPr>
           </w:pPr>
-          <w:hyperlink w:anchor="_Toc241858847" w:history="1">
+          <w:hyperlink w:anchor="_Toc241869866" w:history="1">
             <w:r>
               <w:rPr>
                 <w:rStyle w:val="Hyperlink"/>
@@ -374,7 +374,7 @@
                 <w:noProof/>
                 <w:webHidden/>
               </w:rPr>
-              <w:instrText xml:space="preserve"> PAGEREF _Toc241858847 \h </w:instrText>
+              <w:instrText xml:space="preserve"> PAGEREF _Toc241869866 \h </w:instrText>
             </w:r>
             <w:r>
               <w:rPr>
@@ -421,7 +421,7 @@
               <w14:ligatures w14:val="standardContextual"/>
             </w:rPr>
           </w:pPr>
-          <w:hyperlink w:anchor="_Toc241858848" w:history="1">
+          <w:hyperlink w:anchor="_Toc241869867" w:history="1">
             <w:r>
               <w:rPr>
                 <w:rStyle w:val="Hyperlink"/>
@@ -448,7 +448,7 @@
                 <w:noProof/>
                 <w:webHidden/>
               </w:rPr>
-              <w:instrText xml:space="preserve"> PAGEREF _Toc241858848 \h </w:instrText>
+              <w:instrText xml:space="preserve"> PAGEREF _Toc241869867 \h </w:instrText>
             </w:r>
             <w:r>
               <w:rPr>
@@ -495,7 +495,7 @@
               <w14:ligatures w14:val="standardContextual"/>
             </w:rPr>
           </w:pPr>
-          <w:hyperlink w:anchor="_Toc241858849" w:history="1">
+          <w:hyperlink w:anchor="_Toc241869868" w:history="1">
             <w:r>
               <w:rPr>
                 <w:rStyle w:val="Hyperlink"/>
@@ -522,7 +522,7 @@
                 <w:noProof/>
                 <w:webHidden/>
               </w:rPr>
-              <w:instrText xml:space="preserve"> PAGEREF _Toc241858849 \h </w:instrText>
+              <w:instrText xml:space="preserve"> PAGEREF _Toc241869868 \h </w:instrText>
             </w:r>
             <w:r>
               <w:rPr>
@@ -569,7 +569,7 @@
               <w14:ligatures w14:val="standardContextual"/>
             </w:rPr>
           </w:pPr>
-          <w:hyperlink w:anchor="_Toc241858850" w:history="1">
+          <w:hyperlink w:anchor="_Toc241869869" w:history="1">
             <w:r>
               <w:rPr>
                 <w:rStyle w:val="Hyperlink"/>
@@ -596,7 +596,7 @@
                 <w:noProof/>
                 <w:webHidden/>
               </w:rPr>
-              <w:instrText xml:space="preserve"> PAGEREF _Toc241858850 \h </w:instrText>
+              <w:instrText xml:space="preserve"> PAGEREF _Toc241869869 \h </w:instrText>
             </w:r>
             <w:r>
               <w:rPr>
@@ -616,7 +616,7 @@
                 <w:noProof/>
                 <w:webHidden/>
               </w:rPr>
-              <w:t>5</w:t>
+              <w:t>6</w:t>
             </w:r>
             <w:r>
               <w:rPr>
@@ -639,7 +639,7 @@
         <w:pStyle w:val="Heading1"/>
       </w:pPr>
       <w:bookmarkStart w:id="0" w:name="Xa046f7e33c7391c4827688ee785cfee5a5aaa0a"/>
-      <w:bookmarkStart w:id="1" w:name="_Toc241858843"/>
+      <w:bookmarkStart w:id="1" w:name="_Toc241869862"/>
       <w:r>
         <w:t>Getting Things Done with Copilot Cowork for HR Tasks</w:t>
       </w:r>
@@ -775,7 +775,7 @@
         <w:pStyle w:val="Heading2"/>
       </w:pPr>
       <w:bookmarkStart w:id="3" w:name="learning-objectives"/>
-      <w:bookmarkStart w:id="4" w:name="_Toc241858844"/>
+      <w:bookmarkStart w:id="4" w:name="_Toc241869863"/>
       <w:bookmarkEnd w:id="2"/>
       <w:r>
         <w:t>Learning objectives</w:t>
@@ -916,7 +916,7 @@
         <w:pStyle w:val="Heading2"/>
       </w:pPr>
       <w:bookmarkStart w:id="5" w:name="who-its-for"/>
-      <w:bookmarkStart w:id="6" w:name="_Toc241858845"/>
+      <w:bookmarkStart w:id="6" w:name="_Toc241869864"/>
       <w:bookmarkEnd w:id="3"/>
       <w:r>
         <w:t>Who it's for</w:t>
@@ -1061,7 +1061,7 @@
         <w:pStyle w:val="Heading2"/>
       </w:pPr>
       <w:bookmarkStart w:id="7" w:name="prerequisites"/>
-      <w:bookmarkStart w:id="8" w:name="_Toc241858846"/>
+      <w:bookmarkStart w:id="8" w:name="_Toc241869865"/>
       <w:bookmarkEnd w:id="5"/>
       <w:r>
         <w:t>Prerequisites</w:t>
@@ -1172,7 +1172,7 @@
         <w:pStyle w:val="Heading2"/>
       </w:pPr>
       <w:bookmarkStart w:id="9" w:name="agenda-240-minutes"/>
-      <w:bookmarkStart w:id="10" w:name="_Toc241858847"/>
+      <w:bookmarkStart w:id="10" w:name="_Toc241869866"/>
       <w:bookmarkEnd w:id="7"/>
       <w:r>
         <w:t>Agenda (240 minutes)</w:t>
@@ -1908,7 +1908,7 @@
         <w:pStyle w:val="Heading2"/>
       </w:pPr>
       <w:bookmarkStart w:id="11" w:name="whats-in-this-kit"/>
-      <w:bookmarkStart w:id="12" w:name="_Toc241858848"/>
+      <w:bookmarkStart w:id="12" w:name="_Toc241869867"/>
       <w:bookmarkEnd w:id="9"/>
       <w:r>
         <w:t>What's in this kit</w:t>
@@ -1997,6 +1997,220 @@
       </w:r>
       <w:r>
         <w:t xml:space="preserve"> copy is only for reading and printing.</w:t>
+      </w:r>
+    </w:p>
+    <w:p>
+      <w:pPr>
+        <w:pStyle w:val="BodyText"/>
+      </w:pPr>
+      <w:r>
+        <w:t>The kit is organized by audience:</w:t>
+      </w:r>
+    </w:p>
+    <w:p>
+      <w:pPr>
+        <w:pStyle w:val="Compact"/>
+        <w:numPr>
+          <w:ilvl w:val="0"/>
+          <w:numId w:val="4"/>
+        </w:numPr>
+      </w:pPr>
+      <w:hyperlink r:id="rId8">
+        <w:r>
+          <w:rPr>
+            <w:rStyle w:val="Hyperlink"/>
+            <w:b/>
+            <w:bCs/>
+          </w:rPr>
+          <w:t>participant/</w:t>
+        </w:r>
+      </w:hyperlink>
+      <w:r>
+        <w:t xml:space="preserve"> — what attendees use: the workbook, the quick-reference card, the sample-data zip, and the after-the-workshop pack.</w:t>
+      </w:r>
+    </w:p>
+    <w:p>
+      <w:pPr>
+        <w:pStyle w:val="Compact"/>
+        <w:numPr>
+          <w:ilvl w:val="0"/>
+          <w:numId w:val="4"/>
+        </w:numPr>
+      </w:pPr>
+      <w:hyperlink r:id="rId9">
+        <w:r>
+          <w:rPr>
+            <w:rStyle w:val="Hyperlink"/>
+            <w:b/>
+            <w:bCs/>
+          </w:rPr>
+          <w:t>instructor/</w:t>
+        </w:r>
+      </w:hyperlink>
+      <w:r>
+        <w:t xml:space="preserve"> — what the facilitator and host use: the instructor deck, facilitator guide, answer key, readiness checklist, and seed content.</w:t>
+      </w:r>
+    </w:p>
+    <w:p>
+      <w:pPr>
+        <w:pStyle w:val="Compact"/>
+        <w:numPr>
+          <w:ilvl w:val="0"/>
+          <w:numId w:val="4"/>
+        </w:numPr>
+      </w:pPr>
+      <w:hyperlink r:id="rId10">
+        <w:r>
+          <w:rPr>
+            <w:rStyle w:val="Hyperlink"/>
+            <w:b/>
+            <w:bCs/>
+          </w:rPr>
+          <w:t>communication/</w:t>
+        </w:r>
+      </w:hyperlink>
+      <w:r>
+        <w:t xml:space="preserve"> — what you send out: the training overview deck and paste-ready Outlook emails for participants and instructors.</w:t>
+      </w:r>
+    </w:p>
+    <w:p>
+      <w:pPr>
+        <w:pStyle w:val="Compact"/>
+        <w:numPr>
+          <w:ilvl w:val="0"/>
+          <w:numId w:val="4"/>
+        </w:numPr>
+      </w:pPr>
+      <w:hyperlink r:id="rId11">
+        <w:r>
+          <w:rPr>
+            <w:rStyle w:val="Hyperlink"/>
+            <w:b/>
+            <w:bCs/>
+          </w:rPr>
+          <w:t>reference/</w:t>
+        </w:r>
+      </w:hyperlink>
+      <w:r>
+        <w:t xml:space="preserve">, </w:t>
+      </w:r>
+      <w:hyperlink r:id="rId12">
+        <w:r>
+          <w:rPr>
+            <w:rStyle w:val="Hyperlink"/>
+            <w:b/>
+            <w:bCs/>
+          </w:rPr>
+          <w:t>skills/</w:t>
+        </w:r>
+      </w:hyperlink>
+      <w:r>
+        <w:t xml:space="preserve">, and </w:t>
+      </w:r>
+      <w:hyperlink r:id="rId13">
+        <w:r>
+          <w:rPr>
+            <w:rStyle w:val="Hyperlink"/>
+            <w:b/>
+            <w:bCs/>
+          </w:rPr>
+          <w:t>sample-knowledge/</w:t>
+        </w:r>
+      </w:hyperlink>
+      <w:r>
+        <w:t xml:space="preserve"> — background guides, the example custom skill, and the editable sample data.</w:t>
+      </w:r>
+    </w:p>
+    <w:p>
+      <w:pPr>
+        <w:pStyle w:val="BodyText"/>
+        <w:pBdr>
+          <w:left w:val="single" w:sz="18" w:space="8" w:color="3B1041"/>
+        </w:pBdr>
+        <w:shd w:val="clear" w:color="auto" w:fill="FBF6FD"/>
+        <w:spacing w:before="30" w:after="30"/>
+        <w:ind w:left="288" w:right="144"/>
+      </w:pPr>
+      <w:r>
+        <w:rPr>
+          <w:b/>
+          <w:bCs/>
+        </w:rPr>
+        <w:t>Downloading a file from GitHub:</w:t>
+      </w:r>
+      <w:r>
+        <w:t xml:space="preserve"> if a link opens the file on GitHub instead of downloading it, select the </w:t>
+      </w:r>
+      <w:r>
+        <w:rPr>
+          <w:b/>
+          <w:bCs/>
+        </w:rPr>
+        <w:t>Download</w:t>
+      </w:r>
+      <w:r>
+        <w:t xml:space="preserve"> icon (</w:t>
+      </w:r>
+      <w:r>
+        <w:rPr>
+          <w:b/>
+          <w:bCs/>
+        </w:rPr>
+        <w:t>Download raw file</w:t>
+      </w:r>
+      <w:r>
+        <w:t>) at the top right of the file.</w:t>
+      </w:r>
+    </w:p>
+    <w:p>
+      <w:pPr>
+        <w:pStyle w:val="BodyText"/>
+      </w:pPr>
+      <w:r>
+        <w:rPr>
+          <w:noProof/>
+        </w:rPr>
+        <w:drawing>
+          <wp:inline distT="0" distB="0" distL="0" distR="0" wp14:anchorId="560615AB" wp14:editId="427A13B1">
+            <wp:extent cx="4400120" cy="1306285"/>
+            <wp:effectExtent l="0" t="0" r="0" b="0"/>
+            <wp:docPr id="22" name="Picture" descr="Tip: on a GitHub file page, select the Download icon (Download raw file) at the top right of the file"/>
+            <wp:cNvGraphicFramePr/>
+            <a:graphic xmlns:a="http://schemas.openxmlformats.org/drawingml/2006/main">
+              <a:graphicData uri="http://schemas.openxmlformats.org/drawingml/2006/picture">
+                <pic:pic xmlns:pic="http://schemas.openxmlformats.org/drawingml/2006/picture">
+                  <pic:nvPicPr>
+                    <pic:cNvPr id="23" name="Picture" descr="reference/media/download-hint.png"/>
+                    <pic:cNvPicPr>
+                      <a:picLocks noChangeAspect="1" noChangeArrowheads="1"/>
+                    </pic:cNvPicPr>
+                  </pic:nvPicPr>
+                  <pic:blipFill>
+                    <a:blip r:embed="rId14"/>
+                    <a:stretch>
+                      <a:fillRect/>
+                    </a:stretch>
+                  </pic:blipFill>
+                  <pic:spPr bwMode="auto">
+                    <a:xfrm>
+                      <a:off x="0" y="0"/>
+                      <a:ext cx="4400120" cy="1306285"/>
+                    </a:xfrm>
+                    <a:prstGeom prst="rect">
+                      <a:avLst/>
+                    </a:prstGeom>
+                    <a:noFill/>
+                    <a:ln w="9525">
+                      <a:noFill/>
+                      <a:headEnd/>
+                      <a:tailEnd/>
+                    </a:ln>
+                  </pic:spPr>
+                </pic:pic>
+              </a:graphicData>
+            </a:graphic>
+          </wp:inline>
+        </w:drawing>
       </w:r>
     </w:p>
     <w:tbl>
@@ -2020,9 +2234,9 @@
         <w:tblLook w:val="0020" w:firstRow="1" w:lastRow="0" w:firstColumn="0" w:lastColumn="0" w:noHBand="0" w:noVBand="0"/>
       </w:tblPr>
       <w:tblGrid>
-        <w:gridCol w:w="1828"/>
-        <w:gridCol w:w="1904"/>
-        <w:gridCol w:w="6240"/>
+        <w:gridCol w:w="2883"/>
+        <w:gridCol w:w="1768"/>
+        <w:gridCol w:w="5321"/>
       </w:tblGrid>
       <w:tr>
         <w:trPr>
@@ -2114,7 +2328,7 @@
               <w:pStyle w:val="Compact"/>
               <w:spacing w:before="20" w:after="20"/>
             </w:pPr>
-            <w:hyperlink r:id="rId8">
+            <w:hyperlink r:id="rId15">
               <w:r>
                 <w:rPr>
                   <w:rStyle w:val="Hyperlink"/>
@@ -2128,7 +2342,7 @@
               </w:rPr>
               <w:t xml:space="preserve"> · </w:t>
             </w:r>
-            <w:hyperlink r:id="rId9">
+            <w:hyperlink r:id="rId16">
               <w:r>
                 <w:rPr>
                   <w:rStyle w:val="Hyperlink"/>
@@ -2170,20 +2384,20 @@
               <w:rPr>
                 <w:sz w:val="19"/>
               </w:rPr>
-              <w:t>PROJECT-SUMMARY</w:t>
-            </w:r>
-          </w:p>
-        </w:tc>
-        <w:tc>
-          <w:tcPr>
-            <w:tcW w:w="0" w:type="auto"/>
-          </w:tcPr>
-          <w:p>
-            <w:pPr>
-              <w:pStyle w:val="Compact"/>
-              <w:spacing w:before="20" w:after="20"/>
-            </w:pPr>
-            <w:hyperlink r:id="rId10">
+              <w:t>summary/PROJECT-SUMMARY</w:t>
+            </w:r>
+          </w:p>
+        </w:tc>
+        <w:tc>
+          <w:tcPr>
+            <w:tcW w:w="0" w:type="auto"/>
+          </w:tcPr>
+          <w:p>
+            <w:pPr>
+              <w:pStyle w:val="Compact"/>
+              <w:spacing w:before="20" w:after="20"/>
+            </w:pPr>
+            <w:hyperlink r:id="rId17">
               <w:r>
                 <w:rPr>
                   <w:rStyle w:val="Hyperlink"/>
@@ -2227,12 +2441,12 @@
               <w:pStyle w:val="Compact"/>
               <w:spacing w:before="20" w:after="20"/>
             </w:pPr>
-            <w:hyperlink r:id="rId11">
+            <w:hyperlink r:id="rId18">
               <w:r>
                 <w:rPr>
                   <w:rStyle w:val="Hyperlink"/>
                 </w:rPr>
-                <w:t>instructor-deck.pptx</w:t>
+                <w:t>instructor/instructor-deck.pptx</w:t>
               </w:r>
             </w:hyperlink>
           </w:p>
@@ -2267,7 +2481,21 @@
               <w:rPr>
                 <w:sz w:val="19"/>
               </w:rPr>
-              <w:t>Instructor deck (45 slides, speaker notes, alt text) — a divider slide with a picture and progress tracker before each exercise, one PowerPoint section per exercise for quick navigation, objectives, approvals, a scenario card + hands-on slide per exercise, an Output folder walkthrough, an HR plugins spotlight, and a knowledge check</w:t>
+              <w:t xml:space="preserve">Instructor deck (46 slides, speaker notes, alt text) — a divider slide with a picture and progress tracker before each exercise, one PowerPoint section per exercise for quick navigation, objectives, approvals, a </w:t>
+            </w:r>
+            <w:r>
+              <w:rPr>
+                <w:b/>
+                <w:bCs/>
+                <w:sz w:val="19"/>
+              </w:rPr>
+              <w:t>workshop kit slide with download links</w:t>
+            </w:r>
+            <w:r>
+              <w:rPr>
+                <w:sz w:val="19"/>
+              </w:rPr>
+              <w:t xml:space="preserve"> for participants and instructors, a scenario card + hands-on slide per exercise, an Output folder walkthrough, an HR plugins spotlight, and a knowledge check</w:t>
             </w:r>
           </w:p>
         </w:tc>
@@ -2282,24 +2510,203 @@
               <w:pStyle w:val="Compact"/>
               <w:spacing w:before="20" w:after="20"/>
             </w:pPr>
-            <w:r>
-              <w:rPr>
-                <w:sz w:val="19"/>
-              </w:rPr>
-              <w:t>readiness-checklist</w:t>
-            </w:r>
-          </w:p>
-        </w:tc>
-        <w:tc>
-          <w:tcPr>
-            <w:tcW w:w="0" w:type="auto"/>
-          </w:tcPr>
-          <w:p>
-            <w:pPr>
-              <w:pStyle w:val="Compact"/>
-              <w:spacing w:before="20" w:after="20"/>
-            </w:pPr>
-            <w:hyperlink r:id="rId12">
+            <w:hyperlink r:id="rId19">
+              <w:r>
+                <w:rPr>
+                  <w:rStyle w:val="Hyperlink"/>
+                </w:rPr>
+                <w:t>communication/training-overview.pptx</w:t>
+              </w:r>
+            </w:hyperlink>
+          </w:p>
+        </w:tc>
+        <w:tc>
+          <w:tcPr>
+            <w:tcW w:w="0" w:type="auto"/>
+          </w:tcPr>
+          <w:p>
+            <w:pPr>
+              <w:pStyle w:val="Compact"/>
+              <w:spacing w:before="20" w:after="20"/>
+            </w:pPr>
+            <w:r>
+              <w:rPr>
+                <w:sz w:val="19"/>
+              </w:rPr>
+              <w:t>pptx</w:t>
+            </w:r>
+          </w:p>
+        </w:tc>
+        <w:tc>
+          <w:tcPr>
+            <w:tcW w:w="0" w:type="auto"/>
+          </w:tcPr>
+          <w:p>
+            <w:pPr>
+              <w:pStyle w:val="Compact"/>
+              <w:spacing w:before="20" w:after="20"/>
+            </w:pPr>
+            <w:r>
+              <w:rPr>
+                <w:sz w:val="19"/>
+              </w:rPr>
+              <w:t xml:space="preserve">Training overview deck (8 slides) for HR leaders and prospective attendees — what the training is, objectives, agenda, the eight exercises, what to prepare, and the same </w:t>
+            </w:r>
+            <w:r>
+              <w:rPr>
+                <w:b/>
+                <w:bCs/>
+                <w:sz w:val="19"/>
+              </w:rPr>
+              <w:t>download links</w:t>
+            </w:r>
+            <w:r>
+              <w:rPr>
+                <w:sz w:val="19"/>
+              </w:rPr>
+              <w:t xml:space="preserve"> slide</w:t>
+            </w:r>
+          </w:p>
+        </w:tc>
+      </w:tr>
+      <w:tr>
+        <w:tc>
+          <w:tcPr>
+            <w:tcW w:w="0" w:type="auto"/>
+          </w:tcPr>
+          <w:p>
+            <w:pPr>
+              <w:pStyle w:val="Compact"/>
+              <w:spacing w:before="20" w:after="20"/>
+            </w:pPr>
+            <w:hyperlink r:id="rId20">
+              <w:r>
+                <w:rPr>
+                  <w:rStyle w:val="Hyperlink"/>
+                </w:rPr>
+                <w:t>communication/participant-email.html</w:t>
+              </w:r>
+            </w:hyperlink>
+          </w:p>
+        </w:tc>
+        <w:tc>
+          <w:tcPr>
+            <w:tcW w:w="0" w:type="auto"/>
+          </w:tcPr>
+          <w:p>
+            <w:pPr>
+              <w:pStyle w:val="Compact"/>
+              <w:spacing w:before="20" w:after="20"/>
+            </w:pPr>
+            <w:r>
+              <w:rPr>
+                <w:sz w:val="19"/>
+              </w:rPr>
+              <w:t>html</w:t>
+            </w:r>
+          </w:p>
+        </w:tc>
+        <w:tc>
+          <w:tcPr>
+            <w:tcW w:w="0" w:type="auto"/>
+          </w:tcPr>
+          <w:p>
+            <w:pPr>
+              <w:pStyle w:val="Compact"/>
+              <w:spacing w:before="20" w:after="20"/>
+            </w:pPr>
+            <w:r>
+              <w:rPr>
+                <w:sz w:val="19"/>
+              </w:rPr>
+              <w:t>Paste-ready Outlook invitation for attendees: session details, what to bring, and links to the workbook, sample data, and handouts</w:t>
+            </w:r>
+          </w:p>
+        </w:tc>
+      </w:tr>
+      <w:tr>
+        <w:tc>
+          <w:tcPr>
+            <w:tcW w:w="0" w:type="auto"/>
+          </w:tcPr>
+          <w:p>
+            <w:pPr>
+              <w:pStyle w:val="Compact"/>
+              <w:spacing w:before="20" w:after="20"/>
+            </w:pPr>
+            <w:hyperlink r:id="rId21">
+              <w:r>
+                <w:rPr>
+                  <w:rStyle w:val="Hyperlink"/>
+                </w:rPr>
+                <w:t>communication/instructor-email.html</w:t>
+              </w:r>
+            </w:hyperlink>
+          </w:p>
+        </w:tc>
+        <w:tc>
+          <w:tcPr>
+            <w:tcW w:w="0" w:type="auto"/>
+          </w:tcPr>
+          <w:p>
+            <w:pPr>
+              <w:pStyle w:val="Compact"/>
+              <w:spacing w:before="20" w:after="20"/>
+            </w:pPr>
+            <w:r>
+              <w:rPr>
+                <w:sz w:val="19"/>
+              </w:rPr>
+              <w:t>html</w:t>
+            </w:r>
+          </w:p>
+        </w:tc>
+        <w:tc>
+          <w:tcPr>
+            <w:tcW w:w="0" w:type="auto"/>
+          </w:tcPr>
+          <w:p>
+            <w:pPr>
+              <w:pStyle w:val="Compact"/>
+              <w:spacing w:before="20" w:after="20"/>
+            </w:pPr>
+            <w:r>
+              <w:rPr>
+                <w:sz w:val="19"/>
+              </w:rPr>
+              <w:t>Paste-ready Outlook email for the instructor: links to every kit asset, the preparation timeline, and key reminders</w:t>
+            </w:r>
+          </w:p>
+        </w:tc>
+      </w:tr>
+      <w:tr>
+        <w:tc>
+          <w:tcPr>
+            <w:tcW w:w="0" w:type="auto"/>
+          </w:tcPr>
+          <w:p>
+            <w:pPr>
+              <w:pStyle w:val="Compact"/>
+              <w:spacing w:before="20" w:after="20"/>
+            </w:pPr>
+            <w:r>
+              <w:rPr>
+                <w:sz w:val="19"/>
+              </w:rPr>
+              <w:t>instructor/readiness-checklist</w:t>
+            </w:r>
+          </w:p>
+        </w:tc>
+        <w:tc>
+          <w:tcPr>
+            <w:tcW w:w="0" w:type="auto"/>
+          </w:tcPr>
+          <w:p>
+            <w:pPr>
+              <w:pStyle w:val="Compact"/>
+              <w:spacing w:before="20" w:after="20"/>
+            </w:pPr>
+            <w:hyperlink r:id="rId22">
               <w:r>
                 <w:rPr>
                   <w:rStyle w:val="Hyperlink"/>
@@ -2313,7 +2720,7 @@
               </w:rPr>
               <w:t xml:space="preserve"> · </w:t>
             </w:r>
-            <w:hyperlink r:id="rId13">
+            <w:hyperlink r:id="rId23">
               <w:r>
                 <w:rPr>
                   <w:rStyle w:val="Hyperlink"/>
@@ -2355,20 +2762,20 @@
               <w:rPr>
                 <w:sz w:val="19"/>
               </w:rPr>
-              <w:t>seed-content</w:t>
-            </w:r>
-          </w:p>
-        </w:tc>
-        <w:tc>
-          <w:tcPr>
-            <w:tcW w:w="0" w:type="auto"/>
-          </w:tcPr>
-          <w:p>
-            <w:pPr>
-              <w:pStyle w:val="Compact"/>
-              <w:spacing w:before="20" w:after="20"/>
-            </w:pPr>
-            <w:hyperlink r:id="rId14">
+              <w:t>instructor/seed-content</w:t>
+            </w:r>
+          </w:p>
+        </w:tc>
+        <w:tc>
+          <w:tcPr>
+            <w:tcW w:w="0" w:type="auto"/>
+          </w:tcPr>
+          <w:p>
+            <w:pPr>
+              <w:pStyle w:val="Compact"/>
+              <w:spacing w:before="20" w:after="20"/>
+            </w:pPr>
+            <w:hyperlink r:id="rId24">
               <w:r>
                 <w:rPr>
                   <w:rStyle w:val="Hyperlink"/>
@@ -2382,7 +2789,7 @@
               </w:rPr>
               <w:t xml:space="preserve"> · </w:t>
             </w:r>
-            <w:hyperlink r:id="rId15">
+            <w:hyperlink r:id="rId25">
               <w:r>
                 <w:rPr>
                   <w:rStyle w:val="Hyperlink"/>
@@ -2424,20 +2831,20 @@
               <w:rPr>
                 <w:sz w:val="19"/>
               </w:rPr>
-              <w:t>facilitator-guide</w:t>
-            </w:r>
-          </w:p>
-        </w:tc>
-        <w:tc>
-          <w:tcPr>
-            <w:tcW w:w="0" w:type="auto"/>
-          </w:tcPr>
-          <w:p>
-            <w:pPr>
-              <w:pStyle w:val="Compact"/>
-              <w:spacing w:before="20" w:after="20"/>
-            </w:pPr>
-            <w:hyperlink r:id="rId16">
+              <w:t>instructor/facilitator-guide</w:t>
+            </w:r>
+          </w:p>
+        </w:tc>
+        <w:tc>
+          <w:tcPr>
+            <w:tcW w:w="0" w:type="auto"/>
+          </w:tcPr>
+          <w:p>
+            <w:pPr>
+              <w:pStyle w:val="Compact"/>
+              <w:spacing w:before="20" w:after="20"/>
+            </w:pPr>
+            <w:hyperlink r:id="rId26">
               <w:r>
                 <w:rPr>
                   <w:rStyle w:val="Hyperlink"/>
@@ -2451,7 +2858,7 @@
               </w:rPr>
               <w:t xml:space="preserve"> · </w:t>
             </w:r>
-            <w:hyperlink r:id="rId17">
+            <w:hyperlink r:id="rId27">
               <w:r>
                 <w:rPr>
                   <w:rStyle w:val="Hyperlink"/>
@@ -2493,20 +2900,20 @@
               <w:rPr>
                 <w:sz w:val="19"/>
               </w:rPr>
-              <w:t>facilitator-answer-key</w:t>
-            </w:r>
-          </w:p>
-        </w:tc>
-        <w:tc>
-          <w:tcPr>
-            <w:tcW w:w="0" w:type="auto"/>
-          </w:tcPr>
-          <w:p>
-            <w:pPr>
-              <w:pStyle w:val="Compact"/>
-              <w:spacing w:before="20" w:after="20"/>
-            </w:pPr>
-            <w:hyperlink r:id="rId18">
+              <w:t>instructor/facilitator-answer-key</w:t>
+            </w:r>
+          </w:p>
+        </w:tc>
+        <w:tc>
+          <w:tcPr>
+            <w:tcW w:w="0" w:type="auto"/>
+          </w:tcPr>
+          <w:p>
+            <w:pPr>
+              <w:pStyle w:val="Compact"/>
+              <w:spacing w:before="20" w:after="20"/>
+            </w:pPr>
+            <w:hyperlink r:id="rId28">
               <w:r>
                 <w:rPr>
                   <w:rStyle w:val="Hyperlink"/>
@@ -2520,7 +2927,7 @@
               </w:rPr>
               <w:t xml:space="preserve"> · </w:t>
             </w:r>
-            <w:hyperlink r:id="rId19">
+            <w:hyperlink r:id="rId29">
               <w:r>
                 <w:rPr>
                   <w:rStyle w:val="Hyperlink"/>
@@ -2562,20 +2969,20 @@
               <w:rPr>
                 <w:sz w:val="19"/>
               </w:rPr>
-              <w:t>participant-workbook</w:t>
-            </w:r>
-          </w:p>
-        </w:tc>
-        <w:tc>
-          <w:tcPr>
-            <w:tcW w:w="0" w:type="auto"/>
-          </w:tcPr>
-          <w:p>
-            <w:pPr>
-              <w:pStyle w:val="Compact"/>
-              <w:spacing w:before="20" w:after="20"/>
-            </w:pPr>
-            <w:hyperlink r:id="rId20">
+              <w:t>participant/participant-workbook</w:t>
+            </w:r>
+          </w:p>
+        </w:tc>
+        <w:tc>
+          <w:tcPr>
+            <w:tcW w:w="0" w:type="auto"/>
+          </w:tcPr>
+          <w:p>
+            <w:pPr>
+              <w:pStyle w:val="Compact"/>
+              <w:spacing w:before="20" w:after="20"/>
+            </w:pPr>
+            <w:hyperlink r:id="rId30">
               <w:r>
                 <w:rPr>
                   <w:rStyle w:val="Hyperlink"/>
@@ -2589,7 +2996,7 @@
               </w:rPr>
               <w:t xml:space="preserve"> · </w:t>
             </w:r>
-            <w:hyperlink r:id="rId21">
+            <w:hyperlink r:id="rId31">
               <w:r>
                 <w:rPr>
                   <w:rStyle w:val="Hyperlink"/>
@@ -2627,375 +3034,12 @@
               <w:pStyle w:val="Compact"/>
               <w:spacing w:before="20" w:after="20"/>
             </w:pPr>
-            <w:hyperlink r:id="rId22">
-              <w:r>
-                <w:rPr>
-                  <w:rStyle w:val="Hyperlink"/>
-                </w:rPr>
-                <w:t>quick-reference-card.docx</w:t>
-              </w:r>
-            </w:hyperlink>
-          </w:p>
-        </w:tc>
-        <w:tc>
-          <w:tcPr>
-            <w:tcW w:w="0" w:type="auto"/>
-          </w:tcPr>
-          <w:p>
-            <w:pPr>
-              <w:pStyle w:val="Compact"/>
-              <w:spacing w:before="20" w:after="20"/>
-            </w:pPr>
-            <w:r>
-              <w:rPr>
-                <w:sz w:val="19"/>
-              </w:rPr>
-              <w:t>docx</w:t>
-            </w:r>
-          </w:p>
-        </w:tc>
-        <w:tc>
-          <w:tcPr>
-            <w:tcW w:w="0" w:type="auto"/>
-          </w:tcPr>
-          <w:p>
-            <w:pPr>
-              <w:pStyle w:val="Compact"/>
-              <w:spacing w:before="20" w:after="20"/>
-            </w:pPr>
-            <w:r>
-              <w:rPr>
-                <w:sz w:val="19"/>
-              </w:rPr>
-              <w:t>One-page printable handout: tools, prompt recipe, approvals, UI map, golden rules</w:t>
-            </w:r>
-          </w:p>
-        </w:tc>
-      </w:tr>
-      <w:tr>
-        <w:tc>
-          <w:tcPr>
-            <w:tcW w:w="0" w:type="auto"/>
-          </w:tcPr>
-          <w:p>
-            <w:pPr>
-              <w:pStyle w:val="Compact"/>
-              <w:spacing w:before="20" w:after="20"/>
-            </w:pPr>
-            <w:r>
-              <w:rPr>
-                <w:sz w:val="19"/>
-              </w:rPr>
-              <w:t>after-the-workshop</w:t>
-            </w:r>
-          </w:p>
-        </w:tc>
-        <w:tc>
-          <w:tcPr>
-            <w:tcW w:w="0" w:type="auto"/>
-          </w:tcPr>
-          <w:p>
-            <w:pPr>
-              <w:pStyle w:val="Compact"/>
-              <w:spacing w:before="20" w:after="20"/>
-            </w:pPr>
-            <w:hyperlink r:id="rId23">
-              <w:r>
-                <w:rPr>
-                  <w:rStyle w:val="Hyperlink"/>
-                </w:rPr>
-                <w:t>.md</w:t>
-              </w:r>
-            </w:hyperlink>
-            <w:r>
-              <w:rPr>
-                <w:sz w:val="19"/>
-              </w:rPr>
-              <w:t xml:space="preserve"> · </w:t>
-            </w:r>
-            <w:hyperlink r:id="rId24">
-              <w:r>
-                <w:rPr>
-                  <w:rStyle w:val="Hyperlink"/>
-                </w:rPr>
-                <w:t>.docx</w:t>
-              </w:r>
-            </w:hyperlink>
-          </w:p>
-        </w:tc>
-        <w:tc>
-          <w:tcPr>
-            <w:tcW w:w="0" w:type="auto"/>
-          </w:tcPr>
-          <w:p>
-            <w:pPr>
-              <w:pStyle w:val="Compact"/>
-              <w:spacing w:before="20" w:after="20"/>
-            </w:pPr>
-            <w:r>
-              <w:rPr>
-                <w:sz w:val="19"/>
-              </w:rPr>
-              <w:t>Knowledge check, feedback survey (for Microsoft Forms), and 30-day adoption plan</w:t>
-            </w:r>
-          </w:p>
-        </w:tc>
-      </w:tr>
-      <w:tr>
-        <w:tc>
-          <w:tcPr>
-            <w:tcW w:w="0" w:type="auto"/>
-          </w:tcPr>
-          <w:p>
-            <w:pPr>
-              <w:pStyle w:val="Compact"/>
-              <w:spacing w:before="20" w:after="20"/>
-            </w:pPr>
-            <w:r>
-              <w:rPr>
-                <w:sz w:val="19"/>
-              </w:rPr>
-              <w:lastRenderedPageBreak/>
-              <w:t>reference/00-copilot-vs-cowork</w:t>
-            </w:r>
-          </w:p>
-        </w:tc>
-        <w:tc>
-          <w:tcPr>
-            <w:tcW w:w="0" w:type="auto"/>
-          </w:tcPr>
-          <w:p>
-            <w:pPr>
-              <w:pStyle w:val="Compact"/>
-              <w:spacing w:before="20" w:after="20"/>
-            </w:pPr>
-            <w:hyperlink r:id="rId25">
-              <w:r>
-                <w:rPr>
-                  <w:rStyle w:val="Hyperlink"/>
-                </w:rPr>
-                <w:t>.md</w:t>
-              </w:r>
-            </w:hyperlink>
-            <w:r>
-              <w:rPr>
-                <w:sz w:val="19"/>
-              </w:rPr>
-              <w:t xml:space="preserve"> · </w:t>
-            </w:r>
-            <w:hyperlink r:id="rId26">
-              <w:r>
-                <w:rPr>
-                  <w:rStyle w:val="Hyperlink"/>
-                </w:rPr>
-                <w:t>.docx</w:t>
-              </w:r>
-            </w:hyperlink>
-          </w:p>
-        </w:tc>
-        <w:tc>
-          <w:tcPr>
-            <w:tcW w:w="0" w:type="auto"/>
-          </w:tcPr>
-          <w:p>
-            <w:pPr>
-              <w:pStyle w:val="Compact"/>
-              <w:spacing w:before="20" w:after="20"/>
-            </w:pPr>
-            <w:r>
-              <w:rPr>
-                <w:sz w:val="19"/>
-              </w:rPr>
-              <w:t>Copilot Chat vs. Cowork — the difference (training opener)</w:t>
-            </w:r>
-          </w:p>
-        </w:tc>
-      </w:tr>
-      <w:tr>
-        <w:tc>
-          <w:tcPr>
-            <w:tcW w:w="0" w:type="auto"/>
-          </w:tcPr>
-          <w:p>
-            <w:pPr>
-              <w:pStyle w:val="Compact"/>
-              <w:spacing w:before="20" w:after="20"/>
-            </w:pPr>
-            <w:r>
-              <w:rPr>
-                <w:sz w:val="19"/>
-              </w:rPr>
-              <w:t>reference/01-cowork-overview</w:t>
-            </w:r>
-          </w:p>
-        </w:tc>
-        <w:tc>
-          <w:tcPr>
-            <w:tcW w:w="0" w:type="auto"/>
-          </w:tcPr>
-          <w:p>
-            <w:pPr>
-              <w:pStyle w:val="Compact"/>
-              <w:spacing w:before="20" w:after="20"/>
-            </w:pPr>
-            <w:hyperlink r:id="rId27">
-              <w:r>
-                <w:rPr>
-                  <w:rStyle w:val="Hyperlink"/>
-                </w:rPr>
-                <w:t>.md</w:t>
-              </w:r>
-            </w:hyperlink>
-            <w:r>
-              <w:rPr>
-                <w:sz w:val="19"/>
-              </w:rPr>
-              <w:t xml:space="preserve"> · </w:t>
-            </w:r>
-            <w:hyperlink r:id="rId28">
-              <w:r>
-                <w:rPr>
-                  <w:rStyle w:val="Hyperlink"/>
-                </w:rPr>
-                <w:t>.docx</w:t>
-              </w:r>
-            </w:hyperlink>
-          </w:p>
-        </w:tc>
-        <w:tc>
-          <w:tcPr>
-            <w:tcW w:w="0" w:type="auto"/>
-          </w:tcPr>
-          <w:p>
-            <w:pPr>
-              <w:pStyle w:val="Compact"/>
-              <w:spacing w:before="20" w:after="20"/>
-            </w:pPr>
-            <w:r>
-              <w:rPr>
-                <w:sz w:val="19"/>
-              </w:rPr>
-              <w:t>What Cowork is and where to use it</w:t>
-            </w:r>
-          </w:p>
-        </w:tc>
-      </w:tr>
-      <w:tr>
-        <w:tc>
-          <w:tcPr>
-            <w:tcW w:w="0" w:type="auto"/>
-          </w:tcPr>
-          <w:p>
-            <w:pPr>
-              <w:pStyle w:val="Compact"/>
-              <w:spacing w:before="20" w:after="20"/>
-            </w:pPr>
-            <w:r>
-              <w:rPr>
-                <w:sz w:val="19"/>
-              </w:rPr>
-              <w:t>reference/02-settings-and-models</w:t>
-            </w:r>
-          </w:p>
-        </w:tc>
-        <w:tc>
-          <w:tcPr>
-            <w:tcW w:w="0" w:type="auto"/>
-          </w:tcPr>
-          <w:p>
-            <w:pPr>
-              <w:pStyle w:val="Compact"/>
-              <w:spacing w:before="20" w:after="20"/>
-            </w:pPr>
-            <w:hyperlink r:id="rId29">
-              <w:r>
-                <w:rPr>
-                  <w:rStyle w:val="Hyperlink"/>
-                </w:rPr>
-                <w:t>.md</w:t>
-              </w:r>
-            </w:hyperlink>
-            <w:r>
-              <w:rPr>
-                <w:sz w:val="19"/>
-              </w:rPr>
-              <w:t xml:space="preserve"> · </w:t>
-            </w:r>
-            <w:hyperlink r:id="rId30">
-              <w:r>
-                <w:rPr>
-                  <w:rStyle w:val="Hyperlink"/>
-                </w:rPr>
-                <w:t>.docx</w:t>
-              </w:r>
-            </w:hyperlink>
-          </w:p>
-        </w:tc>
-        <w:tc>
-          <w:tcPr>
-            <w:tcW w:w="0" w:type="auto"/>
-          </w:tcPr>
-          <w:p>
-            <w:pPr>
-              <w:pStyle w:val="Compact"/>
-              <w:spacing w:before="20" w:after="20"/>
-            </w:pPr>
-            <w:r>
-              <w:rPr>
-                <w:sz w:val="19"/>
-              </w:rPr>
-              <w:t>Settings, model picker, reasoning effort, automations</w:t>
-            </w:r>
-          </w:p>
-        </w:tc>
-      </w:tr>
-      <w:tr>
-        <w:tc>
-          <w:tcPr>
-            <w:tcW w:w="0" w:type="auto"/>
-          </w:tcPr>
-          <w:p>
-            <w:pPr>
-              <w:pStyle w:val="Compact"/>
-              <w:spacing w:before="20" w:after="20"/>
-            </w:pPr>
-            <w:r>
-              <w:rPr>
-                <w:sz w:val="19"/>
-              </w:rPr>
-              <w:t>reference/03-skills-catalog</w:t>
-            </w:r>
-          </w:p>
-        </w:tc>
-        <w:tc>
-          <w:tcPr>
-            <w:tcW w:w="0" w:type="auto"/>
-          </w:tcPr>
-          <w:p>
-            <w:pPr>
-              <w:pStyle w:val="Compact"/>
-              <w:spacing w:before="20" w:after="20"/>
-            </w:pPr>
-            <w:hyperlink r:id="rId31">
-              <w:r>
-                <w:rPr>
-                  <w:rStyle w:val="Hyperlink"/>
-                </w:rPr>
-                <w:t>.md</w:t>
-              </w:r>
-            </w:hyperlink>
-            <w:r>
-              <w:rPr>
-                <w:sz w:val="19"/>
-              </w:rPr>
-              <w:t xml:space="preserve"> · </w:t>
-            </w:r>
             <w:hyperlink r:id="rId32">
               <w:r>
                 <w:rPr>
                   <w:rStyle w:val="Hyperlink"/>
                 </w:rPr>
-                <w:t>.docx</w:t>
+                <w:t>participant/quick-reference-card.docx</w:t>
               </w:r>
             </w:hyperlink>
           </w:p>
@@ -3013,7 +3057,24 @@
               <w:rPr>
                 <w:sz w:val="19"/>
               </w:rPr>
-              <w:t>Built-in skills and how skills work</w:t>
+              <w:t>docx</w:t>
+            </w:r>
+          </w:p>
+        </w:tc>
+        <w:tc>
+          <w:tcPr>
+            <w:tcW w:w="0" w:type="auto"/>
+          </w:tcPr>
+          <w:p>
+            <w:pPr>
+              <w:pStyle w:val="Compact"/>
+              <w:spacing w:before="20" w:after="20"/>
+            </w:pPr>
+            <w:r>
+              <w:rPr>
+                <w:sz w:val="19"/>
+              </w:rPr>
+              <w:t>One-page printable handout: tools, prompt recipe, approvals, UI map, golden rules</w:t>
             </w:r>
           </w:p>
         </w:tc>
@@ -3032,7 +3093,7 @@
               <w:rPr>
                 <w:sz w:val="19"/>
               </w:rPr>
-              <w:t>reference/04-prompt-library</w:t>
+              <w:t>participant/after-the-workshop</w:t>
             </w:r>
           </w:p>
         </w:tc>
@@ -3082,7 +3143,7 @@
               <w:rPr>
                 <w:sz w:val="19"/>
               </w:rPr>
-              <w:t>Copy-paste HR prompts by scenario</w:t>
+              <w:t>Knowledge check, feedback survey (for Microsoft Forms), and 30-day adoption plan</w:t>
             </w:r>
           </w:p>
         </w:tc>
@@ -3101,7 +3162,7 @@
               <w:rPr>
                 <w:sz w:val="19"/>
               </w:rPr>
-              <w:t>reference/05-custom-skill-guide</w:t>
+              <w:t>reference/00-copilot-vs-cowork</w:t>
             </w:r>
           </w:p>
         </w:tc>
@@ -3151,7 +3212,7 @@
               <w:rPr>
                 <w:sz w:val="19"/>
               </w:rPr>
-              <w:t>How to build, evaluate, and share a custom skill</w:t>
+              <w:t>Copilot Chat vs. Cowork — the difference (training opener)</w:t>
             </w:r>
           </w:p>
         </w:tc>
@@ -3170,7 +3231,7 @@
               <w:rPr>
                 <w:sz w:val="19"/>
               </w:rPr>
-              <w:t>reference/06-responsible-use</w:t>
+              <w:t>reference/01-cowork-overview</w:t>
             </w:r>
           </w:p>
         </w:tc>
@@ -3220,7 +3281,7 @@
               <w:rPr>
                 <w:sz w:val="19"/>
               </w:rPr>
-              <w:t>Data handling and responsible-use rules</w:t>
+              <w:t>What Cowork is and where to use it</w:t>
             </w:r>
           </w:p>
         </w:tc>
@@ -3239,7 +3300,7 @@
               <w:rPr>
                 <w:sz w:val="19"/>
               </w:rPr>
-              <w:t>reference/07-cowork-ui-walkthrough</w:t>
+              <w:t>reference/02-settings-and-models</w:t>
             </w:r>
           </w:p>
         </w:tc>
@@ -3289,7 +3350,7 @@
               <w:rPr>
                 <w:sz w:val="19"/>
               </w:rPr>
-              <w:t>UI tour — New task, My tasks, Automations, Customize</w:t>
+              <w:t>Settings, model picker, reasoning effort, automations</w:t>
             </w:r>
           </w:p>
         </w:tc>
@@ -3308,7 +3369,7 @@
               <w:rPr>
                 <w:sz w:val="19"/>
               </w:rPr>
-              <w:t>reference/08-agent-builder-policy-agent</w:t>
+              <w:t>reference/03-skills-catalog</w:t>
             </w:r>
           </w:p>
         </w:tc>
@@ -3358,7 +3419,7 @@
               <w:rPr>
                 <w:sz w:val="19"/>
               </w:rPr>
-              <w:t>Build a Policy Agent with Copilot Agent Builder (Exercise 8)</w:t>
+              <w:t>Built-in skills and how skills work</w:t>
             </w:r>
           </w:p>
         </w:tc>
@@ -3377,7 +3438,7 @@
               <w:rPr>
                 <w:sz w:val="19"/>
               </w:rPr>
-              <w:t>reference/09-plugins</w:t>
+              <w:t>reference/04-prompt-library</w:t>
             </w:r>
           </w:p>
         </w:tc>
@@ -3427,7 +3488,7 @@
               <w:rPr>
                 <w:sz w:val="19"/>
               </w:rPr>
-              <w:t>Spotlight: extend Cowork with HR plugins (Customize → Plugins), with an MCP example for IT</w:t>
+              <w:t>Copy-paste HR prompts by scenario</w:t>
             </w:r>
           </w:p>
         </w:tc>
@@ -3446,7 +3507,7 @@
               <w:rPr>
                 <w:sz w:val="19"/>
               </w:rPr>
-              <w:t>reference/10-cowork-browser</w:t>
+              <w:t>reference/05-custom-skill-guide</w:t>
             </w:r>
           </w:p>
         </w:tc>
@@ -3496,7 +3557,7 @@
               <w:rPr>
                 <w:sz w:val="19"/>
               </w:rPr>
-              <w:t>Navigate websites with Cowork's browser: what it is, how to turn it on, troubleshooting (Exercise 3)</w:t>
+              <w:t>How to build, evaluate, and share a custom skill</w:t>
             </w:r>
           </w:p>
         </w:tc>
@@ -3515,7 +3576,7 @@
               <w:rPr>
                 <w:sz w:val="19"/>
               </w:rPr>
-              <w:t>skills/hr-policy-answer/SKILL</w:t>
+              <w:t>reference/06-responsible-use</w:t>
             </w:r>
           </w:p>
         </w:tc>
@@ -3540,7 +3601,7 @@
               <w:rPr>
                 <w:sz w:val="19"/>
               </w:rPr>
-              <w:t xml:space="preserve"> (used by Cowork) · </w:t>
+              <w:t xml:space="preserve"> · </w:t>
             </w:r>
             <w:hyperlink r:id="rId48">
               <w:r>
@@ -3550,28 +3611,22 @@
                 <w:t>.docx</w:t>
               </w:r>
             </w:hyperlink>
-            <w:r>
-              <w:rPr>
-                <w:sz w:val="19"/>
-              </w:rPr>
-              <w:t xml:space="preserve"> (read-only copy)</w:t>
-            </w:r>
-          </w:p>
-        </w:tc>
-        <w:tc>
-          <w:tcPr>
-            <w:tcW w:w="0" w:type="auto"/>
-          </w:tcPr>
-          <w:p>
-            <w:pPr>
-              <w:pStyle w:val="Compact"/>
-              <w:spacing w:before="20" w:after="20"/>
-            </w:pPr>
-            <w:r>
-              <w:rPr>
-                <w:sz w:val="19"/>
-              </w:rPr>
-              <w:t>Example custom skill (reference/answer key)</w:t>
+          </w:p>
+        </w:tc>
+        <w:tc>
+          <w:tcPr>
+            <w:tcW w:w="0" w:type="auto"/>
+          </w:tcPr>
+          <w:p>
+            <w:pPr>
+              <w:pStyle w:val="Compact"/>
+              <w:spacing w:before="20" w:after="20"/>
+            </w:pPr>
+            <w:r>
+              <w:rPr>
+                <w:sz w:val="19"/>
+              </w:rPr>
+              <w:t>Data handling and responsible-use rules</w:t>
             </w:r>
           </w:p>
         </w:tc>
@@ -3586,7 +3641,359 @@
               <w:pStyle w:val="Compact"/>
               <w:spacing w:before="20" w:after="20"/>
             </w:pPr>
+            <w:r>
+              <w:rPr>
+                <w:sz w:val="19"/>
+              </w:rPr>
+              <w:t>reference/07-cowork-ui-walkthrough</w:t>
+            </w:r>
+          </w:p>
+        </w:tc>
+        <w:tc>
+          <w:tcPr>
+            <w:tcW w:w="0" w:type="auto"/>
+          </w:tcPr>
+          <w:p>
+            <w:pPr>
+              <w:pStyle w:val="Compact"/>
+              <w:spacing w:before="20" w:after="20"/>
+            </w:pPr>
             <w:hyperlink r:id="rId49">
+              <w:r>
+                <w:rPr>
+                  <w:rStyle w:val="Hyperlink"/>
+                </w:rPr>
+                <w:t>.md</w:t>
+              </w:r>
+            </w:hyperlink>
+            <w:r>
+              <w:rPr>
+                <w:sz w:val="19"/>
+              </w:rPr>
+              <w:t xml:space="preserve"> · </w:t>
+            </w:r>
+            <w:hyperlink r:id="rId50">
+              <w:r>
+                <w:rPr>
+                  <w:rStyle w:val="Hyperlink"/>
+                </w:rPr>
+                <w:t>.docx</w:t>
+              </w:r>
+            </w:hyperlink>
+          </w:p>
+        </w:tc>
+        <w:tc>
+          <w:tcPr>
+            <w:tcW w:w="0" w:type="auto"/>
+          </w:tcPr>
+          <w:p>
+            <w:pPr>
+              <w:pStyle w:val="Compact"/>
+              <w:spacing w:before="20" w:after="20"/>
+            </w:pPr>
+            <w:r>
+              <w:rPr>
+                <w:sz w:val="19"/>
+              </w:rPr>
+              <w:t>UI tour — New task, My tasks, Automations, Customize</w:t>
+            </w:r>
+          </w:p>
+        </w:tc>
+      </w:tr>
+      <w:tr>
+        <w:tc>
+          <w:tcPr>
+            <w:tcW w:w="0" w:type="auto"/>
+          </w:tcPr>
+          <w:p>
+            <w:pPr>
+              <w:pStyle w:val="Compact"/>
+              <w:spacing w:before="20" w:after="20"/>
+            </w:pPr>
+            <w:r>
+              <w:rPr>
+                <w:sz w:val="19"/>
+              </w:rPr>
+              <w:lastRenderedPageBreak/>
+              <w:t>reference/08-agent-builder-policy-agent</w:t>
+            </w:r>
+          </w:p>
+        </w:tc>
+        <w:tc>
+          <w:tcPr>
+            <w:tcW w:w="0" w:type="auto"/>
+          </w:tcPr>
+          <w:p>
+            <w:pPr>
+              <w:pStyle w:val="Compact"/>
+              <w:spacing w:before="20" w:after="20"/>
+            </w:pPr>
+            <w:hyperlink r:id="rId51">
+              <w:r>
+                <w:rPr>
+                  <w:rStyle w:val="Hyperlink"/>
+                </w:rPr>
+                <w:t>.md</w:t>
+              </w:r>
+            </w:hyperlink>
+            <w:r>
+              <w:rPr>
+                <w:sz w:val="19"/>
+              </w:rPr>
+              <w:t xml:space="preserve"> · </w:t>
+            </w:r>
+            <w:hyperlink r:id="rId52">
+              <w:r>
+                <w:rPr>
+                  <w:rStyle w:val="Hyperlink"/>
+                </w:rPr>
+                <w:t>.docx</w:t>
+              </w:r>
+            </w:hyperlink>
+          </w:p>
+        </w:tc>
+        <w:tc>
+          <w:tcPr>
+            <w:tcW w:w="0" w:type="auto"/>
+          </w:tcPr>
+          <w:p>
+            <w:pPr>
+              <w:pStyle w:val="Compact"/>
+              <w:spacing w:before="20" w:after="20"/>
+            </w:pPr>
+            <w:r>
+              <w:rPr>
+                <w:sz w:val="19"/>
+              </w:rPr>
+              <w:t>Build a Policy Agent with Copilot Agent Builder (Exercise 8)</w:t>
+            </w:r>
+          </w:p>
+        </w:tc>
+      </w:tr>
+      <w:tr>
+        <w:tc>
+          <w:tcPr>
+            <w:tcW w:w="0" w:type="auto"/>
+          </w:tcPr>
+          <w:p>
+            <w:pPr>
+              <w:pStyle w:val="Compact"/>
+              <w:spacing w:before="20" w:after="20"/>
+            </w:pPr>
+            <w:r>
+              <w:rPr>
+                <w:sz w:val="19"/>
+              </w:rPr>
+              <w:t>reference/09-plugins</w:t>
+            </w:r>
+          </w:p>
+        </w:tc>
+        <w:tc>
+          <w:tcPr>
+            <w:tcW w:w="0" w:type="auto"/>
+          </w:tcPr>
+          <w:p>
+            <w:pPr>
+              <w:pStyle w:val="Compact"/>
+              <w:spacing w:before="20" w:after="20"/>
+            </w:pPr>
+            <w:hyperlink r:id="rId53">
+              <w:r>
+                <w:rPr>
+                  <w:rStyle w:val="Hyperlink"/>
+                </w:rPr>
+                <w:t>.md</w:t>
+              </w:r>
+            </w:hyperlink>
+            <w:r>
+              <w:rPr>
+                <w:sz w:val="19"/>
+              </w:rPr>
+              <w:t xml:space="preserve"> · </w:t>
+            </w:r>
+            <w:hyperlink r:id="rId54">
+              <w:r>
+                <w:rPr>
+                  <w:rStyle w:val="Hyperlink"/>
+                </w:rPr>
+                <w:t>.docx</w:t>
+              </w:r>
+            </w:hyperlink>
+          </w:p>
+        </w:tc>
+        <w:tc>
+          <w:tcPr>
+            <w:tcW w:w="0" w:type="auto"/>
+          </w:tcPr>
+          <w:p>
+            <w:pPr>
+              <w:pStyle w:val="Compact"/>
+              <w:spacing w:before="20" w:after="20"/>
+            </w:pPr>
+            <w:r>
+              <w:rPr>
+                <w:sz w:val="19"/>
+              </w:rPr>
+              <w:t>Spotlight: extend Cowork with HR plugins (Customize → Plugins), with an MCP example for IT</w:t>
+            </w:r>
+          </w:p>
+        </w:tc>
+      </w:tr>
+      <w:tr>
+        <w:tc>
+          <w:tcPr>
+            <w:tcW w:w="0" w:type="auto"/>
+          </w:tcPr>
+          <w:p>
+            <w:pPr>
+              <w:pStyle w:val="Compact"/>
+              <w:spacing w:before="20" w:after="20"/>
+            </w:pPr>
+            <w:r>
+              <w:rPr>
+                <w:sz w:val="19"/>
+              </w:rPr>
+              <w:t>reference/10-cowork-browser</w:t>
+            </w:r>
+          </w:p>
+        </w:tc>
+        <w:tc>
+          <w:tcPr>
+            <w:tcW w:w="0" w:type="auto"/>
+          </w:tcPr>
+          <w:p>
+            <w:pPr>
+              <w:pStyle w:val="Compact"/>
+              <w:spacing w:before="20" w:after="20"/>
+            </w:pPr>
+            <w:hyperlink r:id="rId55">
+              <w:r>
+                <w:rPr>
+                  <w:rStyle w:val="Hyperlink"/>
+                </w:rPr>
+                <w:t>.md</w:t>
+              </w:r>
+            </w:hyperlink>
+            <w:r>
+              <w:rPr>
+                <w:sz w:val="19"/>
+              </w:rPr>
+              <w:t xml:space="preserve"> · </w:t>
+            </w:r>
+            <w:hyperlink r:id="rId56">
+              <w:r>
+                <w:rPr>
+                  <w:rStyle w:val="Hyperlink"/>
+                </w:rPr>
+                <w:t>.docx</w:t>
+              </w:r>
+            </w:hyperlink>
+          </w:p>
+        </w:tc>
+        <w:tc>
+          <w:tcPr>
+            <w:tcW w:w="0" w:type="auto"/>
+          </w:tcPr>
+          <w:p>
+            <w:pPr>
+              <w:pStyle w:val="Compact"/>
+              <w:spacing w:before="20" w:after="20"/>
+            </w:pPr>
+            <w:r>
+              <w:rPr>
+                <w:sz w:val="19"/>
+              </w:rPr>
+              <w:t>Navigate websites with Cowork's browser: what it is, how to turn it on, troubleshooting (Exercise 3)</w:t>
+            </w:r>
+          </w:p>
+        </w:tc>
+      </w:tr>
+      <w:tr>
+        <w:tc>
+          <w:tcPr>
+            <w:tcW w:w="0" w:type="auto"/>
+          </w:tcPr>
+          <w:p>
+            <w:pPr>
+              <w:pStyle w:val="Compact"/>
+              <w:spacing w:before="20" w:after="20"/>
+            </w:pPr>
+            <w:r>
+              <w:rPr>
+                <w:sz w:val="19"/>
+              </w:rPr>
+              <w:t>skills/hr-policy-answer/SKILL</w:t>
+            </w:r>
+          </w:p>
+        </w:tc>
+        <w:tc>
+          <w:tcPr>
+            <w:tcW w:w="0" w:type="auto"/>
+          </w:tcPr>
+          <w:p>
+            <w:pPr>
+              <w:pStyle w:val="Compact"/>
+              <w:spacing w:before="20" w:after="20"/>
+            </w:pPr>
+            <w:hyperlink r:id="rId57">
+              <w:r>
+                <w:rPr>
+                  <w:rStyle w:val="Hyperlink"/>
+                </w:rPr>
+                <w:t>.md</w:t>
+              </w:r>
+            </w:hyperlink>
+            <w:r>
+              <w:rPr>
+                <w:sz w:val="19"/>
+              </w:rPr>
+              <w:t xml:space="preserve"> (used by Cowork) · </w:t>
+            </w:r>
+            <w:hyperlink r:id="rId58">
+              <w:r>
+                <w:rPr>
+                  <w:rStyle w:val="Hyperlink"/>
+                </w:rPr>
+                <w:t>.docx</w:t>
+              </w:r>
+            </w:hyperlink>
+            <w:r>
+              <w:rPr>
+                <w:sz w:val="19"/>
+              </w:rPr>
+              <w:t xml:space="preserve"> (read-only copy)</w:t>
+            </w:r>
+          </w:p>
+        </w:tc>
+        <w:tc>
+          <w:tcPr>
+            <w:tcW w:w="0" w:type="auto"/>
+          </w:tcPr>
+          <w:p>
+            <w:pPr>
+              <w:pStyle w:val="Compact"/>
+              <w:spacing w:before="20" w:after="20"/>
+            </w:pPr>
+            <w:r>
+              <w:rPr>
+                <w:sz w:val="19"/>
+              </w:rPr>
+              <w:t>Example custom skill (reference/answer key)</w:t>
+            </w:r>
+          </w:p>
+        </w:tc>
+      </w:tr>
+      <w:tr>
+        <w:tc>
+          <w:tcPr>
+            <w:tcW w:w="0" w:type="auto"/>
+          </w:tcPr>
+          <w:p>
+            <w:pPr>
+              <w:pStyle w:val="Compact"/>
+              <w:spacing w:before="20" w:after="20"/>
+            </w:pPr>
+            <w:hyperlink r:id="rId59">
               <w:r>
                 <w:rPr>
                   <w:rStyle w:val="Hyperlink"/>
@@ -3640,7 +4047,13 @@
               <w:rPr>
                 <w:sz w:val="19"/>
               </w:rPr>
-              <w:t xml:space="preserve"> HR data: the Word/Excel files used in the exercises, plus their editable .md/.csv sources</w:t>
+              <w:t xml:space="preserve"> </w:t>
+            </w:r>
+            <w:r>
+              <w:rPr>
+                <w:sz w:val="19"/>
+              </w:rPr>
+              <w:t>HR data: the Word/Excel files used in the exercises, plus their editable .md/.csv sources</w:t>
             </w:r>
           </w:p>
         </w:tc>
@@ -3655,12 +4068,12 @@
               <w:pStyle w:val="Compact"/>
               <w:spacing w:before="20" w:after="20"/>
             </w:pPr>
-            <w:hyperlink r:id="rId50">
+            <w:hyperlink r:id="rId60">
               <w:r>
                 <w:rPr>
                   <w:rStyle w:val="Hyperlink"/>
                 </w:rPr>
-                <w:t>zava-sample-knowledge.zip</w:t>
+                <w:t>participant/zava-sample-knowledge.zip</w:t>
               </w:r>
             </w:hyperlink>
           </w:p>
@@ -3739,7 +4152,7 @@
       <w:r>
         <w:t xml:space="preserve"> sample files. They work in both Cowork and Agent Builder (which doesn't accept .md or .csv). Download </w:t>
       </w:r>
-      <w:hyperlink r:id="rId51">
+      <w:hyperlink r:id="rId61">
         <w:r>
           <w:rPr>
             <w:rStyle w:val="Hyperlink"/>
@@ -3881,7 +4294,7 @@
               <w:pStyle w:val="Compact"/>
               <w:spacing w:before="20" w:after="20"/>
             </w:pPr>
-            <w:hyperlink r:id="rId52">
+            <w:hyperlink r:id="rId62">
               <w:r>
                 <w:rPr>
                   <w:rStyle w:val="Hyperlink"/>
@@ -3936,7 +4349,7 @@
               <w:pStyle w:val="Compact"/>
               <w:spacing w:before="20" w:after="20"/>
             </w:pPr>
-            <w:hyperlink r:id="rId53">
+            <w:hyperlink r:id="rId63">
               <w:r>
                 <w:rPr>
                   <w:rStyle w:val="Hyperlink"/>
@@ -3991,7 +4404,7 @@
               <w:pStyle w:val="Compact"/>
               <w:spacing w:before="20" w:after="20"/>
             </w:pPr>
-            <w:hyperlink r:id="rId54">
+            <w:hyperlink r:id="rId64">
               <w:r>
                 <w:rPr>
                   <w:rStyle w:val="Hyperlink"/>
@@ -4046,7 +4459,7 @@
               <w:pStyle w:val="Compact"/>
               <w:spacing w:before="20" w:after="20"/>
             </w:pPr>
-            <w:hyperlink r:id="rId55">
+            <w:hyperlink r:id="rId65">
               <w:r>
                 <w:rPr>
                   <w:rStyle w:val="Hyperlink"/>
@@ -4101,7 +4514,7 @@
               <w:pStyle w:val="Compact"/>
               <w:spacing w:before="20" w:after="20"/>
             </w:pPr>
-            <w:hyperlink r:id="rId56">
+            <w:hyperlink r:id="rId66">
               <w:r>
                 <w:rPr>
                   <w:rStyle w:val="Hyperlink"/>
@@ -4156,7 +4569,7 @@
               <w:pStyle w:val="Compact"/>
               <w:spacing w:before="20" w:after="20"/>
             </w:pPr>
-            <w:hyperlink r:id="rId57">
+            <w:hyperlink r:id="rId67">
               <w:r>
                 <w:rPr>
                   <w:rStyle w:val="Hyperlink"/>
@@ -4255,7 +4668,7 @@
         <w:pStyle w:val="Heading2"/>
       </w:pPr>
       <w:bookmarkStart w:id="14" w:name="how-to-use-this-kit"/>
-      <w:bookmarkStart w:id="15" w:name="_Toc241858849"/>
+      <w:bookmarkStart w:id="15" w:name="_Toc241869868"/>
       <w:bookmarkEnd w:id="11"/>
       <w:bookmarkEnd w:id="13"/>
       <w:r>
@@ -4268,7 +4681,7 @@
         <w:pStyle w:val="Compact"/>
         <w:numPr>
           <w:ilvl w:val="0"/>
-          <w:numId w:val="4"/>
+          <w:numId w:val="5"/>
         </w:numPr>
       </w:pPr>
       <w:r>
@@ -4281,7 +4694,7 @@
       <w:r>
         <w:t xml:space="preserve"> follow the </w:t>
       </w:r>
-      <w:hyperlink r:id="rId58">
+      <w:hyperlink r:id="rId68">
         <w:r>
           <w:rPr>
             <w:rStyle w:val="Hyperlink"/>
@@ -4292,7 +4705,7 @@
       <w:r>
         <w:t xml:space="preserve">. Provision accounts, estimate cost, and load </w:t>
       </w:r>
-      <w:hyperlink r:id="rId59">
+      <w:hyperlink r:id="rId69">
         <w:r>
           <w:rPr>
             <w:rStyle w:val="Hyperlink"/>
@@ -4301,7 +4714,43 @@
         </w:r>
       </w:hyperlink>
       <w:r>
-        <w:t xml:space="preserve"> the day before.</w:t>
+        <w:t xml:space="preserve"> the day before. Send the instructor the </w:t>
+      </w:r>
+      <w:hyperlink r:id="rId70">
+        <w:r>
+          <w:rPr>
+            <w:rStyle w:val="Hyperlink"/>
+          </w:rPr>
+          <w:t>instructor email</w:t>
+        </w:r>
+      </w:hyperlink>
+      <w:r>
+        <w:t xml:space="preserve">, and attendees the </w:t>
+      </w:r>
+      <w:hyperlink r:id="rId71">
+        <w:r>
+          <w:rPr>
+            <w:rStyle w:val="Hyperlink"/>
+          </w:rPr>
+          <w:t>participant email</w:t>
+        </w:r>
+      </w:hyperlink>
+      <w:r>
+        <w:t xml:space="preserve"> one week out; use the </w:t>
+      </w:r>
+      <w:hyperlink r:id="rId72">
+        <w:r>
+          <w:rPr>
+            <w:rStyle w:val="Hyperlink"/>
+          </w:rPr>
+          <w:t>training overview deck</w:t>
+        </w:r>
+      </w:hyperlink>
+      <w:r>
+        <w:t xml:space="preserve"> to introduce the workshop. To use </w:t>
+      </w:r>
+      <w:r>
+        <w:t>either email, open it in a browser, copy the email, and paste it into Outlook. Its links point to this private repo, so give recipients access or swap in your Teams/SharePoint links.</w:t>
       </w:r>
     </w:p>
     <w:p>
@@ -4309,7 +4758,7 @@
         <w:pStyle w:val="Compact"/>
         <w:numPr>
           <w:ilvl w:val="0"/>
-          <w:numId w:val="4"/>
+          <w:numId w:val="5"/>
         </w:numPr>
       </w:pPr>
       <w:r>
@@ -4322,7 +4771,7 @@
       <w:r>
         <w:t xml:space="preserve"> read </w:t>
       </w:r>
-      <w:hyperlink r:id="rId60">
+      <w:hyperlink r:id="rId73">
         <w:r>
           <w:rPr>
             <w:rStyle w:val="Hyperlink"/>
@@ -4333,7 +4782,7 @@
       <w:r>
         <w:t xml:space="preserve">, do a full dry run against the </w:t>
       </w:r>
-      <w:hyperlink r:id="rId61">
+      <w:hyperlink r:id="rId74">
         <w:r>
           <w:rPr>
             <w:rStyle w:val="Hyperlink"/>
@@ -4344,7 +4793,7 @@
       <w:r>
         <w:t xml:space="preserve">, and present with </w:t>
       </w:r>
-      <w:hyperlink r:id="rId62">
+      <w:hyperlink r:id="rId75">
         <w:r>
           <w:rPr>
             <w:rStyle w:val="Hyperlink"/>
@@ -4361,7 +4810,7 @@
         <w:pStyle w:val="Compact"/>
         <w:numPr>
           <w:ilvl w:val="0"/>
-          <w:numId w:val="4"/>
+          <w:numId w:val="5"/>
         </w:numPr>
       </w:pPr>
       <w:r>
@@ -4369,12 +4818,16 @@
           <w:b/>
           <w:bCs/>
         </w:rPr>
+        <w:lastRenderedPageBreak/>
         <w:t>Attendees:</w:t>
       </w:r>
       <w:r>
-        <w:t xml:space="preserve"> on the day, follow </w:t>
-      </w:r>
-      <w:hyperlink r:id="rId63">
+        <w:t xml:space="preserve"> </w:t>
+      </w:r>
+      <w:r>
+        <w:t xml:space="preserve">on the day, follow </w:t>
+      </w:r>
+      <w:hyperlink r:id="rId76">
         <w:r>
           <w:rPr>
             <w:rStyle w:val="Hyperlink"/>
@@ -4385,7 +4838,7 @@
       <w:r>
         <w:t xml:space="preserve"> start to finish, with the printed </w:t>
       </w:r>
-      <w:hyperlink r:id="rId64">
+      <w:hyperlink r:id="rId77">
         <w:r>
           <w:rPr>
             <w:rStyle w:val="Hyperlink"/>
@@ -4396,7 +4849,7 @@
       <w:r>
         <w:t xml:space="preserve"> and the </w:t>
       </w:r>
-      <w:hyperlink r:id="rId65">
+      <w:hyperlink r:id="rId78">
         <w:r>
           <w:rPr>
             <w:rStyle w:val="Hyperlink"/>
@@ -4413,7 +4866,7 @@
         <w:pStyle w:val="Compact"/>
         <w:numPr>
           <w:ilvl w:val="0"/>
-          <w:numId w:val="4"/>
+          <w:numId w:val="5"/>
         </w:numPr>
       </w:pPr>
       <w:r>
@@ -4426,7 +4879,7 @@
       <w:r>
         <w:t xml:space="preserve"> send </w:t>
       </w:r>
-      <w:hyperlink r:id="rId66">
+      <w:hyperlink r:id="rId79">
         <w:r>
           <w:rPr>
             <w:rStyle w:val="Hyperlink"/>
@@ -4443,7 +4896,7 @@
         <w:pStyle w:val="Compact"/>
         <w:numPr>
           <w:ilvl w:val="0"/>
-          <w:numId w:val="4"/>
+          <w:numId w:val="5"/>
         </w:numPr>
       </w:pPr>
       <w:r>
@@ -4482,7 +4935,7 @@
         <w:pStyle w:val="Heading2"/>
       </w:pPr>
       <w:bookmarkStart w:id="16" w:name="requirement-coverage"/>
-      <w:bookmarkStart w:id="17" w:name="_Toc241858850"/>
+      <w:bookmarkStart w:id="17" w:name="_Toc241869869"/>
       <w:bookmarkEnd w:id="14"/>
       <w:r>
         <w:t>Requirement coverage</w:t>
@@ -4494,7 +4947,7 @@
         <w:pStyle w:val="Compact"/>
         <w:numPr>
           <w:ilvl w:val="0"/>
-          <w:numId w:val="5"/>
+          <w:numId w:val="6"/>
         </w:numPr>
       </w:pPr>
       <w:r>
@@ -4519,7 +4972,7 @@
         <w:pStyle w:val="Compact"/>
         <w:numPr>
           <w:ilvl w:val="0"/>
-          <w:numId w:val="5"/>
+          <w:numId w:val="6"/>
         </w:numPr>
       </w:pPr>
       <w:r>
@@ -4544,7 +4997,7 @@
         <w:pStyle w:val="Compact"/>
         <w:numPr>
           <w:ilvl w:val="0"/>
-          <w:numId w:val="5"/>
+          <w:numId w:val="6"/>
         </w:numPr>
       </w:pPr>
       <w:r>
@@ -4559,7 +5012,7 @@
         <w:pStyle w:val="Compact"/>
         <w:numPr>
           <w:ilvl w:val="0"/>
-          <w:numId w:val="5"/>
+          <w:numId w:val="6"/>
         </w:numPr>
       </w:pPr>
       <w:r>
@@ -4584,7 +5037,7 @@
         <w:pStyle w:val="Compact"/>
         <w:numPr>
           <w:ilvl w:val="0"/>
-          <w:numId w:val="5"/>
+          <w:numId w:val="6"/>
         </w:numPr>
       </w:pPr>
       <w:r>
@@ -4619,7 +5072,7 @@
         <w:pStyle w:val="Compact"/>
         <w:numPr>
           <w:ilvl w:val="0"/>
-          <w:numId w:val="5"/>
+          <w:numId w:val="6"/>
         </w:numPr>
       </w:pPr>
       <w:r>
@@ -4654,7 +5107,7 @@
         <w:pStyle w:val="Compact"/>
         <w:numPr>
           <w:ilvl w:val="0"/>
-          <w:numId w:val="5"/>
+          <w:numId w:val="6"/>
         </w:numPr>
       </w:pPr>
       <w:r>
@@ -4699,7 +5152,7 @@
         <w:pStyle w:val="Compact"/>
         <w:numPr>
           <w:ilvl w:val="0"/>
-          <w:numId w:val="5"/>
+          <w:numId w:val="6"/>
         </w:numPr>
       </w:pPr>
       <w:r>
@@ -4724,7 +5177,7 @@
         <w:pStyle w:val="Compact"/>
         <w:numPr>
           <w:ilvl w:val="0"/>
-          <w:numId w:val="5"/>
+          <w:numId w:val="6"/>
         </w:numPr>
       </w:pPr>
       <w:r>
@@ -4751,7 +5204,10 @@
         <w:t>Copilot Agent Builder</w:t>
       </w:r>
       <w:r>
-        <w:t xml:space="preserve"> (Exercise 8)</w:t>
+        <w:t xml:space="preserve"> </w:t>
+      </w:r>
+      <w:r>
+        <w:t>(Exercise 8)</w:t>
       </w:r>
     </w:p>
     <w:p>
@@ -4759,7 +5215,7 @@
         <w:pStyle w:val="Compact"/>
         <w:numPr>
           <w:ilvl w:val="0"/>
-          <w:numId w:val="5"/>
+          <w:numId w:val="6"/>
         </w:numPr>
       </w:pPr>
       <w:r>
@@ -4794,7 +5250,7 @@
         <w:pStyle w:val="Compact"/>
         <w:numPr>
           <w:ilvl w:val="0"/>
-          <w:numId w:val="5"/>
+          <w:numId w:val="6"/>
         </w:numPr>
       </w:pPr>
       <w:r>
@@ -4819,7 +5275,7 @@
         <w:pStyle w:val="Compact"/>
         <w:numPr>
           <w:ilvl w:val="0"/>
-          <w:numId w:val="5"/>
+          <w:numId w:val="6"/>
         </w:numPr>
       </w:pPr>
       <w:r>
@@ -4901,7 +5357,7 @@
         <w:pStyle w:val="Compact"/>
         <w:numPr>
           <w:ilvl w:val="0"/>
-          <w:numId w:val="5"/>
+          <w:numId w:val="6"/>
         </w:numPr>
       </w:pPr>
       <w:r>
@@ -4913,8 +5369,7 @@
     </w:p>
     <w:p>
       <w:r>
-        <w:lastRenderedPageBreak/>
-        <w:pict w14:anchorId="6F9EC6E8">
+        <w:pict w14:anchorId="60524D95">
           <v:rect id="_x0000_i1025" style="width:0;height:1.5pt" o:hralign="center" o:hrstd="t" o:hr="t"/>
         </w:pict>
       </w:r>
@@ -4928,9 +5383,16 @@
           <w:i/>
           <w:iCs/>
         </w:rPr>
-        <w:t xml:space="preserve">Sample content depicts the fictional company "Zava" and is for training purposes only. Divider illustrations: </w:t>
-      </w:r>
-      <w:hyperlink r:id="rId67">
+        <w:t xml:space="preserve">Sample content depicts the fictional company "Zava" and is for training purposes only. </w:t>
+      </w:r>
+      <w:r>
+        <w:rPr>
+          <w:i/>
+          <w:iCs/>
+        </w:rPr>
+        <w:t xml:space="preserve">Divider illustrations: </w:t>
+      </w:r>
+      <w:hyperlink r:id="rId80">
         <w:r>
           <w:rPr>
             <w:rStyle w:val="Hyperlink"/>
@@ -4951,7 +5413,7 @@
       <w:bookmarkEnd w:id="16"/>
     </w:p>
     <w:sectPr>
-      <w:footerReference w:type="default" r:id="rId68"/>
+      <w:footerReference w:type="default" r:id="rId81"/>
       <w:footnotePr>
         <w:numRestart w:val="eachSect"/>
       </w:footnotePr>
@@ -5071,7 +5533,7 @@
   <w:abstractNum w:abstractNumId="0" w15:restartNumberingAfterBreak="0">
     <w:nsid w:val="0000A990"/>
     <w:multiLevelType w:val="multilevel"/>
-    <w:tmpl w:val="FA706520"/>
+    <w:tmpl w:val="1BDE94CE"/>
     <w:lvl w:ilvl="0">
       <w:numFmt w:val="bullet"/>
       <w:lvlText w:val=" "/>
@@ -5148,7 +5610,7 @@
   <w:abstractNum w:abstractNumId="1" w15:restartNumberingAfterBreak="0">
     <w:nsid w:val="0000A991"/>
     <w:multiLevelType w:val="multilevel"/>
-    <w:tmpl w:val="80CA409E"/>
+    <w:tmpl w:val="972AAAC4"/>
     <w:lvl w:ilvl="0">
       <w:numFmt w:val="bullet"/>
       <w:lvlText w:val=""/>
@@ -5252,7 +5714,7 @@
   <w:abstractNum w:abstractNumId="2" w15:restartNumberingAfterBreak="0">
     <w:nsid w:val="00A99411"/>
     <w:multiLevelType w:val="multilevel"/>
-    <w:tmpl w:val="DDCC8216"/>
+    <w:tmpl w:val="6C28C2AC"/>
     <w:lvl w:ilvl="0">
       <w:start w:val="1"/>
       <w:numFmt w:val="decimal"/>
@@ -5335,10 +5797,10 @@
       </w:pPr>
     </w:lvl>
   </w:abstractNum>
-  <w:num w:numId="1" w16cid:durableId="1179004737">
+  <w:num w:numId="1" w16cid:durableId="1588802274">
     <w:abstractNumId w:val="0"/>
   </w:num>
-  <w:num w:numId="2" w16cid:durableId="452678937">
+  <w:num w:numId="2" w16cid:durableId="534974269">
     <w:abstractNumId w:val="2"/>
     <w:lvlOverride w:ilvl="0">
       <w:startOverride w:val="1"/>
@@ -5368,10 +5830,13 @@
       <w:startOverride w:val="1"/>
     </w:lvlOverride>
   </w:num>
-  <w:num w:numId="3" w16cid:durableId="1528058854">
+  <w:num w:numId="3" w16cid:durableId="1300037992">
     <w:abstractNumId w:val="1"/>
   </w:num>
-  <w:num w:numId="4" w16cid:durableId="119307553">
+  <w:num w:numId="4" w16cid:durableId="28459922">
+    <w:abstractNumId w:val="1"/>
+  </w:num>
+  <w:num w:numId="5" w16cid:durableId="2091151776">
     <w:abstractNumId w:val="2"/>
     <w:lvlOverride w:ilvl="0">
       <w:startOverride w:val="1"/>
@@ -5401,7 +5866,7 @@
       <w:startOverride w:val="1"/>
     </w:lvlOverride>
   </w:num>
-  <w:num w:numId="5" w16cid:durableId="1134449184">
+  <w:num w:numId="6" w16cid:durableId="915749101">
     <w:abstractNumId w:val="1"/>
   </w:num>
 </w:numbering>
@@ -6652,7 +7117,7 @@
     <w:next w:val="Normal"/>
     <w:autoRedefine/>
     <w:uiPriority w:val="39"/>
-    <w:rsid w:val="00234C3D"/>
+    <w:rsid w:val="007146DD"/>
     <w:pPr>
       <w:spacing w:after="100"/>
     </w:pPr>
@@ -6663,7 +7128,7 @@
     <w:next w:val="Normal"/>
     <w:autoRedefine/>
     <w:uiPriority w:val="39"/>
-    <w:rsid w:val="00234C3D"/>
+    <w:rsid w:val="007146DD"/>
     <w:pPr>
       <w:spacing w:after="100"/>
       <w:ind w:left="210"/>
@@ -6673,7 +7138,7 @@
     <w:name w:val="header"/>
     <w:basedOn w:val="Normal"/>
     <w:link w:val="HeaderChar"/>
-    <w:rsid w:val="00234C3D"/>
+    <w:rsid w:val="007146DD"/>
     <w:pPr>
       <w:tabs>
         <w:tab w:val="center" w:pos="4513"/>
@@ -6686,7 +7151,7 @@
     <w:name w:val="Header Char"/>
     <w:basedOn w:val="DefaultParagraphFont"/>
     <w:link w:val="Header"/>
-    <w:rsid w:val="00234C3D"/>
+    <w:rsid w:val="007146DD"/>
     <w:rPr>
       <w:rFonts w:ascii="Segoe UI" w:eastAsia="Segoe UI" w:hAnsi="Segoe UI" w:cs="Segoe UI"/>
       <w:color w:val="242424"/>
@@ -6697,7 +7162,7 @@
     <w:name w:val="footer"/>
     <w:basedOn w:val="Normal"/>
     <w:link w:val="FooterChar"/>
-    <w:rsid w:val="00234C3D"/>
+    <w:rsid w:val="007146DD"/>
     <w:pPr>
       <w:tabs>
         <w:tab w:val="center" w:pos="4513"/>
@@ -6710,7 +7175,7 @@
     <w:name w:val="Footer Char"/>
     <w:basedOn w:val="DefaultParagraphFont"/>
     <w:link w:val="Footer"/>
-    <w:rsid w:val="00234C3D"/>
+    <w:rsid w:val="007146DD"/>
     <w:rPr>
       <w:rFonts w:ascii="Segoe UI" w:eastAsia="Segoe UI" w:hAnsi="Segoe UI" w:cs="Segoe UI"/>
       <w:color w:val="242424"/>

</xml_diff>

<commit_message>
Colour-code prompt elements and add a prompting best-practices slide
- Highlight Goal (blue), Source (green), Expectations (orange), and Constraints (purple) in the
  Ex 2-8 prompts instead of labelling them; the Ex 1 prompt is unchanged.
- Workbook Setup step F and new deck slide 14 explain the four elements with a weak vs. strong
  open-enrollment prompt; the prompt library and quick-reference card use the same colours.
- Word: callouts.lua maps <span class="goal|source|expect|constraint"> to shaded character styles.
  Deck: {g}/{s}/{e}/{c} markers in content.py render as highlighted runs.
- Add missing constraints/expectations to Ex 5a, 6a, and 7b.
- Rebuild the deck (47 slides) and affected Word files; note finalize_word.ps1 hang findings.

Co-Authored-By: Claude Opus 5.5 <noreply@anthropic.com>
</commit_message>
<xml_diff>
--- a/README.docx
+++ b/README.docx
@@ -10,7 +10,7 @@
           <w:sz w:val="21"/>
           <w:szCs w:val="24"/>
         </w:rPr>
-        <w:id w:val="1117726744"/>
+        <w:id w:val="-1503740854"/>
         <w:docPartObj>
           <w:docPartGallery w:val="Table of Contents"/>
           <w:docPartUnique/>
@@ -51,7 +51,7 @@
           <w:r>
             <w:fldChar w:fldCharType="separate"/>
           </w:r>
-          <w:hyperlink w:anchor="_Toc241869862" w:history="1">
+          <w:hyperlink w:anchor="_Toc241949613" w:history="1">
             <w:r>
               <w:rPr>
                 <w:rStyle w:val="Hyperlink"/>
@@ -78,7 +78,7 @@
                 <w:noProof/>
                 <w:webHidden/>
               </w:rPr>
-              <w:instrText xml:space="preserve"> PAGEREF _Toc241869862 \h </w:instrText>
+              <w:instrText xml:space="preserve"> PAGEREF _Toc241949613 \h </w:instrText>
             </w:r>
             <w:r>
               <w:rPr>
@@ -125,7 +125,7 @@
               <w14:ligatures w14:val="standardContextual"/>
             </w:rPr>
           </w:pPr>
-          <w:hyperlink w:anchor="_Toc241869863" w:history="1">
+          <w:hyperlink w:anchor="_Toc241949614" w:history="1">
             <w:r>
               <w:rPr>
                 <w:rStyle w:val="Hyperlink"/>
@@ -152,7 +152,7 @@
                 <w:noProof/>
                 <w:webHidden/>
               </w:rPr>
-              <w:instrText xml:space="preserve"> PAGEREF _Toc241869863 \h </w:instrText>
+              <w:instrText xml:space="preserve"> PAGEREF _Toc241949614 \h </w:instrText>
             </w:r>
             <w:r>
               <w:rPr>
@@ -199,7 +199,7 @@
               <w14:ligatures w14:val="standardContextual"/>
             </w:rPr>
           </w:pPr>
-          <w:hyperlink w:anchor="_Toc241869864" w:history="1">
+          <w:hyperlink w:anchor="_Toc241949615" w:history="1">
             <w:r>
               <w:rPr>
                 <w:rStyle w:val="Hyperlink"/>
@@ -226,7 +226,7 @@
                 <w:noProof/>
                 <w:webHidden/>
               </w:rPr>
-              <w:instrText xml:space="preserve"> PAGEREF _Toc241869864 \h </w:instrText>
+              <w:instrText xml:space="preserve"> PAGEREF _Toc241949615 \h </w:instrText>
             </w:r>
             <w:r>
               <w:rPr>
@@ -273,7 +273,7 @@
               <w14:ligatures w14:val="standardContextual"/>
             </w:rPr>
           </w:pPr>
-          <w:hyperlink w:anchor="_Toc241869865" w:history="1">
+          <w:hyperlink w:anchor="_Toc241949616" w:history="1">
             <w:r>
               <w:rPr>
                 <w:rStyle w:val="Hyperlink"/>
@@ -300,7 +300,7 @@
                 <w:noProof/>
                 <w:webHidden/>
               </w:rPr>
-              <w:instrText xml:space="preserve"> PAGEREF _Toc241869865 \h </w:instrText>
+              <w:instrText xml:space="preserve"> PAGEREF _Toc241949616 \h </w:instrText>
             </w:r>
             <w:r>
               <w:rPr>
@@ -347,7 +347,7 @@
               <w14:ligatures w14:val="standardContextual"/>
             </w:rPr>
           </w:pPr>
-          <w:hyperlink w:anchor="_Toc241869866" w:history="1">
+          <w:hyperlink w:anchor="_Toc241949617" w:history="1">
             <w:r>
               <w:rPr>
                 <w:rStyle w:val="Hyperlink"/>
@@ -374,7 +374,7 @@
                 <w:noProof/>
                 <w:webHidden/>
               </w:rPr>
-              <w:instrText xml:space="preserve"> PAGEREF _Toc241869866 \h </w:instrText>
+              <w:instrText xml:space="preserve"> PAGEREF _Toc241949617 \h </w:instrText>
             </w:r>
             <w:r>
               <w:rPr>
@@ -421,7 +421,7 @@
               <w14:ligatures w14:val="standardContextual"/>
             </w:rPr>
           </w:pPr>
-          <w:hyperlink w:anchor="_Toc241869867" w:history="1">
+          <w:hyperlink w:anchor="_Toc241949618" w:history="1">
             <w:r>
               <w:rPr>
                 <w:rStyle w:val="Hyperlink"/>
@@ -448,7 +448,7 @@
                 <w:noProof/>
                 <w:webHidden/>
               </w:rPr>
-              <w:instrText xml:space="preserve"> PAGEREF _Toc241869867 \h </w:instrText>
+              <w:instrText xml:space="preserve"> PAGEREF _Toc241949618 \h </w:instrText>
             </w:r>
             <w:r>
               <w:rPr>
@@ -495,7 +495,7 @@
               <w14:ligatures w14:val="standardContextual"/>
             </w:rPr>
           </w:pPr>
-          <w:hyperlink w:anchor="_Toc241869868" w:history="1">
+          <w:hyperlink w:anchor="_Toc241949619" w:history="1">
             <w:r>
               <w:rPr>
                 <w:rStyle w:val="Hyperlink"/>
@@ -522,7 +522,7 @@
                 <w:noProof/>
                 <w:webHidden/>
               </w:rPr>
-              <w:instrText xml:space="preserve"> PAGEREF _Toc241869868 \h </w:instrText>
+              <w:instrText xml:space="preserve"> PAGEREF _Toc241949619 \h </w:instrText>
             </w:r>
             <w:r>
               <w:rPr>
@@ -569,7 +569,7 @@
               <w14:ligatures w14:val="standardContextual"/>
             </w:rPr>
           </w:pPr>
-          <w:hyperlink w:anchor="_Toc241869869" w:history="1">
+          <w:hyperlink w:anchor="_Toc241949620" w:history="1">
             <w:r>
               <w:rPr>
                 <w:rStyle w:val="Hyperlink"/>
@@ -596,7 +596,7 @@
                 <w:noProof/>
                 <w:webHidden/>
               </w:rPr>
-              <w:instrText xml:space="preserve"> PAGEREF _Toc241869869 \h </w:instrText>
+              <w:instrText xml:space="preserve"> PAGEREF _Toc241949620 \h </w:instrText>
             </w:r>
             <w:r>
               <w:rPr>
@@ -639,7 +639,7 @@
         <w:pStyle w:val="Heading1"/>
       </w:pPr>
       <w:bookmarkStart w:id="0" w:name="Xa046f7e33c7391c4827688ee785cfee5a5aaa0a"/>
-      <w:bookmarkStart w:id="1" w:name="_Toc241869862"/>
+      <w:bookmarkStart w:id="1" w:name="_Toc241949613"/>
       <w:r>
         <w:t>Getting Things Done with Copilot Cowork for HR Tasks</w:t>
       </w:r>
@@ -775,7 +775,7 @@
         <w:pStyle w:val="Heading2"/>
       </w:pPr>
       <w:bookmarkStart w:id="3" w:name="learning-objectives"/>
-      <w:bookmarkStart w:id="4" w:name="_Toc241869863"/>
+      <w:bookmarkStart w:id="4" w:name="_Toc241949614"/>
       <w:bookmarkEnd w:id="2"/>
       <w:r>
         <w:t>Learning objectives</w:t>
@@ -916,7 +916,7 @@
         <w:pStyle w:val="Heading2"/>
       </w:pPr>
       <w:bookmarkStart w:id="5" w:name="who-its-for"/>
-      <w:bookmarkStart w:id="6" w:name="_Toc241869864"/>
+      <w:bookmarkStart w:id="6" w:name="_Toc241949615"/>
       <w:bookmarkEnd w:id="3"/>
       <w:r>
         <w:t>Who it's for</w:t>
@@ -1061,7 +1061,7 @@
         <w:pStyle w:val="Heading2"/>
       </w:pPr>
       <w:bookmarkStart w:id="7" w:name="prerequisites"/>
-      <w:bookmarkStart w:id="8" w:name="_Toc241869865"/>
+      <w:bookmarkStart w:id="8" w:name="_Toc241949616"/>
       <w:bookmarkEnd w:id="5"/>
       <w:r>
         <w:t>Prerequisites</w:t>
@@ -1172,7 +1172,7 @@
         <w:pStyle w:val="Heading2"/>
       </w:pPr>
       <w:bookmarkStart w:id="9" w:name="agenda-240-minutes"/>
-      <w:bookmarkStart w:id="10" w:name="_Toc241869866"/>
+      <w:bookmarkStart w:id="10" w:name="_Toc241949617"/>
       <w:bookmarkEnd w:id="7"/>
       <w:r>
         <w:t>Agenda (240 minutes)</w:t>
@@ -1908,7 +1908,7 @@
         <w:pStyle w:val="Heading2"/>
       </w:pPr>
       <w:bookmarkStart w:id="11" w:name="whats-in-this-kit"/>
-      <w:bookmarkStart w:id="12" w:name="_Toc241869867"/>
+      <w:bookmarkStart w:id="12" w:name="_Toc241949618"/>
       <w:bookmarkEnd w:id="9"/>
       <w:r>
         <w:t>What's in this kit</w:t>
@@ -2171,7 +2171,7 @@
           <w:noProof/>
         </w:rPr>
         <w:drawing>
-          <wp:inline distT="0" distB="0" distL="0" distR="0" wp14:anchorId="560615AB" wp14:editId="427A13B1">
+          <wp:inline distT="0" distB="0" distL="0" distR="0" wp14:anchorId="330F0E47" wp14:editId="63A394FB">
             <wp:extent cx="4400120" cy="1306285"/>
             <wp:effectExtent l="0" t="0" r="0" b="0"/>
             <wp:docPr id="22" name="Picture" descr="Tip: on a GitHub file page, select the Download icon (Download raw file) at the top right of the file"/>
@@ -2481,7 +2481,7 @@
               <w:rPr>
                 <w:sz w:val="19"/>
               </w:rPr>
-              <w:t xml:space="preserve">Instructor deck (46 slides, speaker notes, alt text) — a divider slide with a picture and progress tracker before each exercise, one PowerPoint section per exercise for quick navigation, objectives, approvals, a </w:t>
+              <w:t xml:space="preserve">Instructor deck (47 slides, speaker notes, alt text) — a </w:t>
             </w:r>
             <w:r>
               <w:rPr>
@@ -2489,13 +2489,33 @@
                 <w:bCs/>
                 <w:sz w:val="19"/>
               </w:rPr>
+              <w:t>prompting best-practices slide</w:t>
+            </w:r>
+            <w:r>
+              <w:rPr>
+                <w:sz w:val="19"/>
+              </w:rPr>
+              <w:t xml:space="preserve"> (Goal, Source, Expectations, Constraints, with a weak vs. strong HR prompt), a divider slide with a picture and progress tracker before each exercise, one PowerPoint section per exercise for quick navigation, objectives, approvals, a </w:t>
+            </w:r>
+            <w:r>
+              <w:rPr>
+                <w:b/>
+                <w:bCs/>
+                <w:sz w:val="19"/>
+              </w:rPr>
               <w:t>workshop kit slide with download links</w:t>
             </w:r>
             <w:r>
               <w:rPr>
                 <w:sz w:val="19"/>
               </w:rPr>
-              <w:t xml:space="preserve"> for participants and instructors, a scenario card + hands-on slide per exercise, an Output folder walkthrough, an HR plugins spotlight, and a knowledge check</w:t>
+              <w:t xml:space="preserve"> </w:t>
+            </w:r>
+            <w:r>
+              <w:rPr>
+                <w:sz w:val="19"/>
+              </w:rPr>
+              <w:t>for participants and instructors, a scenario card + hands-on slide per exercise, an Output folder walkthrough, an HR plugins spotlight, and a knowledge check</w:t>
             </w:r>
           </w:p>
         </w:tc>
@@ -3645,6 +3665,7 @@
               <w:rPr>
                 <w:sz w:val="19"/>
               </w:rPr>
+              <w:lastRenderedPageBreak/>
               <w:t>reference/07-cowork-ui-walkthrough</w:t>
             </w:r>
           </w:p>
@@ -3714,7 +3735,6 @@
               <w:rPr>
                 <w:sz w:val="19"/>
               </w:rPr>
-              <w:lastRenderedPageBreak/>
               <w:t>reference/08-agent-builder-policy-agent</w:t>
             </w:r>
           </w:p>
@@ -4668,7 +4688,7 @@
         <w:pStyle w:val="Heading2"/>
       </w:pPr>
       <w:bookmarkStart w:id="14" w:name="how-to-use-this-kit"/>
-      <w:bookmarkStart w:id="15" w:name="_Toc241869868"/>
+      <w:bookmarkStart w:id="15" w:name="_Toc241949619"/>
       <w:bookmarkEnd w:id="11"/>
       <w:bookmarkEnd w:id="13"/>
       <w:r>
@@ -4766,6 +4786,7 @@
           <w:b/>
           <w:bCs/>
         </w:rPr>
+        <w:lastRenderedPageBreak/>
         <w:t>Facilitator:</w:t>
       </w:r>
       <w:r>
@@ -4818,7 +4839,6 @@
           <w:b/>
           <w:bCs/>
         </w:rPr>
-        <w:lastRenderedPageBreak/>
         <w:t>Attendees:</w:t>
       </w:r>
       <w:r>
@@ -4935,7 +4955,7 @@
         <w:pStyle w:val="Heading2"/>
       </w:pPr>
       <w:bookmarkStart w:id="16" w:name="requirement-coverage"/>
-      <w:bookmarkStart w:id="17" w:name="_Toc241869869"/>
+      <w:bookmarkStart w:id="17" w:name="_Toc241949620"/>
       <w:bookmarkEnd w:id="14"/>
       <w:r>
         <w:t>Requirement coverage</w:t>
@@ -5369,7 +5389,7 @@
     </w:p>
     <w:p>
       <w:r>
-        <w:pict w14:anchorId="60524D95">
+        <w:pict w14:anchorId="15973D33">
           <v:rect id="_x0000_i1025" style="width:0;height:1.5pt" o:hralign="center" o:hrstd="t" o:hr="t"/>
         </w:pict>
       </w:r>
@@ -5533,7 +5553,7 @@
   <w:abstractNum w:abstractNumId="0" w15:restartNumberingAfterBreak="0">
     <w:nsid w:val="0000A990"/>
     <w:multiLevelType w:val="multilevel"/>
-    <w:tmpl w:val="1BDE94CE"/>
+    <w:tmpl w:val="5156A8FC"/>
     <w:lvl w:ilvl="0">
       <w:numFmt w:val="bullet"/>
       <w:lvlText w:val=" "/>
@@ -5610,7 +5630,7 @@
   <w:abstractNum w:abstractNumId="1" w15:restartNumberingAfterBreak="0">
     <w:nsid w:val="0000A991"/>
     <w:multiLevelType w:val="multilevel"/>
-    <w:tmpl w:val="972AAAC4"/>
+    <w:tmpl w:val="5C96688A"/>
     <w:lvl w:ilvl="0">
       <w:numFmt w:val="bullet"/>
       <w:lvlText w:val=""/>
@@ -5714,7 +5734,7 @@
   <w:abstractNum w:abstractNumId="2" w15:restartNumberingAfterBreak="0">
     <w:nsid w:val="00A99411"/>
     <w:multiLevelType w:val="multilevel"/>
-    <w:tmpl w:val="6C28C2AC"/>
+    <w:tmpl w:val="BB986960"/>
     <w:lvl w:ilvl="0">
       <w:start w:val="1"/>
       <w:numFmt w:val="decimal"/>
@@ -5797,10 +5817,10 @@
       </w:pPr>
     </w:lvl>
   </w:abstractNum>
-  <w:num w:numId="1" w16cid:durableId="1588802274">
+  <w:num w:numId="1" w16cid:durableId="1208637559">
     <w:abstractNumId w:val="0"/>
   </w:num>
-  <w:num w:numId="2" w16cid:durableId="534974269">
+  <w:num w:numId="2" w16cid:durableId="1810393749">
     <w:abstractNumId w:val="2"/>
     <w:lvlOverride w:ilvl="0">
       <w:startOverride w:val="1"/>
@@ -5830,13 +5850,13 @@
       <w:startOverride w:val="1"/>
     </w:lvlOverride>
   </w:num>
-  <w:num w:numId="3" w16cid:durableId="1300037992">
+  <w:num w:numId="3" w16cid:durableId="1844202325">
     <w:abstractNumId w:val="1"/>
   </w:num>
-  <w:num w:numId="4" w16cid:durableId="28459922">
+  <w:num w:numId="4" w16cid:durableId="579678278">
     <w:abstractNumId w:val="1"/>
   </w:num>
-  <w:num w:numId="5" w16cid:durableId="2091151776">
+  <w:num w:numId="5" w16cid:durableId="2139295332">
     <w:abstractNumId w:val="2"/>
     <w:lvlOverride w:ilvl="0">
       <w:startOverride w:val="1"/>
@@ -5866,7 +5886,7 @@
       <w:startOverride w:val="1"/>
     </w:lvlOverride>
   </w:num>
-  <w:num w:numId="6" w16cid:durableId="915749101">
+  <w:num w:numId="6" w16cid:durableId="1747607176">
     <w:abstractNumId w:val="1"/>
   </w:num>
 </w:numbering>
@@ -6809,6 +6829,34 @@
       <w:sz w:val="4"/>
     </w:rPr>
   </w:style>
+  <w:style w:type="character" w:customStyle="1" w:styleId="PromptGoal">
+    <w:name w:val="Prompt Goal"/>
+    <w:rPr>
+      <w:color w:val="1F4E99"/>
+      <w:shd w:val="clear" w:color="auto" w:fill="DCEBFF"/>
+    </w:rPr>
+  </w:style>
+  <w:style w:type="character" w:customStyle="1" w:styleId="PromptSource">
+    <w:name w:val="Prompt Source"/>
+    <w:rPr>
+      <w:color w:val="1E6B32"/>
+      <w:shd w:val="clear" w:color="auto" w:fill="DFF5E1"/>
+    </w:rPr>
+  </w:style>
+  <w:style w:type="character" w:customStyle="1" w:styleId="PromptExpectations">
+    <w:name w:val="Prompt Expectations"/>
+    <w:rPr>
+      <w:color w:val="8A4B00"/>
+      <w:shd w:val="clear" w:color="auto" w:fill="FFE9CC"/>
+    </w:rPr>
+  </w:style>
+  <w:style w:type="character" w:customStyle="1" w:styleId="PromptConstraints">
+    <w:name w:val="Prompt Constraints"/>
+    <w:rPr>
+      <w:color w:val="5B2C91"/>
+      <w:shd w:val="clear" w:color="auto" w:fill="EDE3FA"/>
+    </w:rPr>
+  </w:style>
   <w:style w:type="paragraph" w:customStyle="1" w:styleId="SourceCode">
     <w:name w:val="Source Code"/>
     <w:basedOn w:val="Normal"/>
@@ -7117,7 +7165,7 @@
     <w:next w:val="Normal"/>
     <w:autoRedefine/>
     <w:uiPriority w:val="39"/>
-    <w:rsid w:val="007146DD"/>
+    <w:rsid w:val="00E54575"/>
     <w:pPr>
       <w:spacing w:after="100"/>
     </w:pPr>
@@ -7128,7 +7176,7 @@
     <w:next w:val="Normal"/>
     <w:autoRedefine/>
     <w:uiPriority w:val="39"/>
-    <w:rsid w:val="007146DD"/>
+    <w:rsid w:val="00E54575"/>
     <w:pPr>
       <w:spacing w:after="100"/>
       <w:ind w:left="210"/>
@@ -7138,7 +7186,7 @@
     <w:name w:val="header"/>
     <w:basedOn w:val="Normal"/>
     <w:link w:val="HeaderChar"/>
-    <w:rsid w:val="007146DD"/>
+    <w:rsid w:val="00E54575"/>
     <w:pPr>
       <w:tabs>
         <w:tab w:val="center" w:pos="4513"/>
@@ -7151,7 +7199,7 @@
     <w:name w:val="Header Char"/>
     <w:basedOn w:val="DefaultParagraphFont"/>
     <w:link w:val="Header"/>
-    <w:rsid w:val="007146DD"/>
+    <w:rsid w:val="00E54575"/>
     <w:rPr>
       <w:rFonts w:ascii="Segoe UI" w:eastAsia="Segoe UI" w:hAnsi="Segoe UI" w:cs="Segoe UI"/>
       <w:color w:val="242424"/>
@@ -7162,7 +7210,7 @@
     <w:name w:val="footer"/>
     <w:basedOn w:val="Normal"/>
     <w:link w:val="FooterChar"/>
-    <w:rsid w:val="007146DD"/>
+    <w:rsid w:val="00E54575"/>
     <w:pPr>
       <w:tabs>
         <w:tab w:val="center" w:pos="4513"/>
@@ -7175,7 +7223,7 @@
     <w:name w:val="Footer Char"/>
     <w:basedOn w:val="DefaultParagraphFont"/>
     <w:link w:val="Footer"/>
-    <w:rsid w:val="007146DD"/>
+    <w:rsid w:val="00E54575"/>
     <w:rPr>
       <w:rFonts w:ascii="Segoe UI" w:eastAsia="Segoe UI" w:hAnsi="Segoe UI" w:cs="Segoe UI"/>
       <w:color w:val="242424"/>

</xml_diff>

<commit_message>
Add demo video placeholder slides to the instructor deck
A Demo slide with an empty 16:9 media placeholder follows every exercise's
scenario card, the Copilot and Cowork UI walkthrough, and the prompting
best-practices slide (10 in all; the deck is now 57 slides). Each lists
what to watch for and has notes on inserting the recording. The
facilitator guide, readiness checklist, and instructor email now cover
recording the demos (Exercise 1 after seeding the demo account).

Co-Authored-By: Claude Opus 5.5 <noreply@anthropic.com>
</commit_message>
<xml_diff>
--- a/README.docx
+++ b/README.docx
@@ -10,7 +10,7 @@
           <w:sz w:val="21"/>
           <w:szCs w:val="24"/>
         </w:rPr>
-        <w:id w:val="-1756972969"/>
+        <w:id w:val="1679232031"/>
         <w:docPartObj>
           <w:docPartGallery w:val="Table of Contents"/>
           <w:docPartUnique/>
@@ -51,7 +51,7 @@
           <w:r>
             <w:fldChar w:fldCharType="separate"/>
           </w:r>
-          <w:hyperlink w:anchor="_Toc241956568" w:history="1">
+          <w:hyperlink w:anchor="_Toc241993867" w:history="1">
             <w:r>
               <w:rPr>
                 <w:rStyle w:val="Hyperlink"/>
@@ -78,7 +78,7 @@
                 <w:noProof/>
                 <w:webHidden/>
               </w:rPr>
-              <w:instrText xml:space="preserve"> PAGEREF _Toc241956568 \h </w:instrText>
+              <w:instrText xml:space="preserve"> PAGEREF _Toc241993867 \h </w:instrText>
             </w:r>
             <w:r>
               <w:rPr>
@@ -125,7 +125,7 @@
               <w14:ligatures w14:val="standardContextual"/>
             </w:rPr>
           </w:pPr>
-          <w:hyperlink w:anchor="_Toc241956569" w:history="1">
+          <w:hyperlink w:anchor="_Toc241993868" w:history="1">
             <w:r>
               <w:rPr>
                 <w:rStyle w:val="Hyperlink"/>
@@ -152,7 +152,7 @@
                 <w:noProof/>
                 <w:webHidden/>
               </w:rPr>
-              <w:instrText xml:space="preserve"> PAGEREF _Toc241956569 \h </w:instrText>
+              <w:instrText xml:space="preserve"> PAGEREF _Toc241993868 \h </w:instrText>
             </w:r>
             <w:r>
               <w:rPr>
@@ -199,7 +199,7 @@
               <w14:ligatures w14:val="standardContextual"/>
             </w:rPr>
           </w:pPr>
-          <w:hyperlink w:anchor="_Toc241956570" w:history="1">
+          <w:hyperlink w:anchor="_Toc241993869" w:history="1">
             <w:r>
               <w:rPr>
                 <w:rStyle w:val="Hyperlink"/>
@@ -226,7 +226,7 @@
                 <w:noProof/>
                 <w:webHidden/>
               </w:rPr>
-              <w:instrText xml:space="preserve"> PAGEREF _Toc241956570 \h </w:instrText>
+              <w:instrText xml:space="preserve"> PAGEREF _Toc241993869 \h </w:instrText>
             </w:r>
             <w:r>
               <w:rPr>
@@ -273,7 +273,7 @@
               <w14:ligatures w14:val="standardContextual"/>
             </w:rPr>
           </w:pPr>
-          <w:hyperlink w:anchor="_Toc241956571" w:history="1">
+          <w:hyperlink w:anchor="_Toc241993870" w:history="1">
             <w:r>
               <w:rPr>
                 <w:rStyle w:val="Hyperlink"/>
@@ -300,7 +300,7 @@
                 <w:noProof/>
                 <w:webHidden/>
               </w:rPr>
-              <w:instrText xml:space="preserve"> PAGEREF _Toc241956571 \h </w:instrText>
+              <w:instrText xml:space="preserve"> PAGEREF _Toc241993870 \h </w:instrText>
             </w:r>
             <w:r>
               <w:rPr>
@@ -347,7 +347,7 @@
               <w14:ligatures w14:val="standardContextual"/>
             </w:rPr>
           </w:pPr>
-          <w:hyperlink w:anchor="_Toc241956572" w:history="1">
+          <w:hyperlink w:anchor="_Toc241993871" w:history="1">
             <w:r>
               <w:rPr>
                 <w:rStyle w:val="Hyperlink"/>
@@ -374,7 +374,7 @@
                 <w:noProof/>
                 <w:webHidden/>
               </w:rPr>
-              <w:instrText xml:space="preserve"> PAGEREF _Toc241956572 \h </w:instrText>
+              <w:instrText xml:space="preserve"> PAGEREF _Toc241993871 \h </w:instrText>
             </w:r>
             <w:r>
               <w:rPr>
@@ -421,7 +421,7 @@
               <w14:ligatures w14:val="standardContextual"/>
             </w:rPr>
           </w:pPr>
-          <w:hyperlink w:anchor="_Toc241956573" w:history="1">
+          <w:hyperlink w:anchor="_Toc241993872" w:history="1">
             <w:r>
               <w:rPr>
                 <w:rStyle w:val="Hyperlink"/>
@@ -448,7 +448,7 @@
                 <w:noProof/>
                 <w:webHidden/>
               </w:rPr>
-              <w:instrText xml:space="preserve"> PAGEREF _Toc241956573 \h </w:instrText>
+              <w:instrText xml:space="preserve"> PAGEREF _Toc241993872 \h </w:instrText>
             </w:r>
             <w:r>
               <w:rPr>
@@ -495,7 +495,7 @@
               <w14:ligatures w14:val="standardContextual"/>
             </w:rPr>
           </w:pPr>
-          <w:hyperlink w:anchor="_Toc241956574" w:history="1">
+          <w:hyperlink w:anchor="_Toc241993873" w:history="1">
             <w:r>
               <w:rPr>
                 <w:rStyle w:val="Hyperlink"/>
@@ -522,7 +522,7 @@
                 <w:noProof/>
                 <w:webHidden/>
               </w:rPr>
-              <w:instrText xml:space="preserve"> PAGEREF _Toc241956574 \h </w:instrText>
+              <w:instrText xml:space="preserve"> PAGEREF _Toc241993873 \h </w:instrText>
             </w:r>
             <w:r>
               <w:rPr>
@@ -542,7 +542,7 @@
                 <w:noProof/>
                 <w:webHidden/>
               </w:rPr>
-              <w:t>5</w:t>
+              <w:t>6</w:t>
             </w:r>
             <w:r>
               <w:rPr>
@@ -569,7 +569,7 @@
               <w14:ligatures w14:val="standardContextual"/>
             </w:rPr>
           </w:pPr>
-          <w:hyperlink w:anchor="_Toc241956575" w:history="1">
+          <w:hyperlink w:anchor="_Toc241993874" w:history="1">
             <w:r>
               <w:rPr>
                 <w:rStyle w:val="Hyperlink"/>
@@ -596,7 +596,7 @@
                 <w:noProof/>
                 <w:webHidden/>
               </w:rPr>
-              <w:instrText xml:space="preserve"> PAGEREF _Toc241956575 \h </w:instrText>
+              <w:instrText xml:space="preserve"> PAGEREF _Toc241993874 \h </w:instrText>
             </w:r>
             <w:r>
               <w:rPr>
@@ -639,7 +639,7 @@
         <w:pStyle w:val="Heading1"/>
       </w:pPr>
       <w:bookmarkStart w:id="0" w:name="Xa046f7e33c7391c4827688ee785cfee5a5aaa0a"/>
-      <w:bookmarkStart w:id="1" w:name="_Toc241956568"/>
+      <w:bookmarkStart w:id="1" w:name="_Toc241993867"/>
       <w:r>
         <w:t>Getting Things Done with Copilot Cowork for HR Tasks</w:t>
       </w:r>
@@ -775,7 +775,7 @@
         <w:pStyle w:val="Heading2"/>
       </w:pPr>
       <w:bookmarkStart w:id="3" w:name="learning-objectives"/>
-      <w:bookmarkStart w:id="4" w:name="_Toc241956569"/>
+      <w:bookmarkStart w:id="4" w:name="_Toc241993868"/>
       <w:bookmarkEnd w:id="2"/>
       <w:r>
         <w:t>Learning objectives</w:t>
@@ -916,7 +916,7 @@
         <w:pStyle w:val="Heading2"/>
       </w:pPr>
       <w:bookmarkStart w:id="5" w:name="who-its-for"/>
-      <w:bookmarkStart w:id="6" w:name="_Toc241956570"/>
+      <w:bookmarkStart w:id="6" w:name="_Toc241993869"/>
       <w:bookmarkEnd w:id="3"/>
       <w:r>
         <w:t>Who it's for</w:t>
@@ -1078,7 +1078,7 @@
         <w:pStyle w:val="Heading2"/>
       </w:pPr>
       <w:bookmarkStart w:id="7" w:name="prerequisites"/>
-      <w:bookmarkStart w:id="8" w:name="_Toc241956571"/>
+      <w:bookmarkStart w:id="8" w:name="_Toc241993870"/>
       <w:bookmarkEnd w:id="5"/>
       <w:r>
         <w:t>Prerequisites</w:t>
@@ -1182,7 +1182,7 @@
         <w:pStyle w:val="Heading2"/>
       </w:pPr>
       <w:bookmarkStart w:id="9" w:name="agenda-240-minutes"/>
-      <w:bookmarkStart w:id="10" w:name="_Toc241956572"/>
+      <w:bookmarkStart w:id="10" w:name="_Toc241993871"/>
       <w:bookmarkEnd w:id="7"/>
       <w:r>
         <w:t>Agenda (240 minutes)</w:t>
@@ -1919,7 +1919,7 @@
         <w:pStyle w:val="Heading2"/>
       </w:pPr>
       <w:bookmarkStart w:id="11" w:name="whats-in-this-kit"/>
-      <w:bookmarkStart w:id="12" w:name="_Toc241956573"/>
+      <w:bookmarkStart w:id="12" w:name="_Toc241993872"/>
       <w:bookmarkEnd w:id="9"/>
       <w:r>
         <w:t>What's in this kit</w:t>
@@ -2182,7 +2182,7 @@
           <w:noProof/>
         </w:rPr>
         <w:drawing>
-          <wp:inline distT="0" distB="0" distL="0" distR="0" wp14:anchorId="166D1190" wp14:editId="7147892B">
+          <wp:inline distT="0" distB="0" distL="0" distR="0" wp14:anchorId="0F6198AD" wp14:editId="2E2AD999">
             <wp:extent cx="4400120" cy="1306285"/>
             <wp:effectExtent l="0" t="0" r="0" b="0"/>
             <wp:docPr id="23" name="Picture" descr="Tip: on a GitHub file page, select the Download icon (Download raw file) at the top right of the file"/>
@@ -2493,7 +2493,7 @@
               <w:rPr>
                 <w:sz w:val="19"/>
               </w:rPr>
-              <w:t xml:space="preserve">Instructor deck (47 slides, speaker notes, alt text) — a </w:t>
+              <w:t xml:space="preserve">Instructor deck (57 slides, speaker notes, alt text) — a </w:t>
             </w:r>
             <w:r>
               <w:rPr>
@@ -2521,7 +2521,21 @@
               <w:rPr>
                 <w:sz w:val="19"/>
               </w:rPr>
-              <w:t xml:space="preserve"> for participants and instructors, a scenario card + hands-on slide per exercise, an Output folder walkthrough, an HR plugins spotlight, and a knowledge check</w:t>
+              <w:t xml:space="preserve"> for participants and instructors, a scenario card, </w:t>
+            </w:r>
+            <w:r>
+              <w:rPr>
+                <w:b/>
+                <w:bCs/>
+                <w:sz w:val="19"/>
+              </w:rPr>
+              <w:t>demo video slide</w:t>
+            </w:r>
+            <w:r>
+              <w:rPr>
+                <w:sz w:val="19"/>
+              </w:rPr>
+              <w:t xml:space="preserve"> (an empty video frame for your recording), and hands-on slide per exercise, demo video slides for the UI walkthrough and the prompting slide, an Output folder walkthrough, an HR plugins spotlight, and a knowledge check</w:t>
             </w:r>
           </w:p>
         </w:tc>
@@ -3478,6 +3492,7 @@
               <w:rPr>
                 <w:sz w:val="19"/>
               </w:rPr>
+              <w:lastRenderedPageBreak/>
               <w:t>reference/04-prompt-library</w:t>
             </w:r>
           </w:p>
@@ -3547,7 +3562,6 @@
               <w:rPr>
                 <w:sz w:val="19"/>
               </w:rPr>
-              <w:lastRenderedPageBreak/>
               <w:t>reference/05-custom-skill-guide</w:t>
             </w:r>
           </w:p>
@@ -4087,7 +4101,13 @@
               <w:rPr>
                 <w:sz w:val="19"/>
               </w:rPr>
-              <w:t xml:space="preserve"> HR data: the Word/Excel files used in the exercises, plus their editable .md/.csv sources</w:t>
+              <w:t xml:space="preserve"> </w:t>
+            </w:r>
+            <w:r>
+              <w:rPr>
+                <w:sz w:val="19"/>
+              </w:rPr>
+              <w:t>HR data: the Word/Excel files used in the exercises, plus their editable .md/.csv sources</w:t>
             </w:r>
           </w:p>
         </w:tc>
@@ -4184,7 +4204,10 @@
         <w:t>Word and Excel</w:t>
       </w:r>
       <w:r>
-        <w:t xml:space="preserve"> sample files (Exercise 1 also reads each attendee's own mail and calendar). They work in both Cowork and Agent Builder (which doesn't accept .md or .csv). Download </w:t>
+        <w:t xml:space="preserve"> sample files (Exercise 1 also reads each attendee's own mail and calendar). They work in both Cowork and Agent Builder </w:t>
+      </w:r>
+      <w:r>
+        <w:t xml:space="preserve">(which doesn't accept .md or .csv). Download </w:t>
       </w:r>
       <w:hyperlink r:id="rId62">
         <w:r>
@@ -4694,10 +4717,7 @@
         <w:t>sample-knowledge/</w:t>
       </w:r>
       <w:r>
-        <w:t xml:space="preserve"> are the editable </w:t>
-      </w:r>
-      <w:r>
-        <w:t>sources the Word and Excel files are generated from. Attendees don't need them, and they aren't in the zip. If you change one, regenerate its Word or Excel copy so the two stay in sync.</w:t>
+        <w:t xml:space="preserve"> are the editable sources the Word and Excel files are generated from. Attendees don't need them, and they aren't in the zip. If you change one, regenerate its Word or Excel copy so the two stay in sync.</w:t>
       </w:r>
     </w:p>
     <w:p>
@@ -4705,10 +4725,11 @@
         <w:pStyle w:val="Heading2"/>
       </w:pPr>
       <w:bookmarkStart w:id="14" w:name="how-to-use-this-kit"/>
-      <w:bookmarkStart w:id="15" w:name="_Toc241956574"/>
+      <w:bookmarkStart w:id="15" w:name="_Toc241993873"/>
       <w:bookmarkEnd w:id="11"/>
       <w:bookmarkEnd w:id="13"/>
       <w:r>
+        <w:lastRenderedPageBreak/>
         <w:t>How to use this kit</w:t>
       </w:r>
       <w:bookmarkEnd w:id="15"/>
@@ -4751,14 +4772,7 @@
         </w:r>
       </w:hyperlink>
       <w:r>
-        <w:t xml:space="preserve"> </w:t>
-      </w:r>
-      <w:r>
-        <w:t xml:space="preserve">into their own </w:t>
-      </w:r>
-      <w:r>
-        <w:lastRenderedPageBreak/>
-        <w:t xml:space="preserve">demo account 1–2 days before. Send the instructor the </w:t>
+        <w:t xml:space="preserve"> into their own demo account 1–2 days before. Send the instructor the </w:t>
       </w:r>
       <w:hyperlink r:id="rId71">
         <w:r>
@@ -4791,10 +4805,7 @@
         </w:r>
       </w:hyperlink>
       <w:r>
-        <w:t xml:space="preserve"> to introduce the workshop. To use either email, open it in a browser, copy the email, and paste it into Outlook. Its links point to </w:t>
-      </w:r>
-      <w:r>
-        <w:t>this private repo, so give recipients access or swap in your Teams/SharePoint links.</w:t>
+        <w:t xml:space="preserve"> to introduce the workshop. To use either email, open it in a browser, copy the email, and paste it into Outlook. Its links point to this private repo, so give recipients access or swap in your Teams/SharePoint links.</w:t>
       </w:r>
     </w:p>
     <w:p>
@@ -4928,7 +4939,10 @@
         </w:r>
       </w:hyperlink>
       <w:r>
-        <w:t xml:space="preserve"> (knowledge check, survey, and 30-day plan) and pause the Exercise 1 and 7 schedules.</w:t>
+        <w:t xml:space="preserve"> (knowledge check, survey, and </w:t>
+      </w:r>
+      <w:r>
+        <w:t>30-day plan) and pause the Exercise 1 and 7 schedules.</w:t>
       </w:r>
     </w:p>
     <w:p>
@@ -4975,7 +4989,7 @@
         <w:pStyle w:val="Heading2"/>
       </w:pPr>
       <w:bookmarkStart w:id="16" w:name="requirement-coverage"/>
-      <w:bookmarkStart w:id="17" w:name="_Toc241956575"/>
+      <w:bookmarkStart w:id="17" w:name="_Toc241993874"/>
       <w:bookmarkEnd w:id="14"/>
       <w:r>
         <w:t>Requirement coverage</w:t>
@@ -5244,10 +5258,7 @@
         <w:t>Copilot Agent Builder</w:t>
       </w:r>
       <w:r>
-        <w:t xml:space="preserve"> </w:t>
-      </w:r>
-      <w:r>
-        <w:t>(Exercise 8)</w:t>
+        <w:t xml:space="preserve"> (Exercise 8)</w:t>
       </w:r>
     </w:p>
     <w:p>
@@ -5409,7 +5420,7 @@
     </w:p>
     <w:p>
       <w:r>
-        <w:pict w14:anchorId="606617E0">
+        <w:pict w14:anchorId="3CEA97A0">
           <v:rect id="_x0000_i1025" style="width:0;height:1.5pt" o:hralign="center" o:hrstd="t" o:hr="t"/>
         </w:pict>
       </w:r>
@@ -5566,7 +5577,7 @@
   <w:abstractNum w:abstractNumId="0" w15:restartNumberingAfterBreak="0">
     <w:nsid w:val="0000A990"/>
     <w:multiLevelType w:val="multilevel"/>
-    <w:tmpl w:val="0938F486"/>
+    <w:tmpl w:val="BD04E3C6"/>
     <w:lvl w:ilvl="0">
       <w:numFmt w:val="bullet"/>
       <w:lvlText w:val=" "/>
@@ -5643,7 +5654,7 @@
   <w:abstractNum w:abstractNumId="1" w15:restartNumberingAfterBreak="0">
     <w:nsid w:val="0000A991"/>
     <w:multiLevelType w:val="multilevel"/>
-    <w:tmpl w:val="CD1C5C70"/>
+    <w:tmpl w:val="07267770"/>
     <w:lvl w:ilvl="0">
       <w:numFmt w:val="bullet"/>
       <w:lvlText w:val=""/>
@@ -5747,7 +5758,7 @@
   <w:abstractNum w:abstractNumId="2" w15:restartNumberingAfterBreak="0">
     <w:nsid w:val="00A99411"/>
     <w:multiLevelType w:val="multilevel"/>
-    <w:tmpl w:val="E932A1B2"/>
+    <w:tmpl w:val="EC609D56"/>
     <w:lvl w:ilvl="0">
       <w:start w:val="1"/>
       <w:numFmt w:val="decimal"/>
@@ -5830,10 +5841,10 @@
       </w:pPr>
     </w:lvl>
   </w:abstractNum>
-  <w:num w:numId="1" w16cid:durableId="1309439824">
+  <w:num w:numId="1" w16cid:durableId="2135363901">
     <w:abstractNumId w:val="0"/>
   </w:num>
-  <w:num w:numId="2" w16cid:durableId="965819634">
+  <w:num w:numId="2" w16cid:durableId="1288195873">
     <w:abstractNumId w:val="2"/>
     <w:lvlOverride w:ilvl="0">
       <w:startOverride w:val="1"/>
@@ -5863,13 +5874,13 @@
       <w:startOverride w:val="1"/>
     </w:lvlOverride>
   </w:num>
-  <w:num w:numId="3" w16cid:durableId="1465124385">
+  <w:num w:numId="3" w16cid:durableId="179785170">
     <w:abstractNumId w:val="1"/>
   </w:num>
-  <w:num w:numId="4" w16cid:durableId="2143233216">
+  <w:num w:numId="4" w16cid:durableId="725227240">
     <w:abstractNumId w:val="1"/>
   </w:num>
-  <w:num w:numId="5" w16cid:durableId="339083354">
+  <w:num w:numId="5" w16cid:durableId="1226914024">
     <w:abstractNumId w:val="2"/>
     <w:lvlOverride w:ilvl="0">
       <w:startOverride w:val="1"/>
@@ -5899,7 +5910,7 @@
       <w:startOverride w:val="1"/>
     </w:lvlOverride>
   </w:num>
-  <w:num w:numId="6" w16cid:durableId="762148819">
+  <w:num w:numId="6" w16cid:durableId="219708036">
     <w:abstractNumId w:val="1"/>
   </w:num>
 </w:numbering>
@@ -7178,7 +7189,7 @@
     <w:next w:val="Normal"/>
     <w:autoRedefine/>
     <w:uiPriority w:val="39"/>
-    <w:rsid w:val="007A4352"/>
+    <w:rsid w:val="004C503F"/>
     <w:pPr>
       <w:spacing w:after="100"/>
     </w:pPr>
@@ -7189,7 +7200,7 @@
     <w:next w:val="Normal"/>
     <w:autoRedefine/>
     <w:uiPriority w:val="39"/>
-    <w:rsid w:val="007A4352"/>
+    <w:rsid w:val="004C503F"/>
     <w:pPr>
       <w:spacing w:after="100"/>
       <w:ind w:left="210"/>
@@ -7199,7 +7210,7 @@
     <w:name w:val="header"/>
     <w:basedOn w:val="Normal"/>
     <w:link w:val="HeaderChar"/>
-    <w:rsid w:val="007A4352"/>
+    <w:rsid w:val="004C503F"/>
     <w:pPr>
       <w:tabs>
         <w:tab w:val="center" w:pos="4513"/>
@@ -7212,7 +7223,7 @@
     <w:name w:val="Header Char"/>
     <w:basedOn w:val="DefaultParagraphFont"/>
     <w:link w:val="Header"/>
-    <w:rsid w:val="007A4352"/>
+    <w:rsid w:val="004C503F"/>
     <w:rPr>
       <w:rFonts w:ascii="Segoe UI" w:eastAsia="Segoe UI" w:hAnsi="Segoe UI" w:cs="Segoe UI"/>
       <w:color w:val="242424"/>
@@ -7223,7 +7234,7 @@
     <w:name w:val="footer"/>
     <w:basedOn w:val="Normal"/>
     <w:link w:val="FooterChar"/>
-    <w:rsid w:val="007A4352"/>
+    <w:rsid w:val="004C503F"/>
     <w:pPr>
       <w:tabs>
         <w:tab w:val="center" w:pos="4513"/>
@@ -7236,7 +7247,7 @@
     <w:name w:val="Footer Char"/>
     <w:basedOn w:val="DefaultParagraphFont"/>
     <w:link w:val="Footer"/>
-    <w:rsid w:val="007A4352"/>
+    <w:rsid w:val="004C503F"/>
     <w:rPr>
       <w:rFonts w:ascii="Segoe UI" w:eastAsia="Segoe UI" w:hAnsi="Segoe UI" w:cs="Segoe UI"/>
       <w:color w:val="242424"/>

</xml_diff>

<commit_message>
Put each exercise prompt in the hands-on slide speaker notes
Every Hands-on slide's notes now end with the exercise prompt as plain
text (color markers removed), one labeled block per task, so the
facilitator can copy it straight into Cowork or Agent Builder.

Co-Authored-By: Claude Opus 5.5 <noreply@anthropic.com>
</commit_message>
<xml_diff>
--- a/README.docx
+++ b/README.docx
@@ -10,7 +10,7 @@
           <w:sz w:val="21"/>
           <w:szCs w:val="24"/>
         </w:rPr>
-        <w:id w:val="1679232031"/>
+        <w:id w:val="1023668703"/>
         <w:docPartObj>
           <w:docPartGallery w:val="Table of Contents"/>
           <w:docPartUnique/>
@@ -51,7 +51,7 @@
           <w:r>
             <w:fldChar w:fldCharType="separate"/>
           </w:r>
-          <w:hyperlink w:anchor="_Toc241993867" w:history="1">
+          <w:hyperlink w:anchor="_Toc241995321" w:history="1">
             <w:r>
               <w:rPr>
                 <w:rStyle w:val="Hyperlink"/>
@@ -78,7 +78,7 @@
                 <w:noProof/>
                 <w:webHidden/>
               </w:rPr>
-              <w:instrText xml:space="preserve"> PAGEREF _Toc241993867 \h </w:instrText>
+              <w:instrText xml:space="preserve"> PAGEREF _Toc241995321 \h </w:instrText>
             </w:r>
             <w:r>
               <w:rPr>
@@ -125,7 +125,7 @@
               <w14:ligatures w14:val="standardContextual"/>
             </w:rPr>
           </w:pPr>
-          <w:hyperlink w:anchor="_Toc241993868" w:history="1">
+          <w:hyperlink w:anchor="_Toc241995322" w:history="1">
             <w:r>
               <w:rPr>
                 <w:rStyle w:val="Hyperlink"/>
@@ -152,7 +152,7 @@
                 <w:noProof/>
                 <w:webHidden/>
               </w:rPr>
-              <w:instrText xml:space="preserve"> PAGEREF _Toc241993868 \h </w:instrText>
+              <w:instrText xml:space="preserve"> PAGEREF _Toc241995322 \h </w:instrText>
             </w:r>
             <w:r>
               <w:rPr>
@@ -199,7 +199,7 @@
               <w14:ligatures w14:val="standardContextual"/>
             </w:rPr>
           </w:pPr>
-          <w:hyperlink w:anchor="_Toc241993869" w:history="1">
+          <w:hyperlink w:anchor="_Toc241995323" w:history="1">
             <w:r>
               <w:rPr>
                 <w:rStyle w:val="Hyperlink"/>
@@ -226,7 +226,7 @@
                 <w:noProof/>
                 <w:webHidden/>
               </w:rPr>
-              <w:instrText xml:space="preserve"> PAGEREF _Toc241993869 \h </w:instrText>
+              <w:instrText xml:space="preserve"> PAGEREF _Toc241995323 \h </w:instrText>
             </w:r>
             <w:r>
               <w:rPr>
@@ -273,7 +273,7 @@
               <w14:ligatures w14:val="standardContextual"/>
             </w:rPr>
           </w:pPr>
-          <w:hyperlink w:anchor="_Toc241993870" w:history="1">
+          <w:hyperlink w:anchor="_Toc241995324" w:history="1">
             <w:r>
               <w:rPr>
                 <w:rStyle w:val="Hyperlink"/>
@@ -300,7 +300,7 @@
                 <w:noProof/>
                 <w:webHidden/>
               </w:rPr>
-              <w:instrText xml:space="preserve"> PAGEREF _Toc241993870 \h </w:instrText>
+              <w:instrText xml:space="preserve"> PAGEREF _Toc241995324 \h </w:instrText>
             </w:r>
             <w:r>
               <w:rPr>
@@ -347,7 +347,7 @@
               <w14:ligatures w14:val="standardContextual"/>
             </w:rPr>
           </w:pPr>
-          <w:hyperlink w:anchor="_Toc241993871" w:history="1">
+          <w:hyperlink w:anchor="_Toc241995325" w:history="1">
             <w:r>
               <w:rPr>
                 <w:rStyle w:val="Hyperlink"/>
@@ -374,7 +374,7 @@
                 <w:noProof/>
                 <w:webHidden/>
               </w:rPr>
-              <w:instrText xml:space="preserve"> PAGEREF _Toc241993871 \h </w:instrText>
+              <w:instrText xml:space="preserve"> PAGEREF _Toc241995325 \h </w:instrText>
             </w:r>
             <w:r>
               <w:rPr>
@@ -421,7 +421,7 @@
               <w14:ligatures w14:val="standardContextual"/>
             </w:rPr>
           </w:pPr>
-          <w:hyperlink w:anchor="_Toc241993872" w:history="1">
+          <w:hyperlink w:anchor="_Toc241995326" w:history="1">
             <w:r>
               <w:rPr>
                 <w:rStyle w:val="Hyperlink"/>
@@ -448,7 +448,7 @@
                 <w:noProof/>
                 <w:webHidden/>
               </w:rPr>
-              <w:instrText xml:space="preserve"> PAGEREF _Toc241993872 \h </w:instrText>
+              <w:instrText xml:space="preserve"> PAGEREF _Toc241995326 \h </w:instrText>
             </w:r>
             <w:r>
               <w:rPr>
@@ -495,7 +495,7 @@
               <w14:ligatures w14:val="standardContextual"/>
             </w:rPr>
           </w:pPr>
-          <w:hyperlink w:anchor="_Toc241993873" w:history="1">
+          <w:hyperlink w:anchor="_Toc241995327" w:history="1">
             <w:r>
               <w:rPr>
                 <w:rStyle w:val="Hyperlink"/>
@@ -522,7 +522,7 @@
                 <w:noProof/>
                 <w:webHidden/>
               </w:rPr>
-              <w:instrText xml:space="preserve"> PAGEREF _Toc241993873 \h </w:instrText>
+              <w:instrText xml:space="preserve"> PAGEREF _Toc241995327 \h </w:instrText>
             </w:r>
             <w:r>
               <w:rPr>
@@ -569,7 +569,7 @@
               <w14:ligatures w14:val="standardContextual"/>
             </w:rPr>
           </w:pPr>
-          <w:hyperlink w:anchor="_Toc241993874" w:history="1">
+          <w:hyperlink w:anchor="_Toc241995328" w:history="1">
             <w:r>
               <w:rPr>
                 <w:rStyle w:val="Hyperlink"/>
@@ -596,7 +596,7 @@
                 <w:noProof/>
                 <w:webHidden/>
               </w:rPr>
-              <w:instrText xml:space="preserve"> PAGEREF _Toc241993874 \h </w:instrText>
+              <w:instrText xml:space="preserve"> PAGEREF _Toc241995328 \h </w:instrText>
             </w:r>
             <w:r>
               <w:rPr>
@@ -639,7 +639,7 @@
         <w:pStyle w:val="Heading1"/>
       </w:pPr>
       <w:bookmarkStart w:id="0" w:name="Xa046f7e33c7391c4827688ee785cfee5a5aaa0a"/>
-      <w:bookmarkStart w:id="1" w:name="_Toc241993867"/>
+      <w:bookmarkStart w:id="1" w:name="_Toc241995321"/>
       <w:r>
         <w:t>Getting Things Done with Copilot Cowork for HR Tasks</w:t>
       </w:r>
@@ -775,7 +775,7 @@
         <w:pStyle w:val="Heading2"/>
       </w:pPr>
       <w:bookmarkStart w:id="3" w:name="learning-objectives"/>
-      <w:bookmarkStart w:id="4" w:name="_Toc241993868"/>
+      <w:bookmarkStart w:id="4" w:name="_Toc241995322"/>
       <w:bookmarkEnd w:id="2"/>
       <w:r>
         <w:t>Learning objectives</w:t>
@@ -916,7 +916,7 @@
         <w:pStyle w:val="Heading2"/>
       </w:pPr>
       <w:bookmarkStart w:id="5" w:name="who-its-for"/>
-      <w:bookmarkStart w:id="6" w:name="_Toc241993869"/>
+      <w:bookmarkStart w:id="6" w:name="_Toc241995323"/>
       <w:bookmarkEnd w:id="3"/>
       <w:r>
         <w:t>Who it's for</w:t>
@@ -1078,7 +1078,7 @@
         <w:pStyle w:val="Heading2"/>
       </w:pPr>
       <w:bookmarkStart w:id="7" w:name="prerequisites"/>
-      <w:bookmarkStart w:id="8" w:name="_Toc241993870"/>
+      <w:bookmarkStart w:id="8" w:name="_Toc241995324"/>
       <w:bookmarkEnd w:id="5"/>
       <w:r>
         <w:t>Prerequisites</w:t>
@@ -1182,7 +1182,7 @@
         <w:pStyle w:val="Heading2"/>
       </w:pPr>
       <w:bookmarkStart w:id="9" w:name="agenda-240-minutes"/>
-      <w:bookmarkStart w:id="10" w:name="_Toc241993871"/>
+      <w:bookmarkStart w:id="10" w:name="_Toc241995325"/>
       <w:bookmarkEnd w:id="7"/>
       <w:r>
         <w:t>Agenda (240 minutes)</w:t>
@@ -1919,7 +1919,7 @@
         <w:pStyle w:val="Heading2"/>
       </w:pPr>
       <w:bookmarkStart w:id="11" w:name="whats-in-this-kit"/>
-      <w:bookmarkStart w:id="12" w:name="_Toc241993872"/>
+      <w:bookmarkStart w:id="12" w:name="_Toc241995326"/>
       <w:bookmarkEnd w:id="9"/>
       <w:r>
         <w:t>What's in this kit</w:t>
@@ -2182,7 +2182,7 @@
           <w:noProof/>
         </w:rPr>
         <w:drawing>
-          <wp:inline distT="0" distB="0" distL="0" distR="0" wp14:anchorId="0F6198AD" wp14:editId="2E2AD999">
+          <wp:inline distT="0" distB="0" distL="0" distR="0" wp14:anchorId="2CC54344" wp14:editId="26B26358">
             <wp:extent cx="4400120" cy="1306285"/>
             <wp:effectExtent l="0" t="0" r="0" b="0"/>
             <wp:docPr id="23" name="Picture" descr="Tip: on a GitHub file page, select the Download icon (Download raw file) at the top right of the file"/>
@@ -2535,7 +2535,7 @@
               <w:rPr>
                 <w:sz w:val="19"/>
               </w:rPr>
-              <w:t xml:space="preserve"> (an empty video frame for your recording), and hands-on slide per exercise, demo video slides for the UI walkthrough and the prompting slide, an Output folder walkthrough, an HR plugins spotlight, and a knowledge check</w:t>
+              <w:t xml:space="preserve"> (an empty video frame for your recording), and hands-on slide per exercise (its speaker notes carry the full prompt, ready to copy), demo video slides for the UI walkthrough and the prompting slide, an Output folder walkthrough, an HR plugins spotlight, and a knowledge check</w:t>
             </w:r>
           </w:p>
         </w:tc>
@@ -3423,6 +3423,7 @@
               <w:rPr>
                 <w:sz w:val="19"/>
               </w:rPr>
+              <w:lastRenderedPageBreak/>
               <w:t>reference/03-skills-catalog</w:t>
             </w:r>
           </w:p>
@@ -3492,7 +3493,6 @@
               <w:rPr>
                 <w:sz w:val="19"/>
               </w:rPr>
-              <w:lastRenderedPageBreak/>
               <w:t>reference/04-prompt-library</w:t>
             </w:r>
           </w:p>
@@ -4725,7 +4725,7 @@
         <w:pStyle w:val="Heading2"/>
       </w:pPr>
       <w:bookmarkStart w:id="14" w:name="how-to-use-this-kit"/>
-      <w:bookmarkStart w:id="15" w:name="_Toc241993873"/>
+      <w:bookmarkStart w:id="15" w:name="_Toc241995327"/>
       <w:bookmarkEnd w:id="11"/>
       <w:bookmarkEnd w:id="13"/>
       <w:r>
@@ -4989,7 +4989,7 @@
         <w:pStyle w:val="Heading2"/>
       </w:pPr>
       <w:bookmarkStart w:id="16" w:name="requirement-coverage"/>
-      <w:bookmarkStart w:id="17" w:name="_Toc241993874"/>
+      <w:bookmarkStart w:id="17" w:name="_Toc241995328"/>
       <w:bookmarkEnd w:id="14"/>
       <w:r>
         <w:t>Requirement coverage</w:t>
@@ -5420,7 +5420,7 @@
     </w:p>
     <w:p>
       <w:r>
-        <w:pict w14:anchorId="3CEA97A0">
+        <w:pict w14:anchorId="2499E011">
           <v:rect id="_x0000_i1025" style="width:0;height:1.5pt" o:hralign="center" o:hrstd="t" o:hr="t"/>
         </w:pict>
       </w:r>
@@ -5577,7 +5577,7 @@
   <w:abstractNum w:abstractNumId="0" w15:restartNumberingAfterBreak="0">
     <w:nsid w:val="0000A990"/>
     <w:multiLevelType w:val="multilevel"/>
-    <w:tmpl w:val="BD04E3C6"/>
+    <w:tmpl w:val="D63C3AEC"/>
     <w:lvl w:ilvl="0">
       <w:numFmt w:val="bullet"/>
       <w:lvlText w:val=" "/>
@@ -5654,7 +5654,7 @@
   <w:abstractNum w:abstractNumId="1" w15:restartNumberingAfterBreak="0">
     <w:nsid w:val="0000A991"/>
     <w:multiLevelType w:val="multilevel"/>
-    <w:tmpl w:val="07267770"/>
+    <w:tmpl w:val="204C4E7A"/>
     <w:lvl w:ilvl="0">
       <w:numFmt w:val="bullet"/>
       <w:lvlText w:val=""/>
@@ -5758,7 +5758,7 @@
   <w:abstractNum w:abstractNumId="2" w15:restartNumberingAfterBreak="0">
     <w:nsid w:val="00A99411"/>
     <w:multiLevelType w:val="multilevel"/>
-    <w:tmpl w:val="EC609D56"/>
+    <w:tmpl w:val="66C867F4"/>
     <w:lvl w:ilvl="0">
       <w:start w:val="1"/>
       <w:numFmt w:val="decimal"/>
@@ -5841,10 +5841,10 @@
       </w:pPr>
     </w:lvl>
   </w:abstractNum>
-  <w:num w:numId="1" w16cid:durableId="2135363901">
+  <w:num w:numId="1" w16cid:durableId="1983389761">
     <w:abstractNumId w:val="0"/>
   </w:num>
-  <w:num w:numId="2" w16cid:durableId="1288195873">
+  <w:num w:numId="2" w16cid:durableId="579753890">
     <w:abstractNumId w:val="2"/>
     <w:lvlOverride w:ilvl="0">
       <w:startOverride w:val="1"/>
@@ -5874,13 +5874,13 @@
       <w:startOverride w:val="1"/>
     </w:lvlOverride>
   </w:num>
-  <w:num w:numId="3" w16cid:durableId="179785170">
+  <w:num w:numId="3" w16cid:durableId="2031106731">
     <w:abstractNumId w:val="1"/>
   </w:num>
-  <w:num w:numId="4" w16cid:durableId="725227240">
+  <w:num w:numId="4" w16cid:durableId="1824927429">
     <w:abstractNumId w:val="1"/>
   </w:num>
-  <w:num w:numId="5" w16cid:durableId="1226914024">
+  <w:num w:numId="5" w16cid:durableId="1311443306">
     <w:abstractNumId w:val="2"/>
     <w:lvlOverride w:ilvl="0">
       <w:startOverride w:val="1"/>
@@ -5910,7 +5910,7 @@
       <w:startOverride w:val="1"/>
     </w:lvlOverride>
   </w:num>
-  <w:num w:numId="6" w16cid:durableId="219708036">
+  <w:num w:numId="6" w16cid:durableId="1071125623">
     <w:abstractNumId w:val="1"/>
   </w:num>
 </w:numbering>
@@ -7189,7 +7189,7 @@
     <w:next w:val="Normal"/>
     <w:autoRedefine/>
     <w:uiPriority w:val="39"/>
-    <w:rsid w:val="004C503F"/>
+    <w:rsid w:val="00FA19A9"/>
     <w:pPr>
       <w:spacing w:after="100"/>
     </w:pPr>
@@ -7200,7 +7200,7 @@
     <w:next w:val="Normal"/>
     <w:autoRedefine/>
     <w:uiPriority w:val="39"/>
-    <w:rsid w:val="004C503F"/>
+    <w:rsid w:val="00FA19A9"/>
     <w:pPr>
       <w:spacing w:after="100"/>
       <w:ind w:left="210"/>
@@ -7210,7 +7210,7 @@
     <w:name w:val="header"/>
     <w:basedOn w:val="Normal"/>
     <w:link w:val="HeaderChar"/>
-    <w:rsid w:val="004C503F"/>
+    <w:rsid w:val="00FA19A9"/>
     <w:pPr>
       <w:tabs>
         <w:tab w:val="center" w:pos="4513"/>
@@ -7223,7 +7223,7 @@
     <w:name w:val="Header Char"/>
     <w:basedOn w:val="DefaultParagraphFont"/>
     <w:link w:val="Header"/>
-    <w:rsid w:val="004C503F"/>
+    <w:rsid w:val="00FA19A9"/>
     <w:rPr>
       <w:rFonts w:ascii="Segoe UI" w:eastAsia="Segoe UI" w:hAnsi="Segoe UI" w:cs="Segoe UI"/>
       <w:color w:val="242424"/>
@@ -7234,7 +7234,7 @@
     <w:name w:val="footer"/>
     <w:basedOn w:val="Normal"/>
     <w:link w:val="FooterChar"/>
-    <w:rsid w:val="004C503F"/>
+    <w:rsid w:val="00FA19A9"/>
     <w:pPr>
       <w:tabs>
         <w:tab w:val="center" w:pos="4513"/>
@@ -7247,7 +7247,7 @@
     <w:name w:val="Footer Char"/>
     <w:basedOn w:val="DefaultParagraphFont"/>
     <w:link w:val="Footer"/>
-    <w:rsid w:val="004C503F"/>
+    <w:rsid w:val="00FA19A9"/>
     <w:rPr>
       <w:rFonts w:ascii="Segoe UI" w:eastAsia="Segoe UI" w:hAnsi="Segoe UI" w:cs="Segoe UI"/>
       <w:color w:val="242424"/>

</xml_diff>

<commit_message>
Shorten the workshop to 2½ hours with one break; keep one sample-data zip
- Agenda is now 150 minutes: all eight exercises kept and shortened
  (15/15/15/20/10/10/10/15 min), one 15-minute break after Exercise 5.
- Attendees sign in and upload the sample data before the session
  (participant email, workbook setup, facilitator guide, deck notes).
- The HR plugins spotlight leaves the live session: slide removed, workbook
  section moved to section 4 of the after-the-workshop pack.
- The Zava sample data lives only in sample-knowledge/: the six Word/Excel
  files (now the masters) and one zip, moved from participant/. The .md/.csv
  sources, make_office_samples.py, and whole-kit zip links are removed.
- Rebuilt the instructor deck (55 slides), overview deck, quick-reference
  card, and affected Word copies.

Co-Authored-By: Claude Opus 5.5 <noreply@anthropic.com>
</commit_message>
<xml_diff>
--- a/README.docx
+++ b/README.docx
@@ -10,7 +10,7 @@
           <w:sz w:val="21"/>
           <w:szCs w:val="24"/>
         </w:rPr>
-        <w:id w:val="1023668703"/>
+        <w:id w:val="-161542205"/>
         <w:docPartObj>
           <w:docPartGallery w:val="Table of Contents"/>
           <w:docPartUnique/>
@@ -51,7 +51,7 @@
           <w:r>
             <w:fldChar w:fldCharType="separate"/>
           </w:r>
-          <w:hyperlink w:anchor="_Toc241995321" w:history="1">
+          <w:hyperlink w:anchor="_Toc242255259" w:history="1">
             <w:r>
               <w:rPr>
                 <w:rStyle w:val="Hyperlink"/>
@@ -78,7 +78,7 @@
                 <w:noProof/>
                 <w:webHidden/>
               </w:rPr>
-              <w:instrText xml:space="preserve"> PAGEREF _Toc241995321 \h </w:instrText>
+              <w:instrText xml:space="preserve"> PAGEREF _Toc242255259 \h </w:instrText>
             </w:r>
             <w:r>
               <w:rPr>
@@ -125,7 +125,7 @@
               <w14:ligatures w14:val="standardContextual"/>
             </w:rPr>
           </w:pPr>
-          <w:hyperlink w:anchor="_Toc241995322" w:history="1">
+          <w:hyperlink w:anchor="_Toc242255260" w:history="1">
             <w:r>
               <w:rPr>
                 <w:rStyle w:val="Hyperlink"/>
@@ -152,7 +152,7 @@
                 <w:noProof/>
                 <w:webHidden/>
               </w:rPr>
-              <w:instrText xml:space="preserve"> PAGEREF _Toc241995322 \h </w:instrText>
+              <w:instrText xml:space="preserve"> PAGEREF _Toc242255260 \h </w:instrText>
             </w:r>
             <w:r>
               <w:rPr>
@@ -199,7 +199,7 @@
               <w14:ligatures w14:val="standardContextual"/>
             </w:rPr>
           </w:pPr>
-          <w:hyperlink w:anchor="_Toc241995323" w:history="1">
+          <w:hyperlink w:anchor="_Toc242255261" w:history="1">
             <w:r>
               <w:rPr>
                 <w:rStyle w:val="Hyperlink"/>
@@ -226,7 +226,7 @@
                 <w:noProof/>
                 <w:webHidden/>
               </w:rPr>
-              <w:instrText xml:space="preserve"> PAGEREF _Toc241995323 \h </w:instrText>
+              <w:instrText xml:space="preserve"> PAGEREF _Toc242255261 \h </w:instrText>
             </w:r>
             <w:r>
               <w:rPr>
@@ -273,7 +273,7 @@
               <w14:ligatures w14:val="standardContextual"/>
             </w:rPr>
           </w:pPr>
-          <w:hyperlink w:anchor="_Toc241995324" w:history="1">
+          <w:hyperlink w:anchor="_Toc242255262" w:history="1">
             <w:r>
               <w:rPr>
                 <w:rStyle w:val="Hyperlink"/>
@@ -300,7 +300,7 @@
                 <w:noProof/>
                 <w:webHidden/>
               </w:rPr>
-              <w:instrText xml:space="preserve"> PAGEREF _Toc241995324 \h </w:instrText>
+              <w:instrText xml:space="preserve"> PAGEREF _Toc242255262 \h </w:instrText>
             </w:r>
             <w:r>
               <w:rPr>
@@ -347,13 +347,13 @@
               <w14:ligatures w14:val="standardContextual"/>
             </w:rPr>
           </w:pPr>
-          <w:hyperlink w:anchor="_Toc241995325" w:history="1">
+          <w:hyperlink w:anchor="_Toc242255263" w:history="1">
             <w:r>
               <w:rPr>
                 <w:rStyle w:val="Hyperlink"/>
                 <w:noProof/>
               </w:rPr>
-              <w:t>Agenda (240 minutes)</w:t>
+              <w:t>Agenda (2½ hours)</w:t>
             </w:r>
             <w:r>
               <w:rPr>
@@ -374,7 +374,7 @@
                 <w:noProof/>
                 <w:webHidden/>
               </w:rPr>
-              <w:instrText xml:space="preserve"> PAGEREF _Toc241995325 \h </w:instrText>
+              <w:instrText xml:space="preserve"> PAGEREF _Toc242255263 \h </w:instrText>
             </w:r>
             <w:r>
               <w:rPr>
@@ -421,7 +421,7 @@
               <w14:ligatures w14:val="standardContextual"/>
             </w:rPr>
           </w:pPr>
-          <w:hyperlink w:anchor="_Toc241995326" w:history="1">
+          <w:hyperlink w:anchor="_Toc242255264" w:history="1">
             <w:r>
               <w:rPr>
                 <w:rStyle w:val="Hyperlink"/>
@@ -448,7 +448,7 @@
                 <w:noProof/>
                 <w:webHidden/>
               </w:rPr>
-              <w:instrText xml:space="preserve"> PAGEREF _Toc241995326 \h </w:instrText>
+              <w:instrText xml:space="preserve"> PAGEREF _Toc242255264 \h </w:instrText>
             </w:r>
             <w:r>
               <w:rPr>
@@ -495,7 +495,7 @@
               <w14:ligatures w14:val="standardContextual"/>
             </w:rPr>
           </w:pPr>
-          <w:hyperlink w:anchor="_Toc241995327" w:history="1">
+          <w:hyperlink w:anchor="_Toc242255265" w:history="1">
             <w:r>
               <w:rPr>
                 <w:rStyle w:val="Hyperlink"/>
@@ -522,7 +522,7 @@
                 <w:noProof/>
                 <w:webHidden/>
               </w:rPr>
-              <w:instrText xml:space="preserve"> PAGEREF _Toc241995327 \h </w:instrText>
+              <w:instrText xml:space="preserve"> PAGEREF _Toc242255265 \h </w:instrText>
             </w:r>
             <w:r>
               <w:rPr>
@@ -542,7 +542,7 @@
                 <w:noProof/>
                 <w:webHidden/>
               </w:rPr>
-              <w:t>6</w:t>
+              <w:t>5</w:t>
             </w:r>
             <w:r>
               <w:rPr>
@@ -569,7 +569,7 @@
               <w14:ligatures w14:val="standardContextual"/>
             </w:rPr>
           </w:pPr>
-          <w:hyperlink w:anchor="_Toc241995328" w:history="1">
+          <w:hyperlink w:anchor="_Toc242255266" w:history="1">
             <w:r>
               <w:rPr>
                 <w:rStyle w:val="Hyperlink"/>
@@ -596,7 +596,7 @@
                 <w:noProof/>
                 <w:webHidden/>
               </w:rPr>
-              <w:instrText xml:space="preserve"> PAGEREF _Toc241995328 \h </w:instrText>
+              <w:instrText xml:space="preserve"> PAGEREF _Toc242255266 \h </w:instrText>
             </w:r>
             <w:r>
               <w:rPr>
@@ -639,7 +639,7 @@
         <w:pStyle w:val="Heading1"/>
       </w:pPr>
       <w:bookmarkStart w:id="0" w:name="Xa046f7e33c7391c4827688ee785cfee5a5aaa0a"/>
-      <w:bookmarkStart w:id="1" w:name="_Toc241995321"/>
+      <w:bookmarkStart w:id="1" w:name="_Toc242255259"/>
       <w:r>
         <w:t>Getting Things Done with Copilot Cowork for HR Tasks</w:t>
       </w:r>
@@ -649,9 +649,9 @@
       <w:pPr>
         <w:pStyle w:val="Heading3"/>
       </w:pPr>
-      <w:bookmarkStart w:id="2" w:name="Xee6e3a1630424e8ccbb1d5cbbb8ac145436e4a8"/>
-      <w:r>
-        <w:t>A 4-hour, hands-on workshop kit for HR teams</w:t>
+      <w:bookmarkStart w:id="2" w:name="X5c2a697cc39f7effba939e6c1d8f08cb370c1c7"/>
+      <w:r>
+        <w:t>A 2½-hour, hands-on workshop kit for HR teams</w:t>
       </w:r>
     </w:p>
     <w:p>
@@ -659,7 +659,7 @@
         <w:pStyle w:val="FirstParagraph"/>
       </w:pPr>
       <w:r>
-        <w:t xml:space="preserve">This kit contains everything you need to run (or attend) a 4-hour, hands-on workshop that teaches </w:t>
+        <w:t xml:space="preserve">This kit contains everything you need to run (or attend) a 2½-hour, hands-on workshop that teaches </w:t>
       </w:r>
       <w:r>
         <w:rPr>
@@ -775,7 +775,7 @@
         <w:pStyle w:val="Heading2"/>
       </w:pPr>
       <w:bookmarkStart w:id="3" w:name="learning-objectives"/>
-      <w:bookmarkStart w:id="4" w:name="_Toc241995322"/>
+      <w:bookmarkStart w:id="4" w:name="_Toc242255260"/>
       <w:bookmarkEnd w:id="2"/>
       <w:r>
         <w:t>Learning objectives</w:t>
@@ -916,7 +916,7 @@
         <w:pStyle w:val="Heading2"/>
       </w:pPr>
       <w:bookmarkStart w:id="5" w:name="who-its-for"/>
-      <w:bookmarkStart w:id="6" w:name="_Toc241995323"/>
+      <w:bookmarkStart w:id="6" w:name="_Toc242255261"/>
       <w:bookmarkEnd w:id="3"/>
       <w:r>
         <w:t>Who it's for</w:t>
@@ -1078,7 +1078,7 @@
         <w:pStyle w:val="Heading2"/>
       </w:pPr>
       <w:bookmarkStart w:id="7" w:name="prerequisites"/>
-      <w:bookmarkStart w:id="8" w:name="_Toc241995324"/>
+      <w:bookmarkStart w:id="8" w:name="_Toc242255262"/>
       <w:bookmarkEnd w:id="5"/>
       <w:r>
         <w:t>Prerequisites</w:t>
@@ -1181,11 +1181,11 @@
       <w:pPr>
         <w:pStyle w:val="Heading2"/>
       </w:pPr>
-      <w:bookmarkStart w:id="9" w:name="agenda-240-minutes"/>
-      <w:bookmarkStart w:id="10" w:name="_Toc241995325"/>
+      <w:bookmarkStart w:id="9" w:name="agenda-2½-hours"/>
+      <w:bookmarkStart w:id="10" w:name="_Toc242255263"/>
       <w:bookmarkEnd w:id="7"/>
       <w:r>
-        <w:t>Agenda (240 minutes)</w:t>
+        <w:t>Agenda (2½ hours)</w:t>
       </w:r>
       <w:bookmarkEnd w:id="10"/>
     </w:p>
@@ -1210,8 +1210,8 @@
         <w:tblLook w:val="0020" w:firstRow="1" w:lastRow="0" w:firstColumn="0" w:lastColumn="0" w:noHBand="0" w:noVBand="0"/>
       </w:tblPr>
       <w:tblGrid>
-        <w:gridCol w:w="748"/>
-        <w:gridCol w:w="9224"/>
+        <w:gridCol w:w="711"/>
+        <w:gridCol w:w="9261"/>
       </w:tblGrid>
       <w:tr>
         <w:trPr>
@@ -1271,7 +1271,7 @@
               <w:rPr>
                 <w:sz w:val="19"/>
               </w:rPr>
-              <w:t>10 min</w:t>
+              <w:t>5 min</w:t>
             </w:r>
           </w:p>
         </w:tc>
@@ -1307,7 +1307,7 @@
               <w:rPr>
                 <w:sz w:val="19"/>
               </w:rPr>
-              <w:t>10 min</w:t>
+              <w:t>5 min</w:t>
             </w:r>
           </w:p>
         </w:tc>
@@ -1351,7 +1351,7 @@
               <w:rPr>
                 <w:sz w:val="19"/>
               </w:rPr>
-              <w:t>20 min</w:t>
+              <w:t>10 min</w:t>
             </w:r>
           </w:p>
         </w:tc>
@@ -1376,7 +1376,13 @@
               <w:rPr>
                 <w:sz w:val="19"/>
               </w:rPr>
-              <w:t xml:space="preserve"> + setup — New task, My tasks, Automations, Customize, sign in, copy data</w:t>
+              <w:t xml:space="preserve"> </w:t>
+            </w:r>
+            <w:r>
+              <w:rPr>
+                <w:sz w:val="19"/>
+              </w:rPr>
+              <w:t>+ setup check — New task, My tasks, Automations, Customize (attendees sign in and upload the sample files before the session)</w:t>
             </w:r>
           </w:p>
         </w:tc>
@@ -1395,7 +1401,7 @@
               <w:rPr>
                 <w:sz w:val="19"/>
               </w:rPr>
-              <w:t>25 min</w:t>
+              <w:t>15 min</w:t>
             </w:r>
           </w:p>
         </w:tc>
@@ -1439,7 +1445,7 @@
               <w:rPr>
                 <w:sz w:val="19"/>
               </w:rPr>
-              <w:t>20 min</w:t>
+              <w:t>15 min</w:t>
             </w:r>
           </w:p>
         </w:tc>
@@ -1483,24 +1489,32 @@
               <w:rPr>
                 <w:sz w:val="19"/>
               </w:rPr>
-              <w:t>10 min</w:t>
-            </w:r>
-          </w:p>
-        </w:tc>
-        <w:tc>
-          <w:tcPr>
-            <w:tcW w:w="0" w:type="auto"/>
-          </w:tcPr>
-          <w:p>
-            <w:pPr>
-              <w:pStyle w:val="Compact"/>
-              <w:spacing w:before="20" w:after="20"/>
-            </w:pPr>
-            <w:r>
-              <w:rPr>
-                <w:sz w:val="19"/>
-              </w:rPr>
-              <w:t>Break</w:t>
+              <w:t>15 min</w:t>
+            </w:r>
+          </w:p>
+        </w:tc>
+        <w:tc>
+          <w:tcPr>
+            <w:tcW w:w="0" w:type="auto"/>
+          </w:tcPr>
+          <w:p>
+            <w:pPr>
+              <w:pStyle w:val="Compact"/>
+              <w:spacing w:before="20" w:after="20"/>
+            </w:pPr>
+            <w:r>
+              <w:rPr>
+                <w:b/>
+                <w:bCs/>
+                <w:sz w:val="19"/>
+              </w:rPr>
+              <w:t>Exercise 3</w:t>
+            </w:r>
+            <w:r>
+              <w:rPr>
+                <w:sz w:val="19"/>
+              </w:rPr>
+              <w:t xml:space="preserve"> — Navigate websites with Cowork's browser (search and click through dol.gov and lni.wa.gov in Edge)</w:t>
             </w:r>
           </w:p>
         </w:tc>
@@ -1519,7 +1533,7 @@
               <w:rPr>
                 <w:sz w:val="19"/>
               </w:rPr>
-              <w:t>25 min</w:t>
+              <w:t>20 min</w:t>
             </w:r>
           </w:p>
         </w:tc>
@@ -1538,13 +1552,19 @@
                 <w:bCs/>
                 <w:sz w:val="19"/>
               </w:rPr>
-              <w:t>Exercise 3</w:t>
-            </w:r>
-            <w:r>
-              <w:rPr>
-                <w:sz w:val="19"/>
-              </w:rPr>
-              <w:t xml:space="preserve"> — Navigate websites with Cowork's browser (search and click through dol.gov and lni.wa.gov in Edge)</w:t>
+              <w:t>Exercise 4</w:t>
+            </w:r>
+            <w:r>
+              <w:rPr>
+                <w:sz w:val="19"/>
+              </w:rPr>
+              <w:t xml:space="preserve"> </w:t>
+            </w:r>
+            <w:r>
+              <w:rPr>
+                <w:sz w:val="19"/>
+              </w:rPr>
+              <w:t>— Build your own custom skill ("HR Policy Answer")</w:t>
             </w:r>
           </w:p>
         </w:tc>
@@ -1563,7 +1583,7 @@
               <w:rPr>
                 <w:sz w:val="19"/>
               </w:rPr>
-              <w:t>30 min</w:t>
+              <w:t>10 min</w:t>
             </w:r>
           </w:p>
         </w:tc>
@@ -1582,13 +1602,13 @@
                 <w:bCs/>
                 <w:sz w:val="19"/>
               </w:rPr>
-              <w:t>Exercise 4</w:t>
-            </w:r>
-            <w:r>
-              <w:rPr>
-                <w:sz w:val="19"/>
-              </w:rPr>
-              <w:t xml:space="preserve"> — Build your own custom skill ("HR Policy Answer")</w:t>
+              <w:t>Exercise 5</w:t>
+            </w:r>
+            <w:r>
+              <w:rPr>
+                <w:sz w:val="19"/>
+              </w:rPr>
+              <w:t xml:space="preserve"> — Recruiting + reporting mini-lab</w:t>
             </w:r>
           </w:p>
         </w:tc>
@@ -1607,7 +1627,43 @@
               <w:rPr>
                 <w:sz w:val="19"/>
               </w:rPr>
-              <w:t xml:space="preserve">15 </w:t>
+              <w:t>15 min</w:t>
+            </w:r>
+          </w:p>
+        </w:tc>
+        <w:tc>
+          <w:tcPr>
+            <w:tcW w:w="0" w:type="auto"/>
+          </w:tcPr>
+          <w:p>
+            <w:pPr>
+              <w:pStyle w:val="Compact"/>
+              <w:spacing w:before="20" w:after="20"/>
+            </w:pPr>
+            <w:r>
+              <w:rPr>
+                <w:sz w:val="19"/>
+              </w:rPr>
+              <w:t>Break</w:t>
+            </w:r>
+          </w:p>
+        </w:tc>
+      </w:tr>
+      <w:tr>
+        <w:tc>
+          <w:tcPr>
+            <w:tcW w:w="0" w:type="auto"/>
+          </w:tcPr>
+          <w:p>
+            <w:pPr>
+              <w:pStyle w:val="Compact"/>
+              <w:spacing w:before="20" w:after="20"/>
+            </w:pPr>
+            <w:r>
+              <w:rPr>
+                <w:sz w:val="19"/>
+              </w:rPr>
+              <w:t xml:space="preserve">10 </w:t>
             </w:r>
             <w:r>
               <w:rPr>
@@ -1634,13 +1690,13 @@
                 <w:sz w:val="19"/>
               </w:rPr>
               <w:lastRenderedPageBreak/>
-              <w:t>Exercise 5</w:t>
-            </w:r>
-            <w:r>
-              <w:rPr>
-                <w:sz w:val="19"/>
-              </w:rPr>
-              <w:t xml:space="preserve"> — Recruiting + reporting mini-lab</w:t>
+              <w:t>Exercise 6</w:t>
+            </w:r>
+            <w:r>
+              <w:rPr>
+                <w:sz w:val="19"/>
+              </w:rPr>
+              <w:t xml:space="preserve"> — Onboarding pack (PowerPoint + Scheduling + Communications)</w:t>
             </w:r>
           </w:p>
         </w:tc>
@@ -1674,9 +1730,17 @@
             </w:pPr>
             <w:r>
               <w:rPr>
-                <w:sz w:val="19"/>
-              </w:rPr>
-              <w:t>Break</w:t>
+                <w:b/>
+                <w:bCs/>
+                <w:sz w:val="19"/>
+              </w:rPr>
+              <w:t>Exercise 7</w:t>
+            </w:r>
+            <w:r>
+              <w:rPr>
+                <w:sz w:val="19"/>
+              </w:rPr>
+              <w:t xml:space="preserve"> — Automate &amp; share (Automations, Daily Briefing, skill sharing)</w:t>
             </w:r>
           </w:p>
         </w:tc>
@@ -1695,145 +1759,7 @@
               <w:rPr>
                 <w:sz w:val="19"/>
               </w:rPr>
-              <w:t>20 min</w:t>
-            </w:r>
-          </w:p>
-        </w:tc>
-        <w:tc>
-          <w:tcPr>
-            <w:tcW w:w="0" w:type="auto"/>
-          </w:tcPr>
-          <w:p>
-            <w:pPr>
-              <w:pStyle w:val="Compact"/>
-              <w:spacing w:before="20" w:after="20"/>
-            </w:pPr>
-            <w:r>
-              <w:rPr>
-                <w:b/>
-                <w:bCs/>
-                <w:sz w:val="19"/>
-              </w:rPr>
-              <w:t>Exercise 6</w:t>
-            </w:r>
-            <w:r>
-              <w:rPr>
-                <w:sz w:val="19"/>
-              </w:rPr>
-              <w:t xml:space="preserve"> </w:t>
-            </w:r>
-            <w:r>
-              <w:rPr>
-                <w:sz w:val="19"/>
-              </w:rPr>
-              <w:t>— Onboarding pack (PowerPoint + Scheduling + Communications)</w:t>
-            </w:r>
-          </w:p>
-        </w:tc>
-      </w:tr>
-      <w:tr>
-        <w:tc>
-          <w:tcPr>
-            <w:tcW w:w="0" w:type="auto"/>
-          </w:tcPr>
-          <w:p>
-            <w:pPr>
-              <w:pStyle w:val="Compact"/>
-              <w:spacing w:before="20" w:after="20"/>
-            </w:pPr>
-            <w:r>
-              <w:rPr>
-                <w:sz w:val="19"/>
-              </w:rPr>
               <w:t>15 min</w:t>
-            </w:r>
-          </w:p>
-        </w:tc>
-        <w:tc>
-          <w:tcPr>
-            <w:tcW w:w="0" w:type="auto"/>
-          </w:tcPr>
-          <w:p>
-            <w:pPr>
-              <w:pStyle w:val="Compact"/>
-              <w:spacing w:before="20" w:after="20"/>
-            </w:pPr>
-            <w:r>
-              <w:rPr>
-                <w:b/>
-                <w:bCs/>
-                <w:sz w:val="19"/>
-              </w:rPr>
-              <w:t>Exercise 7</w:t>
-            </w:r>
-            <w:r>
-              <w:rPr>
-                <w:sz w:val="19"/>
-              </w:rPr>
-              <w:t xml:space="preserve"> — Automate &amp; share (Automations, Daily Briefing, skill sharing)</w:t>
-            </w:r>
-          </w:p>
-        </w:tc>
-      </w:tr>
-      <w:tr>
-        <w:tc>
-          <w:tcPr>
-            <w:tcW w:w="0" w:type="auto"/>
-          </w:tcPr>
-          <w:p>
-            <w:pPr>
-              <w:pStyle w:val="Compact"/>
-              <w:spacing w:before="20" w:after="20"/>
-            </w:pPr>
-            <w:r>
-              <w:rPr>
-                <w:sz w:val="19"/>
-              </w:rPr>
-              <w:t>5 min</w:t>
-            </w:r>
-          </w:p>
-        </w:tc>
-        <w:tc>
-          <w:tcPr>
-            <w:tcW w:w="0" w:type="auto"/>
-          </w:tcPr>
-          <w:p>
-            <w:pPr>
-              <w:pStyle w:val="Compact"/>
-              <w:spacing w:before="20" w:after="20"/>
-            </w:pPr>
-            <w:r>
-              <w:rPr>
-                <w:b/>
-                <w:bCs/>
-                <w:sz w:val="19"/>
-              </w:rPr>
-              <w:t>Spotlight</w:t>
-            </w:r>
-            <w:r>
-              <w:rPr>
-                <w:sz w:val="19"/>
-              </w:rPr>
-              <w:t xml:space="preserve"> — Extend Cowork with HR plugins (Customize → Plugins; talk only, no hands-on)</w:t>
-            </w:r>
-          </w:p>
-        </w:tc>
-      </w:tr>
-      <w:tr>
-        <w:tc>
-          <w:tcPr>
-            <w:tcW w:w="0" w:type="auto"/>
-          </w:tcPr>
-          <w:p>
-            <w:pPr>
-              <w:pStyle w:val="Compact"/>
-              <w:spacing w:before="20" w:after="20"/>
-            </w:pPr>
-            <w:r>
-              <w:rPr>
-                <w:sz w:val="19"/>
-              </w:rPr>
-              <w:t>20 min</w:t>
             </w:r>
           </w:p>
         </w:tc>
@@ -1916,10 +1842,52 @@
     </w:tbl>
     <w:p>
       <w:pPr>
+        <w:pStyle w:val="BodyText"/>
+      </w:pPr>
+      <w:r>
+        <w:t xml:space="preserve">The pace is brisk: the facilitator plays a short </w:t>
+      </w:r>
+      <w:r>
+        <w:rPr>
+          <w:b/>
+          <w:bCs/>
+        </w:rPr>
+        <w:t>demo video</w:t>
+      </w:r>
+      <w:r>
+        <w:t xml:space="preserve"> </w:t>
+      </w:r>
+      <w:r>
+        <w:t xml:space="preserve">before each exercise instead of waiting on long Cowork runs, and the </w:t>
+      </w:r>
+      <w:r>
+        <w:rPr>
+          <w:b/>
+          <w:bCs/>
+        </w:rPr>
+        <w:t>HR plugins</w:t>
+      </w:r>
+      <w:r>
+        <w:t xml:space="preserve"> read (Customize → Plugins) is in the </w:t>
+      </w:r>
+      <w:hyperlink r:id="rId9">
+        <w:r>
+          <w:rPr>
+            <w:rStyle w:val="Hyperlink"/>
+          </w:rPr>
+          <w:t>after-the-workshop pack</w:t>
+        </w:r>
+      </w:hyperlink>
+      <w:r>
+        <w:t xml:space="preserve"> for self-study.</w:t>
+      </w:r>
+    </w:p>
+    <w:p>
+      <w:pPr>
         <w:pStyle w:val="Heading2"/>
       </w:pPr>
       <w:bookmarkStart w:id="11" w:name="whats-in-this-kit"/>
-      <w:bookmarkStart w:id="12" w:name="_Toc241995326"/>
+      <w:bookmarkStart w:id="12" w:name="_Toc242255264"/>
       <w:bookmarkEnd w:id="9"/>
       <w:r>
         <w:t>What's in this kit</w:t>
@@ -1972,7 +1940,10 @@
         <w:t>.docx</w:t>
       </w:r>
       <w:r>
-        <w:t>, for printing, sharing, and editing in Microsoft 365). The Word versions have the same content, with a table of contents on the longer guides, and link to each other. Each is listed below with both formats.</w:t>
+        <w:t xml:space="preserve">, for printing, sharing, and editing in Microsoft 365). The Word versions have </w:t>
+      </w:r>
+      <w:r>
+        <w:t>the same content, with a table of contents on the longer guides, and link to each other. Each is listed below with both formats.</w:t>
       </w:r>
     </w:p>
     <w:p>
@@ -2023,7 +1994,7 @@
           <w:numId w:val="4"/>
         </w:numPr>
       </w:pPr>
-      <w:hyperlink r:id="rId9">
+      <w:hyperlink r:id="rId10">
         <w:r>
           <w:rPr>
             <w:rStyle w:val="Hyperlink"/>
@@ -2034,10 +2005,7 @@
         </w:r>
       </w:hyperlink>
       <w:r>
-        <w:t xml:space="preserve"> — what attendees use: the workbook, the quick-reference card, the </w:t>
-      </w:r>
-      <w:r>
-        <w:t>sample-data zip, and the after-the-workshop pack.</w:t>
+        <w:t xml:space="preserve"> — what attendees use: the workbook, the quick-reference card, and the after-the-workshop pack.</w:t>
       </w:r>
     </w:p>
     <w:p>
@@ -2048,7 +2016,7 @@
           <w:numId w:val="4"/>
         </w:numPr>
       </w:pPr>
-      <w:hyperlink r:id="rId10">
+      <w:hyperlink r:id="rId11">
         <w:r>
           <w:rPr>
             <w:rStyle w:val="Hyperlink"/>
@@ -2059,7 +2027,10 @@
         </w:r>
       </w:hyperlink>
       <w:r>
-        <w:t xml:space="preserve"> — what the facilitator and host use: the instructor deck, facilitator guide, answer key, readiness checklist, and the facilitator's demo seed content.</w:t>
+        <w:t xml:space="preserve"> </w:t>
+      </w:r>
+      <w:r>
+        <w:t>— what the facilitator and host use: the instructor deck, facilitator guide, answer key, readiness checklist, and the facilitator's demo seed content.</w:t>
       </w:r>
     </w:p>
     <w:p>
@@ -2070,7 +2041,7 @@
           <w:numId w:val="4"/>
         </w:numPr>
       </w:pPr>
-      <w:hyperlink r:id="rId11">
+      <w:hyperlink r:id="rId12">
         <w:r>
           <w:rPr>
             <w:rStyle w:val="Hyperlink"/>
@@ -2092,7 +2063,49 @@
           <w:numId w:val="4"/>
         </w:numPr>
       </w:pPr>
-      <w:hyperlink r:id="rId12">
+      <w:hyperlink r:id="rId13">
+        <w:r>
+          <w:rPr>
+            <w:rStyle w:val="Hyperlink"/>
+            <w:b/>
+            <w:bCs/>
+          </w:rPr>
+          <w:t>sample-knowledge/</w:t>
+        </w:r>
+      </w:hyperlink>
+      <w:r>
+        <w:t xml:space="preserve"> — the </w:t>
+      </w:r>
+      <w:r>
+        <w:rPr>
+          <w:b/>
+          <w:bCs/>
+        </w:rPr>
+        <w:t>only</w:t>
+      </w:r>
+      <w:r>
+        <w:t xml:space="preserve"> place for the Zava sample data: the six Word and Excel files, and </w:t>
+      </w:r>
+      <w:r>
+        <w:rPr>
+          <w:b/>
+          <w:bCs/>
+        </w:rPr>
+        <w:t>one zip</w:t>
+      </w:r>
+      <w:r>
+        <w:t xml:space="preserve"> with all six for attendees to download.</w:t>
+      </w:r>
+    </w:p>
+    <w:p>
+      <w:pPr>
+        <w:pStyle w:val="Compact"/>
+        <w:numPr>
+          <w:ilvl w:val="0"/>
+          <w:numId w:val="4"/>
+        </w:numPr>
+      </w:pPr>
+      <w:hyperlink r:id="rId14">
         <w:r>
           <w:rPr>
             <w:rStyle w:val="Hyperlink"/>
@@ -2103,9 +2116,9 @@
         </w:r>
       </w:hyperlink>
       <w:r>
-        <w:t xml:space="preserve">, </w:t>
-      </w:r>
-      <w:hyperlink r:id="rId13">
+        <w:t xml:space="preserve"> and </w:t>
+      </w:r>
+      <w:hyperlink r:id="rId15">
         <w:r>
           <w:rPr>
             <w:rStyle w:val="Hyperlink"/>
@@ -2116,20 +2129,7 @@
         </w:r>
       </w:hyperlink>
       <w:r>
-        <w:t xml:space="preserve">, and </w:t>
-      </w:r>
-      <w:hyperlink r:id="rId14">
-        <w:r>
-          <w:rPr>
-            <w:rStyle w:val="Hyperlink"/>
-            <w:b/>
-            <w:bCs/>
-          </w:rPr>
-          <w:t>sample-knowledge/</w:t>
-        </w:r>
-      </w:hyperlink>
-      <w:r>
-        <w:t xml:space="preserve"> — background guides, the example custom skill, and the editable sample data.</w:t>
+        <w:t xml:space="preserve"> — background guides and the example custom skill.</w:t>
       </w:r>
     </w:p>
     <w:p>
@@ -2182,22 +2182,22 @@
           <w:noProof/>
         </w:rPr>
         <w:drawing>
-          <wp:inline distT="0" distB="0" distL="0" distR="0" wp14:anchorId="2CC54344" wp14:editId="26B26358">
+          <wp:inline distT="0" distB="0" distL="0" distR="0" wp14:anchorId="7E49565E" wp14:editId="5E834630">
             <wp:extent cx="4400120" cy="1306285"/>
             <wp:effectExtent l="0" t="0" r="0" b="0"/>
-            <wp:docPr id="23" name="Picture" descr="Tip: on a GitHub file page, select the Download icon (Download raw file) at the top right of the file"/>
+            <wp:docPr id="24" name="Picture" descr="Tip: on a GitHub file page, select the Download icon (Download raw file) at the top right of the file"/>
             <wp:cNvGraphicFramePr/>
             <a:graphic xmlns:a="http://schemas.openxmlformats.org/drawingml/2006/main">
               <a:graphicData uri="http://schemas.openxmlformats.org/drawingml/2006/picture">
                 <pic:pic xmlns:pic="http://schemas.openxmlformats.org/drawingml/2006/picture">
                   <pic:nvPicPr>
-                    <pic:cNvPr id="24" name="Picture" descr="reference/media/download-hint.png"/>
+                    <pic:cNvPr id="25" name="Picture" descr="reference/media/download-hint.png"/>
                     <pic:cNvPicPr>
                       <a:picLocks noChangeAspect="1" noChangeArrowheads="1"/>
                     </pic:cNvPicPr>
                   </pic:nvPicPr>
                   <pic:blipFill>
-                    <a:blip r:embed="rId15"/>
+                    <a:blip r:embed="rId16"/>
                     <a:stretch>
                       <a:fillRect/>
                     </a:stretch>
@@ -2245,9 +2245,9 @@
         <w:tblLook w:val="0020" w:firstRow="1" w:lastRow="0" w:firstColumn="0" w:lastColumn="0" w:noHBand="0" w:noVBand="0"/>
       </w:tblPr>
       <w:tblGrid>
-        <w:gridCol w:w="2883"/>
+        <w:gridCol w:w="2879"/>
         <w:gridCol w:w="1768"/>
-        <w:gridCol w:w="5321"/>
+        <w:gridCol w:w="5325"/>
       </w:tblGrid>
       <w:tr>
         <w:trPr>
@@ -2339,7 +2339,7 @@
               <w:pStyle w:val="Compact"/>
               <w:spacing w:before="20" w:after="20"/>
             </w:pPr>
-            <w:hyperlink r:id="rId16">
+            <w:hyperlink r:id="rId17">
               <w:r>
                 <w:rPr>
                   <w:rStyle w:val="Hyperlink"/>
@@ -2353,7 +2353,7 @@
               </w:rPr>
               <w:t xml:space="preserve"> · </w:t>
             </w:r>
-            <w:hyperlink r:id="rId17">
+            <w:hyperlink r:id="rId18">
               <w:r>
                 <w:rPr>
                   <w:rStyle w:val="Hyperlink"/>
@@ -2395,7 +2395,6 @@
               <w:rPr>
                 <w:sz w:val="19"/>
               </w:rPr>
-              <w:lastRenderedPageBreak/>
               <w:t>summary/PROJECT-SUMMARY</w:t>
             </w:r>
           </w:p>
@@ -2409,7 +2408,7 @@
               <w:pStyle w:val="Compact"/>
               <w:spacing w:before="20" w:after="20"/>
             </w:pPr>
-            <w:hyperlink r:id="rId18">
+            <w:hyperlink r:id="rId19">
               <w:r>
                 <w:rPr>
                   <w:rStyle w:val="Hyperlink"/>
@@ -2421,23 +2420,31 @@
               <w:rPr>
                 <w:sz w:val="19"/>
               </w:rPr>
-              <w:t xml:space="preserve"> (maintainers only)</w:t>
-            </w:r>
-          </w:p>
-        </w:tc>
-        <w:tc>
-          <w:tcPr>
-            <w:tcW w:w="0" w:type="auto"/>
-          </w:tcPr>
-          <w:p>
-            <w:pPr>
-              <w:pStyle w:val="Compact"/>
-              <w:spacing w:before="20" w:after="20"/>
-            </w:pPr>
-            <w:r>
-              <w:rPr>
-                <w:sz w:val="19"/>
-              </w:rPr>
+              <w:t xml:space="preserve"> (maintainers </w:t>
+            </w:r>
+            <w:r>
+              <w:rPr>
+                <w:sz w:val="19"/>
+              </w:rPr>
+              <w:lastRenderedPageBreak/>
+              <w:t>only)</w:t>
+            </w:r>
+          </w:p>
+        </w:tc>
+        <w:tc>
+          <w:tcPr>
+            <w:tcW w:w="0" w:type="auto"/>
+          </w:tcPr>
+          <w:p>
+            <w:pPr>
+              <w:pStyle w:val="Compact"/>
+              <w:spacing w:before="20" w:after="20"/>
+            </w:pPr>
+            <w:r>
+              <w:rPr>
+                <w:sz w:val="19"/>
+              </w:rPr>
+              <w:lastRenderedPageBreak/>
               <w:t>Handoff notes: status, architecture, decisions, how to build and test, remaining work</w:t>
             </w:r>
           </w:p>
@@ -2453,7 +2460,7 @@
               <w:pStyle w:val="Compact"/>
               <w:spacing w:before="20" w:after="20"/>
             </w:pPr>
-            <w:hyperlink r:id="rId19">
+            <w:hyperlink r:id="rId20">
               <w:r>
                 <w:rPr>
                   <w:rStyle w:val="Hyperlink"/>
@@ -2493,7 +2500,7 @@
               <w:rPr>
                 <w:sz w:val="19"/>
               </w:rPr>
-              <w:t xml:space="preserve">Instructor deck (57 slides, speaker notes, alt text) — a </w:t>
+              <w:t xml:space="preserve">Instructor deck (55 slides, speaker notes, alt text) — a </w:t>
             </w:r>
             <w:r>
               <w:rPr>
@@ -2535,7 +2542,7 @@
               <w:rPr>
                 <w:sz w:val="19"/>
               </w:rPr>
-              <w:t xml:space="preserve"> (an empty video frame for your recording), and hands-on slide per exercise (its speaker notes carry the full prompt, ready to copy), demo video slides for the UI walkthrough and the prompting slide, an Output folder walkthrough, an HR plugins spotlight, and a knowledge check</w:t>
+              <w:t xml:space="preserve"> (an empty video frame for your recording), and hands-on slide per exercise (its speaker notes carry the full prompt, ready to copy), demo video slides for the UI walkthrough and the prompting slide, an Output folder walkthrough, and a knowledge check</w:t>
             </w:r>
           </w:p>
         </w:tc>
@@ -2550,7 +2557,7 @@
               <w:pStyle w:val="Compact"/>
               <w:spacing w:before="20" w:after="20"/>
             </w:pPr>
-            <w:hyperlink r:id="rId20">
+            <w:hyperlink r:id="rId21">
               <w:r>
                 <w:rPr>
                   <w:rStyle w:val="Hyperlink"/>
@@ -2619,7 +2626,7 @@
               <w:pStyle w:val="Compact"/>
               <w:spacing w:before="20" w:after="20"/>
             </w:pPr>
-            <w:hyperlink r:id="rId21">
+            <w:hyperlink r:id="rId22">
               <w:r>
                 <w:rPr>
                   <w:rStyle w:val="Hyperlink"/>
@@ -2674,7 +2681,7 @@
               <w:pStyle w:val="Compact"/>
               <w:spacing w:before="20" w:after="20"/>
             </w:pPr>
-            <w:hyperlink r:id="rId22">
+            <w:hyperlink r:id="rId23">
               <w:r>
                 <w:rPr>
                   <w:rStyle w:val="Hyperlink"/>
@@ -2746,7 +2753,7 @@
               <w:pStyle w:val="Compact"/>
               <w:spacing w:before="20" w:after="20"/>
             </w:pPr>
-            <w:hyperlink r:id="rId23">
+            <w:hyperlink r:id="rId24">
               <w:r>
                 <w:rPr>
                   <w:rStyle w:val="Hyperlink"/>
@@ -2760,7 +2767,7 @@
               </w:rPr>
               <w:t xml:space="preserve"> · </w:t>
             </w:r>
-            <w:hyperlink r:id="rId24">
+            <w:hyperlink r:id="rId25">
               <w:r>
                 <w:rPr>
                   <w:rStyle w:val="Hyperlink"/>
@@ -2815,7 +2822,7 @@
               <w:pStyle w:val="Compact"/>
               <w:spacing w:before="20" w:after="20"/>
             </w:pPr>
-            <w:hyperlink r:id="rId25">
+            <w:hyperlink r:id="rId26">
               <w:r>
                 <w:rPr>
                   <w:rStyle w:val="Hyperlink"/>
@@ -2829,7 +2836,7 @@
               </w:rPr>
               <w:t xml:space="preserve"> · </w:t>
             </w:r>
-            <w:hyperlink r:id="rId26">
+            <w:hyperlink r:id="rId27">
               <w:r>
                 <w:rPr>
                   <w:rStyle w:val="Hyperlink"/>
@@ -2898,7 +2905,7 @@
               <w:pStyle w:val="Compact"/>
               <w:spacing w:before="20" w:after="20"/>
             </w:pPr>
-            <w:hyperlink r:id="rId27">
+            <w:hyperlink r:id="rId28">
               <w:r>
                 <w:rPr>
                   <w:rStyle w:val="Hyperlink"/>
@@ -2912,7 +2919,7 @@
               </w:rPr>
               <w:t xml:space="preserve"> · </w:t>
             </w:r>
-            <w:hyperlink r:id="rId28">
+            <w:hyperlink r:id="rId29">
               <w:r>
                 <w:rPr>
                   <w:rStyle w:val="Hyperlink"/>
@@ -2967,7 +2974,7 @@
               <w:pStyle w:val="Compact"/>
               <w:spacing w:before="20" w:after="20"/>
             </w:pPr>
-            <w:hyperlink r:id="rId29">
+            <w:hyperlink r:id="rId30">
               <w:r>
                 <w:rPr>
                   <w:rStyle w:val="Hyperlink"/>
@@ -2981,7 +2988,7 @@
               </w:rPr>
               <w:t xml:space="preserve"> · </w:t>
             </w:r>
-            <w:hyperlink r:id="rId30">
+            <w:hyperlink r:id="rId31">
               <w:r>
                 <w:rPr>
                   <w:rStyle w:val="Hyperlink"/>
@@ -3036,7 +3043,7 @@
               <w:pStyle w:val="Compact"/>
               <w:spacing w:before="20" w:after="20"/>
             </w:pPr>
-            <w:hyperlink r:id="rId31">
+            <w:hyperlink r:id="rId32">
               <w:r>
                 <w:rPr>
                   <w:rStyle w:val="Hyperlink"/>
@@ -3050,7 +3057,7 @@
               </w:rPr>
               <w:t xml:space="preserve"> · </w:t>
             </w:r>
-            <w:hyperlink r:id="rId32">
+            <w:hyperlink r:id="rId33">
               <w:r>
                 <w:rPr>
                   <w:rStyle w:val="Hyperlink"/>
@@ -3088,7 +3095,7 @@
               <w:pStyle w:val="Compact"/>
               <w:spacing w:before="20" w:after="20"/>
             </w:pPr>
-            <w:hyperlink r:id="rId33">
+            <w:hyperlink r:id="rId34">
               <w:r>
                 <w:rPr>
                   <w:rStyle w:val="Hyperlink"/>
@@ -3160,7 +3167,7 @@
               <w:pStyle w:val="Compact"/>
               <w:spacing w:before="20" w:after="20"/>
             </w:pPr>
-            <w:hyperlink r:id="rId34">
+            <w:hyperlink r:id="rId35">
               <w:r>
                 <w:rPr>
                   <w:rStyle w:val="Hyperlink"/>
@@ -3174,7 +3181,7 @@
               </w:rPr>
               <w:t xml:space="preserve"> · </w:t>
             </w:r>
-            <w:hyperlink r:id="rId35">
+            <w:hyperlink r:id="rId36">
               <w:r>
                 <w:rPr>
                   <w:rStyle w:val="Hyperlink"/>
@@ -3229,7 +3236,7 @@
               <w:pStyle w:val="Compact"/>
               <w:spacing w:before="20" w:after="20"/>
             </w:pPr>
-            <w:hyperlink r:id="rId36">
+            <w:hyperlink r:id="rId37">
               <w:r>
                 <w:rPr>
                   <w:rStyle w:val="Hyperlink"/>
@@ -3243,7 +3250,7 @@
               </w:rPr>
               <w:t xml:space="preserve"> · </w:t>
             </w:r>
-            <w:hyperlink r:id="rId37">
+            <w:hyperlink r:id="rId38">
               <w:r>
                 <w:rPr>
                   <w:rStyle w:val="Hyperlink"/>
@@ -3298,7 +3305,7 @@
               <w:pStyle w:val="Compact"/>
               <w:spacing w:before="20" w:after="20"/>
             </w:pPr>
-            <w:hyperlink r:id="rId38">
+            <w:hyperlink r:id="rId39">
               <w:r>
                 <w:rPr>
                   <w:rStyle w:val="Hyperlink"/>
@@ -3312,7 +3319,7 @@
               </w:rPr>
               <w:t xml:space="preserve"> · </w:t>
             </w:r>
-            <w:hyperlink r:id="rId39">
+            <w:hyperlink r:id="rId40">
               <w:r>
                 <w:rPr>
                   <w:rStyle w:val="Hyperlink"/>
@@ -3367,7 +3374,7 @@
               <w:pStyle w:val="Compact"/>
               <w:spacing w:before="20" w:after="20"/>
             </w:pPr>
-            <w:hyperlink r:id="rId40">
+            <w:hyperlink r:id="rId41">
               <w:r>
                 <w:rPr>
                   <w:rStyle w:val="Hyperlink"/>
@@ -3381,7 +3388,7 @@
               </w:rPr>
               <w:t xml:space="preserve"> · </w:t>
             </w:r>
-            <w:hyperlink r:id="rId41">
+            <w:hyperlink r:id="rId42">
               <w:r>
                 <w:rPr>
                   <w:rStyle w:val="Hyperlink"/>
@@ -3423,7 +3430,6 @@
               <w:rPr>
                 <w:sz w:val="19"/>
               </w:rPr>
-              <w:lastRenderedPageBreak/>
               <w:t>reference/03-skills-catalog</w:t>
             </w:r>
           </w:p>
@@ -3437,7 +3443,7 @@
               <w:pStyle w:val="Compact"/>
               <w:spacing w:before="20" w:after="20"/>
             </w:pPr>
-            <w:hyperlink r:id="rId42">
+            <w:hyperlink r:id="rId43">
               <w:r>
                 <w:rPr>
                   <w:rStyle w:val="Hyperlink"/>
@@ -3451,7 +3457,7 @@
               </w:rPr>
               <w:t xml:space="preserve"> · </w:t>
             </w:r>
-            <w:hyperlink r:id="rId43">
+            <w:hyperlink r:id="rId44">
               <w:r>
                 <w:rPr>
                   <w:rStyle w:val="Hyperlink"/>
@@ -3506,7 +3512,7 @@
               <w:pStyle w:val="Compact"/>
               <w:spacing w:before="20" w:after="20"/>
             </w:pPr>
-            <w:hyperlink r:id="rId44">
+            <w:hyperlink r:id="rId45">
               <w:r>
                 <w:rPr>
                   <w:rStyle w:val="Hyperlink"/>
@@ -3520,7 +3526,7 @@
               </w:rPr>
               <w:t xml:space="preserve"> · </w:t>
             </w:r>
-            <w:hyperlink r:id="rId45">
+            <w:hyperlink r:id="rId46">
               <w:r>
                 <w:rPr>
                   <w:rStyle w:val="Hyperlink"/>
@@ -3562,6 +3568,7 @@
               <w:rPr>
                 <w:sz w:val="19"/>
               </w:rPr>
+              <w:lastRenderedPageBreak/>
               <w:t>reference/05-custom-skill-guide</w:t>
             </w:r>
           </w:p>
@@ -3575,7 +3582,7 @@
               <w:pStyle w:val="Compact"/>
               <w:spacing w:before="20" w:after="20"/>
             </w:pPr>
-            <w:hyperlink r:id="rId46">
+            <w:hyperlink r:id="rId47">
               <w:r>
                 <w:rPr>
                   <w:rStyle w:val="Hyperlink"/>
@@ -3589,7 +3596,7 @@
               </w:rPr>
               <w:t xml:space="preserve"> · </w:t>
             </w:r>
-            <w:hyperlink r:id="rId47">
+            <w:hyperlink r:id="rId48">
               <w:r>
                 <w:rPr>
                   <w:rStyle w:val="Hyperlink"/>
@@ -3644,7 +3651,7 @@
               <w:pStyle w:val="Compact"/>
               <w:spacing w:before="20" w:after="20"/>
             </w:pPr>
-            <w:hyperlink r:id="rId48">
+            <w:hyperlink r:id="rId49">
               <w:r>
                 <w:rPr>
                   <w:rStyle w:val="Hyperlink"/>
@@ -3658,7 +3665,7 @@
               </w:rPr>
               <w:t xml:space="preserve"> · </w:t>
             </w:r>
-            <w:hyperlink r:id="rId49">
+            <w:hyperlink r:id="rId50">
               <w:r>
                 <w:rPr>
                   <w:rStyle w:val="Hyperlink"/>
@@ -3713,7 +3720,7 @@
               <w:pStyle w:val="Compact"/>
               <w:spacing w:before="20" w:after="20"/>
             </w:pPr>
-            <w:hyperlink r:id="rId50">
+            <w:hyperlink r:id="rId51">
               <w:r>
                 <w:rPr>
                   <w:rStyle w:val="Hyperlink"/>
@@ -3727,7 +3734,7 @@
               </w:rPr>
               <w:t xml:space="preserve"> · </w:t>
             </w:r>
-            <w:hyperlink r:id="rId51">
+            <w:hyperlink r:id="rId52">
               <w:r>
                 <w:rPr>
                   <w:rStyle w:val="Hyperlink"/>
@@ -3782,7 +3789,7 @@
               <w:pStyle w:val="Compact"/>
               <w:spacing w:before="20" w:after="20"/>
             </w:pPr>
-            <w:hyperlink r:id="rId52">
+            <w:hyperlink r:id="rId53">
               <w:r>
                 <w:rPr>
                   <w:rStyle w:val="Hyperlink"/>
@@ -3796,7 +3803,7 @@
               </w:rPr>
               <w:t xml:space="preserve"> · </w:t>
             </w:r>
-            <w:hyperlink r:id="rId53">
+            <w:hyperlink r:id="rId54">
               <w:r>
                 <w:rPr>
                   <w:rStyle w:val="Hyperlink"/>
@@ -3851,7 +3858,7 @@
               <w:pStyle w:val="Compact"/>
               <w:spacing w:before="20" w:after="20"/>
             </w:pPr>
-            <w:hyperlink r:id="rId54">
+            <w:hyperlink r:id="rId55">
               <w:r>
                 <w:rPr>
                   <w:rStyle w:val="Hyperlink"/>
@@ -3865,7 +3872,7 @@
               </w:rPr>
               <w:t xml:space="preserve"> · </w:t>
             </w:r>
-            <w:hyperlink r:id="rId55">
+            <w:hyperlink r:id="rId56">
               <w:r>
                 <w:rPr>
                   <w:rStyle w:val="Hyperlink"/>
@@ -3888,7 +3895,7 @@
               <w:rPr>
                 <w:sz w:val="19"/>
               </w:rPr>
-              <w:t>Spotlight: extend Cowork with HR plugins (Customize → Plugins), with an MCP example for IT</w:t>
+              <w:t>Self-study: extend Cowork with HR plugins (Customize → Plugins), with an MCP example for IT</w:t>
             </w:r>
           </w:p>
         </w:tc>
@@ -3920,7 +3927,7 @@
               <w:pStyle w:val="Compact"/>
               <w:spacing w:before="20" w:after="20"/>
             </w:pPr>
-            <w:hyperlink r:id="rId56">
+            <w:hyperlink r:id="rId57">
               <w:r>
                 <w:rPr>
                   <w:rStyle w:val="Hyperlink"/>
@@ -3934,7 +3941,7 @@
               </w:rPr>
               <w:t xml:space="preserve"> · </w:t>
             </w:r>
-            <w:hyperlink r:id="rId57">
+            <w:hyperlink r:id="rId58">
               <w:r>
                 <w:rPr>
                   <w:rStyle w:val="Hyperlink"/>
@@ -3989,7 +3996,7 @@
               <w:pStyle w:val="Compact"/>
               <w:spacing w:before="20" w:after="20"/>
             </w:pPr>
-            <w:hyperlink r:id="rId58">
+            <w:hyperlink r:id="rId59">
               <w:r>
                 <w:rPr>
                   <w:rStyle w:val="Hyperlink"/>
@@ -4003,7 +4010,7 @@
               </w:rPr>
               <w:t xml:space="preserve"> (used by Cowork) · </w:t>
             </w:r>
-            <w:hyperlink r:id="rId59">
+            <w:hyperlink r:id="rId60">
               <w:r>
                 <w:rPr>
                   <w:rStyle w:val="Hyperlink"/>
@@ -4047,7 +4054,7 @@
               <w:pStyle w:val="Compact"/>
               <w:spacing w:before="20" w:after="20"/>
             </w:pPr>
-            <w:hyperlink r:id="rId60">
+            <w:hyperlink r:id="rId61">
               <w:r>
                 <w:rPr>
                   <w:rStyle w:val="Hyperlink"/>
@@ -4107,62 +4114,35 @@
               <w:rPr>
                 <w:sz w:val="19"/>
               </w:rPr>
-              <w:t>HR data: the Word/Excel files used in the exercises, plus their editable .md/.csv sources</w:t>
-            </w:r>
-          </w:p>
-        </w:tc>
-      </w:tr>
-      <w:tr>
-        <w:tc>
-          <w:tcPr>
-            <w:tcW w:w="0" w:type="auto"/>
-          </w:tcPr>
-          <w:p>
-            <w:pPr>
-              <w:pStyle w:val="Compact"/>
-              <w:spacing w:before="20" w:after="20"/>
-            </w:pPr>
-            <w:hyperlink r:id="rId61">
+              <w:t xml:space="preserve">HR data: the six Word/Excel files used in the exercises, and </w:t>
+            </w:r>
+            <w:hyperlink r:id="rId62">
               <w:r>
                 <w:rPr>
                   <w:rStyle w:val="Hyperlink"/>
                 </w:rPr>
-                <w:t>participant/zava-sample-knowledge.zip</w:t>
+                <w:t>zava-sample-knowledge.zip</w:t>
               </w:r>
             </w:hyperlink>
-          </w:p>
-        </w:tc>
-        <w:tc>
-          <w:tcPr>
-            <w:tcW w:w="0" w:type="auto"/>
-          </w:tcPr>
-          <w:p>
-            <w:pPr>
-              <w:pStyle w:val="Compact"/>
-              <w:spacing w:before="20" w:after="20"/>
-            </w:pPr>
-            <w:r>
-              <w:rPr>
-                <w:sz w:val="19"/>
-              </w:rPr>
-              <w:t>zip</w:t>
-            </w:r>
-          </w:p>
-        </w:tc>
-        <w:tc>
-          <w:tcPr>
-            <w:tcW w:w="0" w:type="auto"/>
-          </w:tcPr>
-          <w:p>
-            <w:pPr>
-              <w:pStyle w:val="Compact"/>
-              <w:spacing w:before="20" w:after="20"/>
-            </w:pPr>
-            <w:r>
-              <w:rPr>
-                <w:sz w:val="19"/>
-              </w:rPr>
-              <w:t xml:space="preserve">The six Word and Excel sample files in an </w:t>
+            <w:r>
+              <w:rPr>
+                <w:sz w:val="19"/>
+              </w:rPr>
+              <w:t xml:space="preserve">, the </w:t>
+            </w:r>
+            <w:r>
+              <w:rPr>
+                <w:b/>
+                <w:bCs/>
+                <w:sz w:val="19"/>
+              </w:rPr>
+              <w:t>one download</w:t>
+            </w:r>
+            <w:r>
+              <w:rPr>
+                <w:sz w:val="19"/>
+              </w:rPr>
+              <w:t xml:space="preserve"> for attendees (all six in an </w:t>
             </w:r>
             <w:r>
               <w:rPr>
@@ -4174,7 +4154,7 @@
               <w:rPr>
                 <w:sz w:val="19"/>
               </w:rPr>
-              <w:t xml:space="preserve"> folder, ready to upload to OneDrive</w:t>
+              <w:t xml:space="preserve"> folder, ready to upload to OneDrive)</w:t>
             </w:r>
           </w:p>
         </w:tc>
@@ -4204,12 +4184,9 @@
         <w:t>Word and Excel</w:t>
       </w:r>
       <w:r>
-        <w:t xml:space="preserve"> sample files (Exercise 1 also reads each attendee's own mail and calendar). They work in both Cowork and Agent Builder </w:t>
-      </w:r>
-      <w:r>
-        <w:t xml:space="preserve">(which doesn't accept .md or .csv). Download </w:t>
-      </w:r>
-      <w:hyperlink r:id="rId62">
+        <w:t xml:space="preserve"> sample files (Exercise 1 also reads each attendee's own mail and calendar). They work in both Cowork and Agent Builder (which doesn't accept .md or .csv). Download </w:t>
+      </w:r>
+      <w:hyperlink r:id="rId63">
         <w:r>
           <w:rPr>
             <w:rStyle w:val="Hyperlink"/>
@@ -4351,7 +4328,7 @@
               <w:pStyle w:val="Compact"/>
               <w:spacing w:before="20" w:after="20"/>
             </w:pPr>
-            <w:hyperlink r:id="rId63">
+            <w:hyperlink r:id="rId64">
               <w:r>
                 <w:rPr>
                   <w:rStyle w:val="Hyperlink"/>
@@ -4406,7 +4383,7 @@
               <w:pStyle w:val="Compact"/>
               <w:spacing w:before="20" w:after="20"/>
             </w:pPr>
-            <w:hyperlink r:id="rId64">
+            <w:hyperlink r:id="rId65">
               <w:r>
                 <w:rPr>
                   <w:rStyle w:val="Hyperlink"/>
@@ -4461,7 +4438,7 @@
               <w:pStyle w:val="Compact"/>
               <w:spacing w:before="20" w:after="20"/>
             </w:pPr>
-            <w:hyperlink r:id="rId65">
+            <w:hyperlink r:id="rId66">
               <w:r>
                 <w:rPr>
                   <w:rStyle w:val="Hyperlink"/>
@@ -4516,7 +4493,7 @@
               <w:pStyle w:val="Compact"/>
               <w:spacing w:before="20" w:after="20"/>
             </w:pPr>
-            <w:hyperlink r:id="rId66">
+            <w:hyperlink r:id="rId67">
               <w:r>
                 <w:rPr>
                   <w:rStyle w:val="Hyperlink"/>
@@ -4571,7 +4548,7 @@
               <w:pStyle w:val="Compact"/>
               <w:spacing w:before="20" w:after="20"/>
             </w:pPr>
-            <w:hyperlink r:id="rId67">
+            <w:hyperlink r:id="rId68">
               <w:r>
                 <w:rPr>
                   <w:rStyle w:val="Hyperlink"/>
@@ -4626,7 +4603,7 @@
               <w:pStyle w:val="Compact"/>
               <w:spacing w:before="20" w:after="20"/>
             </w:pPr>
-            <w:hyperlink r:id="rId68">
+            <w:hyperlink r:id="rId69">
               <w:r>
                 <w:rPr>
                   <w:rStyle w:val="Hyperlink"/>
@@ -4690,34 +4667,27 @@
         <w:t>Editing the sample data?</w:t>
       </w:r>
       <w:r>
-        <w:t xml:space="preserve"> The </w:t>
+        <w:t xml:space="preserve"> The Word and Excel files in </w:t>
       </w:r>
       <w:r>
         <w:rPr>
           <w:rStyle w:val="VerbatimChar"/>
         </w:rPr>
-        <w:t>.md</w:t>
-      </w:r>
-      <w:r>
-        <w:t xml:space="preserve"> and </w:t>
-      </w:r>
-      <w:r>
-        <w:rPr>
-          <w:rStyle w:val="VerbatimChar"/>
-        </w:rPr>
-        <w:t>.csv</w:t>
-      </w:r>
-      <w:r>
-        <w:t xml:space="preserve"> files in </w:t>
-      </w:r>
-      <w:r>
-        <w:rPr>
-          <w:rStyle w:val="VerbatimChar"/>
-        </w:rPr>
         <w:t>sample-knowledge/</w:t>
       </w:r>
       <w:r>
-        <w:t xml:space="preserve"> are the editable sources the Word and Excel files are generated from. Attendees don't need them, and they aren't in the zip. If you change one, regenerate its Word or Excel copy so the two stay in sync.</w:t>
+        <w:t xml:space="preserve"> are the master copies: edit them directly, then rebuild the zip (</w:t>
+      </w:r>
+      <w:hyperlink r:id="rId70" w:anchor="build-instructions">
+        <w:r>
+          <w:rPr>
+            <w:rStyle w:val="Hyperlink"/>
+          </w:rPr>
+          <w:t>how</w:t>
+        </w:r>
+      </w:hyperlink>
+      <w:r>
+        <w:t>) so attendees always download one zip that matches.</w:t>
       </w:r>
     </w:p>
     <w:p>
@@ -4725,11 +4695,10 @@
         <w:pStyle w:val="Heading2"/>
       </w:pPr>
       <w:bookmarkStart w:id="14" w:name="how-to-use-this-kit"/>
-      <w:bookmarkStart w:id="15" w:name="_Toc241995327"/>
+      <w:bookmarkStart w:id="15" w:name="_Toc242255265"/>
       <w:bookmarkEnd w:id="11"/>
       <w:bookmarkEnd w:id="13"/>
       <w:r>
-        <w:lastRenderedPageBreak/>
         <w:t>How to use this kit</w:t>
       </w:r>
       <w:bookmarkEnd w:id="15"/>
@@ -4752,7 +4721,7 @@
       <w:r>
         <w:t xml:space="preserve"> follow the </w:t>
       </w:r>
-      <w:hyperlink r:id="rId69">
+      <w:hyperlink r:id="rId71">
         <w:r>
           <w:rPr>
             <w:rStyle w:val="Hyperlink"/>
@@ -4763,7 +4732,7 @@
       <w:r>
         <w:t xml:space="preserve">. Confirm licenses and Cowork access, estimate cost, and stage the sample files. The facilitator loads </w:t>
       </w:r>
-      <w:hyperlink r:id="rId70">
+      <w:hyperlink r:id="rId72">
         <w:r>
           <w:rPr>
             <w:rStyle w:val="Hyperlink"/>
@@ -4774,7 +4743,7 @@
       <w:r>
         <w:t xml:space="preserve"> into their own demo account 1–2 days before. Send the instructor the </w:t>
       </w:r>
-      <w:hyperlink r:id="rId71">
+      <w:hyperlink r:id="rId73">
         <w:r>
           <w:rPr>
             <w:rStyle w:val="Hyperlink"/>
@@ -4785,7 +4754,7 @@
       <w:r>
         <w:t xml:space="preserve">, and attendees the </w:t>
       </w:r>
-      <w:hyperlink r:id="rId72">
+      <w:hyperlink r:id="rId74">
         <w:r>
           <w:rPr>
             <w:rStyle w:val="Hyperlink"/>
@@ -4796,7 +4765,7 @@
       <w:r>
         <w:t xml:space="preserve"> one week out; use the </w:t>
       </w:r>
-      <w:hyperlink r:id="rId73">
+      <w:hyperlink r:id="rId75">
         <w:r>
           <w:rPr>
             <w:rStyle w:val="Hyperlink"/>
@@ -4826,7 +4795,7 @@
       <w:r>
         <w:t xml:space="preserve"> read </w:t>
       </w:r>
-      <w:hyperlink r:id="rId74">
+      <w:hyperlink r:id="rId76">
         <w:r>
           <w:rPr>
             <w:rStyle w:val="Hyperlink"/>
@@ -4837,7 +4806,7 @@
       <w:r>
         <w:t xml:space="preserve">, do a full dry run against the </w:t>
       </w:r>
-      <w:hyperlink r:id="rId75">
+      <w:hyperlink r:id="rId77">
         <w:r>
           <w:rPr>
             <w:rStyle w:val="Hyperlink"/>
@@ -4848,7 +4817,7 @@
       <w:r>
         <w:t xml:space="preserve">, and present with </w:t>
       </w:r>
-      <w:hyperlink r:id="rId76">
+      <w:hyperlink r:id="rId78">
         <w:r>
           <w:rPr>
             <w:rStyle w:val="Hyperlink"/>
@@ -4878,7 +4847,7 @@
       <w:r>
         <w:t xml:space="preserve"> on the day, follow </w:t>
       </w:r>
-      <w:hyperlink r:id="rId77">
+      <w:hyperlink r:id="rId79">
         <w:r>
           <w:rPr>
             <w:rStyle w:val="Hyperlink"/>
@@ -4889,7 +4858,7 @@
       <w:r>
         <w:t xml:space="preserve"> start to finish, with the printed </w:t>
       </w:r>
-      <w:hyperlink r:id="rId78">
+      <w:hyperlink r:id="rId80">
         <w:r>
           <w:rPr>
             <w:rStyle w:val="Hyperlink"/>
@@ -4900,7 +4869,7 @@
       <w:r>
         <w:t xml:space="preserve"> and the </w:t>
       </w:r>
-      <w:hyperlink r:id="rId79">
+      <w:hyperlink r:id="rId81">
         <w:r>
           <w:rPr>
             <w:rStyle w:val="Hyperlink"/>
@@ -4930,7 +4899,7 @@
       <w:r>
         <w:t xml:space="preserve"> send </w:t>
       </w:r>
-      <w:hyperlink r:id="rId80">
+      <w:hyperlink r:id="rId82">
         <w:r>
           <w:rPr>
             <w:rStyle w:val="Hyperlink"/>
@@ -4989,7 +4958,7 @@
         <w:pStyle w:val="Heading2"/>
       </w:pPr>
       <w:bookmarkStart w:id="16" w:name="requirement-coverage"/>
-      <w:bookmarkStart w:id="17" w:name="_Toc241995328"/>
+      <w:bookmarkStart w:id="17" w:name="_Toc242255266"/>
       <w:bookmarkEnd w:id="14"/>
       <w:r>
         <w:t>Requirement coverage</w:t>
@@ -5273,17 +5242,17 @@
         <w:t>✅</w:t>
       </w:r>
       <w:r>
-        <w:t xml:space="preserve"> A talk-only </w:t>
+        <w:t xml:space="preserve"> An </w:t>
       </w:r>
       <w:r>
         <w:rPr>
           <w:b/>
           <w:bCs/>
         </w:rPr>
-        <w:t>HR plugins spotlight</w:t>
-      </w:r>
-      <w:r>
-        <w:t xml:space="preserve"> on </w:t>
+        <w:t>HR plugins</w:t>
+      </w:r>
+      <w:r>
+        <w:t xml:space="preserve"> read on </w:t>
       </w:r>
       <w:r>
         <w:rPr>
@@ -5293,7 +5262,7 @@
         <w:t>Customize → Plugins</w:t>
       </w:r>
       <w:r>
-        <w:t>, with a screenshot and benefits</w:t>
+        <w:t xml:space="preserve"> for self-study in the after-the-workshop pack</w:t>
       </w:r>
     </w:p>
     <w:p>
@@ -5420,7 +5389,7 @@
     </w:p>
     <w:p>
       <w:r>
-        <w:pict w14:anchorId="2499E011">
+        <w:pict w14:anchorId="6D288AF5">
           <v:rect id="_x0000_i1025" style="width:0;height:1.5pt" o:hralign="center" o:hrstd="t" o:hr="t"/>
         </w:pict>
       </w:r>
@@ -5436,7 +5405,7 @@
         </w:rPr>
         <w:t xml:space="preserve">Sample content depicts the fictional company "Zava" and is for training purposes only. Divider illustrations: </w:t>
       </w:r>
-      <w:hyperlink r:id="rId81">
+      <w:hyperlink r:id="rId83">
         <w:r>
           <w:rPr>
             <w:rStyle w:val="Hyperlink"/>
@@ -5457,7 +5426,7 @@
       <w:bookmarkEnd w:id="16"/>
     </w:p>
     <w:sectPr>
-      <w:footerReference w:type="default" r:id="rId82"/>
+      <w:footerReference w:type="default" r:id="rId84"/>
       <w:footnotePr>
         <w:numRestart w:val="eachSect"/>
       </w:footnotePr>
@@ -5577,7 +5546,7 @@
   <w:abstractNum w:abstractNumId="0" w15:restartNumberingAfterBreak="0">
     <w:nsid w:val="0000A990"/>
     <w:multiLevelType w:val="multilevel"/>
-    <w:tmpl w:val="D63C3AEC"/>
+    <w:tmpl w:val="0C6E17E2"/>
     <w:lvl w:ilvl="0">
       <w:numFmt w:val="bullet"/>
       <w:lvlText w:val=" "/>
@@ -5654,7 +5623,7 @@
   <w:abstractNum w:abstractNumId="1" w15:restartNumberingAfterBreak="0">
     <w:nsid w:val="0000A991"/>
     <w:multiLevelType w:val="multilevel"/>
-    <w:tmpl w:val="204C4E7A"/>
+    <w:tmpl w:val="BF3CD770"/>
     <w:lvl w:ilvl="0">
       <w:numFmt w:val="bullet"/>
       <w:lvlText w:val=""/>
@@ -5758,7 +5727,7 @@
   <w:abstractNum w:abstractNumId="2" w15:restartNumberingAfterBreak="0">
     <w:nsid w:val="00A99411"/>
     <w:multiLevelType w:val="multilevel"/>
-    <w:tmpl w:val="66C867F4"/>
+    <w:tmpl w:val="71F41B4C"/>
     <w:lvl w:ilvl="0">
       <w:start w:val="1"/>
       <w:numFmt w:val="decimal"/>
@@ -5841,10 +5810,10 @@
       </w:pPr>
     </w:lvl>
   </w:abstractNum>
-  <w:num w:numId="1" w16cid:durableId="1983389761">
+  <w:num w:numId="1" w16cid:durableId="1451972477">
     <w:abstractNumId w:val="0"/>
   </w:num>
-  <w:num w:numId="2" w16cid:durableId="579753890">
+  <w:num w:numId="2" w16cid:durableId="23865375">
     <w:abstractNumId w:val="2"/>
     <w:lvlOverride w:ilvl="0">
       <w:startOverride w:val="1"/>
@@ -5874,13 +5843,13 @@
       <w:startOverride w:val="1"/>
     </w:lvlOverride>
   </w:num>
-  <w:num w:numId="3" w16cid:durableId="2031106731">
+  <w:num w:numId="3" w16cid:durableId="1053888696">
     <w:abstractNumId w:val="1"/>
   </w:num>
-  <w:num w:numId="4" w16cid:durableId="1824927429">
+  <w:num w:numId="4" w16cid:durableId="337082252">
     <w:abstractNumId w:val="1"/>
   </w:num>
-  <w:num w:numId="5" w16cid:durableId="1311443306">
+  <w:num w:numId="5" w16cid:durableId="1496187588">
     <w:abstractNumId w:val="2"/>
     <w:lvlOverride w:ilvl="0">
       <w:startOverride w:val="1"/>
@@ -5910,7 +5879,7 @@
       <w:startOverride w:val="1"/>
     </w:lvlOverride>
   </w:num>
-  <w:num w:numId="6" w16cid:durableId="1071125623">
+  <w:num w:numId="6" w16cid:durableId="1269923795">
     <w:abstractNumId w:val="1"/>
   </w:num>
 </w:numbering>
@@ -7189,7 +7158,7 @@
     <w:next w:val="Normal"/>
     <w:autoRedefine/>
     <w:uiPriority w:val="39"/>
-    <w:rsid w:val="00FA19A9"/>
+    <w:rsid w:val="002D2DDA"/>
     <w:pPr>
       <w:spacing w:after="100"/>
     </w:pPr>
@@ -7200,7 +7169,7 @@
     <w:next w:val="Normal"/>
     <w:autoRedefine/>
     <w:uiPriority w:val="39"/>
-    <w:rsid w:val="00FA19A9"/>
+    <w:rsid w:val="002D2DDA"/>
     <w:pPr>
       <w:spacing w:after="100"/>
       <w:ind w:left="210"/>
@@ -7210,7 +7179,7 @@
     <w:name w:val="header"/>
     <w:basedOn w:val="Normal"/>
     <w:link w:val="HeaderChar"/>
-    <w:rsid w:val="00FA19A9"/>
+    <w:rsid w:val="002D2DDA"/>
     <w:pPr>
       <w:tabs>
         <w:tab w:val="center" w:pos="4513"/>
@@ -7223,7 +7192,7 @@
     <w:name w:val="Header Char"/>
     <w:basedOn w:val="DefaultParagraphFont"/>
     <w:link w:val="Header"/>
-    <w:rsid w:val="00FA19A9"/>
+    <w:rsid w:val="002D2DDA"/>
     <w:rPr>
       <w:rFonts w:ascii="Segoe UI" w:eastAsia="Segoe UI" w:hAnsi="Segoe UI" w:cs="Segoe UI"/>
       <w:color w:val="242424"/>
@@ -7234,7 +7203,7 @@
     <w:name w:val="footer"/>
     <w:basedOn w:val="Normal"/>
     <w:link w:val="FooterChar"/>
-    <w:rsid w:val="00FA19A9"/>
+    <w:rsid w:val="002D2DDA"/>
     <w:pPr>
       <w:tabs>
         <w:tab w:val="center" w:pos="4513"/>
@@ -7247,7 +7216,7 @@
     <w:name w:val="Footer Char"/>
     <w:basedOn w:val="DefaultParagraphFont"/>
     <w:link w:val="Footer"/>
-    <w:rsid w:val="00FA19A9"/>
+    <w:rsid w:val="002D2DDA"/>
     <w:rPr>
       <w:rFonts w:ascii="Segoe UI" w:eastAsia="Segoe UI" w:hAnsi="Segoe UI" w:cs="Segoe UI"/>
       <w:color w:val="242424"/>

</xml_diff>

<commit_message>
Apply dry-run feedback: optional sub-tasks, Zava-only grounding, Ex 1 expectations
The dry run ran ~146 minutes of exercises against a 110-minute budget.
- Make secondary tasks optional for fast finishers: 2c scorecard, 3b payroll
  brief, 6b kickoff, 6c announcement, 7c skill sharing; facilitators demo them.
- Ground Ex 4 and Ex 8 in Zava only: Zava-specific instructions and test
  questions, test the skill in a new task, and set Agent Builder's "Only use
  specified sources" on and "Search all websites" off.
- Ex 1: explain what Cowork asks along the way and that it uses your own work
  (prompt unchanged).
- Replace the Ex 3 stretch (DOL eLaws advisor, which Cowork declined) with a
  read-only exemption check (Fact Sheet #17A + Washington exempt salary).
- Rebuild the decks, quick reference card, and Word docs.

Co-Authored-By: Claude Opus 5.5 <noreply@anthropic.com>
</commit_message>
<xml_diff>
--- a/README.docx
+++ b/README.docx
@@ -10,7 +10,7 @@
           <w:sz w:val="21"/>
           <w:szCs w:val="24"/>
         </w:rPr>
-        <w:id w:val="-161542205"/>
+        <w:id w:val="-1501504136"/>
         <w:docPartObj>
           <w:docPartGallery w:val="Table of Contents"/>
           <w:docPartUnique/>
@@ -51,7 +51,7 @@
           <w:r>
             <w:fldChar w:fldCharType="separate"/>
           </w:r>
-          <w:hyperlink w:anchor="_Toc242255259" w:history="1">
+          <w:hyperlink w:anchor="_Toc242259703" w:history="1">
             <w:r>
               <w:rPr>
                 <w:rStyle w:val="Hyperlink"/>
@@ -78,7 +78,7 @@
                 <w:noProof/>
                 <w:webHidden/>
               </w:rPr>
-              <w:instrText xml:space="preserve"> PAGEREF _Toc242255259 \h </w:instrText>
+              <w:instrText xml:space="preserve"> PAGEREF _Toc242259703 \h </w:instrText>
             </w:r>
             <w:r>
               <w:rPr>
@@ -125,7 +125,7 @@
               <w14:ligatures w14:val="standardContextual"/>
             </w:rPr>
           </w:pPr>
-          <w:hyperlink w:anchor="_Toc242255260" w:history="1">
+          <w:hyperlink w:anchor="_Toc242259704" w:history="1">
             <w:r>
               <w:rPr>
                 <w:rStyle w:val="Hyperlink"/>
@@ -152,7 +152,7 @@
                 <w:noProof/>
                 <w:webHidden/>
               </w:rPr>
-              <w:instrText xml:space="preserve"> PAGEREF _Toc242255260 \h </w:instrText>
+              <w:instrText xml:space="preserve"> PAGEREF _Toc242259704 \h </w:instrText>
             </w:r>
             <w:r>
               <w:rPr>
@@ -199,7 +199,7 @@
               <w14:ligatures w14:val="standardContextual"/>
             </w:rPr>
           </w:pPr>
-          <w:hyperlink w:anchor="_Toc242255261" w:history="1">
+          <w:hyperlink w:anchor="_Toc242259705" w:history="1">
             <w:r>
               <w:rPr>
                 <w:rStyle w:val="Hyperlink"/>
@@ -226,7 +226,7 @@
                 <w:noProof/>
                 <w:webHidden/>
               </w:rPr>
-              <w:instrText xml:space="preserve"> PAGEREF _Toc242255261 \h </w:instrText>
+              <w:instrText xml:space="preserve"> PAGEREF _Toc242259705 \h </w:instrText>
             </w:r>
             <w:r>
               <w:rPr>
@@ -273,7 +273,7 @@
               <w14:ligatures w14:val="standardContextual"/>
             </w:rPr>
           </w:pPr>
-          <w:hyperlink w:anchor="_Toc242255262" w:history="1">
+          <w:hyperlink w:anchor="_Toc242259706" w:history="1">
             <w:r>
               <w:rPr>
                 <w:rStyle w:val="Hyperlink"/>
@@ -300,7 +300,7 @@
                 <w:noProof/>
                 <w:webHidden/>
               </w:rPr>
-              <w:instrText xml:space="preserve"> PAGEREF _Toc242255262 \h </w:instrText>
+              <w:instrText xml:space="preserve"> PAGEREF _Toc242259706 \h </w:instrText>
             </w:r>
             <w:r>
               <w:rPr>
@@ -347,7 +347,7 @@
               <w14:ligatures w14:val="standardContextual"/>
             </w:rPr>
           </w:pPr>
-          <w:hyperlink w:anchor="_Toc242255263" w:history="1">
+          <w:hyperlink w:anchor="_Toc242259707" w:history="1">
             <w:r>
               <w:rPr>
                 <w:rStyle w:val="Hyperlink"/>
@@ -374,7 +374,7 @@
                 <w:noProof/>
                 <w:webHidden/>
               </w:rPr>
-              <w:instrText xml:space="preserve"> PAGEREF _Toc242255263 \h </w:instrText>
+              <w:instrText xml:space="preserve"> PAGEREF _Toc242259707 \h </w:instrText>
             </w:r>
             <w:r>
               <w:rPr>
@@ -421,7 +421,7 @@
               <w14:ligatures w14:val="standardContextual"/>
             </w:rPr>
           </w:pPr>
-          <w:hyperlink w:anchor="_Toc242255264" w:history="1">
+          <w:hyperlink w:anchor="_Toc242259708" w:history="1">
             <w:r>
               <w:rPr>
                 <w:rStyle w:val="Hyperlink"/>
@@ -448,7 +448,7 @@
                 <w:noProof/>
                 <w:webHidden/>
               </w:rPr>
-              <w:instrText xml:space="preserve"> PAGEREF _Toc242255264 \h </w:instrText>
+              <w:instrText xml:space="preserve"> PAGEREF _Toc242259708 \h </w:instrText>
             </w:r>
             <w:r>
               <w:rPr>
@@ -495,7 +495,7 @@
               <w14:ligatures w14:val="standardContextual"/>
             </w:rPr>
           </w:pPr>
-          <w:hyperlink w:anchor="_Toc242255265" w:history="1">
+          <w:hyperlink w:anchor="_Toc242259709" w:history="1">
             <w:r>
               <w:rPr>
                 <w:rStyle w:val="Hyperlink"/>
@@ -522,7 +522,7 @@
                 <w:noProof/>
                 <w:webHidden/>
               </w:rPr>
-              <w:instrText xml:space="preserve"> PAGEREF _Toc242255265 \h </w:instrText>
+              <w:instrText xml:space="preserve"> PAGEREF _Toc242259709 \h </w:instrText>
             </w:r>
             <w:r>
               <w:rPr>
@@ -569,7 +569,7 @@
               <w14:ligatures w14:val="standardContextual"/>
             </w:rPr>
           </w:pPr>
-          <w:hyperlink w:anchor="_Toc242255266" w:history="1">
+          <w:hyperlink w:anchor="_Toc242259710" w:history="1">
             <w:r>
               <w:rPr>
                 <w:rStyle w:val="Hyperlink"/>
@@ -596,7 +596,7 @@
                 <w:noProof/>
                 <w:webHidden/>
               </w:rPr>
-              <w:instrText xml:space="preserve"> PAGEREF _Toc242255266 \h </w:instrText>
+              <w:instrText xml:space="preserve"> PAGEREF _Toc242259710 \h </w:instrText>
             </w:r>
             <w:r>
               <w:rPr>
@@ -639,7 +639,7 @@
         <w:pStyle w:val="Heading1"/>
       </w:pPr>
       <w:bookmarkStart w:id="0" w:name="Xa046f7e33c7391c4827688ee785cfee5a5aaa0a"/>
-      <w:bookmarkStart w:id="1" w:name="_Toc242255259"/>
+      <w:bookmarkStart w:id="1" w:name="_Toc242259703"/>
       <w:r>
         <w:t>Getting Things Done with Copilot Cowork for HR Tasks</w:t>
       </w:r>
@@ -775,7 +775,7 @@
         <w:pStyle w:val="Heading2"/>
       </w:pPr>
       <w:bookmarkStart w:id="3" w:name="learning-objectives"/>
-      <w:bookmarkStart w:id="4" w:name="_Toc242255260"/>
+      <w:bookmarkStart w:id="4" w:name="_Toc242259704"/>
       <w:bookmarkEnd w:id="2"/>
       <w:r>
         <w:t>Learning objectives</w:t>
@@ -916,7 +916,7 @@
         <w:pStyle w:val="Heading2"/>
       </w:pPr>
       <w:bookmarkStart w:id="5" w:name="who-its-for"/>
-      <w:bookmarkStart w:id="6" w:name="_Toc242255261"/>
+      <w:bookmarkStart w:id="6" w:name="_Toc242259705"/>
       <w:bookmarkEnd w:id="3"/>
       <w:r>
         <w:t>Who it's for</w:t>
@@ -1078,7 +1078,7 @@
         <w:pStyle w:val="Heading2"/>
       </w:pPr>
       <w:bookmarkStart w:id="7" w:name="prerequisites"/>
-      <w:bookmarkStart w:id="8" w:name="_Toc242255262"/>
+      <w:bookmarkStart w:id="8" w:name="_Toc242259706"/>
       <w:bookmarkEnd w:id="5"/>
       <w:r>
         <w:t>Prerequisites</w:t>
@@ -1182,7 +1182,7 @@
         <w:pStyle w:val="Heading2"/>
       </w:pPr>
       <w:bookmarkStart w:id="9" w:name="agenda-2½-hours"/>
-      <w:bookmarkStart w:id="10" w:name="_Toc242255263"/>
+      <w:bookmarkStart w:id="10" w:name="_Toc242259707"/>
       <w:bookmarkEnd w:id="7"/>
       <w:r>
         <w:t>Agenda (2½ hours)</w:t>
@@ -1210,8 +1210,8 @@
         <w:tblLook w:val="0020" w:firstRow="1" w:lastRow="0" w:firstColumn="0" w:lastColumn="0" w:noHBand="0" w:noVBand="0"/>
       </w:tblPr>
       <w:tblGrid>
-        <w:gridCol w:w="711"/>
-        <w:gridCol w:w="9261"/>
+        <w:gridCol w:w="712"/>
+        <w:gridCol w:w="9260"/>
       </w:tblGrid>
       <w:tr>
         <w:trPr>
@@ -1470,7 +1470,7 @@
               <w:rPr>
                 <w:sz w:val="19"/>
               </w:rPr>
-              <w:t xml:space="preserve"> — Research the web with Deep Research (cited briefing + Word/Excel scorecard)</w:t>
+              <w:t xml:space="preserve"> — Research the web with Deep Research (cited briefing + 5 tailored interview questions)</w:t>
             </w:r>
           </w:p>
         </w:tc>
@@ -1696,7 +1696,7 @@
               <w:rPr>
                 <w:sz w:val="19"/>
               </w:rPr>
-              <w:t xml:space="preserve"> — Onboarding pack (PowerPoint + Scheduling + Communications)</w:t>
+              <w:t xml:space="preserve"> — Onboarding pack (orientation deck; scheduling + announcement if time allows)</w:t>
             </w:r>
           </w:p>
         </w:tc>
@@ -1740,7 +1740,7 @@
               <w:rPr>
                 <w:sz w:val="19"/>
               </w:rPr>
-              <w:t xml:space="preserve"> — Automate &amp; share (Automations, Daily Briefing, skill sharing)</w:t>
+              <w:t xml:space="preserve"> — Automate &amp; share (Automations, Daily Briefing; skill sharing if time allows)</w:t>
             </w:r>
           </w:p>
         </w:tc>
@@ -1855,10 +1855,7 @@
         <w:t>demo video</w:t>
       </w:r>
       <w:r>
-        <w:t xml:space="preserve"> </w:t>
-      </w:r>
-      <w:r>
-        <w:t xml:space="preserve">before each exercise instead of waiting on long Cowork runs, and the </w:t>
+        <w:t xml:space="preserve"> before each exercise instead of waiting on long Cowork runs, and the </w:t>
       </w:r>
       <w:r>
         <w:rPr>
@@ -1887,7 +1884,7 @@
         <w:pStyle w:val="Heading2"/>
       </w:pPr>
       <w:bookmarkStart w:id="11" w:name="whats-in-this-kit"/>
-      <w:bookmarkStart w:id="12" w:name="_Toc242255264"/>
+      <w:bookmarkStart w:id="12" w:name="_Toc242259708"/>
       <w:bookmarkEnd w:id="9"/>
       <w:r>
         <w:t>What's in this kit</w:t>
@@ -2182,7 +2179,7 @@
           <w:noProof/>
         </w:rPr>
         <w:drawing>
-          <wp:inline distT="0" distB="0" distL="0" distR="0" wp14:anchorId="7E49565E" wp14:editId="5E834630">
+          <wp:inline distT="0" distB="0" distL="0" distR="0" wp14:anchorId="1B2227D1" wp14:editId="085E43AA">
             <wp:extent cx="4400120" cy="1306285"/>
             <wp:effectExtent l="0" t="0" r="0" b="0"/>
             <wp:docPr id="24" name="Picture" descr="Tip: on a GitHub file page, select the Download icon (Download raw file) at the top right of the file"/>
@@ -4695,7 +4692,7 @@
         <w:pStyle w:val="Heading2"/>
       </w:pPr>
       <w:bookmarkStart w:id="14" w:name="how-to-use-this-kit"/>
-      <w:bookmarkStart w:id="15" w:name="_Toc242255265"/>
+      <w:bookmarkStart w:id="15" w:name="_Toc242259709"/>
       <w:bookmarkEnd w:id="11"/>
       <w:bookmarkEnd w:id="13"/>
       <w:r>
@@ -4958,7 +4955,7 @@
         <w:pStyle w:val="Heading2"/>
       </w:pPr>
       <w:bookmarkStart w:id="16" w:name="requirement-coverage"/>
-      <w:bookmarkStart w:id="17" w:name="_Toc242255266"/>
+      <w:bookmarkStart w:id="17" w:name="_Toc242259710"/>
       <w:bookmarkEnd w:id="14"/>
       <w:r>
         <w:t>Requirement coverage</w:t>
@@ -5389,7 +5386,7 @@
     </w:p>
     <w:p>
       <w:r>
-        <w:pict w14:anchorId="6D288AF5">
+        <w:pict w14:anchorId="23567B5B">
           <v:rect id="_x0000_i1025" style="width:0;height:1.5pt" o:hralign="center" o:hrstd="t" o:hr="t"/>
         </w:pict>
       </w:r>
@@ -5546,7 +5543,7 @@
   <w:abstractNum w:abstractNumId="0" w15:restartNumberingAfterBreak="0">
     <w:nsid w:val="0000A990"/>
     <w:multiLevelType w:val="multilevel"/>
-    <w:tmpl w:val="0C6E17E2"/>
+    <w:tmpl w:val="75C80DB0"/>
     <w:lvl w:ilvl="0">
       <w:numFmt w:val="bullet"/>
       <w:lvlText w:val=" "/>
@@ -5623,7 +5620,7 @@
   <w:abstractNum w:abstractNumId="1" w15:restartNumberingAfterBreak="0">
     <w:nsid w:val="0000A991"/>
     <w:multiLevelType w:val="multilevel"/>
-    <w:tmpl w:val="BF3CD770"/>
+    <w:tmpl w:val="3BC6A81C"/>
     <w:lvl w:ilvl="0">
       <w:numFmt w:val="bullet"/>
       <w:lvlText w:val=""/>
@@ -5727,7 +5724,7 @@
   <w:abstractNum w:abstractNumId="2" w15:restartNumberingAfterBreak="0">
     <w:nsid w:val="00A99411"/>
     <w:multiLevelType w:val="multilevel"/>
-    <w:tmpl w:val="71F41B4C"/>
+    <w:tmpl w:val="75166824"/>
     <w:lvl w:ilvl="0">
       <w:start w:val="1"/>
       <w:numFmt w:val="decimal"/>
@@ -5810,10 +5807,10 @@
       </w:pPr>
     </w:lvl>
   </w:abstractNum>
-  <w:num w:numId="1" w16cid:durableId="1451972477">
+  <w:num w:numId="1" w16cid:durableId="126319946">
     <w:abstractNumId w:val="0"/>
   </w:num>
-  <w:num w:numId="2" w16cid:durableId="23865375">
+  <w:num w:numId="2" w16cid:durableId="724569344">
     <w:abstractNumId w:val="2"/>
     <w:lvlOverride w:ilvl="0">
       <w:startOverride w:val="1"/>
@@ -5843,13 +5840,13 @@
       <w:startOverride w:val="1"/>
     </w:lvlOverride>
   </w:num>
-  <w:num w:numId="3" w16cid:durableId="1053888696">
+  <w:num w:numId="3" w16cid:durableId="580716530">
     <w:abstractNumId w:val="1"/>
   </w:num>
-  <w:num w:numId="4" w16cid:durableId="337082252">
+  <w:num w:numId="4" w16cid:durableId="323122711">
     <w:abstractNumId w:val="1"/>
   </w:num>
-  <w:num w:numId="5" w16cid:durableId="1496187588">
+  <w:num w:numId="5" w16cid:durableId="1450317207">
     <w:abstractNumId w:val="2"/>
     <w:lvlOverride w:ilvl="0">
       <w:startOverride w:val="1"/>
@@ -5879,7 +5876,7 @@
       <w:startOverride w:val="1"/>
     </w:lvlOverride>
   </w:num>
-  <w:num w:numId="6" w16cid:durableId="1269923795">
+  <w:num w:numId="6" w16cid:durableId="1888374066">
     <w:abstractNumId w:val="1"/>
   </w:num>
 </w:numbering>
@@ -7158,7 +7155,7 @@
     <w:next w:val="Normal"/>
     <w:autoRedefine/>
     <w:uiPriority w:val="39"/>
-    <w:rsid w:val="002D2DDA"/>
+    <w:rsid w:val="00F22660"/>
     <w:pPr>
       <w:spacing w:after="100"/>
     </w:pPr>
@@ -7169,7 +7166,7 @@
     <w:next w:val="Normal"/>
     <w:autoRedefine/>
     <w:uiPriority w:val="39"/>
-    <w:rsid w:val="002D2DDA"/>
+    <w:rsid w:val="00F22660"/>
     <w:pPr>
       <w:spacing w:after="100"/>
       <w:ind w:left="210"/>
@@ -7179,7 +7176,7 @@
     <w:name w:val="header"/>
     <w:basedOn w:val="Normal"/>
     <w:link w:val="HeaderChar"/>
-    <w:rsid w:val="002D2DDA"/>
+    <w:rsid w:val="00F22660"/>
     <w:pPr>
       <w:tabs>
         <w:tab w:val="center" w:pos="4513"/>
@@ -7192,7 +7189,7 @@
     <w:name w:val="Header Char"/>
     <w:basedOn w:val="DefaultParagraphFont"/>
     <w:link w:val="Header"/>
-    <w:rsid w:val="002D2DDA"/>
+    <w:rsid w:val="00F22660"/>
     <w:rPr>
       <w:rFonts w:ascii="Segoe UI" w:eastAsia="Segoe UI" w:hAnsi="Segoe UI" w:cs="Segoe UI"/>
       <w:color w:val="242424"/>
@@ -7203,7 +7200,7 @@
     <w:name w:val="footer"/>
     <w:basedOn w:val="Normal"/>
     <w:link w:val="FooterChar"/>
-    <w:rsid w:val="002D2DDA"/>
+    <w:rsid w:val="00F22660"/>
     <w:pPr>
       <w:tabs>
         <w:tab w:val="center" w:pos="4513"/>
@@ -7216,7 +7213,7 @@
     <w:name w:val="Footer Char"/>
     <w:basedOn w:val="DefaultParagraphFont"/>
     <w:link w:val="Footer"/>
-    <w:rsid w:val="002D2DDA"/>
+    <w:rsid w:val="00F22660"/>
     <w:rPr>
       <w:rFonts w:ascii="Segoe UI" w:eastAsia="Segoe UI" w:hAnsi="Segoe UI" w:cs="Segoe UI"/>
       <w:color w:val="242424"/>

</xml_diff>

<commit_message>
Move 5 minutes from Ex 4 to Ex 7; use link placeholders in the participant email
- Ex 4 is now 15 minutes and Ex 7 is 15 (the dry run took about 11 and 14).
  Ex 5, the break, and Ex 6 start 5 minutes earlier; Ex 8 is unchanged.
  Updated the agenda slide, card notes, workbook headings and anchors, the
  facilitator run sheet, section times and time checks, and the README.
- The kit repo is private (Microsoft EMU), so attendees get a sign-in page
  from GitHub links. The participant email now has [link: file] placeholders
  for the host's Teams/SharePoint copies, and the GitHub download tip is gone.
  The readiness checklist says to stage all seven files and test each link.

Co-Authored-By: Claude Opus 5.5 <noreply@anthropic.com>
</commit_message>
<xml_diff>
--- a/README.docx
+++ b/README.docx
@@ -10,7 +10,7 @@
           <w:sz w:val="21"/>
           <w:szCs w:val="24"/>
         </w:rPr>
-        <w:id w:val="-1501504136"/>
+        <w:id w:val="1165059517"/>
         <w:docPartObj>
           <w:docPartGallery w:val="Table of Contents"/>
           <w:docPartUnique/>
@@ -51,7 +51,7 @@
           <w:r>
             <w:fldChar w:fldCharType="separate"/>
           </w:r>
-          <w:hyperlink w:anchor="_Toc242259703" w:history="1">
+          <w:hyperlink w:anchor="_Toc242263591" w:history="1">
             <w:r>
               <w:rPr>
                 <w:rStyle w:val="Hyperlink"/>
@@ -78,7 +78,7 @@
                 <w:noProof/>
                 <w:webHidden/>
               </w:rPr>
-              <w:instrText xml:space="preserve"> PAGEREF _Toc242259703 \h </w:instrText>
+              <w:instrText xml:space="preserve"> PAGEREF _Toc242263591 \h </w:instrText>
             </w:r>
             <w:r>
               <w:rPr>
@@ -125,7 +125,7 @@
               <w14:ligatures w14:val="standardContextual"/>
             </w:rPr>
           </w:pPr>
-          <w:hyperlink w:anchor="_Toc242259704" w:history="1">
+          <w:hyperlink w:anchor="_Toc242263592" w:history="1">
             <w:r>
               <w:rPr>
                 <w:rStyle w:val="Hyperlink"/>
@@ -152,7 +152,7 @@
                 <w:noProof/>
                 <w:webHidden/>
               </w:rPr>
-              <w:instrText xml:space="preserve"> PAGEREF _Toc242259704 \h </w:instrText>
+              <w:instrText xml:space="preserve"> PAGEREF _Toc242263592 \h </w:instrText>
             </w:r>
             <w:r>
               <w:rPr>
@@ -199,7 +199,7 @@
               <w14:ligatures w14:val="standardContextual"/>
             </w:rPr>
           </w:pPr>
-          <w:hyperlink w:anchor="_Toc242259705" w:history="1">
+          <w:hyperlink w:anchor="_Toc242263593" w:history="1">
             <w:r>
               <w:rPr>
                 <w:rStyle w:val="Hyperlink"/>
@@ -226,7 +226,7 @@
                 <w:noProof/>
                 <w:webHidden/>
               </w:rPr>
-              <w:instrText xml:space="preserve"> PAGEREF _Toc242259705 \h </w:instrText>
+              <w:instrText xml:space="preserve"> PAGEREF _Toc242263593 \h </w:instrText>
             </w:r>
             <w:r>
               <w:rPr>
@@ -273,7 +273,7 @@
               <w14:ligatures w14:val="standardContextual"/>
             </w:rPr>
           </w:pPr>
-          <w:hyperlink w:anchor="_Toc242259706" w:history="1">
+          <w:hyperlink w:anchor="_Toc242263594" w:history="1">
             <w:r>
               <w:rPr>
                 <w:rStyle w:val="Hyperlink"/>
@@ -300,7 +300,7 @@
                 <w:noProof/>
                 <w:webHidden/>
               </w:rPr>
-              <w:instrText xml:space="preserve"> PAGEREF _Toc242259706 \h </w:instrText>
+              <w:instrText xml:space="preserve"> PAGEREF _Toc242263594 \h </w:instrText>
             </w:r>
             <w:r>
               <w:rPr>
@@ -347,7 +347,7 @@
               <w14:ligatures w14:val="standardContextual"/>
             </w:rPr>
           </w:pPr>
-          <w:hyperlink w:anchor="_Toc242259707" w:history="1">
+          <w:hyperlink w:anchor="_Toc242263595" w:history="1">
             <w:r>
               <w:rPr>
                 <w:rStyle w:val="Hyperlink"/>
@@ -374,7 +374,7 @@
                 <w:noProof/>
                 <w:webHidden/>
               </w:rPr>
-              <w:instrText xml:space="preserve"> PAGEREF _Toc242259707 \h </w:instrText>
+              <w:instrText xml:space="preserve"> PAGEREF _Toc242263595 \h </w:instrText>
             </w:r>
             <w:r>
               <w:rPr>
@@ -421,7 +421,7 @@
               <w14:ligatures w14:val="standardContextual"/>
             </w:rPr>
           </w:pPr>
-          <w:hyperlink w:anchor="_Toc242259708" w:history="1">
+          <w:hyperlink w:anchor="_Toc242263596" w:history="1">
             <w:r>
               <w:rPr>
                 <w:rStyle w:val="Hyperlink"/>
@@ -448,7 +448,7 @@
                 <w:noProof/>
                 <w:webHidden/>
               </w:rPr>
-              <w:instrText xml:space="preserve"> PAGEREF _Toc242259708 \h </w:instrText>
+              <w:instrText xml:space="preserve"> PAGEREF _Toc242263596 \h </w:instrText>
             </w:r>
             <w:r>
               <w:rPr>
@@ -495,7 +495,7 @@
               <w14:ligatures w14:val="standardContextual"/>
             </w:rPr>
           </w:pPr>
-          <w:hyperlink w:anchor="_Toc242259709" w:history="1">
+          <w:hyperlink w:anchor="_Toc242263597" w:history="1">
             <w:r>
               <w:rPr>
                 <w:rStyle w:val="Hyperlink"/>
@@ -522,7 +522,7 @@
                 <w:noProof/>
                 <w:webHidden/>
               </w:rPr>
-              <w:instrText xml:space="preserve"> PAGEREF _Toc242259709 \h </w:instrText>
+              <w:instrText xml:space="preserve"> PAGEREF _Toc242263597 \h </w:instrText>
             </w:r>
             <w:r>
               <w:rPr>
@@ -569,7 +569,7 @@
               <w14:ligatures w14:val="standardContextual"/>
             </w:rPr>
           </w:pPr>
-          <w:hyperlink w:anchor="_Toc242259710" w:history="1">
+          <w:hyperlink w:anchor="_Toc242263598" w:history="1">
             <w:r>
               <w:rPr>
                 <w:rStyle w:val="Hyperlink"/>
@@ -596,7 +596,7 @@
                 <w:noProof/>
                 <w:webHidden/>
               </w:rPr>
-              <w:instrText xml:space="preserve"> PAGEREF _Toc242259710 \h </w:instrText>
+              <w:instrText xml:space="preserve"> PAGEREF _Toc242263598 \h </w:instrText>
             </w:r>
             <w:r>
               <w:rPr>
@@ -639,7 +639,7 @@
         <w:pStyle w:val="Heading1"/>
       </w:pPr>
       <w:bookmarkStart w:id="0" w:name="Xa046f7e33c7391c4827688ee785cfee5a5aaa0a"/>
-      <w:bookmarkStart w:id="1" w:name="_Toc242259703"/>
+      <w:bookmarkStart w:id="1" w:name="_Toc242263591"/>
       <w:r>
         <w:t>Getting Things Done with Copilot Cowork for HR Tasks</w:t>
       </w:r>
@@ -775,7 +775,7 @@
         <w:pStyle w:val="Heading2"/>
       </w:pPr>
       <w:bookmarkStart w:id="3" w:name="learning-objectives"/>
-      <w:bookmarkStart w:id="4" w:name="_Toc242259704"/>
+      <w:bookmarkStart w:id="4" w:name="_Toc242263592"/>
       <w:bookmarkEnd w:id="2"/>
       <w:r>
         <w:t>Learning objectives</w:t>
@@ -916,7 +916,7 @@
         <w:pStyle w:val="Heading2"/>
       </w:pPr>
       <w:bookmarkStart w:id="5" w:name="who-its-for"/>
-      <w:bookmarkStart w:id="6" w:name="_Toc242259705"/>
+      <w:bookmarkStart w:id="6" w:name="_Toc242263593"/>
       <w:bookmarkEnd w:id="3"/>
       <w:r>
         <w:t>Who it's for</w:t>
@@ -1078,7 +1078,7 @@
         <w:pStyle w:val="Heading2"/>
       </w:pPr>
       <w:bookmarkStart w:id="7" w:name="prerequisites"/>
-      <w:bookmarkStart w:id="8" w:name="_Toc242259706"/>
+      <w:bookmarkStart w:id="8" w:name="_Toc242263594"/>
       <w:bookmarkEnd w:id="5"/>
       <w:r>
         <w:t>Prerequisites</w:t>
@@ -1182,7 +1182,7 @@
         <w:pStyle w:val="Heading2"/>
       </w:pPr>
       <w:bookmarkStart w:id="9" w:name="agenda-2½-hours"/>
-      <w:bookmarkStart w:id="10" w:name="_Toc242259707"/>
+      <w:bookmarkStart w:id="10" w:name="_Toc242263595"/>
       <w:bookmarkEnd w:id="7"/>
       <w:r>
         <w:t>Agenda (2½ hours)</w:t>
@@ -1533,7 +1533,7 @@
               <w:rPr>
                 <w:sz w:val="19"/>
               </w:rPr>
-              <w:t>20 min</w:t>
+              <w:t>15 min</w:t>
             </w:r>
           </w:p>
         </w:tc>
@@ -1715,7 +1715,7 @@
               <w:rPr>
                 <w:sz w:val="19"/>
               </w:rPr>
-              <w:t>10 min</w:t>
+              <w:t>15 min</w:t>
             </w:r>
           </w:p>
         </w:tc>
@@ -1884,7 +1884,7 @@
         <w:pStyle w:val="Heading2"/>
       </w:pPr>
       <w:bookmarkStart w:id="11" w:name="whats-in-this-kit"/>
-      <w:bookmarkStart w:id="12" w:name="_Toc242259708"/>
+      <w:bookmarkStart w:id="12" w:name="_Toc242263596"/>
       <w:bookmarkEnd w:id="9"/>
       <w:r>
         <w:t>What's in this kit</w:t>
@@ -2179,7 +2179,7 @@
           <w:noProof/>
         </w:rPr>
         <w:drawing>
-          <wp:inline distT="0" distB="0" distL="0" distR="0" wp14:anchorId="1B2227D1" wp14:editId="085E43AA">
+          <wp:inline distT="0" distB="0" distL="0" distR="0" wp14:anchorId="68DA9A7D" wp14:editId="2565AEE3">
             <wp:extent cx="4400120" cy="1306285"/>
             <wp:effectExtent l="0" t="0" r="0" b="0"/>
             <wp:docPr id="24" name="Picture" descr="Tip: on a GitHub file page, select the Download icon (Download raw file) at the top right of the file"/>
@@ -4692,7 +4692,7 @@
         <w:pStyle w:val="Heading2"/>
       </w:pPr>
       <w:bookmarkStart w:id="14" w:name="how-to-use-this-kit"/>
-      <w:bookmarkStart w:id="15" w:name="_Toc242259709"/>
+      <w:bookmarkStart w:id="15" w:name="_Toc242263597"/>
       <w:bookmarkEnd w:id="11"/>
       <w:bookmarkEnd w:id="13"/>
       <w:r>
@@ -4771,7 +4771,16 @@
         </w:r>
       </w:hyperlink>
       <w:r>
-        <w:t xml:space="preserve"> to introduce the workshop. To use either email, open it in a browser, copy the email, and paste it into Outlook. Its links point to this private repo, so give recipients access or swap in your Teams/SharePoint links.</w:t>
+        <w:t xml:space="preserve"> to introduce the workshop. To use either email, open it in a browser, copy the email, and paste it into Outlook. The participant email has highlighted </w:t>
+      </w:r>
+      <w:r>
+        <w:rPr>
+          <w:rStyle w:val="VerbatimChar"/>
+        </w:rPr>
+        <w:t>[link: …]</w:t>
+      </w:r>
+      <w:r>
+        <w:t xml:space="preserve"> placeholders for your Teams/SharePoint copies of the files. The instructor email links to this private repo, so give the instructor access first.</w:t>
       </w:r>
     </w:p>
     <w:p>
@@ -4905,10 +4914,7 @@
         </w:r>
       </w:hyperlink>
       <w:r>
-        <w:t xml:space="preserve"> (knowledge check, survey, and </w:t>
-      </w:r>
-      <w:r>
-        <w:t>30-day plan) and pause the Exercise 1 and 7 schedules.</w:t>
+        <w:t xml:space="preserve"> (knowledge check, survey, and 30-day plan) and pause the Exercise 1 and 7 schedules.</w:t>
       </w:r>
     </w:p>
     <w:p>
@@ -4955,7 +4961,7 @@
         <w:pStyle w:val="Heading2"/>
       </w:pPr>
       <w:bookmarkStart w:id="16" w:name="requirement-coverage"/>
-      <w:bookmarkStart w:id="17" w:name="_Toc242259710"/>
+      <w:bookmarkStart w:id="17" w:name="_Toc242263598"/>
       <w:bookmarkEnd w:id="14"/>
       <w:r>
         <w:t>Requirement coverage</w:t>
@@ -5386,7 +5392,7 @@
     </w:p>
     <w:p>
       <w:r>
-        <w:pict w14:anchorId="23567B5B">
+        <w:pict w14:anchorId="48F30F82">
           <v:rect id="_x0000_i1025" style="width:0;height:1.5pt" o:hralign="center" o:hrstd="t" o:hr="t"/>
         </w:pict>
       </w:r>
@@ -5543,7 +5549,7 @@
   <w:abstractNum w:abstractNumId="0" w15:restartNumberingAfterBreak="0">
     <w:nsid w:val="0000A990"/>
     <w:multiLevelType w:val="multilevel"/>
-    <w:tmpl w:val="75C80DB0"/>
+    <w:tmpl w:val="C2ACE908"/>
     <w:lvl w:ilvl="0">
       <w:numFmt w:val="bullet"/>
       <w:lvlText w:val=" "/>
@@ -5620,7 +5626,7 @@
   <w:abstractNum w:abstractNumId="1" w15:restartNumberingAfterBreak="0">
     <w:nsid w:val="0000A991"/>
     <w:multiLevelType w:val="multilevel"/>
-    <w:tmpl w:val="3BC6A81C"/>
+    <w:tmpl w:val="AB0A4252"/>
     <w:lvl w:ilvl="0">
       <w:numFmt w:val="bullet"/>
       <w:lvlText w:val=""/>
@@ -5724,7 +5730,7 @@
   <w:abstractNum w:abstractNumId="2" w15:restartNumberingAfterBreak="0">
     <w:nsid w:val="00A99411"/>
     <w:multiLevelType w:val="multilevel"/>
-    <w:tmpl w:val="75166824"/>
+    <w:tmpl w:val="EA66105E"/>
     <w:lvl w:ilvl="0">
       <w:start w:val="1"/>
       <w:numFmt w:val="decimal"/>
@@ -5807,10 +5813,10 @@
       </w:pPr>
     </w:lvl>
   </w:abstractNum>
-  <w:num w:numId="1" w16cid:durableId="126319946">
+  <w:num w:numId="1" w16cid:durableId="272396021">
     <w:abstractNumId w:val="0"/>
   </w:num>
-  <w:num w:numId="2" w16cid:durableId="724569344">
+  <w:num w:numId="2" w16cid:durableId="1045177628">
     <w:abstractNumId w:val="2"/>
     <w:lvlOverride w:ilvl="0">
       <w:startOverride w:val="1"/>
@@ -5840,13 +5846,13 @@
       <w:startOverride w:val="1"/>
     </w:lvlOverride>
   </w:num>
-  <w:num w:numId="3" w16cid:durableId="580716530">
+  <w:num w:numId="3" w16cid:durableId="1360618322">
     <w:abstractNumId w:val="1"/>
   </w:num>
-  <w:num w:numId="4" w16cid:durableId="323122711">
+  <w:num w:numId="4" w16cid:durableId="158498487">
     <w:abstractNumId w:val="1"/>
   </w:num>
-  <w:num w:numId="5" w16cid:durableId="1450317207">
+  <w:num w:numId="5" w16cid:durableId="90248750">
     <w:abstractNumId w:val="2"/>
     <w:lvlOverride w:ilvl="0">
       <w:startOverride w:val="1"/>
@@ -5876,7 +5882,7 @@
       <w:startOverride w:val="1"/>
     </w:lvlOverride>
   </w:num>
-  <w:num w:numId="6" w16cid:durableId="1888374066">
+  <w:num w:numId="6" w16cid:durableId="943461248">
     <w:abstractNumId w:val="1"/>
   </w:num>
 </w:numbering>
@@ -7155,7 +7161,7 @@
     <w:next w:val="Normal"/>
     <w:autoRedefine/>
     <w:uiPriority w:val="39"/>
-    <w:rsid w:val="00F22660"/>
+    <w:rsid w:val="00BB3E24"/>
     <w:pPr>
       <w:spacing w:after="100"/>
     </w:pPr>
@@ -7166,7 +7172,7 @@
     <w:next w:val="Normal"/>
     <w:autoRedefine/>
     <w:uiPriority w:val="39"/>
-    <w:rsid w:val="00F22660"/>
+    <w:rsid w:val="00BB3E24"/>
     <w:pPr>
       <w:spacing w:after="100"/>
       <w:ind w:left="210"/>
@@ -7176,7 +7182,7 @@
     <w:name w:val="header"/>
     <w:basedOn w:val="Normal"/>
     <w:link w:val="HeaderChar"/>
-    <w:rsid w:val="00F22660"/>
+    <w:rsid w:val="00BB3E24"/>
     <w:pPr>
       <w:tabs>
         <w:tab w:val="center" w:pos="4513"/>
@@ -7189,7 +7195,7 @@
     <w:name w:val="Header Char"/>
     <w:basedOn w:val="DefaultParagraphFont"/>
     <w:link w:val="Header"/>
-    <w:rsid w:val="00F22660"/>
+    <w:rsid w:val="00BB3E24"/>
     <w:rPr>
       <w:rFonts w:ascii="Segoe UI" w:eastAsia="Segoe UI" w:hAnsi="Segoe UI" w:cs="Segoe UI"/>
       <w:color w:val="242424"/>
@@ -7200,7 +7206,7 @@
     <w:name w:val="footer"/>
     <w:basedOn w:val="Normal"/>
     <w:link w:val="FooterChar"/>
-    <w:rsid w:val="00F22660"/>
+    <w:rsid w:val="00BB3E24"/>
     <w:pPr>
       <w:tabs>
         <w:tab w:val="center" w:pos="4513"/>
@@ -7213,7 +7219,7 @@
     <w:name w:val="Footer Char"/>
     <w:basedOn w:val="DefaultParagraphFont"/>
     <w:link w:val="Footer"/>
-    <w:rsid w:val="00F22660"/>
+    <w:rsid w:val="00BB3E24"/>
     <w:rPr>
       <w:rFonts w:ascii="Segoe UI" w:eastAsia="Segoe UI" w:hAnsi="Segoe UI" w:cs="Segoe UI"/>
       <w:color w:val="242424"/>

</xml_diff>

<commit_message>
Add "Clean up the training data" steps to the workbook, deck, and guides
Port the clean-up section from the unmerged October 2 commit 3f12944 on
agents/organize-training-content-folders, adapted to attendees' own work
accounts and the 2½-hour agenda: schedules first, then skills, custom
instructions, the HR Policy Agent, Zava files, Outlook items, and the laptop,
keeping anything attendees want to reuse. Adds a closing deck slide in
build_deck.py (the committed .pptx still needs a rebuild with the template),
a facilitator-guide wrap-up note, readiness-checklist day-after steps, an
after-the-workshop housekeeping line, and a quick-reference card item.

Co-Authored-By: Claude Opus 5.5 <noreply@anthropic.com>
</commit_message>
<xml_diff>
--- a/README.docx
+++ b/README.docx
@@ -10,7 +10,7 @@
           <w:sz w:val="21"/>
           <w:szCs w:val="24"/>
         </w:rPr>
-        <w:id w:val="-1382245176"/>
+        <w:id w:val="1234740874"/>
         <w:docPartObj>
           <w:docPartGallery w:val="Table of Contents"/>
           <w:docPartUnique/>
@@ -51,7 +51,7 @@
           <w:r>
             <w:fldChar w:fldCharType="separate"/>
           </w:r>
-          <w:hyperlink w:anchor="_Toc242272185" w:history="1">
+          <w:hyperlink w:anchor="_Toc242289611" w:history="1">
             <w:r>
               <w:rPr>
                 <w:rStyle w:val="Hyperlink"/>
@@ -78,7 +78,7 @@
                 <w:noProof/>
                 <w:webHidden/>
               </w:rPr>
-              <w:instrText xml:space="preserve"> PAGEREF _Toc242272185 \h </w:instrText>
+              <w:instrText xml:space="preserve"> PAGEREF _Toc242289611 \h </w:instrText>
             </w:r>
             <w:r>
               <w:rPr>
@@ -125,7 +125,7 @@
               <w14:ligatures w14:val="standardContextual"/>
             </w:rPr>
           </w:pPr>
-          <w:hyperlink w:anchor="_Toc242272186" w:history="1">
+          <w:hyperlink w:anchor="_Toc242289612" w:history="1">
             <w:r>
               <w:rPr>
                 <w:rStyle w:val="Hyperlink"/>
@@ -152,7 +152,7 @@
                 <w:noProof/>
                 <w:webHidden/>
               </w:rPr>
-              <w:instrText xml:space="preserve"> PAGEREF _Toc242272186 \h </w:instrText>
+              <w:instrText xml:space="preserve"> PAGEREF _Toc242289612 \h </w:instrText>
             </w:r>
             <w:r>
               <w:rPr>
@@ -199,7 +199,7 @@
               <w14:ligatures w14:val="standardContextual"/>
             </w:rPr>
           </w:pPr>
-          <w:hyperlink w:anchor="_Toc242272187" w:history="1">
+          <w:hyperlink w:anchor="_Toc242289613" w:history="1">
             <w:r>
               <w:rPr>
                 <w:rStyle w:val="Hyperlink"/>
@@ -226,7 +226,7 @@
                 <w:noProof/>
                 <w:webHidden/>
               </w:rPr>
-              <w:instrText xml:space="preserve"> PAGEREF _Toc242272187 \h </w:instrText>
+              <w:instrText xml:space="preserve"> PAGEREF _Toc242289613 \h </w:instrText>
             </w:r>
             <w:r>
               <w:rPr>
@@ -273,7 +273,7 @@
               <w14:ligatures w14:val="standardContextual"/>
             </w:rPr>
           </w:pPr>
-          <w:hyperlink w:anchor="_Toc242272188" w:history="1">
+          <w:hyperlink w:anchor="_Toc242289614" w:history="1">
             <w:r>
               <w:rPr>
                 <w:rStyle w:val="Hyperlink"/>
@@ -300,7 +300,7 @@
                 <w:noProof/>
                 <w:webHidden/>
               </w:rPr>
-              <w:instrText xml:space="preserve"> PAGEREF _Toc242272188 \h </w:instrText>
+              <w:instrText xml:space="preserve"> PAGEREF _Toc242289614 \h </w:instrText>
             </w:r>
             <w:r>
               <w:rPr>
@@ -347,7 +347,7 @@
               <w14:ligatures w14:val="standardContextual"/>
             </w:rPr>
           </w:pPr>
-          <w:hyperlink w:anchor="_Toc242272189" w:history="1">
+          <w:hyperlink w:anchor="_Toc242289615" w:history="1">
             <w:r>
               <w:rPr>
                 <w:rStyle w:val="Hyperlink"/>
@@ -374,7 +374,7 @@
                 <w:noProof/>
                 <w:webHidden/>
               </w:rPr>
-              <w:instrText xml:space="preserve"> PAGEREF _Toc242272189 \h </w:instrText>
+              <w:instrText xml:space="preserve"> PAGEREF _Toc242289615 \h </w:instrText>
             </w:r>
             <w:r>
               <w:rPr>
@@ -421,7 +421,7 @@
               <w14:ligatures w14:val="standardContextual"/>
             </w:rPr>
           </w:pPr>
-          <w:hyperlink w:anchor="_Toc242272190" w:history="1">
+          <w:hyperlink w:anchor="_Toc242289616" w:history="1">
             <w:r>
               <w:rPr>
                 <w:rStyle w:val="Hyperlink"/>
@@ -448,7 +448,7 @@
                 <w:noProof/>
                 <w:webHidden/>
               </w:rPr>
-              <w:instrText xml:space="preserve"> PAGEREF _Toc242272190 \h </w:instrText>
+              <w:instrText xml:space="preserve"> PAGEREF _Toc242289616 \h </w:instrText>
             </w:r>
             <w:r>
               <w:rPr>
@@ -495,7 +495,7 @@
               <w14:ligatures w14:val="standardContextual"/>
             </w:rPr>
           </w:pPr>
-          <w:hyperlink w:anchor="_Toc242272191" w:history="1">
+          <w:hyperlink w:anchor="_Toc242289617" w:history="1">
             <w:r>
               <w:rPr>
                 <w:rStyle w:val="Hyperlink"/>
@@ -522,7 +522,7 @@
                 <w:noProof/>
                 <w:webHidden/>
               </w:rPr>
-              <w:instrText xml:space="preserve"> PAGEREF _Toc242272191 \h </w:instrText>
+              <w:instrText xml:space="preserve"> PAGEREF _Toc242289617 \h </w:instrText>
             </w:r>
             <w:r>
               <w:rPr>
@@ -569,7 +569,7 @@
               <w14:ligatures w14:val="standardContextual"/>
             </w:rPr>
           </w:pPr>
-          <w:hyperlink w:anchor="_Toc242272192" w:history="1">
+          <w:hyperlink w:anchor="_Toc242289618" w:history="1">
             <w:r>
               <w:rPr>
                 <w:rStyle w:val="Hyperlink"/>
@@ -596,7 +596,7 @@
                 <w:noProof/>
                 <w:webHidden/>
               </w:rPr>
-              <w:instrText xml:space="preserve"> PAGEREF _Toc242272192 \h </w:instrText>
+              <w:instrText xml:space="preserve"> PAGEREF _Toc242289618 \h </w:instrText>
             </w:r>
             <w:r>
               <w:rPr>
@@ -639,7 +639,7 @@
         <w:pStyle w:val="Heading1"/>
       </w:pPr>
       <w:bookmarkStart w:id="0" w:name="Xa046f7e33c7391c4827688ee785cfee5a5aaa0a"/>
-      <w:bookmarkStart w:id="1" w:name="_Toc242272185"/>
+      <w:bookmarkStart w:id="1" w:name="_Toc242289611"/>
       <w:r>
         <w:t>Getting Things Done with Copilot Cowork for HR Tasks</w:t>
       </w:r>
@@ -775,7 +775,7 @@
         <w:pStyle w:val="Heading2"/>
       </w:pPr>
       <w:bookmarkStart w:id="3" w:name="learning-objectives"/>
-      <w:bookmarkStart w:id="4" w:name="_Toc242272186"/>
+      <w:bookmarkStart w:id="4" w:name="_Toc242289612"/>
       <w:bookmarkEnd w:id="2"/>
       <w:r>
         <w:t>Learning objectives</w:t>
@@ -910,7 +910,7 @@
         <w:pStyle w:val="Heading2"/>
       </w:pPr>
       <w:bookmarkStart w:id="5" w:name="who-its-for"/>
-      <w:bookmarkStart w:id="6" w:name="_Toc242272187"/>
+      <w:bookmarkStart w:id="6" w:name="_Toc242289613"/>
       <w:bookmarkEnd w:id="3"/>
       <w:r>
         <w:t>Who it's for</w:t>
@@ -1069,7 +1069,7 @@
         <w:pStyle w:val="Heading2"/>
       </w:pPr>
       <w:bookmarkStart w:id="7" w:name="prerequisites"/>
-      <w:bookmarkStart w:id="8" w:name="_Toc242272188"/>
+      <w:bookmarkStart w:id="8" w:name="_Toc242289614"/>
       <w:bookmarkEnd w:id="5"/>
       <w:r>
         <w:t>Prerequisites</w:t>
@@ -1170,7 +1170,7 @@
         <w:pStyle w:val="Heading2"/>
       </w:pPr>
       <w:bookmarkStart w:id="9" w:name="agenda-2½-hours"/>
-      <w:bookmarkStart w:id="10" w:name="_Toc242272189"/>
+      <w:bookmarkStart w:id="10" w:name="_Toc242289615"/>
       <w:bookmarkEnd w:id="7"/>
       <w:r>
         <w:t>Agenda (2½ hours)</w:t>
@@ -1860,7 +1860,7 @@
         <w:pStyle w:val="Heading2"/>
       </w:pPr>
       <w:bookmarkStart w:id="11" w:name="whats-in-this-kit"/>
-      <w:bookmarkStart w:id="12" w:name="_Toc242272190"/>
+      <w:bookmarkStart w:id="12" w:name="_Toc242289616"/>
       <w:bookmarkEnd w:id="9"/>
       <w:r>
         <w:t>What's in this kit</w:t>
@@ -2149,7 +2149,7 @@
           <w:noProof/>
         </w:rPr>
         <w:drawing>
-          <wp:inline distT="0" distB="0" distL="0" distR="0" wp14:anchorId="4A993204" wp14:editId="7220AE00">
+          <wp:inline distT="0" distB="0" distL="0" distR="0" wp14:anchorId="6C98CEC5" wp14:editId="3D4150AE">
             <wp:extent cx="4400120" cy="1306285"/>
             <wp:effectExtent l="0" t="0" r="0" b="0"/>
             <wp:docPr id="24" name="Picture" descr="Tip: on a GitHub file page, select the Download icon (Download raw file) at the top right of the file"/>
@@ -2467,7 +2467,7 @@
               <w:rPr>
                 <w:sz w:val="19"/>
               </w:rPr>
-              <w:t xml:space="preserve">Instructor deck (56 slides, speaker notes, alt text) — a </w:t>
+              <w:t xml:space="preserve">Instructor deck (57 slides, speaker notes, alt text) — a </w:t>
             </w:r>
             <w:r>
               <w:rPr>
@@ -2549,7 +2549,21 @@
               <w:rPr>
                 <w:sz w:val="19"/>
               </w:rPr>
-              <w:t xml:space="preserve"> banners on Exercise 8, and a knowledge check</w:t>
+              <w:t xml:space="preserve"> banners on Exercise 8, a knowledge check, and a closing </w:t>
+            </w:r>
+            <w:r>
+              <w:rPr>
+                <w:b/>
+                <w:bCs/>
+                <w:sz w:val="19"/>
+              </w:rPr>
+              <w:t>clean up the training data</w:t>
+            </w:r>
+            <w:r>
+              <w:rPr>
+                <w:sz w:val="19"/>
+              </w:rPr>
+              <w:t xml:space="preserve"> slide</w:t>
             </w:r>
           </w:p>
         </w:tc>
@@ -3166,7 +3180,7 @@
               <w:rPr>
                 <w:sz w:val="19"/>
               </w:rPr>
-              <w:t>Step-by-step attendee exercises with checkpoints</w:t>
+              <w:t>Step-by-step attendee exercises with checkpoints, ending with training-data clean-up steps</w:t>
             </w:r>
           </w:p>
         </w:tc>
@@ -3309,6 +3323,7 @@
               <w:rPr>
                 <w:sz w:val="19"/>
               </w:rPr>
+              <w:lastRenderedPageBreak/>
               <w:t>reference/00-copilot-vs-cowork</w:t>
             </w:r>
           </w:p>
@@ -3378,7 +3393,6 @@
               <w:rPr>
                 <w:sz w:val="19"/>
               </w:rPr>
-              <w:lastRenderedPageBreak/>
               <w:t>reference/01-cowork-overview</w:t>
             </w:r>
           </w:p>
@@ -4776,7 +4790,7 @@
         <w:pStyle w:val="Heading2"/>
       </w:pPr>
       <w:bookmarkStart w:id="14" w:name="how-to-use-this-kit"/>
-      <w:bookmarkStart w:id="15" w:name="_Toc242272191"/>
+      <w:bookmarkStart w:id="15" w:name="_Toc242289617"/>
       <w:bookmarkEnd w:id="11"/>
       <w:bookmarkEnd w:id="13"/>
       <w:r>
@@ -5075,7 +5089,7 @@
         <w:pStyle w:val="Heading2"/>
       </w:pPr>
       <w:bookmarkStart w:id="16" w:name="requirement-coverage"/>
-      <w:bookmarkStart w:id="17" w:name="_Toc242272192"/>
+      <w:bookmarkStart w:id="17" w:name="_Toc242289618"/>
       <w:bookmarkEnd w:id="14"/>
       <w:r>
         <w:t>Requirement coverage</w:t>
@@ -5531,7 +5545,7 @@
     </w:p>
     <w:p>
       <w:r>
-        <w:pict w14:anchorId="6AC01B13">
+        <w:pict w14:anchorId="0DC0F975">
           <v:rect id="_x0000_i1025" style="width:0;height:1.5pt" o:hralign="center" o:hrstd="t" o:hr="t"/>
         </w:pict>
       </w:r>
@@ -5688,7 +5702,7 @@
   <w:abstractNum w:abstractNumId="0" w15:restartNumberingAfterBreak="0">
     <w:nsid w:val="0000A990"/>
     <w:multiLevelType w:val="multilevel"/>
-    <w:tmpl w:val="C9487B6C"/>
+    <w:tmpl w:val="3FA2AA44"/>
     <w:lvl w:ilvl="0">
       <w:numFmt w:val="bullet"/>
       <w:lvlText w:val=" "/>
@@ -5765,7 +5779,7 @@
   <w:abstractNum w:abstractNumId="1" w15:restartNumberingAfterBreak="0">
     <w:nsid w:val="0000A991"/>
     <w:multiLevelType w:val="multilevel"/>
-    <w:tmpl w:val="2D22CBE2"/>
+    <w:tmpl w:val="A860E5A0"/>
     <w:lvl w:ilvl="0">
       <w:numFmt w:val="bullet"/>
       <w:lvlText w:val=""/>
@@ -5869,7 +5883,7 @@
   <w:abstractNum w:abstractNumId="2" w15:restartNumberingAfterBreak="0">
     <w:nsid w:val="00A99411"/>
     <w:multiLevelType w:val="multilevel"/>
-    <w:tmpl w:val="5840F9E6"/>
+    <w:tmpl w:val="29A037BE"/>
     <w:lvl w:ilvl="0">
       <w:start w:val="1"/>
       <w:numFmt w:val="decimal"/>
@@ -5952,10 +5966,10 @@
       </w:pPr>
     </w:lvl>
   </w:abstractNum>
-  <w:num w:numId="1" w16cid:durableId="820732548">
+  <w:num w:numId="1" w16cid:durableId="1830049583">
     <w:abstractNumId w:val="0"/>
   </w:num>
-  <w:num w:numId="2" w16cid:durableId="623119895">
+  <w:num w:numId="2" w16cid:durableId="1033186256">
     <w:abstractNumId w:val="2"/>
     <w:lvlOverride w:ilvl="0">
       <w:startOverride w:val="1"/>
@@ -5985,13 +5999,13 @@
       <w:startOverride w:val="1"/>
     </w:lvlOverride>
   </w:num>
-  <w:num w:numId="3" w16cid:durableId="1015378067">
+  <w:num w:numId="3" w16cid:durableId="467936562">
     <w:abstractNumId w:val="1"/>
   </w:num>
-  <w:num w:numId="4" w16cid:durableId="1280144593">
+  <w:num w:numId="4" w16cid:durableId="1925065383">
     <w:abstractNumId w:val="1"/>
   </w:num>
-  <w:num w:numId="5" w16cid:durableId="701134818">
+  <w:num w:numId="5" w16cid:durableId="318733889">
     <w:abstractNumId w:val="2"/>
     <w:lvlOverride w:ilvl="0">
       <w:startOverride w:val="1"/>
@@ -6021,7 +6035,7 @@
       <w:startOverride w:val="1"/>
     </w:lvlOverride>
   </w:num>
-  <w:num w:numId="6" w16cid:durableId="1493566237">
+  <w:num w:numId="6" w16cid:durableId="1960842873">
     <w:abstractNumId w:val="1"/>
   </w:num>
 </w:numbering>
@@ -7300,7 +7314,7 @@
     <w:next w:val="Normal"/>
     <w:autoRedefine/>
     <w:uiPriority w:val="39"/>
-    <w:rsid w:val="00567114"/>
+    <w:rsid w:val="00625324"/>
     <w:pPr>
       <w:spacing w:after="100"/>
     </w:pPr>
@@ -7311,7 +7325,7 @@
     <w:next w:val="Normal"/>
     <w:autoRedefine/>
     <w:uiPriority w:val="39"/>
-    <w:rsid w:val="00567114"/>
+    <w:rsid w:val="00625324"/>
     <w:pPr>
       <w:spacing w:after="100"/>
       <w:ind w:left="210"/>
@@ -7321,7 +7335,7 @@
     <w:name w:val="header"/>
     <w:basedOn w:val="Normal"/>
     <w:link w:val="HeaderChar"/>
-    <w:rsid w:val="00567114"/>
+    <w:rsid w:val="00625324"/>
     <w:pPr>
       <w:tabs>
         <w:tab w:val="center" w:pos="4513"/>
@@ -7334,7 +7348,7 @@
     <w:name w:val="Header Char"/>
     <w:basedOn w:val="DefaultParagraphFont"/>
     <w:link w:val="Header"/>
-    <w:rsid w:val="00567114"/>
+    <w:rsid w:val="00625324"/>
     <w:rPr>
       <w:rFonts w:ascii="Segoe UI" w:eastAsia="Segoe UI" w:hAnsi="Segoe UI" w:cs="Segoe UI"/>
       <w:color w:val="242424"/>
@@ -7345,7 +7359,7 @@
     <w:name w:val="footer"/>
     <w:basedOn w:val="Normal"/>
     <w:link w:val="FooterChar"/>
-    <w:rsid w:val="00567114"/>
+    <w:rsid w:val="00625324"/>
     <w:pPr>
       <w:tabs>
         <w:tab w:val="center" w:pos="4513"/>
@@ -7358,7 +7372,7 @@
     <w:name w:val="Footer Char"/>
     <w:basedOn w:val="DefaultParagraphFont"/>
     <w:link w:val="Footer"/>
-    <w:rsid w:val="00567114"/>
+    <w:rsid w:val="00625324"/>
     <w:rPr>
       <w:rFonts w:ascii="Segoe UI" w:eastAsia="Segoe UI" w:hAnsi="Segoe UI" w:cs="Segoe UI"/>
       <w:color w:val="242424"/>

</xml_diff>

<commit_message>
Remove knowledge checks from the workshop and related documents
Remove the quiz slide and follow-up questions, update facilitator and email references, and rebuild the affected decks and Word documents.

Co-authored-by: Copilot <223556219+Copilot@users.noreply.github.com>
</commit_message>
<xml_diff>
--- a/README.docx
+++ b/README.docx
@@ -2283,7 +2283,7 @@
               <w:rPr>
                 <w:sz w:val="19"/>
               </w:rPr>
-              <w:t xml:space="preserve">Instructor deck (57 slides, speaker notes, alt text) — a</w:t>
+              <w:t xml:space="preserve">Instructor deck (56 slides, speaker notes, alt text) — a</w:t>
             </w:r>
             <w:r>
               <w:rPr>
@@ -2426,7 +2426,7 @@
               <w:rPr>
                 <w:sz w:val="19"/>
               </w:rPr>
-              <w:t xml:space="preserve">banners on Exercise 7, a knowledge check, and a closing</w:t>
+              <w:t xml:space="preserve">banners on Exercise 7, and a closing</w:t>
             </w:r>
             <w:r>
               <w:rPr>
@@ -3249,7 +3249,7 @@
               <w:rPr>
                 <w:sz w:val="19"/>
               </w:rPr>
-              <w:t xml:space="preserve">Knowledge check, feedback survey (for Microsoft Forms), and 30-day adoption plan</w:t>
+              <w:t xml:space="preserve">Feedback survey (for Microsoft Forms) and 30-day adoption plan</w:t>
             </w:r>
           </w:p>
         </w:tc>
@@ -5247,7 +5247,7 @@
         <w:t xml:space="preserve"> </w:t>
       </w:r>
       <w:r>
-        <w:t xml:space="preserve">(knowledge check, survey, and</w:t>
+        <w:t xml:space="preserve">(survey and</w:t>
       </w:r>
       <w:r>
         <w:t xml:space="preserve"> </w:t>
@@ -5913,19 +5913,6 @@
           <w:bCs/>
         </w:rPr>
         <w:t xml:space="preserve">Plan B</w:t>
-      </w:r>
-      <w:r>
-        <w:t xml:space="preserve">, a</w:t>
-      </w:r>
-      <w:r>
-        <w:t xml:space="preserve"> </w:t>
-      </w:r>
-      <w:r>
-        <w:rPr>
-          <w:b/>
-          <w:bCs/>
-        </w:rPr>
-        <w:t xml:space="preserve">knowledge check</w:t>
       </w:r>
       <w:r>
         <w:t xml:space="preserve">, and a</w:t>

</xml_diff>

<commit_message>
Move custom instructions to optional sections and fix deck XML
Place Cowork custom instructions after Exercise 8 and update setup guidance and generated documents. Replace inherited prompt highlights instead of duplicating them, and add validation to prevent PowerPoint repair warnings.

Co-authored-by: Copilot <223556219+Copilot@users.noreply.github.com>
</commit_message>
<xml_diff>
--- a/README.docx
+++ b/README.docx
@@ -1576,6 +1576,46 @@
       </w:r>
       <w:r>
         <w:t xml:space="preserve">for self-study.</w:t>
+      </w:r>
+    </w:p>
+    <w:p>
+      <w:pPr>
+        <w:pStyle w:val="BodyText"/>
+      </w:pPr>
+      <w:r>
+        <w:rPr>
+          <w:b/>
+          <w:bCs/>
+        </w:rPr>
+        <w:t xml:space="preserve">Customize instructions for Cowork</w:t>
+      </w:r>
+      <w:r>
+        <w:t xml:space="preserve"> </w:t>
+      </w:r>
+      <w:r>
+        <w:t xml:space="preserve">is in</w:t>
+      </w:r>
+      <w:r>
+        <w:t xml:space="preserve"> </w:t>
+      </w:r>
+      <w:r>
+        <w:rPr>
+          <w:b/>
+          <w:bCs/>
+        </w:rPr>
+        <w:t xml:space="preserve">Optional Sections</w:t>
+      </w:r>
+      <w:r>
+        <w:t xml:space="preserve"> </w:t>
+      </w:r>
+      <w:r>
+        <w:t xml:space="preserve">after Exercise 8, not a setup</w:t>
+      </w:r>
+      <w:r>
+        <w:t xml:space="preserve"> </w:t>
+      </w:r>
+      <w:r>
+        <w:t xml:space="preserve">prerequisite; cover it only if time allows, or after the workshop.</w:t>
       </w:r>
     </w:p>
     <w:bookmarkEnd w:id="16"/>

</xml_diff>

<commit_message>
Move reference slides to optional sections and extend Exercise 4
Group workshop downloads, approval guidance, and golden rules after Exercise 8. Give Exercise 4 fifteen minutes, shift later timings, and update decks, Word guides, and invitations for the 155-minute workshop.

Co-authored-by: Copilot <223556219+Copilot@users.noreply.github.com>
</commit_message>
<xml_diff>
--- a/README.docx
+++ b/README.docx
@@ -37,13 +37,13 @@
         <w:t xml:space="preserve">Getting Things Done with Copilot Cowork for HR Tasks</w:t>
       </w:r>
     </w:p>
-    <w:bookmarkStart w:id="9" w:name="X5c2a697cc39f7effba939e6c1d8f08cb370c1c7"/>
+    <w:bookmarkStart w:id="9" w:name="X86a955e17a16d00e8f6339843af50454f3d7aaa"/>
     <w:p>
       <w:pPr>
         <w:pStyle w:val="Heading3"/>
       </w:pPr>
       <w:r>
-        <w:t xml:space="preserve">A 2½-hour, hands-on workshop kit for HR teams</w:t>
+        <w:t xml:space="preserve">A 2-hour 35-minute, hands-on workshop kit for HR teams</w:t>
       </w:r>
     </w:p>
     <w:p>
@@ -51,7 +51,7 @@
         <w:pStyle w:val="FirstParagraph"/>
       </w:pPr>
       <w:r>
-        <w:t xml:space="preserve">This kit contains everything you need to run (or attend) a 2½-hour, hands-on workshop that teaches</w:t>
+        <w:t xml:space="preserve">This kit contains everything you need to run (or attend) a 2-hour 35-minute, hands-on workshop that teaches</w:t>
       </w:r>
       <w:r>
         <w:t xml:space="preserve"> </w:t>
@@ -858,13 +858,13 @@
       </w:r>
     </w:p>
     <w:bookmarkEnd w:id="14"/>
-    <w:bookmarkStart w:id="16" w:name="agenda-2½-hours"/>
+    <w:bookmarkStart w:id="16" w:name="agenda-2-hours-35-minutes"/>
     <w:p>
       <w:pPr>
         <w:pStyle w:val="Heading2"/>
       </w:pPr>
       <w:r>
-        <w:t xml:space="preserve">Agenda (2½ hours)</w:t>
+        <w:t xml:space="preserve">Agenda (2 hours 35 minutes)</w:t>
       </w:r>
     </w:p>
     <w:tbl>
@@ -1206,7 +1206,7 @@
               <w:rPr>
                 <w:sz w:val="19"/>
               </w:rPr>
-              <w:t xml:space="preserve">10 min</w:t>
+              <w:t xml:space="preserve">15 min</w:t>
             </w:r>
           </w:p>
         </w:tc>
@@ -1583,6 +1583,44 @@
         <w:pStyle w:val="BodyText"/>
       </w:pPr>
       <w:r>
+        <w:t xml:space="preserve">The</w:t>
+      </w:r>
+      <w:r>
+        <w:t xml:space="preserve"> </w:t>
+      </w:r>
+      <w:r>
+        <w:rPr>
+          <w:b/>
+          <w:bCs/>
+        </w:rPr>
+        <w:t xml:space="preserve">Workshop kit / Download links</w:t>
+      </w:r>
+      <w:r>
+        <w:t xml:space="preserve"> </w:t>
+      </w:r>
+      <w:r>
+        <w:t xml:space="preserve">slide, detailed</w:t>
+      </w:r>
+      <w:r>
+        <w:t xml:space="preserve"> </w:t>
+      </w:r>
+      <w:r>
+        <w:rPr>
+          <w:b/>
+          <w:bCs/>
+        </w:rPr>
+        <w:t xml:space="preserve">How approvals work</w:t>
+      </w:r>
+      <w:r>
+        <w:t xml:space="preserve"> </w:t>
+      </w:r>
+      <w:r>
+        <w:t xml:space="preserve">walkthrough,</w:t>
+      </w:r>
+      <w:r>
+        <w:t xml:space="preserve"> </w:t>
+      </w:r>
+      <w:r>
         <w:rPr>
           <w:b/>
           <w:bCs/>
@@ -1590,10 +1628,23 @@
         <w:t xml:space="preserve">Customize instructions for Cowork</w:t>
       </w:r>
       <w:r>
-        <w:t xml:space="preserve"> </w:t>
-      </w:r>
-      <w:r>
-        <w:t xml:space="preserve">is in</w:t>
+        <w:t xml:space="preserve">, and</w:t>
+      </w:r>
+      <w:r>
+        <w:t xml:space="preserve"> </w:t>
+      </w:r>
+      <w:r>
+        <w:rPr>
+          <w:b/>
+          <w:bCs/>
+        </w:rPr>
+        <w:t xml:space="preserve">Responsible use — the golden rules</w:t>
+      </w:r>
+      <w:r>
+        <w:t xml:space="preserve"> </w:t>
+      </w:r>
+      <w:r>
+        <w:t xml:space="preserve">slide are in</w:t>
       </w:r>
       <w:r>
         <w:t xml:space="preserve"> </w:t>
@@ -1609,13 +1660,19 @@
         <w:t xml:space="preserve"> </w:t>
       </w:r>
       <w:r>
-        <w:t xml:space="preserve">after Exercise 8, not a setup</w:t>
-      </w:r>
-      <w:r>
-        <w:t xml:space="preserve"> </w:t>
-      </w:r>
-      <w:r>
-        <w:t xml:space="preserve">prerequisite; cover it only if time allows, or after the workshop.</w:t>
+        <w:t xml:space="preserve">after Exercise 8; cover them</w:t>
+      </w:r>
+      <w:r>
+        <w:t xml:space="preserve"> </w:t>
+      </w:r>
+      <w:r>
+        <w:t xml:space="preserve">only if time allows, or after the workshop.</w:t>
+      </w:r>
+      <w:r>
+        <w:t xml:space="preserve"> </w:t>
+      </w:r>
+      <w:r>
+        <w:t xml:space="preserve">Brief one-at-a-time approval reminders remain in the exercises.</w:t>
       </w:r>
     </w:p>
     <w:bookmarkEnd w:id="16"/>

</xml_diff>

<commit_message>
Rename optional sections to Appendix and add starter prompts
Move learning objectives into the Appendix and add a screenshot-based Cowork starter-prompts slide before Exercise 1. Update related guides, links, and generated Office documents.

Co-authored-by: Copilot <223556219+Copilot@users.noreply.github.com>
</commit_message>
<xml_diff>
--- a/README.docx
+++ b/README.docx
@@ -1593,6 +1593,22 @@
           <w:b/>
           <w:bCs/>
         </w:rPr>
+        <w:t xml:space="preserve">What you'll be able to do by the end</w:t>
+      </w:r>
+      <w:r>
+        <w:t xml:space="preserve"> </w:t>
+      </w:r>
+      <w:r>
+        <w:t xml:space="preserve">learning-objectives slide,</w:t>
+      </w:r>
+      <w:r>
+        <w:t xml:space="preserve"> </w:t>
+      </w:r>
+      <w:r>
+        <w:rPr>
+          <w:b/>
+          <w:bCs/>
+        </w:rPr>
         <w:t xml:space="preserve">Workshop kit / Download links</w:t>
       </w:r>
       <w:r>
@@ -1650,11 +1666,17 @@
         <w:t xml:space="preserve"> </w:t>
       </w:r>
       <w:r>
-        <w:rPr>
-          <w:b/>
-          <w:bCs/>
-        </w:rPr>
-        <w:t xml:space="preserve">Optional Sections</w:t>
+        <w:t xml:space="preserve">the</w:t>
+      </w:r>
+      <w:r>
+        <w:t xml:space="preserve"> </w:t>
+      </w:r>
+      <w:r>
+        <w:rPr>
+          <w:b/>
+          <w:bCs/>
+        </w:rPr>
+        <w:t xml:space="preserve">Appendix</w:t>
       </w:r>
       <w:r>
         <w:t xml:space="preserve"> </w:t>

</xml_diff>

<commit_message>
Add Appendix divider and Cowork settings readiness slide
Show Edge browsing setup and Copilot Credit access requirements with the supplied spending-policy screenshot. Update guides to require enough credit and budget headroom before training.

Co-authored-by: Copilot <223556219+Copilot@users.noreply.github.com>
</commit_message>
<xml_diff>
--- a/README.docx
+++ b/README.docx
@@ -1615,7 +1615,29 @@
         <w:t xml:space="preserve"> </w:t>
       </w:r>
       <w:r>
-        <w:t xml:space="preserve">slide, detailed</w:t>
+        <w:t xml:space="preserve">slide,</w:t>
+      </w:r>
+      <w:r>
+        <w:t xml:space="preserve"> </w:t>
+      </w:r>
+      <w:r>
+        <w:rPr>
+          <w:b/>
+          <w:bCs/>
+        </w:rPr>
+        <w:t xml:space="preserve">Cowork settings — Edge browsing &amp; Copilot Credits</w:t>
+      </w:r>
+      <w:r>
+        <w:t xml:space="preserve"> </w:t>
+      </w:r>
+      <w:r>
+        <w:t xml:space="preserve">reference,</w:t>
+      </w:r>
+      <w:r>
+        <w:t xml:space="preserve"> </w:t>
+      </w:r>
+      <w:r>
+        <w:t xml:space="preserve">detailed</w:t>
       </w:r>
       <w:r>
         <w:t xml:space="preserve"> </w:t>
@@ -1695,6 +1717,31 @@
       </w:r>
       <w:r>
         <w:t xml:space="preserve">Brief one-at-a-time approval reminders remain in the exercises.</w:t>
+      </w:r>
+      <w:r>
+        <w:t xml:space="preserve"> </w:t>
+      </w:r>
+      <w:r>
+        <w:t xml:space="preserve">Browser access and enough available Copilot Credits are prerequisites to verify</w:t>
+      </w:r>
+      <w:r>
+        <w:t xml:space="preserve"> </w:t>
+      </w:r>
+      <w:r>
+        <w:rPr>
+          <w:b/>
+          <w:bCs/>
+        </w:rPr>
+        <w:t xml:space="preserve">before training</w:t>
+      </w:r>
+      <w:r>
+        <w:t xml:space="preserve">,</w:t>
+      </w:r>
+      <w:r>
+        <w:t xml:space="preserve"> </w:t>
+      </w:r>
+      <w:r>
+        <w:t xml:space="preserve">even though their reference slide is in the Appendix.</w:t>
       </w:r>
     </w:p>
     <w:bookmarkEnd w:id="16"/>

</xml_diff>